<commit_message>
Runda 3, stavka 7: ograničena retencija + sidra arhive (S8 + P3); keš za replay
Dnevnik se skraćuje samo iza sidra: arhiva (gzip, sha256, read-only) →
append-only sidro + događaj u lancu → brisanje. Okidač dozvoljava DELETE
samo za arhivirane događaje. verify_archives provjerava hash, unutrašnji
lanac i spoj sidara. Replay čita i arhive i preskače već potvrđene zapise
dok se ne promijeni zapis ili kod koji odlučuje.

Co-Authored-By: Claude Opus 5.5 <noreply@anthropic.com>
</commit_message>
<xml_diff>
--- a/PSE Riemann — PLAN.docx
+++ b/PSE Riemann — PLAN.docx
@@ -1282,6 +1282,181 @@
           </w:p>
         </w:tc>
       </w:tr>
+      <w:tr>
+        <w:trPr>
+          <w:tblHeader w:val="off"/>
+        </w:trPr>
+        <w:tc>
+          <w:tcPr>
+            <w:tcW w:type="dxa" w:w="1191"/>
+            <w:tcBorders>
+              <w:top w:val="single" w:color="D9D4C7" w:sz="4"/>
+              <w:left w:val="single" w:color="D9D4C7" w:sz="4"/>
+              <w:bottom w:val="single" w:color="D9D4C7" w:sz="4"/>
+              <w:right w:val="single" w:color="D9D4C7" w:sz="4"/>
+            </w:tcBorders>
+            <w:tcMar>
+              <w:top w:type="dxa" w:w="60"/>
+              <w:left w:type="dxa" w:w="100"/>
+              <w:bottom w:type="dxa" w:w="60"/>
+              <w:right w:type="dxa" w:w="100"/>
+            </w:tcMar>
+          </w:tcPr>
+          <w:p>
+            <w:pPr>
+              <w:spacing w:after="0"/>
+            </w:pPr>
+            <w:r>
+              <w:rPr>
+                <w:sz w:val="19"/>
+                <w:szCs w:val="19"/>
+              </w:rPr>
+              <w:t xml:space="preserve">2026-10-25</w:t>
+            </w:r>
+          </w:p>
+        </w:tc>
+        <w:tc>
+          <w:tcPr>
+            <w:tcW w:type="dxa" w:w="1732"/>
+            <w:tcBorders>
+              <w:top w:val="single" w:color="D9D4C7" w:sz="4"/>
+              <w:left w:val="single" w:color="D9D4C7" w:sz="4"/>
+              <w:bottom w:val="single" w:color="D9D4C7" w:sz="4"/>
+              <w:right w:val="single" w:color="D9D4C7" w:sz="4"/>
+            </w:tcBorders>
+            <w:tcMar>
+              <w:top w:type="dxa" w:w="60"/>
+              <w:left w:type="dxa" w:w="100"/>
+              <w:bottom w:type="dxa" w:w="60"/>
+              <w:right w:type="dxa" w:w="100"/>
+            </w:tcMar>
+          </w:tcPr>
+          <w:p>
+            <w:pPr>
+              <w:spacing w:after="0"/>
+            </w:pPr>
+            <w:r>
+              <w:rPr>
+                <w:sz w:val="19"/>
+                <w:szCs w:val="19"/>
+              </w:rPr>
+              <w:t xml:space="preserve">7 · retencija + sidra arhive (S8 + P3)</w:t>
+            </w:r>
+          </w:p>
+        </w:tc>
+        <w:tc>
+          <w:tcPr>
+            <w:tcW w:type="dxa" w:w="974"/>
+            <w:tcBorders>
+              <w:top w:val="single" w:color="D9D4C7" w:sz="4"/>
+              <w:left w:val="single" w:color="D9D4C7" w:sz="4"/>
+              <w:bottom w:val="single" w:color="D9D4C7" w:sz="4"/>
+              <w:right w:val="single" w:color="D9D4C7" w:sz="4"/>
+            </w:tcBorders>
+            <w:tcMar>
+              <w:top w:type="dxa" w:w="60"/>
+              <w:left w:type="dxa" w:w="100"/>
+              <w:bottom w:type="dxa" w:w="60"/>
+              <w:right w:type="dxa" w:w="100"/>
+            </w:tcMar>
+          </w:tcPr>
+          <w:p>
+            <w:pPr>
+              <w:spacing w:after="0"/>
+            </w:pPr>
+            <w:r>
+              <w:rPr>
+                <w:sz w:val="19"/>
+                <w:szCs w:val="19"/>
+              </w:rPr>
+              <w:t xml:space="preserve">✅</w:t>
+            </w:r>
+          </w:p>
+        </w:tc>
+        <w:tc>
+          <w:tcPr>
+            <w:tcW w:type="dxa" w:w="1407"/>
+            <w:tcBorders>
+              <w:top w:val="single" w:color="D9D4C7" w:sz="4"/>
+              <w:left w:val="single" w:color="D9D4C7" w:sz="4"/>
+              <w:bottom w:val="single" w:color="D9D4C7" w:sz="4"/>
+              <w:right w:val="single" w:color="D9D4C7" w:sz="4"/>
+            </w:tcBorders>
+            <w:tcMar>
+              <w:top w:type="dxa" w:w="60"/>
+              <w:left w:type="dxa" w:w="100"/>
+              <w:bottom w:type="dxa" w:w="60"/>
+              <w:right w:type="dxa" w:w="100"/>
+            </w:tcMar>
+          </w:tcPr>
+          <w:p>
+            <w:pPr>
+              <w:spacing w:after="0"/>
+            </w:pPr>
+            <w:r>
+              <w:rPr>
+                <w:sz w:val="19"/>
+                <w:szCs w:val="19"/>
+              </w:rPr>
+              <w:t xml:space="preserve">pytest 131/131, selftest ✅</w:t>
+            </w:r>
+          </w:p>
+        </w:tc>
+        <w:tc>
+          <w:tcPr>
+            <w:tcW w:type="dxa" w:w="4334"/>
+            <w:tcBorders>
+              <w:top w:val="single" w:color="D9D4C7" w:sz="4"/>
+              <w:left w:val="single" w:color="D9D4C7" w:sz="4"/>
+              <w:bottom w:val="single" w:color="D9D4C7" w:sz="4"/>
+              <w:right w:val="single" w:color="D9D4C7" w:sz="4"/>
+            </w:tcBorders>
+            <w:tcMar>
+              <w:top w:type="dxa" w:w="60"/>
+              <w:left w:type="dxa" w:w="100"/>
+              <w:bottom w:type="dxa" w:w="60"/>
+              <w:right w:type="dxa" w:w="100"/>
+            </w:tcMar>
+          </w:tcPr>
+          <w:p>
+            <w:pPr>
+              <w:spacing w:after="0"/>
+            </w:pPr>
+            <w:r>
+              <w:rPr>
+                <w:rFonts w:ascii="Consolas" w:cs="Consolas" w:eastAsia="Consolas" w:hAnsi="Consolas"/>
+                <w:color w:val="6B4A12"/>
+                <w:sz w:val="19"/>
+                <w:szCs w:val="19"/>
+              </w:rPr>
+              <w:t xml:space="preserve">core/archive.py</w:t>
+            </w:r>
+            <w:r>
+              <w:rPr>
+                <w:sz w:val="19"/>
+                <w:szCs w:val="19"/>
+              </w:rPr>
+              <w:t xml:space="preserve">: stari događaji → </w:t>
+            </w:r>
+            <w:r>
+              <w:rPr>
+                <w:rFonts w:ascii="Consolas" w:cs="Consolas" w:eastAsia="Consolas" w:hAnsi="Consolas"/>
+                <w:color w:val="6B4A12"/>
+                <w:sz w:val="19"/>
+                <w:szCs w:val="19"/>
+              </w:rPr>
+              <w:t xml:space="preserve">.state/archive/*.jsonl.gz</w:t>
+            </w:r>
+            <w:r>
+              <w:rPr>
+                <w:sz w:val="19"/>
+                <w:szCs w:val="19"/>
+              </w:rPr>
+              <w:t xml:space="preserve"> (sha256, samo za čitanje) → sidro (append-only tabela + događaj u lancu) → tek onda brisanje; okidač dozvoljava DELETE samo ispod sidra; lanac se nastavlja preko sidra; lažirana arhiva otkrivena; dnevno u pozadini (&gt; 200 000 događaja, čuva 90 dana / min 20 000). Replay čita i arhive; keš za replay (hash zapisa + hash koda) — test 58 s → 0,1 s. Pravi dnevnik: okidač migriran, lanac netaknut</w:t>
+            </w:r>
+          </w:p>
+        </w:tc>
+      </w:tr>
     </w:tbl>
     <w:p>
       <w:pPr>
@@ -1300,7 +1475,7 @@
         <w:t xml:space="preserve">Sljedeće:</w:t>
       </w:r>
       <w:r>
-        <w:t xml:space="preserve"> stavka 7 (ograničena retencija + sidra arhive, S8 + P3).</w:t>
+        <w:t xml:space="preserve"> Faza 2 — stavka 8 (početno podešavanje pri prvom otvaranju).</w:t>
       </w:r>
     </w:p>
     <w:p>
@@ -1315,7 +1490,7 @@
         <w:t xml:space="preserve">Preostalo:</w:t>
       </w:r>
       <w:r>
-        <w:t xml:space="preserve"> oko 86–135 h (plan proširen: stavka 36 + polja uz 32).</w:t>
+        <w:t xml:space="preserve"> oko 83–132 h.</w:t>
       </w:r>
     </w:p>
     <w:p>

</xml_diff>

<commit_message>
Runda 3, stavke 9–11: provajderi, strujanje kroz egress, savjeti o naplati
9: 10 gotovih provajdera + deklarisane OpenAI-kompatibilne adrese (otvaraju
   se tek uz potvrdu operatera) + GGUF sa bilo kog mjesta po putanji.
   Claude podrazumijevano claude-opus-5-5, server-side fallback 'default'.
10: svi pozivi strujanjem kroz Guardian egress; prekid = shutdown socketa;
   kill_streams() za prekidač. Test na pravom socketu.
11: prekid zaustavlja naplatu ili ne po provajderu; strože granice gdje ne;
   budžet broji najgori slučaj.

Co-Authored-By: Claude Opus 5.5 <noreply@anthropic.com>
</commit_message>
<xml_diff>
--- a/PSE Riemann — PLAN.docx
+++ b/PSE Riemann — PLAN.docx
@@ -1457,6 +1457,644 @@
           </w:p>
         </w:tc>
       </w:tr>
+      <w:tr>
+        <w:trPr>
+          <w:tblHeader w:val="off"/>
+        </w:trPr>
+        <w:tc>
+          <w:tcPr>
+            <w:tcW w:type="dxa" w:w="1191"/>
+            <w:tcBorders>
+              <w:top w:val="single" w:color="D9D4C7" w:sz="4"/>
+              <w:left w:val="single" w:color="D9D4C7" w:sz="4"/>
+              <w:bottom w:val="single" w:color="D9D4C7" w:sz="4"/>
+              <w:right w:val="single" w:color="D9D4C7" w:sz="4"/>
+            </w:tcBorders>
+            <w:shd w:fill="F4F1EA" w:color="auto" w:val="clear"/>
+            <w:tcMar>
+              <w:top w:type="dxa" w:w="60"/>
+              <w:left w:type="dxa" w:w="100"/>
+              <w:bottom w:type="dxa" w:w="60"/>
+              <w:right w:type="dxa" w:w="100"/>
+            </w:tcMar>
+          </w:tcPr>
+          <w:p>
+            <w:pPr>
+              <w:spacing w:after="0"/>
+            </w:pPr>
+            <w:r>
+              <w:rPr>
+                <w:sz w:val="19"/>
+                <w:szCs w:val="19"/>
+              </w:rPr>
+              <w:t xml:space="preserve">2026-10-25</w:t>
+            </w:r>
+          </w:p>
+        </w:tc>
+        <w:tc>
+          <w:tcPr>
+            <w:tcW w:type="dxa" w:w="1732"/>
+            <w:tcBorders>
+              <w:top w:val="single" w:color="D9D4C7" w:sz="4"/>
+              <w:left w:val="single" w:color="D9D4C7" w:sz="4"/>
+              <w:bottom w:val="single" w:color="D9D4C7" w:sz="4"/>
+              <w:right w:val="single" w:color="D9D4C7" w:sz="4"/>
+            </w:tcBorders>
+            <w:shd w:fill="F4F1EA" w:color="auto" w:val="clear"/>
+            <w:tcMar>
+              <w:top w:type="dxa" w:w="60"/>
+              <w:left w:type="dxa" w:w="100"/>
+              <w:bottom w:type="dxa" w:w="60"/>
+              <w:right w:type="dxa" w:w="100"/>
+            </w:tcMar>
+          </w:tcPr>
+          <w:p>
+            <w:pPr>
+              <w:spacing w:after="0"/>
+            </w:pPr>
+            <w:r>
+              <w:rPr>
+                <w:sz w:val="19"/>
+                <w:szCs w:val="19"/>
+              </w:rPr>
+              <w:t xml:space="preserve">9 · provajderi</w:t>
+            </w:r>
+          </w:p>
+        </w:tc>
+        <w:tc>
+          <w:tcPr>
+            <w:tcW w:type="dxa" w:w="974"/>
+            <w:tcBorders>
+              <w:top w:val="single" w:color="D9D4C7" w:sz="4"/>
+              <w:left w:val="single" w:color="D9D4C7" w:sz="4"/>
+              <w:bottom w:val="single" w:color="D9D4C7" w:sz="4"/>
+              <w:right w:val="single" w:color="D9D4C7" w:sz="4"/>
+            </w:tcBorders>
+            <w:shd w:fill="F4F1EA" w:color="auto" w:val="clear"/>
+            <w:tcMar>
+              <w:top w:type="dxa" w:w="60"/>
+              <w:left w:type="dxa" w:w="100"/>
+              <w:bottom w:type="dxa" w:w="60"/>
+              <w:right w:type="dxa" w:w="100"/>
+            </w:tcMar>
+          </w:tcPr>
+          <w:p>
+            <w:pPr>
+              <w:spacing w:after="0"/>
+            </w:pPr>
+            <w:r>
+              <w:rPr>
+                <w:sz w:val="19"/>
+                <w:szCs w:val="19"/>
+              </w:rPr>
+              <w:t xml:space="preserve">✅</w:t>
+            </w:r>
+          </w:p>
+        </w:tc>
+        <w:tc>
+          <w:tcPr>
+            <w:tcW w:type="dxa" w:w="1407"/>
+            <w:tcBorders>
+              <w:top w:val="single" w:color="D9D4C7" w:sz="4"/>
+              <w:left w:val="single" w:color="D9D4C7" w:sz="4"/>
+              <w:bottom w:val="single" w:color="D9D4C7" w:sz="4"/>
+              <w:right w:val="single" w:color="D9D4C7" w:sz="4"/>
+            </w:tcBorders>
+            <w:shd w:fill="F4F1EA" w:color="auto" w:val="clear"/>
+            <w:tcMar>
+              <w:top w:type="dxa" w:w="60"/>
+              <w:left w:type="dxa" w:w="100"/>
+              <w:bottom w:type="dxa" w:w="60"/>
+              <w:right w:type="dxa" w:w="100"/>
+            </w:tcMar>
+          </w:tcPr>
+          <w:p>
+            <w:pPr>
+              <w:spacing w:after="0"/>
+            </w:pPr>
+            <w:r>
+              <w:rPr>
+                <w:sz w:val="19"/>
+                <w:szCs w:val="19"/>
+              </w:rPr>
+              <w:t xml:space="preserve">pytest 144/144</w:t>
+            </w:r>
+          </w:p>
+        </w:tc>
+        <w:tc>
+          <w:tcPr>
+            <w:tcW w:type="dxa" w:w="4334"/>
+            <w:tcBorders>
+              <w:top w:val="single" w:color="D9D4C7" w:sz="4"/>
+              <w:left w:val="single" w:color="D9D4C7" w:sz="4"/>
+              <w:bottom w:val="single" w:color="D9D4C7" w:sz="4"/>
+              <w:right w:val="single" w:color="D9D4C7" w:sz="4"/>
+            </w:tcBorders>
+            <w:shd w:fill="F4F1EA" w:color="auto" w:val="clear"/>
+            <w:tcMar>
+              <w:top w:type="dxa" w:w="60"/>
+              <w:left w:type="dxa" w:w="100"/>
+              <w:bottom w:type="dxa" w:w="60"/>
+              <w:right w:type="dxa" w:w="100"/>
+            </w:tcMar>
+          </w:tcPr>
+          <w:p>
+            <w:pPr>
+              <w:spacing w:after="0"/>
+            </w:pPr>
+            <w:r>
+              <w:rPr>
+                <w:rFonts w:ascii="Consolas" w:cs="Consolas" w:eastAsia="Consolas" w:hAnsi="Consolas"/>
+                <w:color w:val="6B4A12"/>
+                <w:sz w:val="19"/>
+                <w:szCs w:val="19"/>
+              </w:rPr>
+              <w:t xml:space="preserve">llm/providers.py</w:t>
+            </w:r>
+            <w:r>
+              <w:rPr>
+                <w:sz w:val="19"/>
+                <w:szCs w:val="19"/>
+              </w:rPr>
+              <w:t xml:space="preserve">: Claude (sada </w:t>
+            </w:r>
+            <w:r>
+              <w:rPr>
+                <w:rFonts w:ascii="Consolas" w:cs="Consolas" w:eastAsia="Consolas" w:hAnsi="Consolas"/>
+                <w:color w:val="6B4A12"/>
+                <w:sz w:val="19"/>
+                <w:szCs w:val="19"/>
+              </w:rPr>
+              <w:t xml:space="preserve">claude-opus-5-5</w:t>
+            </w:r>
+            <w:r>
+              <w:rPr>
+                <w:sz w:val="19"/>
+                <w:szCs w:val="19"/>
+              </w:rPr>
+              <w:t xml:space="preserve">, effort uvijek eksplicitno, server-side fallback „default“ pri odbijanju), OpenAI, Gemini, Mistral, Groq, DeepSeek, xAI, OpenRouter, Together, Fireworks — svi na allowlisti sa svojim ključem; vlastita OpenAI-kompatibilna adresa = prijedlog deklaracije, otvara se tek kad operater potvrdi (kind </w:t>
+            </w:r>
+            <w:r>
+              <w:rPr>
+                <w:rFonts w:ascii="Consolas" w:cs="Consolas" w:eastAsia="Consolas" w:hAnsi="Consolas"/>
+                <w:color w:val="6B4A12"/>
+                <w:sz w:val="19"/>
+                <w:szCs w:val="19"/>
+              </w:rPr>
+              <w:t xml:space="preserve">endpoints</w:t>
+            </w:r>
+            <w:r>
+              <w:rPr>
+                <w:sz w:val="19"/>
+                <w:szCs w:val="19"/>
+              </w:rPr>
+              <w:t xml:space="preserve">); GGUF sa bilo kog mjesta po putanji (bez kopiranja, prijem po sha256); </w:t>
+            </w:r>
+            <w:r>
+              <w:rPr>
+                <w:rFonts w:ascii="Consolas" w:cs="Consolas" w:eastAsia="Consolas" w:hAnsi="Consolas"/>
+                <w:color w:val="6B4A12"/>
+                <w:sz w:val="19"/>
+                <w:szCs w:val="19"/>
+              </w:rPr>
+              <w:t xml:space="preserve">list_models()</w:t>
+            </w:r>
+            <w:r>
+              <w:rPr>
+                <w:sz w:val="19"/>
+                <w:szCs w:val="19"/>
+              </w:rPr>
+              <w:t xml:space="preserve"> nudi prava imena modela sa servera. Uživo NIJE testirano — nema nijednog ključa (živi test = stavka 26)</w:t>
+            </w:r>
+          </w:p>
+        </w:tc>
+      </w:tr>
+      <w:tr>
+        <w:trPr>
+          <w:tblHeader w:val="off"/>
+        </w:trPr>
+        <w:tc>
+          <w:tcPr>
+            <w:tcW w:type="dxa" w:w="1191"/>
+            <w:tcBorders>
+              <w:top w:val="single" w:color="D9D4C7" w:sz="4"/>
+              <w:left w:val="single" w:color="D9D4C7" w:sz="4"/>
+              <w:bottom w:val="single" w:color="D9D4C7" w:sz="4"/>
+              <w:right w:val="single" w:color="D9D4C7" w:sz="4"/>
+            </w:tcBorders>
+            <w:tcMar>
+              <w:top w:type="dxa" w:w="60"/>
+              <w:left w:type="dxa" w:w="100"/>
+              <w:bottom w:type="dxa" w:w="60"/>
+              <w:right w:type="dxa" w:w="100"/>
+            </w:tcMar>
+          </w:tcPr>
+          <w:p>
+            <w:pPr>
+              <w:spacing w:after="0"/>
+            </w:pPr>
+            <w:r>
+              <w:rPr>
+                <w:sz w:val="19"/>
+                <w:szCs w:val="19"/>
+              </w:rPr>
+              <w:t xml:space="preserve">2026-10-25</w:t>
+            </w:r>
+          </w:p>
+        </w:tc>
+        <w:tc>
+          <w:tcPr>
+            <w:tcW w:type="dxa" w:w="1732"/>
+            <w:tcBorders>
+              <w:top w:val="single" w:color="D9D4C7" w:sz="4"/>
+              <w:left w:val="single" w:color="D9D4C7" w:sz="4"/>
+              <w:bottom w:val="single" w:color="D9D4C7" w:sz="4"/>
+              <w:right w:val="single" w:color="D9D4C7" w:sz="4"/>
+            </w:tcBorders>
+            <w:tcMar>
+              <w:top w:type="dxa" w:w="60"/>
+              <w:left w:type="dxa" w:w="100"/>
+              <w:bottom w:type="dxa" w:w="60"/>
+              <w:right w:type="dxa" w:w="100"/>
+            </w:tcMar>
+          </w:tcPr>
+          <w:p>
+            <w:pPr>
+              <w:spacing w:after="0"/>
+            </w:pPr>
+            <w:r>
+              <w:rPr>
+                <w:sz w:val="19"/>
+                <w:szCs w:val="19"/>
+              </w:rPr>
+              <w:t xml:space="preserve">10 · strujanje kroz egress</w:t>
+            </w:r>
+          </w:p>
+        </w:tc>
+        <w:tc>
+          <w:tcPr>
+            <w:tcW w:type="dxa" w:w="974"/>
+            <w:tcBorders>
+              <w:top w:val="single" w:color="D9D4C7" w:sz="4"/>
+              <w:left w:val="single" w:color="D9D4C7" w:sz="4"/>
+              <w:bottom w:val="single" w:color="D9D4C7" w:sz="4"/>
+              <w:right w:val="single" w:color="D9D4C7" w:sz="4"/>
+            </w:tcBorders>
+            <w:tcMar>
+              <w:top w:type="dxa" w:w="60"/>
+              <w:left w:type="dxa" w:w="100"/>
+              <w:bottom w:type="dxa" w:w="60"/>
+              <w:right w:type="dxa" w:w="100"/>
+            </w:tcMar>
+          </w:tcPr>
+          <w:p>
+            <w:pPr>
+              <w:spacing w:after="0"/>
+            </w:pPr>
+            <w:r>
+              <w:rPr>
+                <w:sz w:val="19"/>
+                <w:szCs w:val="19"/>
+              </w:rPr>
+              <w:t xml:space="preserve">✅</w:t>
+            </w:r>
+          </w:p>
+        </w:tc>
+        <w:tc>
+          <w:tcPr>
+            <w:tcW w:type="dxa" w:w="1407"/>
+            <w:tcBorders>
+              <w:top w:val="single" w:color="D9D4C7" w:sz="4"/>
+              <w:left w:val="single" w:color="D9D4C7" w:sz="4"/>
+              <w:bottom w:val="single" w:color="D9D4C7" w:sz="4"/>
+              <w:right w:val="single" w:color="D9D4C7" w:sz="4"/>
+            </w:tcBorders>
+            <w:tcMar>
+              <w:top w:type="dxa" w:w="60"/>
+              <w:left w:type="dxa" w:w="100"/>
+              <w:bottom w:type="dxa" w:w="60"/>
+              <w:right w:type="dxa" w:w="100"/>
+            </w:tcMar>
+          </w:tcPr>
+          <w:p>
+            <w:pPr>
+              <w:spacing w:after="0"/>
+            </w:pPr>
+            <w:r>
+              <w:rPr>
+                <w:sz w:val="19"/>
+                <w:szCs w:val="19"/>
+              </w:rPr>
+              <w:t xml:space="preserve">pravi socket: prekid → server dobija prekinutu vezu</w:t>
+            </w:r>
+          </w:p>
+        </w:tc>
+        <w:tc>
+          <w:tcPr>
+            <w:tcW w:type="dxa" w:w="4334"/>
+            <w:tcBorders>
+              <w:top w:val="single" w:color="D9D4C7" w:sz="4"/>
+              <w:left w:val="single" w:color="D9D4C7" w:sz="4"/>
+              <w:bottom w:val="single" w:color="D9D4C7" w:sz="4"/>
+              <w:right w:val="single" w:color="D9D4C7" w:sz="4"/>
+            </w:tcBorders>
+            <w:tcMar>
+              <w:top w:type="dxa" w:w="60"/>
+              <w:left w:type="dxa" w:w="100"/>
+              <w:bottom w:type="dxa" w:w="60"/>
+              <w:right w:type="dxa" w:w="100"/>
+            </w:tcMar>
+          </w:tcPr>
+          <w:p>
+            <w:pPr>
+              <w:spacing w:after="0"/>
+            </w:pPr>
+            <w:r>
+              <w:rPr>
+                <w:rFonts w:ascii="Consolas" w:cs="Consolas" w:eastAsia="Consolas" w:hAnsi="Consolas"/>
+                <w:color w:val="6B4A12"/>
+                <w:sz w:val="19"/>
+                <w:szCs w:val="19"/>
+              </w:rPr>
+              <w:t xml:space="preserve">egress.stream_post</w:t>
+            </w:r>
+            <w:r>
+              <w:rPr>
+                <w:sz w:val="19"/>
+                <w:szCs w:val="19"/>
+              </w:rPr>
+              <w:t xml:space="preserve">: iste kapije kao </w:t>
+            </w:r>
+            <w:r>
+              <w:rPr>
+                <w:rFonts w:ascii="Consolas" w:cs="Consolas" w:eastAsia="Consolas" w:hAnsi="Consolas"/>
+                <w:color w:val="6B4A12"/>
+                <w:sz w:val="19"/>
+                <w:szCs w:val="19"/>
+              </w:rPr>
+              <w:t xml:space="preserve">request</w:t>
+            </w:r>
+            <w:r>
+              <w:rPr>
+                <w:sz w:val="19"/>
+                <w:szCs w:val="19"/>
+              </w:rPr>
+              <w:t xml:space="preserve"> (izdvojeno u </w:t>
+            </w:r>
+            <w:r>
+              <w:rPr>
+                <w:rFonts w:ascii="Consolas" w:cs="Consolas" w:eastAsia="Consolas" w:hAnsi="Consolas"/>
+                <w:color w:val="6B4A12"/>
+                <w:sz w:val="19"/>
+                <w:szCs w:val="19"/>
+              </w:rPr>
+              <w:t xml:space="preserve">_gate</w:t>
+            </w:r>
+            <w:r>
+              <w:rPr>
+                <w:sz w:val="19"/>
+                <w:szCs w:val="19"/>
+              </w:rPr>
+              <w:t xml:space="preserve">/</w:t>
+            </w:r>
+            <w:r>
+              <w:rPr>
+                <w:rFonts w:ascii="Consolas" w:cs="Consolas" w:eastAsia="Consolas" w:hAnsi="Consolas"/>
+                <w:color w:val="6B4A12"/>
+                <w:sz w:val="19"/>
+                <w:szCs w:val="19"/>
+              </w:rPr>
+              <w:t xml:space="preserve">_connect</w:t>
+            </w:r>
+            <w:r>
+              <w:rPr>
+                <w:sz w:val="19"/>
+                <w:szCs w:val="19"/>
+              </w:rPr>
+              <w:t xml:space="preserve">, TLS pinovi), čita red po red, </w:t>
+            </w:r>
+            <w:r>
+              <w:rPr>
+                <w:rFonts w:ascii="Consolas" w:cs="Consolas" w:eastAsia="Consolas" w:hAnsi="Consolas"/>
+                <w:color w:val="6B4A12"/>
+                <w:sz w:val="19"/>
+                <w:szCs w:val="19"/>
+              </w:rPr>
+              <w:t xml:space="preserve">gen.close()</w:t>
+            </w:r>
+            <w:r>
+              <w:rPr>
+                <w:sz w:val="19"/>
+                <w:szCs w:val="19"/>
+              </w:rPr>
+              <w:t xml:space="preserve">/otkaz/„→ ∞“/vrtnja/rok → </w:t>
+            </w:r>
+            <w:r>
+              <w:rPr>
+                <w:rFonts w:ascii="Consolas" w:cs="Consolas" w:eastAsia="Consolas" w:hAnsi="Consolas"/>
+                <w:color w:val="6B4A12"/>
+                <w:sz w:val="19"/>
+                <w:szCs w:val="19"/>
+              </w:rPr>
+              <w:t xml:space="preserve">shutdown(SHUT_RDWR)</w:t>
+            </w:r>
+            <w:r>
+              <w:rPr>
+                <w:sz w:val="19"/>
+                <w:szCs w:val="19"/>
+              </w:rPr>
+              <w:t xml:space="preserve">; </w:t>
+            </w:r>
+            <w:r>
+              <w:rPr>
+                <w:rFonts w:ascii="Consolas" w:cs="Consolas" w:eastAsia="Consolas" w:hAnsi="Consolas"/>
+                <w:color w:val="6B4A12"/>
+                <w:sz w:val="19"/>
+                <w:szCs w:val="19"/>
+              </w:rPr>
+              <w:t xml:space="preserve">kill_streams()</w:t>
+            </w:r>
+            <w:r>
+              <w:rPr>
+                <w:sz w:val="19"/>
+                <w:szCs w:val="19"/>
+              </w:rPr>
+              <w:t xml:space="preserve"> prekida sve tokove odjednom (za stavku 12). Nađeno testom: </w:t>
+            </w:r>
+            <w:r>
+              <w:rPr>
+                <w:rFonts w:ascii="Consolas" w:cs="Consolas" w:eastAsia="Consolas" w:hAnsi="Consolas"/>
+                <w:color w:val="6B4A12"/>
+                <w:sz w:val="19"/>
+                <w:szCs w:val="19"/>
+              </w:rPr>
+              <w:t xml:space="preserve">http.client</w:t>
+            </w:r>
+            <w:r>
+              <w:rPr>
+                <w:sz w:val="19"/>
+                <w:szCs w:val="19"/>
+              </w:rPr>
+              <w:t xml:space="preserve"> zaboravi socket posle odgovora → prekidač nije sjekao vezu; sada se socket čuva posebno</w:t>
+            </w:r>
+          </w:p>
+        </w:tc>
+      </w:tr>
+      <w:tr>
+        <w:trPr>
+          <w:tblHeader w:val="off"/>
+        </w:trPr>
+        <w:tc>
+          <w:tcPr>
+            <w:tcW w:type="dxa" w:w="1191"/>
+            <w:tcBorders>
+              <w:top w:val="single" w:color="D9D4C7" w:sz="4"/>
+              <w:left w:val="single" w:color="D9D4C7" w:sz="4"/>
+              <w:bottom w:val="single" w:color="D9D4C7" w:sz="4"/>
+              <w:right w:val="single" w:color="D9D4C7" w:sz="4"/>
+            </w:tcBorders>
+            <w:shd w:fill="F4F1EA" w:color="auto" w:val="clear"/>
+            <w:tcMar>
+              <w:top w:type="dxa" w:w="60"/>
+              <w:left w:type="dxa" w:w="100"/>
+              <w:bottom w:type="dxa" w:w="60"/>
+              <w:right w:type="dxa" w:w="100"/>
+            </w:tcMar>
+          </w:tcPr>
+          <w:p>
+            <w:pPr>
+              <w:spacing w:after="0"/>
+            </w:pPr>
+            <w:r>
+              <w:rPr>
+                <w:sz w:val="19"/>
+                <w:szCs w:val="19"/>
+              </w:rPr>
+              <w:t xml:space="preserve">2026-10-25</w:t>
+            </w:r>
+          </w:p>
+        </w:tc>
+        <w:tc>
+          <w:tcPr>
+            <w:tcW w:type="dxa" w:w="1732"/>
+            <w:tcBorders>
+              <w:top w:val="single" w:color="D9D4C7" w:sz="4"/>
+              <w:left w:val="single" w:color="D9D4C7" w:sz="4"/>
+              <w:bottom w:val="single" w:color="D9D4C7" w:sz="4"/>
+              <w:right w:val="single" w:color="D9D4C7" w:sz="4"/>
+            </w:tcBorders>
+            <w:shd w:fill="F4F1EA" w:color="auto" w:val="clear"/>
+            <w:tcMar>
+              <w:top w:type="dxa" w:w="60"/>
+              <w:left w:type="dxa" w:w="100"/>
+              <w:bottom w:type="dxa" w:w="60"/>
+              <w:right w:type="dxa" w:w="100"/>
+            </w:tcMar>
+          </w:tcPr>
+          <w:p>
+            <w:pPr>
+              <w:spacing w:after="0"/>
+            </w:pPr>
+            <w:r>
+              <w:rPr>
+                <w:sz w:val="19"/>
+                <w:szCs w:val="19"/>
+              </w:rPr>
+              <w:t xml:space="preserve">11 · naplata</w:t>
+            </w:r>
+          </w:p>
+        </w:tc>
+        <w:tc>
+          <w:tcPr>
+            <w:tcW w:type="dxa" w:w="974"/>
+            <w:tcBorders>
+              <w:top w:val="single" w:color="D9D4C7" w:sz="4"/>
+              <w:left w:val="single" w:color="D9D4C7" w:sz="4"/>
+              <w:bottom w:val="single" w:color="D9D4C7" w:sz="4"/>
+              <w:right w:val="single" w:color="D9D4C7" w:sz="4"/>
+            </w:tcBorders>
+            <w:shd w:fill="F4F1EA" w:color="auto" w:val="clear"/>
+            <w:tcMar>
+              <w:top w:type="dxa" w:w="60"/>
+              <w:left w:type="dxa" w:w="100"/>
+              <w:bottom w:type="dxa" w:w="60"/>
+              <w:right w:type="dxa" w:w="100"/>
+            </w:tcMar>
+          </w:tcPr>
+          <w:p>
+            <w:pPr>
+              <w:spacing w:after="0"/>
+            </w:pPr>
+            <w:r>
+              <w:rPr>
+                <w:sz w:val="19"/>
+                <w:szCs w:val="19"/>
+              </w:rPr>
+              <w:t xml:space="preserve">✅ (UI u stavci 8)</w:t>
+            </w:r>
+          </w:p>
+        </w:tc>
+        <w:tc>
+          <w:tcPr>
+            <w:tcW w:type="dxa" w:w="1407"/>
+            <w:tcBorders>
+              <w:top w:val="single" w:color="D9D4C7" w:sz="4"/>
+              <w:left w:val="single" w:color="D9D4C7" w:sz="4"/>
+              <w:bottom w:val="single" w:color="D9D4C7" w:sz="4"/>
+              <w:right w:val="single" w:color="D9D4C7" w:sz="4"/>
+            </w:tcBorders>
+            <w:shd w:fill="F4F1EA" w:color="auto" w:val="clear"/>
+            <w:tcMar>
+              <w:top w:type="dxa" w:w="60"/>
+              <w:left w:type="dxa" w:w="100"/>
+              <w:bottom w:type="dxa" w:w="60"/>
+              <w:right w:type="dxa" w:w="100"/>
+            </w:tcMar>
+          </w:tcPr>
+          <w:p>
+            <w:pPr>
+              <w:spacing w:after="0"/>
+            </w:pPr>
+            <w:r>
+              <w:rPr>
+                <w:sz w:val="19"/>
+                <w:szCs w:val="19"/>
+              </w:rPr>
+              <w:t xml:space="preserve">testovi</w:t>
+            </w:r>
+          </w:p>
+        </w:tc>
+        <w:tc>
+          <w:tcPr>
+            <w:tcW w:type="dxa" w:w="4334"/>
+            <w:tcBorders>
+              <w:top w:val="single" w:color="D9D4C7" w:sz="4"/>
+              <w:left w:val="single" w:color="D9D4C7" w:sz="4"/>
+              <w:bottom w:val="single" w:color="D9D4C7" w:sz="4"/>
+              <w:right w:val="single" w:color="D9D4C7" w:sz="4"/>
+            </w:tcBorders>
+            <w:shd w:fill="F4F1EA" w:color="auto" w:val="clear"/>
+            <w:tcMar>
+              <w:top w:type="dxa" w:w="60"/>
+              <w:left w:type="dxa" w:w="100"/>
+              <w:bottom w:type="dxa" w:w="60"/>
+              <w:right w:type="dxa" w:w="100"/>
+            </w:tcMar>
+          </w:tcPr>
+          <w:p>
+            <w:pPr>
+              <w:spacing w:after="0"/>
+            </w:pPr>
+            <w:r>
+              <w:rPr>
+                <w:sz w:val="19"/>
+                <w:szCs w:val="19"/>
+              </w:rPr>
+              <w:t xml:space="preserve">po provajderu: prekid zaustavlja naplatu ili ne (nepoznato = najgori slučaj); za „ne“: max_tokens ≤ 1500, ulaz ≤ 60 000 znakova; budžet broji max_tokens kad prekinemo provajdera koji naplaćuje sve ili kad nema podatka o potrošnji; cijene Claude modela ažurirane, ostale upisuje operater (bez izmišljanja)</w:t>
+            </w:r>
+          </w:p>
+        </w:tc>
+      </w:tr>
     </w:tbl>
     <w:p>
       <w:pPr>
@@ -1475,7 +2113,7 @@
         <w:t xml:space="preserve">Sljedeće:</w:t>
       </w:r>
       <w:r>
-        <w:t xml:space="preserve"> Faza 2 — stavka 8 (početno podešavanje pri prvom otvaranju).</w:t>
+        <w:t xml:space="preserve"> stavka 8 (početno podešavanje; radi se posle 9–11 jer nudi ono što oni daju), pa 12–13.</w:t>
       </w:r>
     </w:p>
     <w:p>
@@ -1490,7 +2128,7 @@
         <w:t xml:space="preserve">Preostalo:</w:t>
       </w:r>
       <w:r>
-        <w:t xml:space="preserve"> oko 83–132 h.</w:t>
+        <w:t xml:space="preserve"> oko 75–122 h.</w:t>
       </w:r>
     </w:p>
     <w:p>

</xml_diff>

<commit_message>
Runda 3, stavka 12: prekidač za online AI (Ctrl+K)
Zatvara put prema cloud modelima u kapiji egress-a, prekida tokove u toku,
sklanja ključeve iz memorije (po izboru ih trajno briše), prelazi na GGUF
ili 'bez AI', preživljava restart, uključuje ga samo operater, samo-okidanje
na '→ ∞' broja/veličine/troška poziva sa linkovima za opoziv ključeva.
Paleta komandi prelazi na Ctrl+Shift+P.

Co-Authored-By: Claude Opus 5.5 <noreply@anthropic.com>
</commit_message>
<xml_diff>
--- a/PSE Riemann — PLAN.docx
+++ b/PSE Riemann — PLAN.docx
@@ -2095,6 +2095,361 @@
           </w:p>
         </w:tc>
       </w:tr>
+      <w:tr>
+        <w:trPr>
+          <w:tblHeader w:val="off"/>
+        </w:trPr>
+        <w:tc>
+          <w:tcPr>
+            <w:tcW w:type="dxa" w:w="1191"/>
+            <w:tcBorders>
+              <w:top w:val="single" w:color="D9D4C7" w:sz="4"/>
+              <w:left w:val="single" w:color="D9D4C7" w:sz="4"/>
+              <w:bottom w:val="single" w:color="D9D4C7" w:sz="4"/>
+              <w:right w:val="single" w:color="D9D4C7" w:sz="4"/>
+            </w:tcBorders>
+            <w:tcMar>
+              <w:top w:type="dxa" w:w="60"/>
+              <w:left w:type="dxa" w:w="100"/>
+              <w:bottom w:type="dxa" w:w="60"/>
+              <w:right w:type="dxa" w:w="100"/>
+            </w:tcMar>
+          </w:tcPr>
+          <w:p>
+            <w:pPr>
+              <w:spacing w:after="0"/>
+            </w:pPr>
+            <w:r>
+              <w:rPr>
+                <w:sz w:val="19"/>
+                <w:szCs w:val="19"/>
+              </w:rPr>
+              <w:t xml:space="preserve">2026-10-25</w:t>
+            </w:r>
+          </w:p>
+        </w:tc>
+        <w:tc>
+          <w:tcPr>
+            <w:tcW w:type="dxa" w:w="1732"/>
+            <w:tcBorders>
+              <w:top w:val="single" w:color="D9D4C7" w:sz="4"/>
+              <w:left w:val="single" w:color="D9D4C7" w:sz="4"/>
+              <w:bottom w:val="single" w:color="D9D4C7" w:sz="4"/>
+              <w:right w:val="single" w:color="D9D4C7" w:sz="4"/>
+            </w:tcBorders>
+            <w:tcMar>
+              <w:top w:type="dxa" w:w="60"/>
+              <w:left w:type="dxa" w:w="100"/>
+              <w:bottom w:type="dxa" w:w="60"/>
+              <w:right w:type="dxa" w:w="100"/>
+            </w:tcMar>
+          </w:tcPr>
+          <w:p>
+            <w:pPr>
+              <w:spacing w:after="0"/>
+            </w:pPr>
+            <w:r>
+              <w:rPr>
+                <w:sz w:val="19"/>
+                <w:szCs w:val="19"/>
+              </w:rPr>
+              <w:t xml:space="preserve">13 · lokalni model samo prema ovom računaru (P8)</w:t>
+            </w:r>
+          </w:p>
+        </w:tc>
+        <w:tc>
+          <w:tcPr>
+            <w:tcW w:type="dxa" w:w="974"/>
+            <w:tcBorders>
+              <w:top w:val="single" w:color="D9D4C7" w:sz="4"/>
+              <w:left w:val="single" w:color="D9D4C7" w:sz="4"/>
+              <w:bottom w:val="single" w:color="D9D4C7" w:sz="4"/>
+              <w:right w:val="single" w:color="D9D4C7" w:sz="4"/>
+            </w:tcBorders>
+            <w:tcMar>
+              <w:top w:type="dxa" w:w="60"/>
+              <w:left w:type="dxa" w:w="100"/>
+              <w:bottom w:type="dxa" w:w="60"/>
+              <w:right w:type="dxa" w:w="100"/>
+            </w:tcMar>
+          </w:tcPr>
+          <w:p>
+            <w:pPr>
+              <w:spacing w:after="0"/>
+            </w:pPr>
+            <w:r>
+              <w:rPr>
+                <w:sz w:val="19"/>
+                <w:szCs w:val="19"/>
+              </w:rPr>
+              <w:t xml:space="preserve">✅</w:t>
+            </w:r>
+          </w:p>
+        </w:tc>
+        <w:tc>
+          <w:tcPr>
+            <w:tcW w:type="dxa" w:w="1407"/>
+            <w:tcBorders>
+              <w:top w:val="single" w:color="D9D4C7" w:sz="4"/>
+              <w:left w:val="single" w:color="D9D4C7" w:sz="4"/>
+              <w:bottom w:val="single" w:color="D9D4C7" w:sz="4"/>
+              <w:right w:val="single" w:color="D9D4C7" w:sz="4"/>
+            </w:tcBorders>
+            <w:tcMar>
+              <w:top w:type="dxa" w:w="60"/>
+              <w:left w:type="dxa" w:w="100"/>
+              <w:bottom w:type="dxa" w:w="60"/>
+              <w:right w:type="dxa" w:w="100"/>
+            </w:tcMar>
+          </w:tcPr>
+          <w:p>
+            <w:pPr>
+              <w:spacing w:after="0"/>
+            </w:pPr>
+            <w:r>
+              <w:rPr>
+                <w:sz w:val="19"/>
+                <w:szCs w:val="19"/>
+              </w:rPr>
+              <w:t xml:space="preserve">testovi + živi DeepSeek (0 lažnih blokada)</w:t>
+            </w:r>
+          </w:p>
+        </w:tc>
+        <w:tc>
+          <w:tcPr>
+            <w:tcW w:type="dxa" w:w="4334"/>
+            <w:tcBorders>
+              <w:top w:val="single" w:color="D9D4C7" w:sz="4"/>
+              <w:left w:val="single" w:color="D9D4C7" w:sz="4"/>
+              <w:bottom w:val="single" w:color="D9D4C7" w:sz="4"/>
+              <w:right w:val="single" w:color="D9D4C7" w:sz="4"/>
+            </w:tcBorders>
+            <w:tcMar>
+              <w:top w:type="dxa" w:w="60"/>
+              <w:left w:type="dxa" w:w="100"/>
+              <w:bottom w:type="dxa" w:w="60"/>
+              <w:right w:type="dxa" w:w="100"/>
+            </w:tcMar>
+          </w:tcPr>
+          <w:p>
+            <w:pPr>
+              <w:spacing w:after="0"/>
+            </w:pPr>
+            <w:r>
+              <w:rPr>
+                <w:rFonts w:ascii="Consolas" w:cs="Consolas" w:eastAsia="Consolas" w:hAnsi="Consolas"/>
+                <w:color w:val="6B4A12"/>
+                <w:sz w:val="19"/>
+                <w:szCs w:val="19"/>
+              </w:rPr>
+              <w:t xml:space="preserve">llm/local_only.py</w:t>
+            </w:r>
+            <w:r>
+              <w:rPr>
+                <w:sz w:val="19"/>
+                <w:szCs w:val="19"/>
+              </w:rPr>
+              <w:t xml:space="preserve">: audit hook (socket.connect/getaddrinfo) za nit koja izvodi GGUF poziv; sve osim loopbacka odbijeno + prijetnja u dnevniku</w:t>
+            </w:r>
+          </w:p>
+        </w:tc>
+      </w:tr>
+      <w:tr>
+        <w:trPr>
+          <w:tblHeader w:val="off"/>
+        </w:trPr>
+        <w:tc>
+          <w:tcPr>
+            <w:tcW w:type="dxa" w:w="1191"/>
+            <w:tcBorders>
+              <w:top w:val="single" w:color="D9D4C7" w:sz="4"/>
+              <w:left w:val="single" w:color="D9D4C7" w:sz="4"/>
+              <w:bottom w:val="single" w:color="D9D4C7" w:sz="4"/>
+              <w:right w:val="single" w:color="D9D4C7" w:sz="4"/>
+            </w:tcBorders>
+            <w:shd w:fill="F4F1EA" w:color="auto" w:val="clear"/>
+            <w:tcMar>
+              <w:top w:type="dxa" w:w="60"/>
+              <w:left w:type="dxa" w:w="100"/>
+              <w:bottom w:type="dxa" w:w="60"/>
+              <w:right w:type="dxa" w:w="100"/>
+            </w:tcMar>
+          </w:tcPr>
+          <w:p>
+            <w:pPr>
+              <w:spacing w:after="0"/>
+            </w:pPr>
+            <w:r>
+              <w:rPr>
+                <w:sz w:val="19"/>
+                <w:szCs w:val="19"/>
+              </w:rPr>
+              <w:t xml:space="preserve">2026-10-25</w:t>
+            </w:r>
+          </w:p>
+        </w:tc>
+        <w:tc>
+          <w:tcPr>
+            <w:tcW w:type="dxa" w:w="1732"/>
+            <w:tcBorders>
+              <w:top w:val="single" w:color="D9D4C7" w:sz="4"/>
+              <w:left w:val="single" w:color="D9D4C7" w:sz="4"/>
+              <w:bottom w:val="single" w:color="D9D4C7" w:sz="4"/>
+              <w:right w:val="single" w:color="D9D4C7" w:sz="4"/>
+            </w:tcBorders>
+            <w:shd w:fill="F4F1EA" w:color="auto" w:val="clear"/>
+            <w:tcMar>
+              <w:top w:type="dxa" w:w="60"/>
+              <w:left w:type="dxa" w:w="100"/>
+              <w:bottom w:type="dxa" w:w="60"/>
+              <w:right w:type="dxa" w:w="100"/>
+            </w:tcMar>
+          </w:tcPr>
+          <w:p>
+            <w:pPr>
+              <w:spacing w:after="0"/>
+            </w:pPr>
+            <w:r>
+              <w:rPr>
+                <w:sz w:val="19"/>
+                <w:szCs w:val="19"/>
+              </w:rPr>
+              <w:t xml:space="preserve">12 · prekidač za online AI</w:t>
+            </w:r>
+          </w:p>
+        </w:tc>
+        <w:tc>
+          <w:tcPr>
+            <w:tcW w:type="dxa" w:w="974"/>
+            <w:tcBorders>
+              <w:top w:val="single" w:color="D9D4C7" w:sz="4"/>
+              <w:left w:val="single" w:color="D9D4C7" w:sz="4"/>
+              <w:bottom w:val="single" w:color="D9D4C7" w:sz="4"/>
+              <w:right w:val="single" w:color="D9D4C7" w:sz="4"/>
+            </w:tcBorders>
+            <w:shd w:fill="F4F1EA" w:color="auto" w:val="clear"/>
+            <w:tcMar>
+              <w:top w:type="dxa" w:w="60"/>
+              <w:left w:type="dxa" w:w="100"/>
+              <w:bottom w:type="dxa" w:w="60"/>
+              <w:right w:type="dxa" w:w="100"/>
+            </w:tcMar>
+          </w:tcPr>
+          <w:p>
+            <w:pPr>
+              <w:spacing w:after="0"/>
+            </w:pPr>
+            <w:r>
+              <w:rPr>
+                <w:sz w:val="19"/>
+                <w:szCs w:val="19"/>
+              </w:rPr>
+              <w:t xml:space="preserve">✅ (meni ikone u traci: stavka 19)</w:t>
+            </w:r>
+          </w:p>
+        </w:tc>
+        <w:tc>
+          <w:tcPr>
+            <w:tcW w:type="dxa" w:w="1407"/>
+            <w:tcBorders>
+              <w:top w:val="single" w:color="D9D4C7" w:sz="4"/>
+              <w:left w:val="single" w:color="D9D4C7" w:sz="4"/>
+              <w:bottom w:val="single" w:color="D9D4C7" w:sz="4"/>
+              <w:right w:val="single" w:color="D9D4C7" w:sz="4"/>
+            </w:tcBorders>
+            <w:shd w:fill="F4F1EA" w:color="auto" w:val="clear"/>
+            <w:tcMar>
+              <w:top w:type="dxa" w:w="60"/>
+              <w:left w:type="dxa" w:w="100"/>
+              <w:bottom w:type="dxa" w:w="60"/>
+              <w:right w:type="dxa" w:w="100"/>
+            </w:tcMar>
+          </w:tcPr>
+          <w:p>
+            <w:pPr>
+              <w:spacing w:after="0"/>
+            </w:pPr>
+            <w:r>
+              <w:rPr>
+                <w:sz w:val="19"/>
+                <w:szCs w:val="19"/>
+              </w:rPr>
+              <w:t xml:space="preserve">pytest 152/152</w:t>
+            </w:r>
+          </w:p>
+        </w:tc>
+        <w:tc>
+          <w:tcPr>
+            <w:tcW w:type="dxa" w:w="4334"/>
+            <w:tcBorders>
+              <w:top w:val="single" w:color="D9D4C7" w:sz="4"/>
+              <w:left w:val="single" w:color="D9D4C7" w:sz="4"/>
+              <w:bottom w:val="single" w:color="D9D4C7" w:sz="4"/>
+              <w:right w:val="single" w:color="D9D4C7" w:sz="4"/>
+            </w:tcBorders>
+            <w:shd w:fill="F4F1EA" w:color="auto" w:val="clear"/>
+            <w:tcMar>
+              <w:top w:type="dxa" w:w="60"/>
+              <w:left w:type="dxa" w:w="100"/>
+              <w:bottom w:type="dxa" w:w="60"/>
+              <w:right w:type="dxa" w:w="100"/>
+            </w:tcMar>
+          </w:tcPr>
+          <w:p>
+            <w:pPr>
+              <w:spacing w:after="0"/>
+            </w:pPr>
+            <w:r>
+              <w:rPr>
+                <w:rFonts w:ascii="Consolas" w:cs="Consolas" w:eastAsia="Consolas" w:hAnsi="Consolas"/>
+                <w:color w:val="6B4A12"/>
+                <w:sz w:val="19"/>
+                <w:szCs w:val="19"/>
+              </w:rPr>
+              <w:t xml:space="preserve">guardian/killswitch.py</w:t>
+            </w:r>
+            <w:r>
+              <w:rPr>
+                <w:sz w:val="19"/>
+                <w:szCs w:val="19"/>
+              </w:rPr>
+              <w:t xml:space="preserve">: zatvara put u egress-u (kapija), prekida tokove u toku, sklanja ključeve iz memorije (po izboru briše iz secrets.json), prelazi na GGUF ili „bez AI“, preživljava restart, uključuje samo operater; samo-okidanje na „→ ∞“ broja/veličine/troška poziva + stavka sa linkovima za opoziv ključeva. Dugme u gornjoj traci (crveno kad je isključeno) + </w:t>
+            </w:r>
+            <w:r>
+              <w:rPr>
+                <w:b/>
+                <w:bCs/>
+                <w:sz w:val="19"/>
+                <w:szCs w:val="19"/>
+              </w:rPr>
+              <w:t xml:space="preserve">Ctrl+K</w:t>
+            </w:r>
+            <w:r>
+              <w:rPr>
+                <w:sz w:val="19"/>
+                <w:szCs w:val="19"/>
+              </w:rPr>
+              <w:t xml:space="preserve">; paleta komandi prebačena na </w:t>
+            </w:r>
+            <w:r>
+              <w:rPr>
+                <w:b/>
+                <w:bCs/>
+                <w:sz w:val="19"/>
+                <w:szCs w:val="19"/>
+              </w:rPr>
+              <w:t xml:space="preserve">Ctrl+Shift+P</w:t>
+            </w:r>
+            <w:r>
+              <w:rPr>
+                <w:sz w:val="19"/>
+                <w:szCs w:val="19"/>
+              </w:rPr>
+              <w:t xml:space="preserve"> (vodiči ažurirani)</w:t>
+            </w:r>
+          </w:p>
+        </w:tc>
+      </w:tr>
     </w:tbl>
     <w:p>
       <w:pPr>
@@ -2113,7 +2468,7 @@
         <w:t xml:space="preserve">Sljedeće:</w:t>
       </w:r>
       <w:r>
-        <w:t xml:space="preserve"> stavka 8 (početno podešavanje; radi se posle 9–11 jer nudi ono što oni daju), pa 12–13.</w:t>
+        <w:t xml:space="preserve"> stavka 8 (početno podešavanje).</w:t>
       </w:r>
     </w:p>
     <w:p>
@@ -2128,7 +2483,7 @@
         <w:t xml:space="preserve">Preostalo:</w:t>
       </w:r>
       <w:r>
-        <w:t xml:space="preserve"> oko 75–122 h.</w:t>
+        <w:t xml:space="preserve"> oko 71–117 h.</w:t>
       </w:r>
     </w:p>
     <w:p>

</xml_diff>

<commit_message>
Runda 3, stavka 8: početno podešavanje pri prvom otvaranju
Operater (samo ime) · glavni AI (10 provajdera, vlastita adresa, GGUF sa
bilo kog mjesta, bez AI) · skeptik · deklaracije · čuvar pri prijavi.
Logika u setup_flow.py (testirana), prozor u gui/setup.py; kasnije iz
palete. Snimci u docs/screenshots/r3_setup_*.

Co-Authored-By: Claude Opus 5.5 <noreply@anthropic.com>
</commit_message>
<xml_diff>
--- a/PSE Riemann — PLAN.docx
+++ b/PSE Riemann — PLAN.docx
@@ -2450,6 +2450,190 @@
           </w:p>
         </w:tc>
       </w:tr>
+      <w:tr>
+        <w:trPr>
+          <w:tblHeader w:val="off"/>
+        </w:trPr>
+        <w:tc>
+          <w:tcPr>
+            <w:tcW w:type="dxa" w:w="1191"/>
+            <w:tcBorders>
+              <w:top w:val="single" w:color="D9D4C7" w:sz="4"/>
+              <w:left w:val="single" w:color="D9D4C7" w:sz="4"/>
+              <w:bottom w:val="single" w:color="D9D4C7" w:sz="4"/>
+              <w:right w:val="single" w:color="D9D4C7" w:sz="4"/>
+            </w:tcBorders>
+            <w:tcMar>
+              <w:top w:type="dxa" w:w="60"/>
+              <w:left w:type="dxa" w:w="100"/>
+              <w:bottom w:type="dxa" w:w="60"/>
+              <w:right w:type="dxa" w:w="100"/>
+            </w:tcMar>
+          </w:tcPr>
+          <w:p>
+            <w:pPr>
+              <w:spacing w:after="0"/>
+            </w:pPr>
+            <w:r>
+              <w:rPr>
+                <w:sz w:val="19"/>
+                <w:szCs w:val="19"/>
+              </w:rPr>
+              <w:t xml:space="preserve">2026-10-25</w:t>
+            </w:r>
+          </w:p>
+        </w:tc>
+        <w:tc>
+          <w:tcPr>
+            <w:tcW w:type="dxa" w:w="1732"/>
+            <w:tcBorders>
+              <w:top w:val="single" w:color="D9D4C7" w:sz="4"/>
+              <w:left w:val="single" w:color="D9D4C7" w:sz="4"/>
+              <w:bottom w:val="single" w:color="D9D4C7" w:sz="4"/>
+              <w:right w:val="single" w:color="D9D4C7" w:sz="4"/>
+            </w:tcBorders>
+            <w:tcMar>
+              <w:top w:type="dxa" w:w="60"/>
+              <w:left w:type="dxa" w:w="100"/>
+              <w:bottom w:type="dxa" w:w="60"/>
+              <w:right w:type="dxa" w:w="100"/>
+            </w:tcMar>
+          </w:tcPr>
+          <w:p>
+            <w:pPr>
+              <w:spacing w:after="0"/>
+            </w:pPr>
+            <w:r>
+              <w:rPr>
+                <w:sz w:val="19"/>
+                <w:szCs w:val="19"/>
+              </w:rPr>
+              <w:t xml:space="preserve">8 · početno podešavanje</w:t>
+            </w:r>
+          </w:p>
+        </w:tc>
+        <w:tc>
+          <w:tcPr>
+            <w:tcW w:type="dxa" w:w="974"/>
+            <w:tcBorders>
+              <w:top w:val="single" w:color="D9D4C7" w:sz="4"/>
+              <w:left w:val="single" w:color="D9D4C7" w:sz="4"/>
+              <w:bottom w:val="single" w:color="D9D4C7" w:sz="4"/>
+              <w:right w:val="single" w:color="D9D4C7" w:sz="4"/>
+            </w:tcBorders>
+            <w:tcMar>
+              <w:top w:type="dxa" w:w="60"/>
+              <w:left w:type="dxa" w:w="100"/>
+              <w:bottom w:type="dxa" w:w="60"/>
+              <w:right w:type="dxa" w:w="100"/>
+            </w:tcMar>
+          </w:tcPr>
+          <w:p>
+            <w:pPr>
+              <w:spacing w:after="0"/>
+            </w:pPr>
+            <w:r>
+              <w:rPr>
+                <w:sz w:val="19"/>
+                <w:szCs w:val="19"/>
+              </w:rPr>
+              <w:t xml:space="preserve">✅</w:t>
+            </w:r>
+          </w:p>
+        </w:tc>
+        <w:tc>
+          <w:tcPr>
+            <w:tcW w:type="dxa" w:w="1407"/>
+            <w:tcBorders>
+              <w:top w:val="single" w:color="D9D4C7" w:sz="4"/>
+              <w:left w:val="single" w:color="D9D4C7" w:sz="4"/>
+              <w:bottom w:val="single" w:color="D9D4C7" w:sz="4"/>
+              <w:right w:val="single" w:color="D9D4C7" w:sz="4"/>
+            </w:tcBorders>
+            <w:tcMar>
+              <w:top w:type="dxa" w:w="60"/>
+              <w:left w:type="dxa" w:w="100"/>
+              <w:bottom w:type="dxa" w:w="60"/>
+              <w:right w:type="dxa" w:w="100"/>
+            </w:tcMar>
+          </w:tcPr>
+          <w:p>
+            <w:pPr>
+              <w:spacing w:after="0"/>
+            </w:pPr>
+            <w:r>
+              <w:rPr>
+                <w:sz w:val="19"/>
+                <w:szCs w:val="19"/>
+              </w:rPr>
+              <w:t xml:space="preserve">pytest 157/157 (exit 0), snimci </w:t>
+            </w:r>
+            <w:r>
+              <w:rPr>
+                <w:rFonts w:ascii="Consolas" w:cs="Consolas" w:eastAsia="Consolas" w:hAnsi="Consolas"/>
+                <w:color w:val="6B4A12"/>
+                <w:sz w:val="19"/>
+                <w:szCs w:val="19"/>
+              </w:rPr>
+              <w:t xml:space="preserve">docs/screenshots/r3_setup_*</w:t>
+            </w:r>
+          </w:p>
+        </w:tc>
+        <w:tc>
+          <w:tcPr>
+            <w:tcW w:type="dxa" w:w="4334"/>
+            <w:tcBorders>
+              <w:top w:val="single" w:color="D9D4C7" w:sz="4"/>
+              <w:left w:val="single" w:color="D9D4C7" w:sz="4"/>
+              <w:bottom w:val="single" w:color="D9D4C7" w:sz="4"/>
+              <w:right w:val="single" w:color="D9D4C7" w:sz="4"/>
+            </w:tcBorders>
+            <w:tcMar>
+              <w:top w:type="dxa" w:w="60"/>
+              <w:left w:type="dxa" w:w="100"/>
+              <w:bottom w:type="dxa" w:w="60"/>
+              <w:right w:type="dxa" w:w="100"/>
+            </w:tcMar>
+          </w:tcPr>
+          <w:p>
+            <w:pPr>
+              <w:spacing w:after="0"/>
+            </w:pPr>
+            <w:r>
+              <w:rPr>
+                <w:rFonts w:ascii="Consolas" w:cs="Consolas" w:eastAsia="Consolas" w:hAnsi="Consolas"/>
+                <w:color w:val="6B4A12"/>
+                <w:sz w:val="19"/>
+                <w:szCs w:val="19"/>
+              </w:rPr>
+              <w:t xml:space="preserve">setup_flow.py</w:t>
+            </w:r>
+            <w:r>
+              <w:rPr>
+                <w:sz w:val="19"/>
+                <w:szCs w:val="19"/>
+              </w:rPr>
+              <w:t xml:space="preserve"> (logika, testirana) + </w:t>
+            </w:r>
+            <w:r>
+              <w:rPr>
+                <w:rFonts w:ascii="Consolas" w:cs="Consolas" w:eastAsia="Consolas" w:hAnsi="Consolas"/>
+                <w:color w:val="6B4A12"/>
+                <w:sz w:val="19"/>
+                <w:szCs w:val="19"/>
+              </w:rPr>
+              <w:t xml:space="preserve">gui/setup.py</w:t>
+            </w:r>
+            <w:r>
+              <w:rPr>
+                <w:sz w:val="19"/>
+                <w:szCs w:val="19"/>
+              </w:rPr>
+              <w:t xml:space="preserve"> (prozor): 1 ime operatera · 2 glavni AI (10 provajdera sa ✓/✗ i savjetom o naplati, „Učitaj prave modele“, „Testiraj“, vlastita adresa, GGUF sa bilo kog mjesta, „bez AI“ sa spiskom šta radi/ne radi) · 3 skeptik (drugi model ili bez) · 4 deklaracije (GGUF hash vs objavljeni, adresa = prijedlog koji potvrđuješ) · 5 čuvar pri prijavi + email; kasnije iz palete „Podešavanje“. Nađeno snimcima/testom: polja su se brisala pri prelasku između opcija (pad prozora) — popravljeno; lista odsječena — popravljeno</w:t>
+            </w:r>
+          </w:p>
+        </w:tc>
+      </w:tr>
     </w:tbl>
     <w:p>
       <w:pPr>
@@ -2468,7 +2652,7 @@
         <w:t xml:space="preserve">Sljedeće:</w:t>
       </w:r>
       <w:r>
-        <w:t xml:space="preserve"> stavka 8 (početno podešavanje).</w:t>
+        <w:t xml:space="preserve"> Faza 4 — stavka 14 (SSH čuvar).</w:t>
       </w:r>
     </w:p>
     <w:p>
@@ -2483,7 +2667,7 @@
         <w:t xml:space="preserve">Preostalo:</w:t>
       </w:r>
       <w:r>
-        <w:t xml:space="preserve"> oko 71–117 h.</w:t>
+        <w:t xml:space="preserve"> oko 66–111 h.</w:t>
       </w:r>
     </w:p>
     <w:p>

</xml_diff>

<commit_message>
Runda 3, stavke 14, 16–19: SSH čuvar, povratno zadržavanje, opasan alarm, šabloni, sudoers vodič
14: guardian/ssh — journal/auth.log bez root-a, otporno na rotaciju;
    tri ključa iz master §10.6 pod '→ ∞'; nivo 1/2; zapis u SHARED_LIB;
    theta mjerena; ravna → zamjena. Provjereno živo na ovom računaru.
16: blokada 24 h sa auto-skidanjem (preživi restart), prekid sesije, preko
    validiranog root pomoćnog programa; zaštićene adrese; nepovratno = prijedlog.
17: opasno upozorenje sa zvukom dok se ne potvrdi.
18: šablonske poruke za kritične stvari.
19: SUDOERS-SR/EN.

Co-Authored-By: Claude Opus 5.5 <noreply@anthropic.com>
</commit_message>
<xml_diff>
--- a/PSE Riemann — PLAN.docx
+++ b/PSE Riemann — PLAN.docx
@@ -40,7 +40,7 @@
           <w:sz w:val="20"/>
           <w:szCs w:val="20"/>
         </w:rPr>
-        <w:t xml:space="preserve">Stanje na dan 2026-10-25 · izvor: docs/PLAN.md i docs/WORKLOG.md (GitHub andrejristic/pse-riemann)</w:t>
+        <w:t xml:space="preserve">Stanje na dan 2026-10-26 · izvor: docs/PLAN.md i docs/WORKLOG.md (GitHub andrejristic/pse-riemann)</w:t>
       </w:r>
     </w:p>
     <w:p>
@@ -2652,7 +2652,7 @@
         <w:t xml:space="preserve">Sljedeće:</w:t>
       </w:r>
       <w:r>
-        <w:t xml:space="preserve"> Faza 4 — stavka 14 (SSH čuvar).</w:t>
+        <w:t xml:space="preserve"> stavka 20 (čuvar kao poseban proces sa ikonom u traci, dijalog pri zatvaranju, korisnički servis) + dugme „Provjeri prava čuvara“ u Guardian tabu.</w:t>
       </w:r>
     </w:p>
     <w:p>
@@ -2667,7 +2667,7 @@
         <w:t xml:space="preserve">Preostalo:</w:t>
       </w:r>
       <w:r>
-        <w:t xml:space="preserve"> oko 66–111 h.</w:t>
+        <w:t xml:space="preserve"> oko 58–100 h.</w:t>
       </w:r>
     </w:p>
     <w:p>

</xml_diff>

<commit_message>
Runda 3, stavka 20: čuvar kao poseban proces, ikona u traci, gašenje, autostart
--guardian (ikona u traci) / --headless (servis), jedna instanca, glavna
aplikacija ga drži upaljenim; dijalog pri zatvaranju; XDG autostart ili
systemd korisnički servis sa hardeningom; Guardian tab prikazuje SSH čuvara.

Co-Authored-By: Claude Opus 5.5 <noreply@anthropic.com>
</commit_message>
<xml_diff>
--- a/PSE Riemann — PLAN.docx
+++ b/PSE Riemann — PLAN.docx
@@ -2652,7 +2652,7 @@
         <w:t xml:space="preserve">Sljedeće:</w:t>
       </w:r>
       <w:r>
-        <w:t xml:space="preserve"> stavka 20 (čuvar kao poseban proces sa ikonom u traci, dijalog pri zatvaranju, korisnički servis) + dugme „Provjeri prava čuvara“ u Guardian tabu.</w:t>
+        <w:t xml:space="preserve"> Faza 5 — stavka 21 (statistički jača dijagnoza: CUSUM, posterior, 3-od-3).</w:t>
       </w:r>
     </w:p>
     <w:p>
@@ -2667,7 +2667,7 @@
         <w:t xml:space="preserve">Preostalo:</w:t>
       </w:r>
       <w:r>
-        <w:t xml:space="preserve"> oko 58–100 h.</w:t>
+        <w:t xml:space="preserve"> oko 55–97 h.</w:t>
       </w:r>
     </w:p>
     <w:p>

</xml_diff>

<commit_message>
Runda 3, stavka 21: dijagnoza 3-od-3 (posterior + CUSUM + tvrdi znak)
Manje lažnih zaraza: meki znaci sami nikad ne proglašavaju zarazu;
tvrdi (injekcija, pečat, ključ, tvrdnja o dokazu RH) i dalje odmah.

Co-Authored-By: Claude Opus 5.5 <noreply@anthropic.com>
</commit_message>
<xml_diff>
--- a/PSE Riemann — PLAN.docx
+++ b/PSE Riemann — PLAN.docx
@@ -2634,6 +2634,186 @@
           </w:p>
         </w:tc>
       </w:tr>
+      <w:tr>
+        <w:trPr>
+          <w:tblHeader w:val="off"/>
+        </w:trPr>
+        <w:tc>
+          <w:tcPr>
+            <w:tcW w:type="dxa" w:w="1191"/>
+            <w:tcBorders>
+              <w:top w:val="single" w:color="D9D4C7" w:sz="4"/>
+              <w:left w:val="single" w:color="D9D4C7" w:sz="4"/>
+              <w:bottom w:val="single" w:color="D9D4C7" w:sz="4"/>
+              <w:right w:val="single" w:color="D9D4C7" w:sz="4"/>
+            </w:tcBorders>
+            <w:shd w:fill="F4F1EA" w:color="auto" w:val="clear"/>
+            <w:tcMar>
+              <w:top w:type="dxa" w:w="60"/>
+              <w:left w:type="dxa" w:w="100"/>
+              <w:bottom w:type="dxa" w:w="60"/>
+              <w:right w:type="dxa" w:w="100"/>
+            </w:tcMar>
+          </w:tcPr>
+          <w:p>
+            <w:pPr>
+              <w:spacing w:after="0"/>
+            </w:pPr>
+            <w:r>
+              <w:rPr>
+                <w:sz w:val="19"/>
+                <w:szCs w:val="19"/>
+              </w:rPr>
+              <w:t xml:space="preserve">2026-10-25</w:t>
+            </w:r>
+          </w:p>
+        </w:tc>
+        <w:tc>
+          <w:tcPr>
+            <w:tcW w:type="dxa" w:w="1732"/>
+            <w:tcBorders>
+              <w:top w:val="single" w:color="D9D4C7" w:sz="4"/>
+              <w:left w:val="single" w:color="D9D4C7" w:sz="4"/>
+              <w:bottom w:val="single" w:color="D9D4C7" w:sz="4"/>
+              <w:right w:val="single" w:color="D9D4C7" w:sz="4"/>
+            </w:tcBorders>
+            <w:shd w:fill="F4F1EA" w:color="auto" w:val="clear"/>
+            <w:tcMar>
+              <w:top w:type="dxa" w:w="60"/>
+              <w:left w:type="dxa" w:w="100"/>
+              <w:bottom w:type="dxa" w:w="60"/>
+              <w:right w:type="dxa" w:w="100"/>
+            </w:tcMar>
+          </w:tcPr>
+          <w:p>
+            <w:pPr>
+              <w:spacing w:after="0"/>
+            </w:pPr>
+            <w:r>
+              <w:rPr>
+                <w:sz w:val="19"/>
+                <w:szCs w:val="19"/>
+              </w:rPr>
+              <w:t xml:space="preserve">21 · statistički jača dijagnoza (S5)</w:t>
+            </w:r>
+          </w:p>
+        </w:tc>
+        <w:tc>
+          <w:tcPr>
+            <w:tcW w:type="dxa" w:w="974"/>
+            <w:tcBorders>
+              <w:top w:val="single" w:color="D9D4C7" w:sz="4"/>
+              <w:left w:val="single" w:color="D9D4C7" w:sz="4"/>
+              <w:bottom w:val="single" w:color="D9D4C7" w:sz="4"/>
+              <w:right w:val="single" w:color="D9D4C7" w:sz="4"/>
+            </w:tcBorders>
+            <w:shd w:fill="F4F1EA" w:color="auto" w:val="clear"/>
+            <w:tcMar>
+              <w:top w:type="dxa" w:w="60"/>
+              <w:left w:type="dxa" w:w="100"/>
+              <w:bottom w:type="dxa" w:w="60"/>
+              <w:right w:type="dxa" w:w="100"/>
+            </w:tcMar>
+          </w:tcPr>
+          <w:p>
+            <w:pPr>
+              <w:spacing w:after="0"/>
+            </w:pPr>
+            <w:r>
+              <w:rPr>
+                <w:sz w:val="19"/>
+                <w:szCs w:val="19"/>
+              </w:rPr>
+              <w:t xml:space="preserve">✅</w:t>
+            </w:r>
+          </w:p>
+        </w:tc>
+        <w:tc>
+          <w:tcPr>
+            <w:tcW w:type="dxa" w:w="1407"/>
+            <w:tcBorders>
+              <w:top w:val="single" w:color="D9D4C7" w:sz="4"/>
+              <w:left w:val="single" w:color="D9D4C7" w:sz="4"/>
+              <w:bottom w:val="single" w:color="D9D4C7" w:sz="4"/>
+              <w:right w:val="single" w:color="D9D4C7" w:sz="4"/>
+            </w:tcBorders>
+            <w:shd w:fill="F4F1EA" w:color="auto" w:val="clear"/>
+            <w:tcMar>
+              <w:top w:type="dxa" w:w="60"/>
+              <w:left w:type="dxa" w:w="100"/>
+              <w:bottom w:type="dxa" w:w="60"/>
+              <w:right w:type="dxa" w:w="100"/>
+            </w:tcMar>
+          </w:tcPr>
+          <w:p>
+            <w:pPr>
+              <w:spacing w:after="0"/>
+            </w:pPr>
+            <w:r>
+              <w:rPr>
+                <w:sz w:val="19"/>
+                <w:szCs w:val="19"/>
+              </w:rPr>
+              <w:t xml:space="preserve">pytest 194/194</w:t>
+            </w:r>
+          </w:p>
+        </w:tc>
+        <w:tc>
+          <w:tcPr>
+            <w:tcW w:type="dxa" w:w="4334"/>
+            <w:tcBorders>
+              <w:top w:val="single" w:color="D9D4C7" w:sz="4"/>
+              <w:left w:val="single" w:color="D9D4C7" w:sz="4"/>
+              <w:bottom w:val="single" w:color="D9D4C7" w:sz="4"/>
+              <w:right w:val="single" w:color="D9D4C7" w:sz="4"/>
+            </w:tcBorders>
+            <w:shd w:fill="F4F1EA" w:color="auto" w:val="clear"/>
+            <w:tcMar>
+              <w:top w:type="dxa" w:w="60"/>
+              <w:left w:type="dxa" w:w="100"/>
+              <w:bottom w:type="dxa" w:w="60"/>
+              <w:right w:type="dxa" w:w="100"/>
+            </w:tcMar>
+          </w:tcPr>
+          <w:p>
+            <w:pPr>
+              <w:spacing w:after="0"/>
+            </w:pPr>
+            <w:r>
+              <w:rPr>
+                <w:rFonts w:ascii="Consolas" w:cs="Consolas" w:eastAsia="Consolas" w:hAnsi="Consolas"/>
+                <w:color w:val="6B4A12"/>
+                <w:sz w:val="19"/>
+                <w:szCs w:val="19"/>
+              </w:rPr>
+              <w:t xml:space="preserve">guardian/diagnosis.py</w:t>
+            </w:r>
+            <w:r>
+              <w:rPr>
+                <w:sz w:val="19"/>
+                <w:szCs w:val="19"/>
+              </w:rPr>
+              <w:t xml:space="preserve">: posterior nad oblicima H/N/B/C/S (+ zaboravljanje), CUSUM, potvrda tvrdim znakom; zaraza = 3-od-3 → Fizičar; posterior+CUSUM bez potvrde = povratno zadržavanje (</w:t>
+            </w:r>
+            <w:r>
+              <w:rPr>
+                <w:rFonts w:ascii="Consolas" w:cs="Consolas" w:eastAsia="Consolas" w:hAnsi="Consolas"/>
+                <w:color w:val="6B4A12"/>
+                <w:sz w:val="19"/>
+                <w:szCs w:val="19"/>
+              </w:rPr>
+              <w:t xml:space="preserve">Healer.hold</w:t>
+            </w:r>
+            <w:r>
+              <w:rPr>
+                <w:sz w:val="19"/>
+                <w:szCs w:val="19"/>
+              </w:rPr>
+              <w:t xml:space="preserve">); inače samo zapis. Svaki izlaz se posmatra (i čisti). Test: zdrav model sa povremenim „broj bez izvora“ u 60 izlaza → 0 zaraza (ranije: svaki takav izlaz = zaraza); injekcija/izmijenjen pečat/procureo ključ/tvrdnja o dokazu RH → zaraza odmah</w:t>
+            </w:r>
+          </w:p>
+        </w:tc>
+      </w:tr>
     </w:tbl>
     <w:p>
       <w:pPr>
@@ -2652,7 +2832,7 @@
         <w:t xml:space="preserve">Sljedeće:</w:t>
       </w:r>
       <w:r>
-        <w:t xml:space="preserve"> Faza 5 — stavka 21 (statistički jača dijagnoza: CUSUM, posterior, 3-od-3).</w:t>
+        <w:t xml:space="preserve"> stavka 22 (budžeti otkrivanja + takmičenje hipoteza, P7).</w:t>
       </w:r>
     </w:p>
     <w:p>
@@ -2667,7 +2847,7 @@
         <w:t xml:space="preserve">Preostalo:</w:t>
       </w:r>
       <w:r>
-        <w:t xml:space="preserve"> oko 55–97 h.</w:t>
+        <w:t xml:space="preserve"> oko 52–93 h.</w:t>
       </w:r>
     </w:p>
     <w:p>

</xml_diff>

<commit_message>
Runda 3, stavka 22: budžeti otkrivanja i takmičenje hipoteza (P7)
Mjerenje zaštićenog sadržaja prije svakog cloud poziva (ključevi i
privatno 0, licencirani tekst radova 2000 znakova/dan/odredište).
Dijagnoza drži sve hipoteze; liječenje vezano za oblik čeka odluku.

Co-Authored-By: Claude Opus 5.5 <noreply@anthropic.com>
</commit_message>
<xml_diff>
--- a/PSE Riemann — PLAN.docx
+++ b/PSE Riemann — PLAN.docx
@@ -2814,6 +2814,165 @@
           </w:p>
         </w:tc>
       </w:tr>
+      <w:tr>
+        <w:trPr>
+          <w:tblHeader w:val="off"/>
+        </w:trPr>
+        <w:tc>
+          <w:tcPr>
+            <w:tcW w:type="dxa" w:w="1191"/>
+            <w:tcBorders>
+              <w:top w:val="single" w:color="D9D4C7" w:sz="4"/>
+              <w:left w:val="single" w:color="D9D4C7" w:sz="4"/>
+              <w:bottom w:val="single" w:color="D9D4C7" w:sz="4"/>
+              <w:right w:val="single" w:color="D9D4C7" w:sz="4"/>
+            </w:tcBorders>
+            <w:tcMar>
+              <w:top w:type="dxa" w:w="60"/>
+              <w:left w:type="dxa" w:w="100"/>
+              <w:bottom w:type="dxa" w:w="60"/>
+              <w:right w:type="dxa" w:w="100"/>
+            </w:tcMar>
+          </w:tcPr>
+          <w:p>
+            <w:pPr>
+              <w:spacing w:after="0"/>
+            </w:pPr>
+            <w:r>
+              <w:rPr>
+                <w:sz w:val="19"/>
+                <w:szCs w:val="19"/>
+              </w:rPr>
+              <w:t xml:space="preserve">2026-10-25</w:t>
+            </w:r>
+          </w:p>
+        </w:tc>
+        <w:tc>
+          <w:tcPr>
+            <w:tcW w:type="dxa" w:w="1732"/>
+            <w:tcBorders>
+              <w:top w:val="single" w:color="D9D4C7" w:sz="4"/>
+              <w:left w:val="single" w:color="D9D4C7" w:sz="4"/>
+              <w:bottom w:val="single" w:color="D9D4C7" w:sz="4"/>
+              <w:right w:val="single" w:color="D9D4C7" w:sz="4"/>
+            </w:tcBorders>
+            <w:tcMar>
+              <w:top w:type="dxa" w:w="60"/>
+              <w:left w:type="dxa" w:w="100"/>
+              <w:bottom w:type="dxa" w:w="60"/>
+              <w:right w:type="dxa" w:w="100"/>
+            </w:tcMar>
+          </w:tcPr>
+          <w:p>
+            <w:pPr>
+              <w:spacing w:after="0"/>
+            </w:pPr>
+            <w:r>
+              <w:rPr>
+                <w:sz w:val="19"/>
+                <w:szCs w:val="19"/>
+              </w:rPr>
+              <w:t xml:space="preserve">22 · budžeti otkrivanja + takmičenje hipoteza (P7)</w:t>
+            </w:r>
+          </w:p>
+        </w:tc>
+        <w:tc>
+          <w:tcPr>
+            <w:tcW w:type="dxa" w:w="974"/>
+            <w:tcBorders>
+              <w:top w:val="single" w:color="D9D4C7" w:sz="4"/>
+              <w:left w:val="single" w:color="D9D4C7" w:sz="4"/>
+              <w:bottom w:val="single" w:color="D9D4C7" w:sz="4"/>
+              <w:right w:val="single" w:color="D9D4C7" w:sz="4"/>
+            </w:tcBorders>
+            <w:tcMar>
+              <w:top w:type="dxa" w:w="60"/>
+              <w:left w:type="dxa" w:w="100"/>
+              <w:bottom w:type="dxa" w:w="60"/>
+              <w:right w:type="dxa" w:w="100"/>
+            </w:tcMar>
+          </w:tcPr>
+          <w:p>
+            <w:pPr>
+              <w:spacing w:after="0"/>
+            </w:pPr>
+            <w:r>
+              <w:rPr>
+                <w:sz w:val="19"/>
+                <w:szCs w:val="19"/>
+              </w:rPr>
+              <w:t xml:space="preserve">✅</w:t>
+            </w:r>
+          </w:p>
+        </w:tc>
+        <w:tc>
+          <w:tcPr>
+            <w:tcW w:type="dxa" w:w="1407"/>
+            <w:tcBorders>
+              <w:top w:val="single" w:color="D9D4C7" w:sz="4"/>
+              <w:left w:val="single" w:color="D9D4C7" w:sz="4"/>
+              <w:bottom w:val="single" w:color="D9D4C7" w:sz="4"/>
+              <w:right w:val="single" w:color="D9D4C7" w:sz="4"/>
+            </w:tcBorders>
+            <w:tcMar>
+              <w:top w:type="dxa" w:w="60"/>
+              <w:left w:type="dxa" w:w="100"/>
+              <w:bottom w:type="dxa" w:w="60"/>
+              <w:right w:type="dxa" w:w="100"/>
+            </w:tcMar>
+          </w:tcPr>
+          <w:p>
+            <w:pPr>
+              <w:spacing w:after="0"/>
+            </w:pPr>
+            <w:r>
+              <w:rPr>
+                <w:sz w:val="19"/>
+                <w:szCs w:val="19"/>
+              </w:rPr>
+              <w:t xml:space="preserve">pytest 198/198</w:t>
+            </w:r>
+          </w:p>
+        </w:tc>
+        <w:tc>
+          <w:tcPr>
+            <w:tcW w:type="dxa" w:w="4334"/>
+            <w:tcBorders>
+              <w:top w:val="single" w:color="D9D4C7" w:sz="4"/>
+              <w:left w:val="single" w:color="D9D4C7" w:sz="4"/>
+              <w:bottom w:val="single" w:color="D9D4C7" w:sz="4"/>
+              <w:right w:val="single" w:color="D9D4C7" w:sz="4"/>
+            </w:tcBorders>
+            <w:tcMar>
+              <w:top w:type="dxa" w:w="60"/>
+              <w:left w:type="dxa" w:w="100"/>
+              <w:bottom w:type="dxa" w:w="60"/>
+              <w:right w:type="dxa" w:w="100"/>
+            </w:tcMar>
+          </w:tcPr>
+          <w:p>
+            <w:pPr>
+              <w:spacing w:after="0"/>
+            </w:pPr>
+            <w:r>
+              <w:rPr>
+                <w:rFonts w:ascii="Consolas" w:cs="Consolas" w:eastAsia="Consolas" w:hAnsi="Consolas"/>
+                <w:color w:val="6B4A12"/>
+                <w:sz w:val="19"/>
+                <w:szCs w:val="19"/>
+              </w:rPr>
+              <w:t xml:space="preserve">guardian/disclosure.py</w:t>
+            </w:r>
+            <w:r>
+              <w:rPr>
+                <w:sz w:val="19"/>
+                <w:szCs w:val="19"/>
+              </w:rPr>
+              <w:t xml:space="preserve">: svaki zahtjev prema cloud modelu se mjeri PRIJE slanja — ključevi i privatno (privatni IP, MAC, /home putanje, ime računara) budžet 0; tekst lokalnih licenciranih radova (papers-local, 115 425 odlomaka po 8 riječi) 2 000 znakova dnevno po odredištu; prekoračenje = ništa ne izlazi + prijetnja u dnevniku. Sistemski promptovi i naš REPORT ne okidaju ništa (provjereno). Dijagnoza drži sve 4 hipoteze; liječenje vezano za jedan oblik (ponovni prijem modela = N) čeka dok vodeća hipoteza nije ≥ 2× druga. Nalaz mehanizma ponovljivih odluka: plan liječenja je zavisio od neupisanog „odlučeno“ → upisano u ulaz, odlučivač v2</w:t>
+            </w:r>
+          </w:p>
+        </w:tc>
+      </w:tr>
     </w:tbl>
     <w:p>
       <w:pPr>
@@ -2832,7 +2991,7 @@
         <w:t xml:space="preserve">Sljedeće:</w:t>
       </w:r>
       <w:r>
-        <w:t xml:space="preserve"> stavka 22 (budžeti otkrivanja + takmičenje hipoteza, P7).</w:t>
+        <w:t xml:space="preserve"> stavka 23 (mjereni benchmark: tri zla, SSH napadi, prekidač).</w:t>
       </w:r>
     </w:p>
     <w:p>
@@ -2847,7 +3006,7 @@
         <w:t xml:space="preserve">Preostalo:</w:t>
       </w:r>
       <w:r>
-        <w:t xml:space="preserve"> oko 52–93 h.</w:t>
+        <w:t xml:space="preserve"> oko 49–89 h.</w:t>
       </w:r>
     </w:p>
     <w:p>

</xml_diff>

<commit_message>
Runda 3, stavka 23: mjereni benchmark (S7) i popravke koje je našao
Sintetički označen korpus kroz iste puteve odlučivanja; prvo mjerenje
našlo 4 slabosti (curenje u chatu, tvrdnja o dokazu u prvom licu, SSH
klaster, klizna suma prekidača) — popravljeno, test čuva brojke.
docs/BENCHMARK.md sa prvim i zadnjim mjerenjem i ograničenjem korpusa.

Co-Authored-By: Claude Opus 5.5 <noreply@anthropic.com>
</commit_message>
<xml_diff>
--- a/PSE Riemann — PLAN.docx
+++ b/PSE Riemann — PLAN.docx
@@ -2973,6 +2973,227 @@
           </w:p>
         </w:tc>
       </w:tr>
+      <w:tr>
+        <w:trPr>
+          <w:tblHeader w:val="off"/>
+        </w:trPr>
+        <w:tc>
+          <w:tcPr>
+            <w:tcW w:type="dxa" w:w="1191"/>
+            <w:tcBorders>
+              <w:top w:val="single" w:color="D9D4C7" w:sz="4"/>
+              <w:left w:val="single" w:color="D9D4C7" w:sz="4"/>
+              <w:bottom w:val="single" w:color="D9D4C7" w:sz="4"/>
+              <w:right w:val="single" w:color="D9D4C7" w:sz="4"/>
+            </w:tcBorders>
+            <w:shd w:fill="F4F1EA" w:color="auto" w:val="clear"/>
+            <w:tcMar>
+              <w:top w:type="dxa" w:w="60"/>
+              <w:left w:type="dxa" w:w="100"/>
+              <w:bottom w:type="dxa" w:w="60"/>
+              <w:right w:type="dxa" w:w="100"/>
+            </w:tcMar>
+          </w:tcPr>
+          <w:p>
+            <w:pPr>
+              <w:spacing w:after="0"/>
+            </w:pPr>
+            <w:r>
+              <w:rPr>
+                <w:sz w:val="19"/>
+                <w:szCs w:val="19"/>
+              </w:rPr>
+              <w:t xml:space="preserve">2026-10-25</w:t>
+            </w:r>
+          </w:p>
+        </w:tc>
+        <w:tc>
+          <w:tcPr>
+            <w:tcW w:type="dxa" w:w="1732"/>
+            <w:tcBorders>
+              <w:top w:val="single" w:color="D9D4C7" w:sz="4"/>
+              <w:left w:val="single" w:color="D9D4C7" w:sz="4"/>
+              <w:bottom w:val="single" w:color="D9D4C7" w:sz="4"/>
+              <w:right w:val="single" w:color="D9D4C7" w:sz="4"/>
+            </w:tcBorders>
+            <w:shd w:fill="F4F1EA" w:color="auto" w:val="clear"/>
+            <w:tcMar>
+              <w:top w:type="dxa" w:w="60"/>
+              <w:left w:type="dxa" w:w="100"/>
+              <w:bottom w:type="dxa" w:w="60"/>
+              <w:right w:type="dxa" w:w="100"/>
+            </w:tcMar>
+          </w:tcPr>
+          <w:p>
+            <w:pPr>
+              <w:spacing w:after="0"/>
+            </w:pPr>
+            <w:r>
+              <w:rPr>
+                <w:sz w:val="19"/>
+                <w:szCs w:val="19"/>
+              </w:rPr>
+              <w:t xml:space="preserve">23 · mjereni benchmark (S7)</w:t>
+            </w:r>
+          </w:p>
+        </w:tc>
+        <w:tc>
+          <w:tcPr>
+            <w:tcW w:type="dxa" w:w="974"/>
+            <w:tcBorders>
+              <w:top w:val="single" w:color="D9D4C7" w:sz="4"/>
+              <w:left w:val="single" w:color="D9D4C7" w:sz="4"/>
+              <w:bottom w:val="single" w:color="D9D4C7" w:sz="4"/>
+              <w:right w:val="single" w:color="D9D4C7" w:sz="4"/>
+            </w:tcBorders>
+            <w:shd w:fill="F4F1EA" w:color="auto" w:val="clear"/>
+            <w:tcMar>
+              <w:top w:type="dxa" w:w="60"/>
+              <w:left w:type="dxa" w:w="100"/>
+              <w:bottom w:type="dxa" w:w="60"/>
+              <w:right w:type="dxa" w:w="100"/>
+            </w:tcMar>
+          </w:tcPr>
+          <w:p>
+            <w:pPr>
+              <w:spacing w:after="0"/>
+            </w:pPr>
+            <w:r>
+              <w:rPr>
+                <w:sz w:val="19"/>
+                <w:szCs w:val="19"/>
+              </w:rPr>
+              <w:t xml:space="preserve">✅</w:t>
+            </w:r>
+          </w:p>
+        </w:tc>
+        <w:tc>
+          <w:tcPr>
+            <w:tcW w:type="dxa" w:w="1407"/>
+            <w:tcBorders>
+              <w:top w:val="single" w:color="D9D4C7" w:sz="4"/>
+              <w:left w:val="single" w:color="D9D4C7" w:sz="4"/>
+              <w:bottom w:val="single" w:color="D9D4C7" w:sz="4"/>
+              <w:right w:val="single" w:color="D9D4C7" w:sz="4"/>
+            </w:tcBorders>
+            <w:shd w:fill="F4F1EA" w:color="auto" w:val="clear"/>
+            <w:tcMar>
+              <w:top w:type="dxa" w:w="60"/>
+              <w:left w:type="dxa" w:w="100"/>
+              <w:bottom w:type="dxa" w:w="60"/>
+              <w:right w:type="dxa" w:w="100"/>
+            </w:tcMar>
+          </w:tcPr>
+          <w:p>
+            <w:pPr>
+              <w:spacing w:after="0"/>
+            </w:pPr>
+            <w:r>
+              <w:rPr>
+                <w:sz w:val="19"/>
+                <w:szCs w:val="19"/>
+              </w:rPr>
+              <w:t xml:space="preserve">pytest 199/199</w:t>
+            </w:r>
+          </w:p>
+        </w:tc>
+        <w:tc>
+          <w:tcPr>
+            <w:tcW w:type="dxa" w:w="4334"/>
+            <w:tcBorders>
+              <w:top w:val="single" w:color="D9D4C7" w:sz="4"/>
+              <w:left w:val="single" w:color="D9D4C7" w:sz="4"/>
+              <w:bottom w:val="single" w:color="D9D4C7" w:sz="4"/>
+              <w:right w:val="single" w:color="D9D4C7" w:sz="4"/>
+            </w:tcBorders>
+            <w:shd w:fill="F4F1EA" w:color="auto" w:val="clear"/>
+            <w:tcMar>
+              <w:top w:type="dxa" w:w="60"/>
+              <w:left w:type="dxa" w:w="100"/>
+              <w:bottom w:type="dxa" w:w="60"/>
+              <w:right w:type="dxa" w:w="100"/>
+            </w:tcMar>
+          </w:tcPr>
+          <w:p>
+            <w:pPr>
+              <w:spacing w:after="0"/>
+            </w:pPr>
+            <w:r>
+              <w:rPr>
+                <w:rFonts w:ascii="Consolas" w:cs="Consolas" w:eastAsia="Consolas" w:hAnsi="Consolas"/>
+                <w:color w:val="6B4A12"/>
+                <w:sz w:val="19"/>
+                <w:szCs w:val="19"/>
+              </w:rPr>
+              <w:t xml:space="preserve">pse_r/bench.py</w:t>
+            </w:r>
+            <w:r>
+              <w:rPr>
+                <w:sz w:val="19"/>
+                <w:szCs w:val="19"/>
+              </w:rPr>
+              <w:t xml:space="preserve"> + </w:t>
+            </w:r>
+            <w:r>
+              <w:rPr>
+                <w:rFonts w:ascii="Consolas" w:cs="Consolas" w:eastAsia="Consolas" w:hAnsi="Consolas"/>
+                <w:color w:val="6B4A12"/>
+                <w:sz w:val="19"/>
+                <w:szCs w:val="19"/>
+              </w:rPr>
+              <w:t xml:space="preserve">app/bench/corpus.json</w:t>
+            </w:r>
+            <w:r>
+              <w:rPr>
+                <w:sz w:val="19"/>
+                <w:szCs w:val="19"/>
+              </w:rPr>
+              <w:t xml:space="preserve"> (sintetički, označeno), </w:t>
+            </w:r>
+            <w:r>
+              <w:rPr>
+                <w:rFonts w:ascii="Consolas" w:cs="Consolas" w:eastAsia="Consolas" w:hAnsi="Consolas"/>
+                <w:color w:val="6B4A12"/>
+                <w:sz w:val="19"/>
+                <w:szCs w:val="19"/>
+              </w:rPr>
+              <w:t xml:space="preserve">pse-riemann --bench [--report]</w:t>
+            </w:r>
+            <w:r>
+              <w:rPr>
+                <w:sz w:val="19"/>
+                <w:szCs w:val="19"/>
+              </w:rPr>
+              <w:t xml:space="preserve"> uvijek u privremenom vaultu, Guardian → „Benchmark → izvještaj“. </w:t>
+            </w:r>
+            <w:r>
+              <w:rPr>
+                <w:b/>
+                <w:bCs/>
+                <w:sz w:val="19"/>
+                <w:szCs w:val="19"/>
+              </w:rPr>
+              <w:t xml:space="preserve">Prvo mjerenje našlo 4 prave slabosti</w:t>
+            </w:r>
+            <w:r>
+              <w:rPr>
+                <w:sz w:val="19"/>
+                <w:szCs w:val="19"/>
+              </w:rPr>
+              <w:t xml:space="preserve"> (curenje u chatu nevidljivo; tvrdnja o dokazu u prvom licu; SSH napad sa jednog IP-a nikad blokiran jer je „klaster“ bio korisničko ime; lažna uzbuna prekidača na kliznoj sumi) → popravljeno → 0 FP / 0 FN na korpusu. Iskreno: korpus je moj i na njemu sam podešavao — nula ovdje ≠ nula u stvarnosti. Detalji: </w:t>
+            </w:r>
+            <w:r>
+              <w:rPr>
+                <w:rFonts w:ascii="Consolas" w:cs="Consolas" w:eastAsia="Consolas" w:hAnsi="Consolas"/>
+                <w:color w:val="6B4A12"/>
+                <w:sz w:val="19"/>
+                <w:szCs w:val="19"/>
+              </w:rPr>
+              <w:t xml:space="preserve">docs/BENCHMARK.md</w:t>
+            </w:r>
+          </w:p>
+        </w:tc>
+      </w:tr>
     </w:tbl>
     <w:p>
       <w:pPr>
@@ -2991,7 +3212,7 @@
         <w:t xml:space="preserve">Sljedeće:</w:t>
       </w:r>
       <w:r>
-        <w:t xml:space="preserve"> stavka 23 (mjereni benchmark: tri zla, SSH napadi, prekidač).</w:t>
+        <w:t xml:space="preserve"> Faza 6 — stavka 24 (SR/EN prekidač za cijeli interfejs).</w:t>
       </w:r>
     </w:p>
     <w:p>
@@ -3006,7 +3227,7 @@
         <w:t xml:space="preserve">Preostalo:</w:t>
       </w:r>
       <w:r>
-        <w:t xml:space="preserve"> oko 49–89 h.</w:t>
+        <w:t xml:space="preserve"> oko 46–85 h.</w:t>
       </w:r>
     </w:p>
     <w:p>

</xml_diff>

<commit_message>
Runda 3, stavka 24: SR/EN prekidač za cijeli interfejs
tr() + engleski rječnik (~470 tekstova), prekidač u gornjoj traci,
engleski kritični šabloni, selftest provjerava potpunost prevoda.
Docx generator: izuzeti | u ćelijama tabela.

Co-Authored-By: Claude Opus 5.5 <noreply@anthropic.com>
</commit_message>
<xml_diff>
--- a/PSE Riemann — PLAN.docx
+++ b/PSE Riemann — PLAN.docx
@@ -3194,6 +3194,238 @@
           </w:p>
         </w:tc>
       </w:tr>
+      <w:tr>
+        <w:trPr>
+          <w:tblHeader w:val="off"/>
+        </w:trPr>
+        <w:tc>
+          <w:tcPr>
+            <w:tcW w:type="dxa" w:w="1191"/>
+            <w:tcBorders>
+              <w:top w:val="single" w:color="D9D4C7" w:sz="4"/>
+              <w:left w:val="single" w:color="D9D4C7" w:sz="4"/>
+              <w:bottom w:val="single" w:color="D9D4C7" w:sz="4"/>
+              <w:right w:val="single" w:color="D9D4C7" w:sz="4"/>
+            </w:tcBorders>
+            <w:tcMar>
+              <w:top w:type="dxa" w:w="60"/>
+              <w:left w:type="dxa" w:w="100"/>
+              <w:bottom w:type="dxa" w:w="60"/>
+              <w:right w:type="dxa" w:w="100"/>
+            </w:tcMar>
+          </w:tcPr>
+          <w:p>
+            <w:pPr>
+              <w:spacing w:after="0"/>
+            </w:pPr>
+            <w:r>
+              <w:rPr>
+                <w:sz w:val="19"/>
+                <w:szCs w:val="19"/>
+              </w:rPr>
+              <w:t xml:space="preserve">2026-10-25</w:t>
+            </w:r>
+          </w:p>
+        </w:tc>
+        <w:tc>
+          <w:tcPr>
+            <w:tcW w:type="dxa" w:w="1732"/>
+            <w:tcBorders>
+              <w:top w:val="single" w:color="D9D4C7" w:sz="4"/>
+              <w:left w:val="single" w:color="D9D4C7" w:sz="4"/>
+              <w:bottom w:val="single" w:color="D9D4C7" w:sz="4"/>
+              <w:right w:val="single" w:color="D9D4C7" w:sz="4"/>
+            </w:tcBorders>
+            <w:tcMar>
+              <w:top w:type="dxa" w:w="60"/>
+              <w:left w:type="dxa" w:w="100"/>
+              <w:bottom w:type="dxa" w:w="60"/>
+              <w:right w:type="dxa" w:w="100"/>
+            </w:tcMar>
+          </w:tcPr>
+          <w:p>
+            <w:pPr>
+              <w:spacing w:after="0"/>
+            </w:pPr>
+            <w:r>
+              <w:rPr>
+                <w:sz w:val="19"/>
+                <w:szCs w:val="19"/>
+              </w:rPr>
+              <w:t xml:space="preserve">24 · SR/EN za cijeli interfejs</w:t>
+            </w:r>
+          </w:p>
+        </w:tc>
+        <w:tc>
+          <w:tcPr>
+            <w:tcW w:type="dxa" w:w="974"/>
+            <w:tcBorders>
+              <w:top w:val="single" w:color="D9D4C7" w:sz="4"/>
+              <w:left w:val="single" w:color="D9D4C7" w:sz="4"/>
+              <w:bottom w:val="single" w:color="D9D4C7" w:sz="4"/>
+              <w:right w:val="single" w:color="D9D4C7" w:sz="4"/>
+            </w:tcBorders>
+            <w:tcMar>
+              <w:top w:type="dxa" w:w="60"/>
+              <w:left w:type="dxa" w:w="100"/>
+              <w:bottom w:type="dxa" w:w="60"/>
+              <w:right w:type="dxa" w:w="100"/>
+            </w:tcMar>
+          </w:tcPr>
+          <w:p>
+            <w:pPr>
+              <w:spacing w:after="0"/>
+            </w:pPr>
+            <w:r>
+              <w:rPr>
+                <w:sz w:val="19"/>
+                <w:szCs w:val="19"/>
+              </w:rPr>
+              <w:t xml:space="preserve">✅</w:t>
+            </w:r>
+          </w:p>
+        </w:tc>
+        <w:tc>
+          <w:tcPr>
+            <w:tcW w:type="dxa" w:w="1407"/>
+            <w:tcBorders>
+              <w:top w:val="single" w:color="D9D4C7" w:sz="4"/>
+              <w:left w:val="single" w:color="D9D4C7" w:sz="4"/>
+              <w:bottom w:val="single" w:color="D9D4C7" w:sz="4"/>
+              <w:right w:val="single" w:color="D9D4C7" w:sz="4"/>
+            </w:tcBorders>
+            <w:tcMar>
+              <w:top w:type="dxa" w:w="60"/>
+              <w:left w:type="dxa" w:w="100"/>
+              <w:bottom w:type="dxa" w:w="60"/>
+              <w:right w:type="dxa" w:w="100"/>
+            </w:tcMar>
+          </w:tcPr>
+          <w:p>
+            <w:pPr>
+              <w:spacing w:after="0"/>
+            </w:pPr>
+            <w:r>
+              <w:rPr>
+                <w:sz w:val="19"/>
+                <w:szCs w:val="19"/>
+              </w:rPr>
+              <w:t xml:space="preserve">pytest 202/202; snimci </w:t>
+            </w:r>
+            <w:r>
+              <w:rPr>
+                <w:rFonts w:ascii="Consolas" w:cs="Consolas" w:eastAsia="Consolas" w:hAnsi="Consolas"/>
+                <w:color w:val="6B4A12"/>
+                <w:sz w:val="19"/>
+                <w:szCs w:val="19"/>
+              </w:rPr>
+              <w:t xml:space="preserve">r3_en_*.png</w:t>
+            </w:r>
+          </w:p>
+        </w:tc>
+        <w:tc>
+          <w:tcPr>
+            <w:tcW w:type="dxa" w:w="4334"/>
+            <w:tcBorders>
+              <w:top w:val="single" w:color="D9D4C7" w:sz="4"/>
+              <w:left w:val="single" w:color="D9D4C7" w:sz="4"/>
+              <w:bottom w:val="single" w:color="D9D4C7" w:sz="4"/>
+              <w:right w:val="single" w:color="D9D4C7" w:sz="4"/>
+            </w:tcBorders>
+            <w:tcMar>
+              <w:top w:type="dxa" w:w="60"/>
+              <w:left w:type="dxa" w:w="100"/>
+              <w:bottom w:type="dxa" w:w="60"/>
+              <w:right w:type="dxa" w:w="100"/>
+            </w:tcMar>
+          </w:tcPr>
+          <w:p>
+            <w:pPr>
+              <w:spacing w:after="0"/>
+            </w:pPr>
+            <w:r>
+              <w:rPr>
+                <w:rFonts w:ascii="Consolas" w:cs="Consolas" w:eastAsia="Consolas" w:hAnsi="Consolas"/>
+                <w:color w:val="6B4A12"/>
+                <w:sz w:val="19"/>
+                <w:szCs w:val="19"/>
+              </w:rPr>
+              <w:t xml:space="preserve">pse_r/i18n.py</w:t>
+            </w:r>
+            <w:r>
+              <w:rPr>
+                <w:sz w:val="19"/>
+                <w:szCs w:val="19"/>
+              </w:rPr>
+              <w:t xml:space="preserve"> (</w:t>
+            </w:r>
+            <w:r>
+              <w:rPr>
+                <w:rFonts w:ascii="Consolas" w:cs="Consolas" w:eastAsia="Consolas" w:hAnsi="Consolas"/>
+                <w:color w:val="6B4A12"/>
+                <w:sz w:val="19"/>
+                <w:szCs w:val="19"/>
+              </w:rPr>
+              <w:t xml:space="preserve">tr()</w:t>
+            </w:r>
+            <w:r>
+              <w:rPr>
+                <w:sz w:val="19"/>
+                <w:szCs w:val="19"/>
+              </w:rPr>
+              <w:t xml:space="preserve">), </w:t>
+            </w:r>
+            <w:r>
+              <w:rPr>
+                <w:rFonts w:ascii="Consolas" w:cs="Consolas" w:eastAsia="Consolas" w:hAnsi="Consolas"/>
+                <w:color w:val="6B4A12"/>
+                <w:sz w:val="19"/>
+                <w:szCs w:val="19"/>
+              </w:rPr>
+              <w:t xml:space="preserve">i18n_en.py</w:t>
+            </w:r>
+            <w:r>
+              <w:rPr>
+                <w:sz w:val="19"/>
+                <w:szCs w:val="19"/>
+              </w:rPr>
+              <w:t xml:space="preserve"> (~470 prevoda), </w:t>
+            </w:r>
+            <w:r>
+              <w:rPr>
+                <w:rFonts w:ascii="Consolas" w:cs="Consolas" w:eastAsia="Consolas" w:hAnsi="Consolas"/>
+                <w:color w:val="6B4A12"/>
+                <w:sz w:val="19"/>
+                <w:szCs w:val="19"/>
+              </w:rPr>
+              <w:t xml:space="preserve">i18n_strings.py</w:t>
+            </w:r>
+            <w:r>
+              <w:rPr>
+                <w:sz w:val="19"/>
+                <w:szCs w:val="19"/>
+              </w:rPr>
+              <w:t xml:space="preserve"> (generiše </w:t>
+            </w:r>
+            <w:r>
+              <w:rPr>
+                <w:rFonts w:ascii="Consolas" w:cs="Consolas" w:eastAsia="Consolas" w:hAnsi="Consolas"/>
+                <w:color w:val="6B4A12"/>
+                <w:sz w:val="19"/>
+                <w:szCs w:val="19"/>
+              </w:rPr>
+              <w:t xml:space="preserve">tools/i18n_collect.py</w:t>
+            </w:r>
+            <w:r>
+              <w:rPr>
+                <w:sz w:val="19"/>
+                <w:szCs w:val="19"/>
+              </w:rPr>
+              <w:t xml:space="preserve">); prekidač „SR | EN“ u gornjoj traci (snima, pa ponovo otvara prozor); kritični šabloni imaju fiksne engleske verzije; selftest provjerava da nijedan tekst nema bez prevoda i da se poklapaju polja za vrijednosti. Automatsko omotavanje je na pregledu omotalo i SQL, metapodatke kartica, prečice i promptove za model — vraćeno; tri mjesta gdje je tekst bio i ključ u kodu — popravljeno (test ih je uhvatio). Ostaje na izvornom jeziku namjerno: sadržaj (dnevnik, kartice, odgovori modela, promptovi)</w:t>
+            </w:r>
+          </w:p>
+        </w:tc>
+      </w:tr>
     </w:tbl>
     <w:p>
       <w:pPr>
@@ -3212,7 +3444,7 @@
         <w:t xml:space="preserve">Sljedeće:</w:t>
       </w:r>
       <w:r>
-        <w:t xml:space="preserve"> Faza 6 — stavka 24 (SR/EN prekidač za cijeli interfejs).</w:t>
+        <w:t xml:space="preserve"> stavka 25 (automatski profil mašine: Dell / Acer).</w:t>
       </w:r>
     </w:p>
     <w:p>
@@ -3227,7 +3459,7 @@
         <w:t xml:space="preserve">Preostalo:</w:t>
       </w:r>
       <w:r>
-        <w:t xml:space="preserve"> oko 46–85 h.</w:t>
+        <w:t xml:space="preserve"> oko 40–77 h.</w:t>
       </w:r>
     </w:p>
     <w:p>

</xml_diff>

<commit_message>
Runda 3: prenumerisan plan (izdanje .deb/.exe = stavka 36, posljednja); stavka 24 profil mašine
Faza 6b = 25–31, Faza 7 = 32–36. WORKLOG i komentari u kodu usklađeni sa
brojevima iz plana (ranije commit poruke: 16–25 znače 15–24).
Stavka 24: automatski profil mašine (Dell izmjeren, Acer procjena).

Co-Authored-By: Claude Opus 5.5 <noreply@anthropic.com>
</commit_message>
<xml_diff>
--- a/PSE Riemann — PLAN.docx
+++ b/PSE Riemann — PLAN.docx
@@ -1664,7 +1664,7 @@
                 <w:sz w:val="19"/>
                 <w:szCs w:val="19"/>
               </w:rPr>
-              <w:t xml:space="preserve"> nudi prava imena modela sa servera. Uživo NIJE testirano — nema nijednog ključa (živi test = stavka 26)</w:t>
+              <w:t xml:space="preserve"> nudi prava imena modela sa servera. Uživo NIJE testirano — nema nijednog ključa (živi test = stavka 33)</w:t>
             </w:r>
           </w:p>
         </w:tc>
@@ -2694,7 +2694,7 @@
                 <w:sz w:val="19"/>
                 <w:szCs w:val="19"/>
               </w:rPr>
-              <w:t xml:space="preserve">21 · statistički jača dijagnoza (S5)</w:t>
+              <w:t xml:space="preserve">20 · statistički jača dijagnoza (S5)</w:t>
             </w:r>
           </w:p>
         </w:tc>
@@ -2872,7 +2872,7 @@
                 <w:sz w:val="19"/>
                 <w:szCs w:val="19"/>
               </w:rPr>
-              <w:t xml:space="preserve">22 · budžeti otkrivanja + takmičenje hipoteza (P7)</w:t>
+              <w:t xml:space="preserve">21 · budžeti otkrivanja + takmičenje hipoteza (P7)</w:t>
             </w:r>
           </w:p>
         </w:tc>
@@ -3033,7 +3033,7 @@
                 <w:sz w:val="19"/>
                 <w:szCs w:val="19"/>
               </w:rPr>
-              <w:t xml:space="preserve">23 · mjereni benchmark (S7)</w:t>
+              <w:t xml:space="preserve">22 · mjereni benchmark (S7)</w:t>
             </w:r>
           </w:p>
         </w:tc>
@@ -3252,7 +3252,7 @@
                 <w:sz w:val="19"/>
                 <w:szCs w:val="19"/>
               </w:rPr>
-              <w:t xml:space="preserve">24 · SR/EN za cijeli interfejs</w:t>
+              <w:t xml:space="preserve">23 · SR/EN za cijeli interfejs</w:t>
             </w:r>
           </w:p>
         </w:tc>
@@ -3426,6 +3426,352 @@
           </w:p>
         </w:tc>
       </w:tr>
+      <w:tr>
+        <w:trPr>
+          <w:tblHeader w:val="off"/>
+        </w:trPr>
+        <w:tc>
+          <w:tcPr>
+            <w:tcW w:type="dxa" w:w="1191"/>
+            <w:tcBorders>
+              <w:top w:val="single" w:color="D9D4C7" w:sz="4"/>
+              <w:left w:val="single" w:color="D9D4C7" w:sz="4"/>
+              <w:bottom w:val="single" w:color="D9D4C7" w:sz="4"/>
+              <w:right w:val="single" w:color="D9D4C7" w:sz="4"/>
+            </w:tcBorders>
+            <w:shd w:fill="F4F1EA" w:color="auto" w:val="clear"/>
+            <w:tcMar>
+              <w:top w:type="dxa" w:w="60"/>
+              <w:left w:type="dxa" w:w="100"/>
+              <w:bottom w:type="dxa" w:w="60"/>
+              <w:right w:type="dxa" w:w="100"/>
+            </w:tcMar>
+          </w:tcPr>
+          <w:p>
+            <w:pPr>
+              <w:spacing w:after="0"/>
+            </w:pPr>
+            <w:r>
+              <w:rPr>
+                <w:sz w:val="19"/>
+                <w:szCs w:val="19"/>
+              </w:rPr>
+              <w:t xml:space="preserve">2026-10-25</w:t>
+            </w:r>
+          </w:p>
+        </w:tc>
+        <w:tc>
+          <w:tcPr>
+            <w:tcW w:type="dxa" w:w="1732"/>
+            <w:tcBorders>
+              <w:top w:val="single" w:color="D9D4C7" w:sz="4"/>
+              <w:left w:val="single" w:color="D9D4C7" w:sz="4"/>
+              <w:bottom w:val="single" w:color="D9D4C7" w:sz="4"/>
+              <w:right w:val="single" w:color="D9D4C7" w:sz="4"/>
+            </w:tcBorders>
+            <w:shd w:fill="F4F1EA" w:color="auto" w:val="clear"/>
+            <w:tcMar>
+              <w:top w:type="dxa" w:w="60"/>
+              <w:left w:type="dxa" w:w="100"/>
+              <w:bottom w:type="dxa" w:w="60"/>
+              <w:right w:type="dxa" w:w="100"/>
+            </w:tcMar>
+          </w:tcPr>
+          <w:p>
+            <w:pPr>
+              <w:spacing w:after="0"/>
+            </w:pPr>
+            <w:r>
+              <w:rPr>
+                <w:sz w:val="19"/>
+                <w:szCs w:val="19"/>
+              </w:rPr>
+              <w:t xml:space="preserve">24 · automatski profil mašine</w:t>
+            </w:r>
+          </w:p>
+        </w:tc>
+        <w:tc>
+          <w:tcPr>
+            <w:tcW w:type="dxa" w:w="974"/>
+            <w:tcBorders>
+              <w:top w:val="single" w:color="D9D4C7" w:sz="4"/>
+              <w:left w:val="single" w:color="D9D4C7" w:sz="4"/>
+              <w:bottom w:val="single" w:color="D9D4C7" w:sz="4"/>
+              <w:right w:val="single" w:color="D9D4C7" w:sz="4"/>
+            </w:tcBorders>
+            <w:shd w:fill="F4F1EA" w:color="auto" w:val="clear"/>
+            <w:tcMar>
+              <w:top w:type="dxa" w:w="60"/>
+              <w:left w:type="dxa" w:w="100"/>
+              <w:bottom w:type="dxa" w:w="60"/>
+              <w:right w:type="dxa" w:w="100"/>
+            </w:tcMar>
+          </w:tcPr>
+          <w:p>
+            <w:pPr>
+              <w:spacing w:after="0"/>
+            </w:pPr>
+            <w:r>
+              <w:rPr>
+                <w:sz w:val="19"/>
+                <w:szCs w:val="19"/>
+              </w:rPr>
+              <w:t xml:space="preserve">✅</w:t>
+            </w:r>
+          </w:p>
+        </w:tc>
+        <w:tc>
+          <w:tcPr>
+            <w:tcW w:type="dxa" w:w="1407"/>
+            <w:tcBorders>
+              <w:top w:val="single" w:color="D9D4C7" w:sz="4"/>
+              <w:left w:val="single" w:color="D9D4C7" w:sz="4"/>
+              <w:bottom w:val="single" w:color="D9D4C7" w:sz="4"/>
+              <w:right w:val="single" w:color="D9D4C7" w:sz="4"/>
+            </w:tcBorders>
+            <w:shd w:fill="F4F1EA" w:color="auto" w:val="clear"/>
+            <w:tcMar>
+              <w:top w:type="dxa" w:w="60"/>
+              <w:left w:type="dxa" w:w="100"/>
+              <w:bottom w:type="dxa" w:w="60"/>
+              <w:right w:type="dxa" w:w="100"/>
+            </w:tcMar>
+          </w:tcPr>
+          <w:p>
+            <w:pPr>
+              <w:spacing w:after="0"/>
+            </w:pPr>
+            <w:r>
+              <w:rPr>
+                <w:sz w:val="19"/>
+                <w:szCs w:val="19"/>
+              </w:rPr>
+              <w:t xml:space="preserve">pytest 206/206</w:t>
+            </w:r>
+          </w:p>
+        </w:tc>
+        <w:tc>
+          <w:tcPr>
+            <w:tcW w:type="dxa" w:w="4334"/>
+            <w:tcBorders>
+              <w:top w:val="single" w:color="D9D4C7" w:sz="4"/>
+              <w:left w:val="single" w:color="D9D4C7" w:sz="4"/>
+              <w:bottom w:val="single" w:color="D9D4C7" w:sz="4"/>
+              <w:right w:val="single" w:color="D9D4C7" w:sz="4"/>
+            </w:tcBorders>
+            <w:shd w:fill="F4F1EA" w:color="auto" w:val="clear"/>
+            <w:tcMar>
+              <w:top w:type="dxa" w:w="60"/>
+              <w:left w:type="dxa" w:w="100"/>
+              <w:bottom w:type="dxa" w:w="60"/>
+              <w:right w:type="dxa" w:w="100"/>
+            </w:tcMar>
+          </w:tcPr>
+          <w:p>
+            <w:pPr>
+              <w:spacing w:after="0"/>
+            </w:pPr>
+            <w:r>
+              <w:rPr>
+                <w:rFonts w:ascii="Consolas" w:cs="Consolas" w:eastAsia="Consolas" w:hAnsi="Consolas"/>
+                <w:color w:val="6B4A12"/>
+                <w:sz w:val="19"/>
+                <w:szCs w:val="19"/>
+              </w:rPr>
+              <w:t xml:space="preserve">pse_r/machine.py</w:t>
+            </w:r>
+            <w:r>
+              <w:rPr>
+                <w:sz w:val="19"/>
+                <w:szCs w:val="19"/>
+              </w:rPr>
+              <w:t xml:space="preserve">: prepoznaje Dell (i5-6600, 4 jezgra — ovaj računar, izmjereno 0,44–0,62 s/token) i Acer (i3, 2 jezgra/4 niti — </w:t>
+            </w:r>
+            <w:r>
+              <w:rPr>
+                <w:b/>
+                <w:bCs/>
+                <w:sz w:val="19"/>
+                <w:szCs w:val="19"/>
+              </w:rPr>
+              <w:t xml:space="preserve">procjena</w:t>
+            </w:r>
+            <w:r>
+              <w:rPr>
+                <w:sz w:val="19"/>
+                <w:szCs w:val="19"/>
+              </w:rPr>
+              <w:t xml:space="preserve">, nije mjereno), inače generički profil po jezgrima; podešava niti, kontekst, budžet razmišljanja, izlaz, rok i „→ ∞“ s/token; „kad birati“ i čarobnjak upozoravaju da je DeepSeek spor na Aceru; testovi sa simuliranim Acerom (</w:t>
+            </w:r>
+            <w:r>
+              <w:rPr>
+                <w:rFonts w:ascii="Consolas" w:cs="Consolas" w:eastAsia="Consolas" w:hAnsi="Consolas"/>
+                <w:color w:val="6B4A12"/>
+                <w:sz w:val="19"/>
+                <w:szCs w:val="19"/>
+              </w:rPr>
+              <w:t xml:space="preserve">PSE_RIEMANN_MACHINE=acer</w:t>
+            </w:r>
+            <w:r>
+              <w:rPr>
+                <w:sz w:val="19"/>
+                <w:szCs w:val="19"/>
+              </w:rPr>
+              <w:t xml:space="preserve">)</w:t>
+            </w:r>
+          </w:p>
+        </w:tc>
+      </w:tr>
+      <w:tr>
+        <w:trPr>
+          <w:tblHeader w:val="off"/>
+        </w:trPr>
+        <w:tc>
+          <w:tcPr>
+            <w:tcW w:type="dxa" w:w="1191"/>
+            <w:tcBorders>
+              <w:top w:val="single" w:color="D9D4C7" w:sz="4"/>
+              <w:left w:val="single" w:color="D9D4C7" w:sz="4"/>
+              <w:bottom w:val="single" w:color="D9D4C7" w:sz="4"/>
+              <w:right w:val="single" w:color="D9D4C7" w:sz="4"/>
+            </w:tcBorders>
+            <w:tcMar>
+              <w:top w:type="dxa" w:w="60"/>
+              <w:left w:type="dxa" w:w="100"/>
+              <w:bottom w:type="dxa" w:w="60"/>
+              <w:right w:type="dxa" w:w="100"/>
+            </w:tcMar>
+          </w:tcPr>
+          <w:p>
+            <w:pPr>
+              <w:spacing w:after="0"/>
+            </w:pPr>
+            <w:r>
+              <w:rPr>
+                <w:sz w:val="19"/>
+                <w:szCs w:val="19"/>
+              </w:rPr>
+              <w:t xml:space="preserve">2026-10-25</w:t>
+            </w:r>
+          </w:p>
+        </w:tc>
+        <w:tc>
+          <w:tcPr>
+            <w:tcW w:type="dxa" w:w="1732"/>
+            <w:tcBorders>
+              <w:top w:val="single" w:color="D9D4C7" w:sz="4"/>
+              <w:left w:val="single" w:color="D9D4C7" w:sz="4"/>
+              <w:bottom w:val="single" w:color="D9D4C7" w:sz="4"/>
+              <w:right w:val="single" w:color="D9D4C7" w:sz="4"/>
+            </w:tcBorders>
+            <w:tcMar>
+              <w:top w:type="dxa" w:w="60"/>
+              <w:left w:type="dxa" w:w="100"/>
+              <w:bottom w:type="dxa" w:w="60"/>
+              <w:right w:type="dxa" w:w="100"/>
+            </w:tcMar>
+          </w:tcPr>
+          <w:p>
+            <w:pPr>
+              <w:spacing w:after="0"/>
+            </w:pPr>
+            <w:r>
+              <w:rPr>
+                <w:sz w:val="19"/>
+                <w:szCs w:val="19"/>
+              </w:rPr>
+              <w:t xml:space="preserve">— · prenumerisanje plana</w:t>
+            </w:r>
+          </w:p>
+        </w:tc>
+        <w:tc>
+          <w:tcPr>
+            <w:tcW w:type="dxa" w:w="974"/>
+            <w:tcBorders>
+              <w:top w:val="single" w:color="D9D4C7" w:sz="4"/>
+              <w:left w:val="single" w:color="D9D4C7" w:sz="4"/>
+              <w:bottom w:val="single" w:color="D9D4C7" w:sz="4"/>
+              <w:right w:val="single" w:color="D9D4C7" w:sz="4"/>
+            </w:tcBorders>
+            <w:tcMar>
+              <w:top w:type="dxa" w:w="60"/>
+              <w:left w:type="dxa" w:w="100"/>
+              <w:bottom w:type="dxa" w:w="60"/>
+              <w:right w:type="dxa" w:w="100"/>
+            </w:tcMar>
+          </w:tcPr>
+          <w:p>
+            <w:pPr>
+              <w:spacing w:after="0"/>
+            </w:pPr>
+            <w:r>
+              <w:rPr>
+                <w:sz w:val="19"/>
+                <w:szCs w:val="19"/>
+              </w:rPr>
+              <w:t xml:space="preserve">✅</w:t>
+            </w:r>
+          </w:p>
+        </w:tc>
+        <w:tc>
+          <w:tcPr>
+            <w:tcW w:type="dxa" w:w="1407"/>
+            <w:tcBorders>
+              <w:top w:val="single" w:color="D9D4C7" w:sz="4"/>
+              <w:left w:val="single" w:color="D9D4C7" w:sz="4"/>
+              <w:bottom w:val="single" w:color="D9D4C7" w:sz="4"/>
+              <w:right w:val="single" w:color="D9D4C7" w:sz="4"/>
+            </w:tcBorders>
+            <w:tcMar>
+              <w:top w:type="dxa" w:w="60"/>
+              <w:left w:type="dxa" w:w="100"/>
+              <w:bottom w:type="dxa" w:w="60"/>
+              <w:right w:type="dxa" w:w="100"/>
+            </w:tcMar>
+          </w:tcPr>
+          <w:p>
+            <w:pPr>
+              <w:spacing w:after="0"/>
+            </w:pPr>
+            <w:r>
+              <w:rPr>
+                <w:sz w:val="19"/>
+                <w:szCs w:val="19"/>
+              </w:rPr>
+              <w:t xml:space="preserve">—</w:t>
+            </w:r>
+          </w:p>
+        </w:tc>
+        <w:tc>
+          <w:tcPr>
+            <w:tcW w:type="dxa" w:w="4334"/>
+            <w:tcBorders>
+              <w:top w:val="single" w:color="D9D4C7" w:sz="4"/>
+              <w:left w:val="single" w:color="D9D4C7" w:sz="4"/>
+              <w:bottom w:val="single" w:color="D9D4C7" w:sz="4"/>
+              <w:right w:val="single" w:color="D9D4C7" w:sz="4"/>
+            </w:tcBorders>
+            <w:tcMar>
+              <w:top w:type="dxa" w:w="60"/>
+              <w:left w:type="dxa" w:w="100"/>
+              <w:bottom w:type="dxa" w:w="60"/>
+              <w:right w:type="dxa" w:w="100"/>
+            </w:tcMar>
+          </w:tcPr>
+          <w:p>
+            <w:pPr>
+              <w:spacing w:after="0"/>
+            </w:pPr>
+            <w:r>
+              <w:rPr>
+                <w:sz w:val="19"/>
+                <w:szCs w:val="19"/>
+              </w:rPr>
+              <w:t xml:space="preserve">Andrej je primijetio: izgradnja .deb/.exe (bila stavka 29) mora biti posljednja. Redoslijed je već bio takav (Faza 6b prije Faze 7), ali brojevi nisu. Sada: Faza 6b = 25–31, Faza 7 = 32–36 (36 = .deb + .exe + spajanje). WORKLOG je do sada pratio staru numeraciju (sa P4 kao 8) — redovi od 15 nadalje su ispravljeni na brojeve iz plana; u commit porukama prije ovoga brojevi 16–25 znače 15–24</w:t>
+            </w:r>
+          </w:p>
+        </w:tc>
+      </w:tr>
     </w:tbl>
     <w:p>
       <w:pPr>
@@ -3444,7 +3790,7 @@
         <w:t xml:space="preserve">Sljedeće:</w:t>
       </w:r>
       <w:r>
-        <w:t xml:space="preserve"> stavka 25 (automatski profil mašine: Dell / Acer).</w:t>
+        <w:t xml:space="preserve"> Faza 6b — stavka 25 (istraživanje Langlandsa sa izvorima), pa 26 (pitanje za Andreja o cilju druge misije). Izdanje (.deb, .exe) je stavka 36 — posljednja.</w:t>
       </w:r>
     </w:p>
     <w:p>
@@ -3459,7 +3805,7 @@
         <w:t xml:space="preserve">Preostalo:</w:t>
       </w:r>
       <w:r>
-        <w:t xml:space="preserve"> oko 40–77 h.</w:t>
+        <w:t xml:space="preserve"> oko 38–74 h.</w:t>
       </w:r>
     </w:p>
     <w:p>
@@ -4086,7 +4432,7 @@
           </w:pPr>
           <w:hyperlink w:history="1" w:anchor="_Toc28">
             <w:r>
-              <w:t xml:space="preserve">Faza 6b · Druga misija, inspiracije, grafovi (dodato 2026-10-25, radi se prije Faze 7)</w:t>
+              <w:t xml:space="preserve">Faza 6b · Druga misija, inspiracije, grafovi (dodato 2026-10-25; radi se prije Faze 7 — izdanje je uvijek posljednje)</w:t>
             </w:r>
             <w:r>
               <w:tab/>
@@ -8108,7 +8454,7 @@
       </w:pPr>
       <w:bookmarkStart w:name="_Toc28" w:id="28"/>
       <w:r>
-        <w:t xml:space="preserve">Faza 6b · Druga misija, inspiracije, grafovi (dodato 2026-10-25, radi se prije Faze 7)</w:t>
+        <w:t xml:space="preserve">Faza 6b · Druga misija, inspiracije, grafovi (dodato 2026-10-25; radi se prije Faze 7 — izdanje je uvijek posljednje)</w:t>
       </w:r>
       <w:bookmarkEnd w:id="28"/>
     </w:p>
@@ -8135,7 +8481,7 @@
           <w:bCs/>
           <w:color w:val="B07A1E"/>
         </w:rPr>
-        <w:t xml:space="preserve">30.	</w:t>
+        <w:t xml:space="preserve">25.	</w:t>
       </w:r>
       <w:r>
         <w:rPr>
@@ -8172,7 +8518,7 @@
           <w:bCs/>
           <w:color w:val="B07A1E"/>
         </w:rPr>
-        <w:t xml:space="preserve">31.	</w:t>
+        <w:t xml:space="preserve">26.	</w:t>
       </w:r>
       <w:r>
         <w:rPr>
@@ -8182,7 +8528,7 @@
         <w:t xml:space="preserve">Dogovor o cilju druge misije</w:t>
       </w:r>
       <w:r>
-        <w:t xml:space="preserve"> (Andrej odlučuje, prije ubacivanja u softver). Pitam čim 30 završi; ništa od 32 ne počinje prije odgovora. Prijedlozi su u chatu 2026-10-25.</w:t>
+        <w:t xml:space="preserve"> (Andrej odlučuje, prije ubacivanja u softver). Pitam čim 25 završi; ništa od 27 ne počinje prije odgovora. Prijedlozi su u chatu 2026-10-25.</w:t>
       </w:r>
     </w:p>
     <w:p>
@@ -8199,7 +8545,7 @@
           <w:bCs/>
           <w:color w:val="B07A1E"/>
         </w:rPr>
-        <w:t xml:space="preserve">32.	</w:t>
+        <w:t xml:space="preserve">27.	</w:t>
       </w:r>
       <w:r>
         <w:rPr>
@@ -8276,7 +8622,7 @@
           <w:bCs/>
           <w:color w:val="B07A1E"/>
         </w:rPr>
-        <w:t xml:space="preserve">33.	</w:t>
+        <w:t xml:space="preserve">28.	</w:t>
       </w:r>
       <w:r>
         <w:rPr>
@@ -8323,7 +8669,7 @@
           <w:bCs/>
           <w:color w:val="B07A1E"/>
         </w:rPr>
-        <w:t xml:space="preserve">34.	</w:t>
+        <w:t xml:space="preserve">29.	</w:t>
       </w:r>
       <w:r>
         <w:rPr>
@@ -8675,7 +9021,7 @@
           <w:bCs/>
           <w:color w:val="B07A1E"/>
         </w:rPr>
-        <w:t xml:space="preserve">35.	</w:t>
+        <w:t xml:space="preserve">30.	</w:t>
       </w:r>
       <w:r>
         <w:rPr>
@@ -8702,7 +9048,7 @@
           <w:bCs/>
           <w:color w:val="B07A1E"/>
         </w:rPr>
-        <w:t xml:space="preserve">36.	</w:t>
+        <w:t xml:space="preserve">31.	</w:t>
       </w:r>
       <w:r>
         <w:rPr>
@@ -8742,7 +9088,7 @@
         <w:t xml:space="preserve">certifikat praznine</w:t>
       </w:r>
       <w:r>
-        <w:t xml:space="preserve"> (pravac A): za datu metodu strogi interval da iznad B* nema dopustivih parametara. Rezultati: „Čeka tvoju odluku“, tab Grafovi (tačka kontraprimjera), lab run NAŠE-NERECENZIRANO; poštuje limitere. Ne ulazi: apstraktna „mašina“ bez implementacije, „Langlands transfer“ kao konstanta (samo kao otvoreno pitanje / INSPIRACIJA, stavka 33), Lean.</w:t>
+        <w:t xml:space="preserve"> (pravac A): za datu metodu strogi interval da iznad B* nema dopustivih parametara. Rezultati: „Čeka tvoju odluku“, tab Grafovi (tačka kontraprimjera), lab run NAŠE-NERECENZIRANO; poštuje limitere. Ne ulazi: apstraktna „mašina“ bez implementacije, „Langlands transfer“ kao konstanta (samo kao otvoreno pitanje / INSPIRACIJA, stavka 28), Lean.</w:t>
       </w:r>
     </w:p>
     <w:p>
@@ -8769,7 +9115,7 @@
           <w:bCs/>
           <w:color w:val="B07A1E"/>
         </w:rPr>
-        <w:t xml:space="preserve">25.	</w:t>
+        <w:t xml:space="preserve">32.	</w:t>
       </w:r>
       <w:r>
         <w:t xml:space="preserve">Uputstvo za instalaciju .deb, vodiči SR/EN ažurirani.</w:t>
@@ -8789,7 +9135,7 @@
           <w:bCs/>
           <w:color w:val="B07A1E"/>
         </w:rPr>
-        <w:t xml:space="preserve">26.	</w:t>
+        <w:t xml:space="preserve">33.	</w:t>
       </w:r>
       <w:r>
         <w:t xml:space="preserve">Detaljan vodič za živi test sa pravim AI-jem (git i računar). Test radi Andrej.</w:t>
@@ -8809,7 +9155,7 @@
           <w:bCs/>
           <w:color w:val="B07A1E"/>
         </w:rPr>
-        <w:t xml:space="preserve">27.	</w:t>
+        <w:t xml:space="preserve">34.	</w:t>
       </w:r>
       <w:r>
         <w:t xml:space="preserve">CI koji instalira .deb na čistom sistemu i radi pravi poziv (P9).</w:t>
@@ -8829,7 +9175,7 @@
           <w:bCs/>
           <w:color w:val="B07A1E"/>
         </w:rPr>
-        <w:t xml:space="preserve">28.	</w:t>
+        <w:t xml:space="preserve">35.	</w:t>
       </w:r>
       <w:r>
         <w:t xml:space="preserve">Verzija 0.2.0, tag </w:t>
@@ -8859,7 +9205,7 @@
           <w:bCs/>
           <w:color w:val="B07A1E"/>
         </w:rPr>
-        <w:t xml:space="preserve">29.	</w:t>
+        <w:t xml:space="preserve">36.	</w:t>
       </w:r>
       <w:r>
         <w:t xml:space="preserve">Tri .deb paketa ponovo izgrađena i provjerena, .exe, testovi, snimci ekrana, oba repoa, spajanje u </w:t>
@@ -8914,7 +9260,7 @@
         <w:t xml:space="preserve">Procjena:</w:t>
       </w:r>
       <w:r>
-        <w:t xml:space="preserve"> oko 62–92 sata rada (bez P4) + oko 36–55 sati za Fazu 6b (sa stavkom 36 i poljima uz 32) = </w:t>
+        <w:t xml:space="preserve"> oko 62–92 sata rada (bez P4) + oko 36–55 sati za Fazu 6b (sa stavkom 31 i poljima uz 27) = </w:t>
       </w:r>
       <w:r>
         <w:rPr>

</xml_diff>

<commit_message>
Runda 3, stavka 25: istraživanje Langlandsa i višeg stepena sa izvorima
research/langlands-2026-10/REPORT.md + 8 kartica izvora u vaultu paketa.
Misija 2 je otvoreno pitanje: dokaz 7/8 koristi GL(1) alate bez poznatog
GL(2) analoga. Cilj misije 2 (stavka 26) čeka odluku Andreja.

Co-Authored-By: Claude Opus 5.5 <noreply@anthropic.com>
</commit_message>
<xml_diff>
--- a/PSE Riemann — PLAN.docx
+++ b/PSE Riemann — PLAN.docx
@@ -3772,6 +3772,336 @@
           </w:p>
         </w:tc>
       </w:tr>
+      <w:tr>
+        <w:trPr>
+          <w:tblHeader w:val="off"/>
+        </w:trPr>
+        <w:tc>
+          <w:tcPr>
+            <w:tcW w:type="dxa" w:w="1191"/>
+            <w:tcBorders>
+              <w:top w:val="single" w:color="D9D4C7" w:sz="4"/>
+              <w:left w:val="single" w:color="D9D4C7" w:sz="4"/>
+              <w:bottom w:val="single" w:color="D9D4C7" w:sz="4"/>
+              <w:right w:val="single" w:color="D9D4C7" w:sz="4"/>
+            </w:tcBorders>
+            <w:shd w:fill="F4F1EA" w:color="auto" w:val="clear"/>
+            <w:tcMar>
+              <w:top w:type="dxa" w:w="60"/>
+              <w:left w:type="dxa" w:w="100"/>
+              <w:bottom w:type="dxa" w:w="60"/>
+              <w:right w:type="dxa" w:w="100"/>
+            </w:tcMar>
+          </w:tcPr>
+          <w:p>
+            <w:pPr>
+              <w:spacing w:after="0"/>
+            </w:pPr>
+            <w:r>
+              <w:rPr>
+                <w:sz w:val="19"/>
+                <w:szCs w:val="19"/>
+              </w:rPr>
+              <w:t xml:space="preserve">2026-10-25</w:t>
+            </w:r>
+          </w:p>
+        </w:tc>
+        <w:tc>
+          <w:tcPr>
+            <w:tcW w:type="dxa" w:w="1732"/>
+            <w:tcBorders>
+              <w:top w:val="single" w:color="D9D4C7" w:sz="4"/>
+              <w:left w:val="single" w:color="D9D4C7" w:sz="4"/>
+              <w:bottom w:val="single" w:color="D9D4C7" w:sz="4"/>
+              <w:right w:val="single" w:color="D9D4C7" w:sz="4"/>
+            </w:tcBorders>
+            <w:shd w:fill="F4F1EA" w:color="auto" w:val="clear"/>
+            <w:tcMar>
+              <w:top w:type="dxa" w:w="60"/>
+              <w:left w:type="dxa" w:w="100"/>
+              <w:bottom w:type="dxa" w:w="60"/>
+              <w:right w:type="dxa" w:w="100"/>
+            </w:tcMar>
+          </w:tcPr>
+          <w:p>
+            <w:pPr>
+              <w:spacing w:after="0"/>
+            </w:pPr>
+            <w:r>
+              <w:rPr>
+                <w:sz w:val="19"/>
+                <w:szCs w:val="19"/>
+              </w:rPr>
+              <w:t xml:space="preserve">25 · istraživanje Langlandsa sa izvorima</w:t>
+            </w:r>
+          </w:p>
+        </w:tc>
+        <w:tc>
+          <w:tcPr>
+            <w:tcW w:type="dxa" w:w="974"/>
+            <w:tcBorders>
+              <w:top w:val="single" w:color="D9D4C7" w:sz="4"/>
+              <w:left w:val="single" w:color="D9D4C7" w:sz="4"/>
+              <w:bottom w:val="single" w:color="D9D4C7" w:sz="4"/>
+              <w:right w:val="single" w:color="D9D4C7" w:sz="4"/>
+            </w:tcBorders>
+            <w:shd w:fill="F4F1EA" w:color="auto" w:val="clear"/>
+            <w:tcMar>
+              <w:top w:type="dxa" w:w="60"/>
+              <w:left w:type="dxa" w:w="100"/>
+              <w:bottom w:type="dxa" w:w="60"/>
+              <w:right w:type="dxa" w:w="100"/>
+            </w:tcMar>
+          </w:tcPr>
+          <w:p>
+            <w:pPr>
+              <w:spacing w:after="0"/>
+            </w:pPr>
+            <w:r>
+              <w:rPr>
+                <w:sz w:val="19"/>
+                <w:szCs w:val="19"/>
+              </w:rPr>
+              <w:t xml:space="preserve">✅</w:t>
+            </w:r>
+          </w:p>
+        </w:tc>
+        <w:tc>
+          <w:tcPr>
+            <w:tcW w:type="dxa" w:w="1407"/>
+            <w:tcBorders>
+              <w:top w:val="single" w:color="D9D4C7" w:sz="4"/>
+              <w:left w:val="single" w:color="D9D4C7" w:sz="4"/>
+              <w:bottom w:val="single" w:color="D9D4C7" w:sz="4"/>
+              <w:right w:val="single" w:color="D9D4C7" w:sz="4"/>
+            </w:tcBorders>
+            <w:shd w:fill="F4F1EA" w:color="auto" w:val="clear"/>
+            <w:tcMar>
+              <w:top w:type="dxa" w:w="60"/>
+              <w:left w:type="dxa" w:w="100"/>
+              <w:bottom w:type="dxa" w:w="60"/>
+              <w:right w:type="dxa" w:w="100"/>
+            </w:tcMar>
+          </w:tcPr>
+          <w:p>
+            <w:pPr>
+              <w:spacing w:after="0"/>
+            </w:pPr>
+            <w:r>
+              <w:rPr>
+                <w:sz w:val="19"/>
+                <w:szCs w:val="19"/>
+              </w:rPr>
+              <w:t xml:space="preserve">pytest 207/207</w:t>
+            </w:r>
+          </w:p>
+        </w:tc>
+        <w:tc>
+          <w:tcPr>
+            <w:tcW w:type="dxa" w:w="4334"/>
+            <w:tcBorders>
+              <w:top w:val="single" w:color="D9D4C7" w:sz="4"/>
+              <w:left w:val="single" w:color="D9D4C7" w:sz="4"/>
+              <w:bottom w:val="single" w:color="D9D4C7" w:sz="4"/>
+              <w:right w:val="single" w:color="D9D4C7" w:sz="4"/>
+            </w:tcBorders>
+            <w:shd w:fill="F4F1EA" w:color="auto" w:val="clear"/>
+            <w:tcMar>
+              <w:top w:type="dxa" w:w="60"/>
+              <w:left w:type="dxa" w:w="100"/>
+              <w:bottom w:type="dxa" w:w="60"/>
+              <w:right w:type="dxa" w:w="100"/>
+            </w:tcMar>
+          </w:tcPr>
+          <w:p>
+            <w:pPr>
+              <w:spacing w:after="0"/>
+            </w:pPr>
+            <w:r>
+              <w:rPr>
+                <w:rFonts w:ascii="Consolas" w:cs="Consolas" w:eastAsia="Consolas" w:hAnsi="Consolas"/>
+                <w:color w:val="6B4A12"/>
+                <w:sz w:val="19"/>
+                <w:szCs w:val="19"/>
+              </w:rPr>
+              <w:t xml:space="preserve">research/langlands-2026-10/REPORT.md</w:t>
+            </w:r>
+            <w:r>
+              <w:rPr>
+                <w:sz w:val="19"/>
+                <w:szCs w:val="19"/>
+              </w:rPr>
+              <w:t xml:space="preserve"> (izvori, nivoi, mapa prenosivosti, 3 prijedloga cilja) + </w:t>
+            </w:r>
+            <w:r>
+              <w:rPr>
+                <w:rFonts w:ascii="Consolas" w:cs="Consolas" w:eastAsia="Consolas" w:hAnsi="Consolas"/>
+                <w:color w:val="6B4A12"/>
+                <w:sz w:val="19"/>
+                <w:szCs w:val="19"/>
+              </w:rPr>
+              <w:t xml:space="preserve">vault/langlands_seed.py</w:t>
+            </w:r>
+            <w:r>
+              <w:rPr>
+                <w:sz w:val="19"/>
+                <w:szCs w:val="19"/>
+              </w:rPr>
+              <w:t xml:space="preserve"> (8 kartica izvora: Newton–Thorne I = REFEREED po DOI, ostalo PREPRINT; tema = FOLKLORE mapa) — paketi ih nose. Glavni nalaz [naše čitanje]: dokaz 7/8 stoji na GL(1) alatima (kubna theta, Pattersonovi koeficijenti, Gaussove sume) bez poznatog GL(2) analoga → prenos nije direktan; misija 2 je zasad otvoreno pitanje, ne račun. Geometrijski Langlands (2024) ne daje eksponente nad ℚ — kontekst, ne alat. Alpöge–Furman (2/3 na pravoj) je drugi tip rezultata</w:t>
+            </w:r>
+          </w:p>
+        </w:tc>
+      </w:tr>
+      <w:tr>
+        <w:trPr>
+          <w:tblHeader w:val="off"/>
+        </w:trPr>
+        <w:tc>
+          <w:tcPr>
+            <w:tcW w:type="dxa" w:w="1191"/>
+            <w:tcBorders>
+              <w:top w:val="single" w:color="D9D4C7" w:sz="4"/>
+              <w:left w:val="single" w:color="D9D4C7" w:sz="4"/>
+              <w:bottom w:val="single" w:color="D9D4C7" w:sz="4"/>
+              <w:right w:val="single" w:color="D9D4C7" w:sz="4"/>
+            </w:tcBorders>
+            <w:tcMar>
+              <w:top w:type="dxa" w:w="60"/>
+              <w:left w:type="dxa" w:w="100"/>
+              <w:bottom w:type="dxa" w:w="60"/>
+              <w:right w:type="dxa" w:w="100"/>
+            </w:tcMar>
+          </w:tcPr>
+          <w:p>
+            <w:pPr>
+              <w:spacing w:after="0"/>
+            </w:pPr>
+            <w:r>
+              <w:rPr>
+                <w:sz w:val="19"/>
+                <w:szCs w:val="19"/>
+              </w:rPr>
+              <w:t xml:space="preserve">2026-10-25</w:t>
+            </w:r>
+          </w:p>
+        </w:tc>
+        <w:tc>
+          <w:tcPr>
+            <w:tcW w:type="dxa" w:w="1732"/>
+            <w:tcBorders>
+              <w:top w:val="single" w:color="D9D4C7" w:sz="4"/>
+              <w:left w:val="single" w:color="D9D4C7" w:sz="4"/>
+              <w:bottom w:val="single" w:color="D9D4C7" w:sz="4"/>
+              <w:right w:val="single" w:color="D9D4C7" w:sz="4"/>
+            </w:tcBorders>
+            <w:tcMar>
+              <w:top w:type="dxa" w:w="60"/>
+              <w:left w:type="dxa" w:w="100"/>
+              <w:bottom w:type="dxa" w:w="60"/>
+              <w:right w:type="dxa" w:w="100"/>
+            </w:tcMar>
+          </w:tcPr>
+          <w:p>
+            <w:pPr>
+              <w:spacing w:after="0"/>
+            </w:pPr>
+            <w:r>
+              <w:rPr>
+                <w:sz w:val="19"/>
+                <w:szCs w:val="19"/>
+              </w:rPr>
+              <w:t xml:space="preserve">26 · dogovor o cilju misije 2</w:t>
+            </w:r>
+          </w:p>
+        </w:tc>
+        <w:tc>
+          <w:tcPr>
+            <w:tcW w:type="dxa" w:w="974"/>
+            <w:tcBorders>
+              <w:top w:val="single" w:color="D9D4C7" w:sz="4"/>
+              <w:left w:val="single" w:color="D9D4C7" w:sz="4"/>
+              <w:bottom w:val="single" w:color="D9D4C7" w:sz="4"/>
+              <w:right w:val="single" w:color="D9D4C7" w:sz="4"/>
+            </w:tcBorders>
+            <w:tcMar>
+              <w:top w:type="dxa" w:w="60"/>
+              <w:left w:type="dxa" w:w="100"/>
+              <w:bottom w:type="dxa" w:w="60"/>
+              <w:right w:type="dxa" w:w="100"/>
+            </w:tcMar>
+          </w:tcPr>
+          <w:p>
+            <w:pPr>
+              <w:spacing w:after="0"/>
+            </w:pPr>
+            <w:r>
+              <w:rPr>
+                <w:sz w:val="19"/>
+                <w:szCs w:val="19"/>
+              </w:rPr>
+              <w:t xml:space="preserve">⏳ čeka Andreja</w:t>
+            </w:r>
+          </w:p>
+        </w:tc>
+        <w:tc>
+          <w:tcPr>
+            <w:tcW w:type="dxa" w:w="1407"/>
+            <w:tcBorders>
+              <w:top w:val="single" w:color="D9D4C7" w:sz="4"/>
+              <w:left w:val="single" w:color="D9D4C7" w:sz="4"/>
+              <w:bottom w:val="single" w:color="D9D4C7" w:sz="4"/>
+              <w:right w:val="single" w:color="D9D4C7" w:sz="4"/>
+            </w:tcBorders>
+            <w:tcMar>
+              <w:top w:type="dxa" w:w="60"/>
+              <w:left w:type="dxa" w:w="100"/>
+              <w:bottom w:type="dxa" w:w="60"/>
+              <w:right w:type="dxa" w:w="100"/>
+            </w:tcMar>
+          </w:tcPr>
+          <w:p>
+            <w:pPr>
+              <w:spacing w:after="0"/>
+            </w:pPr>
+            <w:r>
+              <w:rPr>
+                <w:sz w:val="19"/>
+                <w:szCs w:val="19"/>
+              </w:rPr>
+              <w:t xml:space="preserve">—</w:t>
+            </w:r>
+          </w:p>
+        </w:tc>
+        <w:tc>
+          <w:tcPr>
+            <w:tcW w:type="dxa" w:w="4334"/>
+            <w:tcBorders>
+              <w:top w:val="single" w:color="D9D4C7" w:sz="4"/>
+              <w:left w:val="single" w:color="D9D4C7" w:sz="4"/>
+              <w:bottom w:val="single" w:color="D9D4C7" w:sz="4"/>
+              <w:right w:val="single" w:color="D9D4C7" w:sz="4"/>
+            </w:tcBorders>
+            <w:tcMar>
+              <w:top w:type="dxa" w:w="60"/>
+              <w:left w:type="dxa" w:w="100"/>
+              <w:bottom w:type="dxa" w:w="60"/>
+              <w:right w:type="dxa" w:w="100"/>
+            </w:tcMar>
+          </w:tcPr>
+          <w:p>
+            <w:pPr>
+              <w:spacing w:after="0"/>
+            </w:pPr>
+            <w:r>
+              <w:rPr>
+                <w:sz w:val="19"/>
+                <w:szCs w:val="19"/>
+              </w:rPr>
+              <w:t xml:space="preserve">pitanje postavljeno u chatu; stavka 27 ne počinje prije odgovora; u međuvremenu 28–31</w:t>
+            </w:r>
+          </w:p>
+        </w:tc>
+      </w:tr>
     </w:tbl>
     <w:p>
       <w:pPr>
@@ -3790,7 +4120,7 @@
         <w:t xml:space="preserve">Sljedeće:</w:t>
       </w:r>
       <w:r>
-        <w:t xml:space="preserve"> Faza 6b — stavka 25 (istraživanje Langlandsa sa izvorima), pa 26 (pitanje za Andreja o cilju druge misije). Izdanje (.deb, .exe) je stavka 36 — posljednja.</w:t>
+        <w:t xml:space="preserve"> stavke 28–31 (inspiracije, grafovi, graf znanja, adversarijalni mod) dok Andrej ne odluči o cilju misije 2 (26); zatim 27; izdanje 36 posljednje.</w:t>
       </w:r>
     </w:p>
     <w:p>
@@ -3805,7 +4135,7 @@
         <w:t xml:space="preserve">Preostalo:</w:t>
       </w:r>
       <w:r>
-        <w:t xml:space="preserve"> oko 38–74 h.</w:t>
+        <w:t xml:space="preserve"> oko 35–70 h.</w:t>
       </w:r>
     </w:p>
     <w:p>

</xml_diff>

<commit_message>
Plan: odluka o cilju misije 2, kompleksni/3D grafovi, misija 3 i radni tekst; izdanje = 38
Co-Authored-By: Claude Opus 5.5 <noreply@anthropic.com>
</commit_message>
<xml_diff>
--- a/PSE Riemann — PLAN.docx
+++ b/PSE Riemann — PLAN.docx
@@ -1664,7 +1664,7 @@
                 <w:sz w:val="19"/>
                 <w:szCs w:val="19"/>
               </w:rPr>
-              <w:t xml:space="preserve"> nudi prava imena modela sa servera. Uživo NIJE testirano — nema nijednog ključa (živi test = stavka 33)</w:t>
+              <w:t xml:space="preserve"> nudi prava imena modela sa servera. Uživo NIJE testirano — nema nijednog ključa (živi test = stavka 35)</w:t>
             </w:r>
           </w:p>
         </w:tc>
@@ -4039,7 +4039,7 @@
                 <w:sz w:val="19"/>
                 <w:szCs w:val="19"/>
               </w:rPr>
-              <w:t xml:space="preserve">⏳ čeka Andreja</w:t>
+              <w:t xml:space="preserve">✅</w:t>
             </w:r>
           </w:p>
         </w:tc>
@@ -4097,7 +4097,7 @@
                 <w:sz w:val="19"/>
                 <w:szCs w:val="19"/>
               </w:rPr>
-              <w:t xml:space="preserve">pitanje postavljeno u chatu; stavka 27 ne počinje prije odgovora; u međuvremenu 28–31</w:t>
+              <w:t xml:space="preserve">Andrej: cilj 1 (mapa prenosivosti) obavezan; 2 i 3 su opcije — aplikacija ih samo PREDLAŽE, izbor 1/2/3 uvijek u meniju misije. Dodato u plan: kompleksni i 3D/više-dimenzionalni grafovi (29), misija 3 — kompleksna verzija (32), radni tekst rada (33); izdanje sada 34–38 (38 = .deb + .exe, posljednje)</w:t>
             </w:r>
           </w:p>
         </w:tc>
@@ -4120,7 +4120,7 @@
         <w:t xml:space="preserve">Sljedeće:</w:t>
       </w:r>
       <w:r>
-        <w:t xml:space="preserve"> stavke 28–31 (inspiracije, grafovi, graf znanja, adversarijalni mod) dok Andrej ne odluči o cilju misije 2 (26); zatim 27; izdanje 36 posljednje.</w:t>
+        <w:t xml:space="preserve"> stavka 27 (misija 2 u aplikaciji + meni „Cilj misije“), pa 28–33; izdanje 34–38 (38 = .deb + .exe) posljednje.</w:t>
       </w:r>
     </w:p>
     <w:p>
@@ -4135,7 +4135,7 @@
         <w:t xml:space="preserve">Preostalo:</w:t>
       </w:r>
       <w:r>
-        <w:t xml:space="preserve"> oko 35–70 h.</w:t>
+        <w:t xml:space="preserve"> oko 49–94 h.</w:t>
       </w:r>
     </w:p>
     <w:p>
@@ -4784,7 +4784,7 @@
           </w:pPr>
           <w:hyperlink w:history="1" w:anchor="_Toc29">
             <w:r>
-              <w:t xml:space="preserve">Faza 7 · Dokumentacija i izdanje</w:t>
+              <w:t xml:space="preserve">Faza 6c · Misija 3 i radni tekst (dodato 2026-10-25, prije izdanja)</w:t>
             </w:r>
             <w:r>
               <w:tab/>
@@ -4792,6 +4792,28 @@
             <w:r>
               <w:fldChar w:fldCharType="begin" w:dirty="true"/>
               <w:instrText xml:space="preserve">PAGEREF _Toc29 \h</w:instrText>
+              <w:fldChar w:fldCharType="separate"/>
+              <w:fldChar w:fldCharType="end"/>
+            </w:r>
+          </w:hyperlink>
+        </w:p>
+        <w:p>
+          <w:pPr>
+            <w:pStyle w:val="TOC2"/>
+            <w:tabs>
+              <w:tab w:val="right" w:pos="9638" w:leader="dot"/>
+            </w:tabs>
+          </w:pPr>
+          <w:hyperlink w:history="1" w:anchor="_Toc30">
+            <w:r>
+              <w:t xml:space="preserve">Faza 7 · Dokumentacija i izdanje</w:t>
+            </w:r>
+            <w:r>
+              <w:tab/>
+            </w:r>
+            <w:r>
+              <w:fldChar w:fldCharType="begin" w:dirty="true"/>
+              <w:instrText xml:space="preserve">PAGEREF _Toc30 \h</w:instrText>
               <w:fldChar w:fldCharType="separate"/>
               <w:fldChar w:fldCharType="end"/>
             </w:r>
@@ -8858,7 +8880,17 @@
         <w:t xml:space="preserve">Dogovor o cilju druge misije</w:t>
       </w:r>
       <w:r>
-        <w:t xml:space="preserve"> (Andrej odlučuje, prije ubacivanja u softver). Pitam čim 25 završi; ništa od 27 ne počinje prije odgovora. Prijedlozi su u chatu 2026-10-25.</w:t>
+        <w:t xml:space="preserve"> (Andrej odlučuje, prije ubacivanja u softver). Pitam čim 25 završi; ništa od 27 ne počinje prije odgovora. Prijedlozi su u chatu 2026-10-25. </w:t>
+      </w:r>
+      <w:r>
+        <w:rPr>
+          <w:b/>
+          <w:bCs/>
+        </w:rPr>
+        <w:t xml:space="preserve">Odluka (Andrej, 2026-10-25):</w:t>
+      </w:r>
+      <w:r>
+        <w:t xml:space="preserve"> cilj 1 (mapa prenosivosti) je obavezan i podrazumijevan; ciljevi 2 (E_d i T_d uslovno) i 3 (samo praćenje) su opcije. Promjenu cilja aplikacija NIKAD ne radi sama: predloži je u „Čeka tvoju odluku“ sa obrazloženjem; izbor 1 / 2 / 3 je uvijek dostupan u meniju misije (tab Misije → „Cilj misije“), svaka promjena zapisana sa imenom operatera.</w:t>
       </w:r>
     </w:p>
     <w:p>
@@ -9339,6 +9371,132 @@
     </w:p>
     <w:p>
       <w:pPr>
+        <w:spacing w:after="100"/>
+        <w:ind w:left="820"/>
+      </w:pPr>
+      <w:r>
+        <w:rPr>
+          <w:b/>
+          <w:bCs/>
+        </w:rPr>
+        <w:t xml:space="preserve">Kompleksni brojevi i više dimenzija (Andrej, 2026-10-25):</w:t>
+      </w:r>
+    </w:p>
+    <w:p>
+      <w:pPr>
+        <w:pStyle w:val="ListParagraph"/>
+        <w:numPr>
+          <w:ilvl w:val="1"/>
+          <w:numId w:val="2"/>
+        </w:numPr>
+        <w:spacing w:after="60"/>
+      </w:pPr>
+      <w:r>
+        <w:t xml:space="preserve">funkcije kompleksne promjenljive (f(s) = ζ(s), L(s, χ), bilo šta u s); fazni portret (boja = argument, svjetlina = modul); krive Re f = 0 i Im f = 0 (nule su njihovi presjeci); presjeci duž prave (|ζ(1/2+it)|, Hardyjeva Z(t), Re/Im); oblasti u ravni (poluravan Re s &gt; B, kritična traka, prava 1/2, nule kao tačke); „sve o tački“ za kompleksnu tačku (s, f(s), |f|, arg f, udaljenost do najbliže nule i do prave 1/2, u oblasti bez nula ili ne); računi na zahtjev: kompleksni izvod, nule u pravougaoniku (princip argumenta), rezidui;</w:t>
+      </w:r>
+    </w:p>
+    <w:p>
+      <w:pPr>
+        <w:pStyle w:val="ListParagraph"/>
+        <w:numPr>
+          <w:ilvl w:val="1"/>
+          <w:numId w:val="2"/>
+        </w:numPr>
+        <w:spacing w:after="60"/>
+      </w:pPr>
+      <w:r>
+        <w:rPr>
+          <w:b/>
+          <w:bCs/>
+        </w:rPr>
+        <w:t xml:space="preserve">povezani prikazi:</w:t>
+      </w:r>
+      <w:r>
+        <w:t xml:space="preserve"> ravan eksponenata (σ, eksponent) i kompleksna ravan — isti broj σ\* je tačka presjeka u prvoj i granica poluravni u drugoj; pomjeranje parametra mijenja oba;</w:t>
+      </w:r>
+    </w:p>
+    <w:p>
+      <w:pPr>
+        <w:pStyle w:val="ListParagraph"/>
+        <w:numPr>
+          <w:ilvl w:val="1"/>
+          <w:numId w:val="2"/>
+        </w:numPr>
+        <w:spacing w:after="60"/>
+      </w:pPr>
+      <w:r>
+        <w:rPr>
+          <w:b/>
+          <w:bCs/>
+        </w:rPr>
+        <w:t xml:space="preserve">klizač „niska strana + Δ“:</w:t>
+      </w:r>
+      <w:r>
+        <w:t xml:space="preserve"> σ\* = 11/16 + niska strana — koliko gubitka metoda podnosi prije nego što oblast bez nula nestane (σ\* → 1); mjerilo za mapu prenosivosti;</w:t>
+      </w:r>
+    </w:p>
+    <w:p>
+      <w:pPr>
+        <w:pStyle w:val="ListParagraph"/>
+        <w:numPr>
+          <w:ilvl w:val="1"/>
+          <w:numId w:val="2"/>
+        </w:numPr>
+        <w:spacing w:after="60"/>
+      </w:pPr>
+      <w:r>
+        <w:rPr>
+          <w:b/>
+          <w:bCs/>
+        </w:rPr>
+        <w:t xml:space="preserve">3D:</w:t>
+      </w:r>
+      <w:r>
+        <w:t xml:space="preserve"> površi koje se rotiraju (|ζ(s)| iznad kompleksne ravni — nule su jame; eksponenti iznad (σ, ℓ) — dvije površi se sijeku po krivoj presjeka = B(ℓ)); </w:t>
+      </w:r>
+      <w:r>
+        <w:rPr>
+          <w:b/>
+          <w:bCs/>
+        </w:rPr>
+        <w:t xml:space="preserve">4. dimenzija kao boja</w:t>
+      </w:r>
+      <w:r>
+        <w:t xml:space="preserve"> (npr. |f| obojen po arg f); </w:t>
+      </w:r>
+      <w:r>
+        <w:rPr>
+          <w:b/>
+          <w:bCs/>
+        </w:rPr>
+        <w:t xml:space="preserve">5. i dalje kao klizači ili animacija</w:t>
+      </w:r>
+      <w:r>
+        <w:t xml:space="preserve">; </w:t>
+      </w:r>
+      <w:r>
+        <w:rPr>
+          <w:b/>
+          <w:bCs/>
+        </w:rPr>
+        <w:t xml:space="preserve">male slike</w:t>
+      </w:r>
+      <w:r>
+        <w:t xml:space="preserve"> (ista površ za više vrijednosti parametra); </w:t>
+      </w:r>
+      <w:r>
+        <w:rPr>
+          <w:b/>
+          <w:bCs/>
+        </w:rPr>
+        <w:t xml:space="preserve">paralelne koordinate</w:t>
+      </w:r>
+      <w:r>
+        <w:t xml:space="preserve"> za sve parametre metoda odjednom. Pravilo: najviše 3 dimenzije na ekranu, ostale uvijek vidljive kao klizači; profil mašine smanjuje mrežu na Aceru.</w:t>
+      </w:r>
+    </w:p>
+    <w:p>
+      <w:pPr>
         <w:tabs>
           <w:tab w:val="left" w:pos="460"/>
         </w:tabs>
@@ -9427,7 +9585,7 @@
       </w:pPr>
       <w:bookmarkStart w:name="_Toc29" w:id="29"/>
       <w:r>
-        <w:t xml:space="preserve">Faza 7 · Dokumentacija i izdanje</w:t>
+        <w:t xml:space="preserve">Faza 6c · Misija 3 i radni tekst (dodato 2026-10-25, prije izdanja)</w:t>
       </w:r>
       <w:bookmarkEnd w:id="29"/>
     </w:p>
@@ -9448,7 +9606,14 @@
         <w:t xml:space="preserve">32.	</w:t>
       </w:r>
       <w:r>
-        <w:t xml:space="preserve">Uputstvo za instalaciju .deb, vodiči SR/EN ažurirani.</w:t>
+        <w:rPr>
+          <w:b/>
+          <w:bCs/>
+        </w:rPr>
+        <w:t xml:space="preserve">Misija 3 — kompleksna verzija:</w:t>
+      </w:r>
+      <w:r>
+        <w:t xml:space="preserve"> dokaz 7/8 gleda samo σ = Re ρ, jer |X^s| = X^σ; imaginarni dio γ nosi fazu, a poništavanje u dokazu dolazi iz oscilacija. Pitanja: (a) zavisi li granica od visine γ — da li vertikalna prava Re s = B postaje kriva σ\*(γ) i savija li se igdje prema 1/2; (b) šta su funkcije eksponenata kad im se dozvoli kompleksni argument E(s; ℓ, b, κ) i gdje se signal i niska strana „sijeku“ u kompleksnom smislu. Otvoreno pitanje; svaki korak NAŠE-NERECENZIRANO; isti meni ciljeva i isto pravilo (aplikacija predlaže, operater bira).</w:t>
       </w:r>
     </w:p>
     <w:p>
@@ -9468,8 +9633,25 @@
         <w:t xml:space="preserve">33.	</w:t>
       </w:r>
       <w:r>
-        <w:t xml:space="preserve">Detaljan vodič za živi test sa pravim AI-jem (git i računar). Test radi Andrej.</w:t>
-      </w:r>
+        <w:rPr>
+          <w:b/>
+          <w:bCs/>
+        </w:rPr>
+        <w:t xml:space="preserve">Radni tekst rada iz misija 2 i 3:</w:t>
+      </w:r>
+      <w:r>
+        <w:t xml:space="preserve"> aplikacija sastavlja radni tekst (uvod, metode, računi sa lab run-ovima, grafovi, izvori sa nivoima, otvorena pitanja), označen NAŠE-NERECENZIRANO; kapija i dalje odbija svaku tvrdnju o dokazu; svaki broj nosi izvor ili lab run; skeptik i adversarijalni mod napadaju tekst prije nego što ga operater vidi. Rezultat „kompleksna verzija ne daje ništa novo“ je takođe rezultat i piše se.</w:t>
+      </w:r>
+    </w:p>
+    <w:p>
+      <w:pPr>
+        <w:pStyle w:val="Heading2"/>
+      </w:pPr>
+      <w:bookmarkStart w:name="_Toc30" w:id="30"/>
+      <w:r>
+        <w:t xml:space="preserve">Faza 7 · Dokumentacija i izdanje</w:t>
+      </w:r>
+      <w:bookmarkEnd w:id="30"/>
     </w:p>
     <w:p>
       <w:pPr>
@@ -9488,7 +9670,7 @@
         <w:t xml:space="preserve">34.	</w:t>
       </w:r>
       <w:r>
-        <w:t xml:space="preserve">CI koji instalira .deb na čistom sistemu i radi pravi poziv (P9).</w:t>
+        <w:t xml:space="preserve">Uputstvo za instalaciju .deb, vodiči SR/EN ažurirani.</w:t>
       </w:r>
     </w:p>
     <w:p>
@@ -9508,17 +9690,7 @@
         <w:t xml:space="preserve">35.	</w:t>
       </w:r>
       <w:r>
-        <w:t xml:space="preserve">Verzija 0.2.0, tag </w:t>
-      </w:r>
-      <w:r>
-        <w:rPr>
-          <w:rFonts w:ascii="Consolas" w:cs="Consolas" w:eastAsia="Consolas" w:hAnsi="Consolas"/>
-          <w:color w:val="6B4A12"/>
-        </w:rPr>
-        <w:t xml:space="preserve">v0.2.0</w:t>
-      </w:r>
-      <w:r>
-        <w:t xml:space="preserve">, .exe samo kao GitHub Release.</w:t>
+        <w:t xml:space="preserve">Detaljan vodič za živi test sa pravim AI-jem (git i računar). Test radi Andrej.</w:t>
       </w:r>
     </w:p>
     <w:p>
@@ -9538,13 +9710,63 @@
         <w:t xml:space="preserve">36.	</w:t>
       </w:r>
       <w:r>
-        <w:t xml:space="preserve">Tri .deb paketa ponovo izgrađena i provjerena, .exe, testovi, snimci ekrana, oba repoa, spajanje u </w:t>
+        <w:t xml:space="preserve">CI koji instalira .deb na čistom sistemu i radi pravi poziv (P9).</w:t>
+      </w:r>
+    </w:p>
+    <w:p>
+      <w:pPr>
+        <w:tabs>
+          <w:tab w:val="left" w:pos="460"/>
+        </w:tabs>
+        <w:spacing w:after="80"/>
+        <w:ind w:left="460" w:hanging="460"/>
+      </w:pPr>
+      <w:r>
+        <w:rPr>
+          <w:b/>
+          <w:bCs/>
+          <w:color w:val="B07A1E"/>
+        </w:rPr>
+        <w:t xml:space="preserve">37.	</w:t>
+      </w:r>
+      <w:r>
+        <w:t xml:space="preserve">Verzija 0.2.0, tag </w:t>
       </w:r>
       <w:r>
         <w:rPr>
           <w:rFonts w:ascii="Consolas" w:cs="Consolas" w:eastAsia="Consolas" w:hAnsi="Consolas"/>
           <w:color w:val="6B4A12"/>
         </w:rPr>
+        <w:t xml:space="preserve">v0.2.0</w:t>
+      </w:r>
+      <w:r>
+        <w:t xml:space="preserve">, .exe samo kao GitHub Release.</w:t>
+      </w:r>
+    </w:p>
+    <w:p>
+      <w:pPr>
+        <w:tabs>
+          <w:tab w:val="left" w:pos="460"/>
+        </w:tabs>
+        <w:spacing w:after="80"/>
+        <w:ind w:left="460" w:hanging="460"/>
+      </w:pPr>
+      <w:r>
+        <w:rPr>
+          <w:b/>
+          <w:bCs/>
+          <w:color w:val="B07A1E"/>
+        </w:rPr>
+        <w:t xml:space="preserve">38.	</w:t>
+      </w:r>
+      <w:r>
+        <w:t xml:space="preserve">Tri .deb paketa ponovo izgrađena i provjerena, .exe, testovi, snimci ekrana, oba repoa, spajanje u </w:t>
+      </w:r>
+      <w:r>
+        <w:rPr>
+          <w:rFonts w:ascii="Consolas" w:cs="Consolas" w:eastAsia="Consolas" w:hAnsi="Consolas"/>
+          <w:color w:val="6B4A12"/>
+        </w:rPr>
         <w:t xml:space="preserve">main</w:t>
       </w:r>
       <w:r>
@@ -9590,14 +9812,14 @@
         <w:t xml:space="preserve">Procjena:</w:t>
       </w:r>
       <w:r>
-        <w:t xml:space="preserve"> oko 62–92 sata rada (bez P4) + oko 36–55 sati za Fazu 6b (sa stavkom 31 i poljima uz 27) = </w:t>
-      </w:r>
-      <w:r>
-        <w:rPr>
-          <w:b/>
-          <w:bCs/>
-        </w:rPr>
-        <w:t xml:space="preserve">oko 98–147 sati</w:t>
+        <w:t xml:space="preserve"> oko 62–92 sata rada (bez P4) + oko 36–55 sati za Fazu 6b (sa stavkom 31 i poljima uz 27) + oko 14–24 h za Fazu 6c i kompleksne/3D grafove = </w:t>
+      </w:r>
+      <w:r>
+        <w:rPr>
+          <w:b/>
+          <w:bCs/>
+        </w:rPr>
+        <w:t xml:space="preserve">oko 112–171 sat</w:t>
       </w:r>
       <w:r>
         <w:t xml:space="preserve">, kalendarski oko 8–12 dana (bez auto-nastavka sporije: rad ide samo dok je chat otvoren). Napredak faza po fazu u WORKLOG.</w:t>

</xml_diff>

<commit_message>
Runda 3, stavka 27: misija 2 (viši stepen), meni ciljeva, vrsta rezultata i pretpostavke
Co-Authored-By: Claude Opus 5.5 <noreply@anthropic.com>
</commit_message>
<xml_diff>
--- a/PSE Riemann — PLAN.docx
+++ b/PSE Riemann — PLAN.docx
@@ -4102,6 +4102,161 @@
           </w:p>
         </w:tc>
       </w:tr>
+      <w:tr>
+        <w:trPr>
+          <w:tblHeader w:val="off"/>
+        </w:trPr>
+        <w:tc>
+          <w:tcPr>
+            <w:tcW w:type="dxa" w:w="1191"/>
+            <w:tcBorders>
+              <w:top w:val="single" w:color="D9D4C7" w:sz="4"/>
+              <w:left w:val="single" w:color="D9D4C7" w:sz="4"/>
+              <w:bottom w:val="single" w:color="D9D4C7" w:sz="4"/>
+              <w:right w:val="single" w:color="D9D4C7" w:sz="4"/>
+            </w:tcBorders>
+            <w:shd w:fill="F4F1EA" w:color="auto" w:val="clear"/>
+            <w:tcMar>
+              <w:top w:type="dxa" w:w="60"/>
+              <w:left w:type="dxa" w:w="100"/>
+              <w:bottom w:type="dxa" w:w="60"/>
+              <w:right w:type="dxa" w:w="100"/>
+            </w:tcMar>
+          </w:tcPr>
+          <w:p>
+            <w:pPr>
+              <w:spacing w:after="0"/>
+            </w:pPr>
+            <w:r>
+              <w:rPr>
+                <w:sz w:val="19"/>
+                <w:szCs w:val="19"/>
+              </w:rPr>
+              <w:t xml:space="preserve">2026-10-25</w:t>
+            </w:r>
+          </w:p>
+        </w:tc>
+        <w:tc>
+          <w:tcPr>
+            <w:tcW w:type="dxa" w:w="1732"/>
+            <w:tcBorders>
+              <w:top w:val="single" w:color="D9D4C7" w:sz="4"/>
+              <w:left w:val="single" w:color="D9D4C7" w:sz="4"/>
+              <w:bottom w:val="single" w:color="D9D4C7" w:sz="4"/>
+              <w:right w:val="single" w:color="D9D4C7" w:sz="4"/>
+            </w:tcBorders>
+            <w:shd w:fill="F4F1EA" w:color="auto" w:val="clear"/>
+            <w:tcMar>
+              <w:top w:type="dxa" w:w="60"/>
+              <w:left w:type="dxa" w:w="100"/>
+              <w:bottom w:type="dxa" w:w="60"/>
+              <w:right w:type="dxa" w:w="100"/>
+            </w:tcMar>
+          </w:tcPr>
+          <w:p>
+            <w:pPr>
+              <w:spacing w:after="0"/>
+            </w:pPr>
+            <w:r>
+              <w:rPr>
+                <w:sz w:val="19"/>
+                <w:szCs w:val="19"/>
+              </w:rPr>
+              <w:t xml:space="preserve">27 · misija 2 u aplikaciji</w:t>
+            </w:r>
+          </w:p>
+        </w:tc>
+        <w:tc>
+          <w:tcPr>
+            <w:tcW w:type="dxa" w:w="974"/>
+            <w:tcBorders>
+              <w:top w:val="single" w:color="D9D4C7" w:sz="4"/>
+              <w:left w:val="single" w:color="D9D4C7" w:sz="4"/>
+              <w:bottom w:val="single" w:color="D9D4C7" w:sz="4"/>
+              <w:right w:val="single" w:color="D9D4C7" w:sz="4"/>
+            </w:tcBorders>
+            <w:shd w:fill="F4F1EA" w:color="auto" w:val="clear"/>
+            <w:tcMar>
+              <w:top w:type="dxa" w:w="60"/>
+              <w:left w:type="dxa" w:w="100"/>
+              <w:bottom w:type="dxa" w:w="60"/>
+              <w:right w:type="dxa" w:w="100"/>
+            </w:tcMar>
+          </w:tcPr>
+          <w:p>
+            <w:pPr>
+              <w:spacing w:after="0"/>
+            </w:pPr>
+            <w:r>
+              <w:rPr>
+                <w:sz w:val="19"/>
+                <w:szCs w:val="19"/>
+              </w:rPr>
+              <w:t xml:space="preserve">✅</w:t>
+            </w:r>
+          </w:p>
+        </w:tc>
+        <w:tc>
+          <w:tcPr>
+            <w:tcW w:type="dxa" w:w="1407"/>
+            <w:tcBorders>
+              <w:top w:val="single" w:color="D9D4C7" w:sz="4"/>
+              <w:left w:val="single" w:color="D9D4C7" w:sz="4"/>
+              <w:bottom w:val="single" w:color="D9D4C7" w:sz="4"/>
+              <w:right w:val="single" w:color="D9D4C7" w:sz="4"/>
+            </w:tcBorders>
+            <w:shd w:fill="F4F1EA" w:color="auto" w:val="clear"/>
+            <w:tcMar>
+              <w:top w:type="dxa" w:w="60"/>
+              <w:left w:type="dxa" w:w="100"/>
+              <w:bottom w:type="dxa" w:w="60"/>
+              <w:right w:type="dxa" w:w="100"/>
+            </w:tcMar>
+          </w:tcPr>
+          <w:p>
+            <w:pPr>
+              <w:spacing w:after="0"/>
+            </w:pPr>
+            <w:r>
+              <w:rPr>
+                <w:sz w:val="19"/>
+                <w:szCs w:val="19"/>
+              </w:rPr>
+              <w:t xml:space="preserve">pytest 210/210</w:t>
+            </w:r>
+          </w:p>
+        </w:tc>
+        <w:tc>
+          <w:tcPr>
+            <w:tcW w:type="dxa" w:w="4334"/>
+            <w:tcBorders>
+              <w:top w:val="single" w:color="D9D4C7" w:sz="4"/>
+              <w:left w:val="single" w:color="D9D4C7" w:sz="4"/>
+              <w:bottom w:val="single" w:color="D9D4C7" w:sz="4"/>
+              <w:right w:val="single" w:color="D9D4C7" w:sz="4"/>
+            </w:tcBorders>
+            <w:shd w:fill="F4F1EA" w:color="auto" w:val="clear"/>
+            <w:tcMar>
+              <w:top w:type="dxa" w:w="60"/>
+              <w:left w:type="dxa" w:w="100"/>
+              <w:bottom w:type="dxa" w:w="60"/>
+              <w:right w:type="dxa" w:w="100"/>
+            </w:tcMar>
+          </w:tcPr>
+          <w:p>
+            <w:pPr>
+              <w:spacing w:after="0"/>
+            </w:pPr>
+            <w:r>
+              <w:rPr>
+                <w:sz w:val="19"/>
+                <w:szCs w:val="19"/>
+              </w:rPr>
+              <w:t xml:space="preserve">misija „Viši stepen: prenosi li se 7/8?“ sa prvim nacrtom mape prenosivosti (4 koraka, NAŠE-NERECENZIRANO); meni „Cilj misije“ (1/2/3) u tabu Misije — mijenja samo operater, zapisano sa imenom; aplikacija samo predlaže (stavka u „Čeka tvoju odluku“); paket metode nosi vrstu rezultata (poluravan/gustina/udio na pravoj), stepen d i pretpostavke — pretpostavke bez „conditional“ odbijene; rezultat koji nije poluravan nikad ne ulazi u front misije</w:t>
+            </w:r>
+          </w:p>
+        </w:tc>
+      </w:tr>
     </w:tbl>
     <w:p>
       <w:pPr>
@@ -4120,7 +4275,7 @@
         <w:t xml:space="preserve">Sljedeće:</w:t>
       </w:r>
       <w:r>
-        <w:t xml:space="preserve"> stavka 27 (misija 2 u aplikaciji + meni „Cilj misije“), pa 28–33; izdanje 34–38 (38 = .deb + .exe) posljednje.</w:t>
+        <w:t xml:space="preserve"> stavka 28 (engine za inspiracije „Ideje“), pa 29–33; izdanje 34–38 (38 = .deb + .exe) posljednje.</w:t>
       </w:r>
     </w:p>
     <w:p>
@@ -4135,7 +4290,7 @@
         <w:t xml:space="preserve">Preostalo:</w:t>
       </w:r>
       <w:r>
-        <w:t xml:space="preserve"> oko 49–94 h.</w:t>
+        <w:t xml:space="preserve"> oko 46–90 h.</w:t>
       </w:r>
     </w:p>
     <w:p>

</xml_diff>

<commit_message>
Runda 3, stavka 28a: rad po misijama u krug (aktivna misija, ostavi za kasnije, gdje si stao, zamrznuto/tiho skuplja)
Co-Authored-By: Claude Opus 5.5 <noreply@anthropic.com>
</commit_message>
<xml_diff>
--- a/PSE Riemann — PLAN.docx
+++ b/PSE Riemann — PLAN.docx
@@ -4257,6 +4257,213 @@
           </w:p>
         </w:tc>
       </w:tr>
+      <w:tr>
+        <w:trPr>
+          <w:tblHeader w:val="off"/>
+        </w:trPr>
+        <w:tc>
+          <w:tcPr>
+            <w:tcW w:type="dxa" w:w="1191"/>
+            <w:tcBorders>
+              <w:top w:val="single" w:color="D9D4C7" w:sz="4"/>
+              <w:left w:val="single" w:color="D9D4C7" w:sz="4"/>
+              <w:bottom w:val="single" w:color="D9D4C7" w:sz="4"/>
+              <w:right w:val="single" w:color="D9D4C7" w:sz="4"/>
+            </w:tcBorders>
+            <w:tcMar>
+              <w:top w:type="dxa" w:w="60"/>
+              <w:left w:type="dxa" w:w="100"/>
+              <w:bottom w:type="dxa" w:w="60"/>
+              <w:right w:type="dxa" w:w="100"/>
+            </w:tcMar>
+          </w:tcPr>
+          <w:p>
+            <w:pPr>
+              <w:spacing w:after="0"/>
+            </w:pPr>
+            <w:r>
+              <w:rPr>
+                <w:sz w:val="19"/>
+                <w:szCs w:val="19"/>
+              </w:rPr>
+              <w:t xml:space="preserve">2026-10-25</w:t>
+            </w:r>
+          </w:p>
+        </w:tc>
+        <w:tc>
+          <w:tcPr>
+            <w:tcW w:type="dxa" w:w="1732"/>
+            <w:tcBorders>
+              <w:top w:val="single" w:color="D9D4C7" w:sz="4"/>
+              <w:left w:val="single" w:color="D9D4C7" w:sz="4"/>
+              <w:bottom w:val="single" w:color="D9D4C7" w:sz="4"/>
+              <w:right w:val="single" w:color="D9D4C7" w:sz="4"/>
+            </w:tcBorders>
+            <w:tcMar>
+              <w:top w:type="dxa" w:w="60"/>
+              <w:left w:type="dxa" w:w="100"/>
+              <w:bottom w:type="dxa" w:w="60"/>
+              <w:right w:type="dxa" w:w="100"/>
+            </w:tcMar>
+          </w:tcPr>
+          <w:p>
+            <w:pPr>
+              <w:spacing w:after="0"/>
+            </w:pPr>
+            <w:r>
+              <w:rPr>
+                <w:sz w:val="19"/>
+                <w:szCs w:val="19"/>
+              </w:rPr>
+              <w:t xml:space="preserve">28a · rad po misijama u krug</w:t>
+            </w:r>
+          </w:p>
+        </w:tc>
+        <w:tc>
+          <w:tcPr>
+            <w:tcW w:type="dxa" w:w="974"/>
+            <w:tcBorders>
+              <w:top w:val="single" w:color="D9D4C7" w:sz="4"/>
+              <w:left w:val="single" w:color="D9D4C7" w:sz="4"/>
+              <w:bottom w:val="single" w:color="D9D4C7" w:sz="4"/>
+              <w:right w:val="single" w:color="D9D4C7" w:sz="4"/>
+            </w:tcBorders>
+            <w:tcMar>
+              <w:top w:type="dxa" w:w="60"/>
+              <w:left w:type="dxa" w:w="100"/>
+              <w:bottom w:type="dxa" w:w="60"/>
+              <w:right w:type="dxa" w:w="100"/>
+            </w:tcMar>
+          </w:tcPr>
+          <w:p>
+            <w:pPr>
+              <w:spacing w:after="0"/>
+            </w:pPr>
+            <w:r>
+              <w:rPr>
+                <w:sz w:val="19"/>
+                <w:szCs w:val="19"/>
+              </w:rPr>
+              <w:t xml:space="preserve">✅</w:t>
+            </w:r>
+          </w:p>
+        </w:tc>
+        <w:tc>
+          <w:tcPr>
+            <w:tcW w:type="dxa" w:w="1407"/>
+            <w:tcBorders>
+              <w:top w:val="single" w:color="D9D4C7" w:sz="4"/>
+              <w:left w:val="single" w:color="D9D4C7" w:sz="4"/>
+              <w:bottom w:val="single" w:color="D9D4C7" w:sz="4"/>
+              <w:right w:val="single" w:color="D9D4C7" w:sz="4"/>
+            </w:tcBorders>
+            <w:tcMar>
+              <w:top w:type="dxa" w:w="60"/>
+              <w:left w:type="dxa" w:w="100"/>
+              <w:bottom w:type="dxa" w:w="60"/>
+              <w:right w:type="dxa" w:w="100"/>
+            </w:tcMar>
+          </w:tcPr>
+          <w:p>
+            <w:pPr>
+              <w:spacing w:after="0"/>
+            </w:pPr>
+            <w:r>
+              <w:rPr>
+                <w:sz w:val="19"/>
+                <w:szCs w:val="19"/>
+              </w:rPr>
+              <w:t xml:space="preserve">pytest 214/214, selftest ✅, snimak </w:t>
+            </w:r>
+            <w:r>
+              <w:rPr>
+                <w:rFonts w:ascii="Consolas" w:cs="Consolas" w:eastAsia="Consolas" w:hAnsi="Consolas"/>
+                <w:color w:val="6B4A12"/>
+                <w:sz w:val="19"/>
+                <w:szCs w:val="19"/>
+              </w:rPr>
+              <w:t xml:space="preserve">r3_mission_turns.png</w:t>
+            </w:r>
+          </w:p>
+        </w:tc>
+        <w:tc>
+          <w:tcPr>
+            <w:tcW w:type="dxa" w:w="4334"/>
+            <w:tcBorders>
+              <w:top w:val="single" w:color="D9D4C7" w:sz="4"/>
+              <w:left w:val="single" w:color="D9D4C7" w:sz="4"/>
+              <w:bottom w:val="single" w:color="D9D4C7" w:sz="4"/>
+              <w:right w:val="single" w:color="D9D4C7" w:sz="4"/>
+            </w:tcBorders>
+            <w:tcMar>
+              <w:top w:type="dxa" w:w="60"/>
+              <w:left w:type="dxa" w:w="100"/>
+              <w:bottom w:type="dxa" w:w="60"/>
+              <w:right w:type="dxa" w:w="100"/>
+            </w:tcMar>
+          </w:tcPr>
+          <w:p>
+            <w:pPr>
+              <w:spacing w:after="0"/>
+            </w:pPr>
+            <w:r>
+              <w:rPr>
+                <w:sz w:val="19"/>
+                <w:szCs w:val="19"/>
+              </w:rPr>
+              <w:t xml:space="preserve">jedna aktivna misija (pilula u gornjoj traci); tab Misije: „Pređi na izabranu“, „Sljedeća misija ⟳“ (krug po redu nastanka), „Ostavi za kasnije…“ (bilješka operatera + automatski snimak: front B, cilj, zadnji korak, otvorene stavke; </w:t>
+            </w:r>
+            <w:r>
+              <w:rPr>
+                <w:rFonts w:ascii="Consolas" w:cs="Consolas" w:eastAsia="Consolas" w:hAnsi="Consolas"/>
+                <w:color w:val="6B4A12"/>
+                <w:sz w:val="19"/>
+                <w:szCs w:val="19"/>
+              </w:rPr>
+              <w:t xml:space="preserve">register_snapshot</w:t>
+            </w:r>
+            <w:r>
+              <w:rPr>
+                <w:sz w:val="19"/>
+                <w:szCs w:val="19"/>
+              </w:rPr>
+              <w:t xml:space="preserve"> za Grafovi/Ideje); pri povratku kartica „Gdje si stao“ (bilješka + šta se desilo u međuvremenu). Misija na čekanju je podrazumijevano </w:t>
+            </w:r>
+            <w:r>
+              <w:rPr>
+                <w:b/>
+                <w:bCs/>
+                <w:sz w:val="19"/>
+                <w:szCs w:val="19"/>
+              </w:rPr>
+              <w:t xml:space="preserve">zamrznuta</w:t>
+            </w:r>
+            <w:r>
+              <w:rPr>
+                <w:sz w:val="19"/>
+                <w:szCs w:val="19"/>
+              </w:rPr>
+              <w:t xml:space="preserve"> (arXiv straža misije 1 tada ne radi ništa); „Dok čeka: tiho skuplja“ → radovi se čuvaju bez reda/značke i puštaju u red pri nastavku; uvijek se vraća. Mijenja samo operater (zapis sa imenom); aplikacija samo predlaže (</w:t>
+            </w:r>
+            <w:r>
+              <w:rPr>
+                <w:rFonts w:ascii="Consolas" w:cs="Consolas" w:eastAsia="Consolas" w:hAnsi="Consolas"/>
+                <w:color w:val="6B4A12"/>
+                <w:sz w:val="19"/>
+                <w:szCs w:val="19"/>
+              </w:rPr>
+              <w:t xml:space="preserve">mission-switch</w:t>
+            </w:r>
+            <w:r>
+              <w:rPr>
+                <w:sz w:val="19"/>
+                <w:szCs w:val="19"/>
+              </w:rPr>
+              <w:t xml:space="preserve"> u redu). Aktivna misija ulazi u kontekst chata. Nađeno testom: zajednička test-baza ima i druge misije → test kruga ne smije pretpostaviti tačno 2</w:t>
+            </w:r>
+          </w:p>
+        </w:tc>
+      </w:tr>
     </w:tbl>
     <w:p>
       <w:pPr>
@@ -4290,7 +4497,7 @@
         <w:t xml:space="preserve">Preostalo:</w:t>
       </w:r>
       <w:r>
-        <w:t xml:space="preserve"> oko 46–90 h.</w:t>
+        <w:t xml:space="preserve"> oko 45–90 h.</w:t>
       </w:r>
     </w:p>
     <w:p>
@@ -9123,6 +9330,85 @@
       </w:r>
       <w:r>
         <w:t xml:space="preserve"> (npr. „funkcionalnost do GL(3)“, „pod RH“): kapija odbija bezuslovnu tvrdnju koja se oslanja na nedokazanu pretpostavku, kao što sada traži „pod RH“.</w:t>
+      </w:r>
+    </w:p>
+    <w:p>
+      <w:pPr>
+        <w:spacing w:after="100"/>
+        <w:ind w:left="0"/>
+      </w:pPr>
+      <w:r>
+        <w:t xml:space="preserve">28a. </w:t>
+      </w:r>
+      <w:r>
+        <w:rPr>
+          <w:b/>
+          <w:bCs/>
+        </w:rPr>
+        <w:t xml:space="preserve">Rad po misijama u krug</w:t>
+      </w:r>
+      <w:r>
+        <w:t xml:space="preserve"> (Andrej, 2026-10-25; radi se prije 28, jer „Ideje“ treba da znaju aktivnu misiju): u svakom trenutku je </w:t>
+      </w:r>
+      <w:r>
+        <w:rPr>
+          <w:b/>
+          <w:bCs/>
+        </w:rPr>
+        <w:t xml:space="preserve">jedna aktivna misija</w:t>
+      </w:r>
+      <w:r>
+        <w:t xml:space="preserve">, vidljiva u gornjoj traci; operater je mijenja slobodno (meni) ili dugmetom </w:t>
+      </w:r>
+      <w:r>
+        <w:rPr>
+          <w:b/>
+          <w:bCs/>
+        </w:rPr>
+        <w:t xml:space="preserve">„Sljedeća misija“</w:t>
+      </w:r>
+      <w:r>
+        <w:t xml:space="preserve"> (krug 1 → 2 → 3 → 1). </w:t>
+      </w:r>
+      <w:r>
+        <w:rPr>
+          <w:b/>
+          <w:bCs/>
+        </w:rPr>
+        <w:t xml:space="preserve">„Ostavi za kasnije“</w:t>
+      </w:r>
+      <w:r>
+        <w:t xml:space="preserve">: misija prelazi u stanje </w:t>
+      </w:r>
+      <w:r>
+        <w:rPr>
+          <w:i/>
+          <w:iCs/>
+        </w:rPr>
+        <w:t xml:space="preserve">na čekanju</w:t>
+      </w:r>
+      <w:r>
+        <w:t xml:space="preserve"> sa bilješkom „gdje sam stao“ (rečenica operatera + automatski: front B, zadnji korak, otvorene stavke u redu, ideje; kasnije i prikaz u Grafovima). Pri povratku prvo kartica </w:t>
+      </w:r>
+      <w:r>
+        <w:rPr>
+          <w:b/>
+          <w:bCs/>
+        </w:rPr>
+        <w:t xml:space="preserve">„Gdje si stao“</w:t>
+      </w:r>
+      <w:r>
+        <w:t xml:space="preserve"> (bilješka + šta se desilo u međuvremenu). Misija na čekanju: </w:t>
+      </w:r>
+      <w:r>
+        <w:rPr>
+          <w:b/>
+          <w:bCs/>
+        </w:rPr>
+        <w:t xml:space="preserve">podrazumijevano potpuno zamrznuta</w:t>
+      </w:r>
+      <w:r>
+        <w:t xml:space="preserve">; operater je uvijek može prebaciti na „tiho skuplja“ (arXiv, ideje, bez značke; pri nastavku „dok te nije bilo: …“) i nazad. Aktivna misija određuje kontekst chata, rangiranje i značku „Ideja“, podrazumijevani prikaz u Grafovima i cilj adversarijalnog moda. Aplikacija nikad sama ne mijenja misiju (najviše predloži); svaka promjena u dnevniku sa imenom operatera. Misija 3 ulazi u krug kad nastane (stavka 32).</w:t>
       </w:r>
     </w:p>
     <w:p>

</xml_diff>

<commit_message>
Runda 3, stavka 28: engine za inspiracije (Ideje); prilagođavanje izmjerenom ekranu
Co-Authored-By: Claude Opus 5.5 <noreply@anthropic.com>
</commit_message>
<xml_diff>
--- a/PSE Riemann — PLAN.docx
+++ b/PSE Riemann — PLAN.docx
@@ -4464,6 +4464,393 @@
           </w:p>
         </w:tc>
       </w:tr>
+      <w:tr>
+        <w:trPr>
+          <w:tblHeader w:val="off"/>
+        </w:trPr>
+        <w:tc>
+          <w:tcPr>
+            <w:tcW w:type="dxa" w:w="1191"/>
+            <w:tcBorders>
+              <w:top w:val="single" w:color="D9D4C7" w:sz="4"/>
+              <w:left w:val="single" w:color="D9D4C7" w:sz="4"/>
+              <w:bottom w:val="single" w:color="D9D4C7" w:sz="4"/>
+              <w:right w:val="single" w:color="D9D4C7" w:sz="4"/>
+            </w:tcBorders>
+            <w:shd w:fill="F4F1EA" w:color="auto" w:val="clear"/>
+            <w:tcMar>
+              <w:top w:type="dxa" w:w="60"/>
+              <w:left w:type="dxa" w:w="100"/>
+              <w:bottom w:type="dxa" w:w="60"/>
+              <w:right w:type="dxa" w:w="100"/>
+            </w:tcMar>
+          </w:tcPr>
+          <w:p>
+            <w:pPr>
+              <w:spacing w:after="0"/>
+            </w:pPr>
+            <w:r>
+              <w:rPr>
+                <w:sz w:val="19"/>
+                <w:szCs w:val="19"/>
+              </w:rPr>
+              <w:t xml:space="preserve">2026-10-26</w:t>
+            </w:r>
+          </w:p>
+        </w:tc>
+        <w:tc>
+          <w:tcPr>
+            <w:tcW w:type="dxa" w:w="1732"/>
+            <w:tcBorders>
+              <w:top w:val="single" w:color="D9D4C7" w:sz="4"/>
+              <w:left w:val="single" w:color="D9D4C7" w:sz="4"/>
+              <w:bottom w:val="single" w:color="D9D4C7" w:sz="4"/>
+              <w:right w:val="single" w:color="D9D4C7" w:sz="4"/>
+            </w:tcBorders>
+            <w:shd w:fill="F4F1EA" w:color="auto" w:val="clear"/>
+            <w:tcMar>
+              <w:top w:type="dxa" w:w="60"/>
+              <w:left w:type="dxa" w:w="100"/>
+              <w:bottom w:type="dxa" w:w="60"/>
+              <w:right w:type="dxa" w:w="100"/>
+            </w:tcMar>
+          </w:tcPr>
+          <w:p>
+            <w:pPr>
+              <w:spacing w:after="0"/>
+            </w:pPr>
+            <w:r>
+              <w:rPr>
+                <w:sz w:val="19"/>
+                <w:szCs w:val="19"/>
+              </w:rPr>
+              <w:t xml:space="preserve">28 · engine za inspiracije „Ideje“</w:t>
+            </w:r>
+          </w:p>
+        </w:tc>
+        <w:tc>
+          <w:tcPr>
+            <w:tcW w:type="dxa" w:w="974"/>
+            <w:tcBorders>
+              <w:top w:val="single" w:color="D9D4C7" w:sz="4"/>
+              <w:left w:val="single" w:color="D9D4C7" w:sz="4"/>
+              <w:bottom w:val="single" w:color="D9D4C7" w:sz="4"/>
+              <w:right w:val="single" w:color="D9D4C7" w:sz="4"/>
+            </w:tcBorders>
+            <w:shd w:fill="F4F1EA" w:color="auto" w:val="clear"/>
+            <w:tcMar>
+              <w:top w:type="dxa" w:w="60"/>
+              <w:left w:type="dxa" w:w="100"/>
+              <w:bottom w:type="dxa" w:w="60"/>
+              <w:right w:type="dxa" w:w="100"/>
+            </w:tcMar>
+          </w:tcPr>
+          <w:p>
+            <w:pPr>
+              <w:spacing w:after="0"/>
+            </w:pPr>
+            <w:r>
+              <w:rPr>
+                <w:sz w:val="19"/>
+                <w:szCs w:val="19"/>
+              </w:rPr>
+              <w:t xml:space="preserve">✅</w:t>
+            </w:r>
+          </w:p>
+        </w:tc>
+        <w:tc>
+          <w:tcPr>
+            <w:tcW w:type="dxa" w:w="1407"/>
+            <w:tcBorders>
+              <w:top w:val="single" w:color="D9D4C7" w:sz="4"/>
+              <w:left w:val="single" w:color="D9D4C7" w:sz="4"/>
+              <w:bottom w:val="single" w:color="D9D4C7" w:sz="4"/>
+              <w:right w:val="single" w:color="D9D4C7" w:sz="4"/>
+            </w:tcBorders>
+            <w:shd w:fill="F4F1EA" w:color="auto" w:val="clear"/>
+            <w:tcMar>
+              <w:top w:type="dxa" w:w="60"/>
+              <w:left w:type="dxa" w:w="100"/>
+              <w:bottom w:type="dxa" w:w="60"/>
+              <w:right w:type="dxa" w:w="100"/>
+            </w:tcMar>
+          </w:tcPr>
+          <w:p>
+            <w:pPr>
+              <w:spacing w:after="0"/>
+            </w:pPr>
+            <w:r>
+              <w:rPr>
+                <w:sz w:val="19"/>
+                <w:szCs w:val="19"/>
+              </w:rPr>
+              <w:t xml:space="preserve">pytest 228/228, selftest ✅, snimak </w:t>
+            </w:r>
+            <w:r>
+              <w:rPr>
+                <w:rFonts w:ascii="Consolas" w:cs="Consolas" w:eastAsia="Consolas" w:hAnsi="Consolas"/>
+                <w:color w:val="6B4A12"/>
+                <w:sz w:val="19"/>
+                <w:szCs w:val="19"/>
+              </w:rPr>
+              <w:t xml:space="preserve">r3_ideas.png</w:t>
+            </w:r>
+          </w:p>
+        </w:tc>
+        <w:tc>
+          <w:tcPr>
+            <w:tcW w:type="dxa" w:w="4334"/>
+            <w:tcBorders>
+              <w:top w:val="single" w:color="D9D4C7" w:sz="4"/>
+              <w:left w:val="single" w:color="D9D4C7" w:sz="4"/>
+              <w:bottom w:val="single" w:color="D9D4C7" w:sz="4"/>
+              <w:right w:val="single" w:color="D9D4C7" w:sz="4"/>
+            </w:tcBorders>
+            <w:shd w:fill="F4F1EA" w:color="auto" w:val="clear"/>
+            <w:tcMar>
+              <w:top w:type="dxa" w:w="60"/>
+              <w:left w:type="dxa" w:w="100"/>
+              <w:bottom w:type="dxa" w:w="60"/>
+              <w:right w:type="dxa" w:w="100"/>
+            </w:tcMar>
+          </w:tcPr>
+          <w:p>
+            <w:pPr>
+              <w:spacing w:after="0"/>
+            </w:pPr>
+            <w:r>
+              <w:rPr>
+                <w:rFonts w:ascii="Consolas" w:cs="Consolas" w:eastAsia="Consolas" w:hAnsi="Consolas"/>
+                <w:color w:val="6B4A12"/>
+                <w:sz w:val="19"/>
+                <w:szCs w:val="19"/>
+              </w:rPr>
+              <w:t xml:space="preserve">shared_lib/ideas.py</w:t>
+            </w:r>
+            <w:r>
+              <w:rPr>
+                <w:sz w:val="19"/>
+                <w:szCs w:val="19"/>
+              </w:rPr>
+              <w:t xml:space="preserve"> + tab </w:t>
+            </w:r>
+            <w:r>
+              <w:rPr>
+                <w:b/>
+                <w:bCs/>
+                <w:sz w:val="19"/>
+                <w:szCs w:val="19"/>
+              </w:rPr>
+              <w:t xml:space="preserve">Ideje</w:t>
+            </w:r>
+            <w:r>
+              <w:rPr>
+                <w:sz w:val="19"/>
+                <w:szCs w:val="19"/>
+              </w:rPr>
+              <w:t xml:space="preserve"> (značka „Ideje (n)“, bez iskačućih prozora): arXiv krug i sedmični krug (upiti po misiji, kroz egress) → kandidati rangirani po vezi sa misijom (engleski pojmovi po misiji; aktivna misija ×1,5); bez duplikata (isti izvor/verzija ili ≥ 70 % istih riječi naslova); najviše 3 sedmično (operater mijenja 0–20); skeptik napada svaku ideju PRIJE prikaza (prigovori uz ideju; „nedostupan“ se kaže, ne krije); zadrži · odbaci · otvoreno pitanje (korak misije, NAŠE-NERECENZIRANO) · odgodi (vraća se za 7 dana); odluka jednom, samo operater; sedmični pregled. Tabela </w:t>
+            </w:r>
+            <w:r>
+              <w:rPr>
+                <w:rFonts w:ascii="Consolas" w:cs="Consolas" w:eastAsia="Consolas" w:hAnsi="Consolas"/>
+                <w:color w:val="6B4A12"/>
+                <w:sz w:val="19"/>
+                <w:szCs w:val="19"/>
+              </w:rPr>
+              <w:t xml:space="preserve">inspiracije</w:t>
+            </w:r>
+            <w:r>
+              <w:rPr>
+                <w:sz w:val="19"/>
+                <w:szCs w:val="19"/>
+              </w:rPr>
+              <w:t xml:space="preserve"> je samo u SHARED_LIB-u, kolona </w:t>
+            </w:r>
+            <w:r>
+              <w:rPr>
+                <w:rFonts w:ascii="Consolas" w:cs="Consolas" w:eastAsia="Consolas" w:hAnsi="Consolas"/>
+                <w:color w:val="6B4A12"/>
+                <w:sz w:val="19"/>
+                <w:szCs w:val="19"/>
+              </w:rPr>
+              <w:t xml:space="preserve">oznaka</w:t>
+            </w:r>
+            <w:r>
+              <w:rPr>
+                <w:sz w:val="19"/>
+                <w:szCs w:val="19"/>
+              </w:rPr>
+              <w:t xml:space="preserve">=INSPIRACIJA (vidi se i u SQL odgovoru), vault netaknut (test). Tekst modela sa tvrdnjom („dokazano“, „we prove“…) odbijen → šablon. Ubačen tekst (injection) nikad ne postaje ideja. Zamrznuta misija ne dobija ideje; „tiho skuplja“ → kandidati čekaju nastavak. Geometrijski Langlands zasijan samo kao INSPIRACIJA (misija 2, korak „Gaussove sume → kubna theta“). Nađeno snimkom: lista preuska, naslovi odsječeni → popravljeno</w:t>
+            </w:r>
+          </w:p>
+        </w:tc>
+      </w:tr>
+      <w:tr>
+        <w:trPr>
+          <w:tblHeader w:val="off"/>
+        </w:trPr>
+        <w:tc>
+          <w:tcPr>
+            <w:tcW w:type="dxa" w:w="1191"/>
+            <w:tcBorders>
+              <w:top w:val="single" w:color="D9D4C7" w:sz="4"/>
+              <w:left w:val="single" w:color="D9D4C7" w:sz="4"/>
+              <w:bottom w:val="single" w:color="D9D4C7" w:sz="4"/>
+              <w:right w:val="single" w:color="D9D4C7" w:sz="4"/>
+            </w:tcBorders>
+            <w:tcMar>
+              <w:top w:type="dxa" w:w="60"/>
+              <w:left w:type="dxa" w:w="100"/>
+              <w:bottom w:type="dxa" w:w="60"/>
+              <w:right w:type="dxa" w:w="100"/>
+            </w:tcMar>
+          </w:tcPr>
+          <w:p>
+            <w:pPr>
+              <w:spacing w:after="0"/>
+            </w:pPr>
+            <w:r>
+              <w:rPr>
+                <w:sz w:val="19"/>
+                <w:szCs w:val="19"/>
+              </w:rPr>
+              <w:t xml:space="preserve">2026-10-26</w:t>
+            </w:r>
+          </w:p>
+        </w:tc>
+        <w:tc>
+          <w:tcPr>
+            <w:tcW w:type="dxa" w:w="1732"/>
+            <w:tcBorders>
+              <w:top w:val="single" w:color="D9D4C7" w:sz="4"/>
+              <w:left w:val="single" w:color="D9D4C7" w:sz="4"/>
+              <w:bottom w:val="single" w:color="D9D4C7" w:sz="4"/>
+              <w:right w:val="single" w:color="D9D4C7" w:sz="4"/>
+            </w:tcBorders>
+            <w:tcMar>
+              <w:top w:type="dxa" w:w="60"/>
+              <w:left w:type="dxa" w:w="100"/>
+              <w:bottom w:type="dxa" w:w="60"/>
+              <w:right w:type="dxa" w:w="100"/>
+            </w:tcMar>
+          </w:tcPr>
+          <w:p>
+            <w:pPr>
+              <w:spacing w:after="0"/>
+            </w:pPr>
+            <w:r>
+              <w:rPr>
+                <w:sz w:val="19"/>
+                <w:szCs w:val="19"/>
+              </w:rPr>
+              <w:t xml:space="preserve">— · prilagođavanje ekranu</w:t>
+            </w:r>
+          </w:p>
+        </w:tc>
+        <w:tc>
+          <w:tcPr>
+            <w:tcW w:type="dxa" w:w="974"/>
+            <w:tcBorders>
+              <w:top w:val="single" w:color="D9D4C7" w:sz="4"/>
+              <w:left w:val="single" w:color="D9D4C7" w:sz="4"/>
+              <w:bottom w:val="single" w:color="D9D4C7" w:sz="4"/>
+              <w:right w:val="single" w:color="D9D4C7" w:sz="4"/>
+            </w:tcBorders>
+            <w:tcMar>
+              <w:top w:type="dxa" w:w="60"/>
+              <w:left w:type="dxa" w:w="100"/>
+              <w:bottom w:type="dxa" w:w="60"/>
+              <w:right w:type="dxa" w:w="100"/>
+            </w:tcMar>
+          </w:tcPr>
+          <w:p>
+            <w:pPr>
+              <w:spacing w:after="0"/>
+            </w:pPr>
+            <w:r>
+              <w:rPr>
+                <w:sz w:val="19"/>
+                <w:szCs w:val="19"/>
+              </w:rPr>
+              <w:t xml:space="preserve">✅</w:t>
+            </w:r>
+          </w:p>
+        </w:tc>
+        <w:tc>
+          <w:tcPr>
+            <w:tcW w:type="dxa" w:w="1407"/>
+            <w:tcBorders>
+              <w:top w:val="single" w:color="D9D4C7" w:sz="4"/>
+              <w:left w:val="single" w:color="D9D4C7" w:sz="4"/>
+              <w:bottom w:val="single" w:color="D9D4C7" w:sz="4"/>
+              <w:right w:val="single" w:color="D9D4C7" w:sz="4"/>
+            </w:tcBorders>
+            <w:tcMar>
+              <w:top w:type="dxa" w:w="60"/>
+              <w:left w:type="dxa" w:w="100"/>
+              <w:bottom w:type="dxa" w:w="60"/>
+              <w:right w:type="dxa" w:w="100"/>
+            </w:tcMar>
+          </w:tcPr>
+          <w:p>
+            <w:pPr>
+              <w:spacing w:after="0"/>
+            </w:pPr>
+            <w:r>
+              <w:rPr>
+                <w:sz w:val="19"/>
+                <w:szCs w:val="19"/>
+              </w:rPr>
+              <w:t xml:space="preserve">pytest (5 novih)</w:t>
+            </w:r>
+          </w:p>
+        </w:tc>
+        <w:tc>
+          <w:tcPr>
+            <w:tcW w:type="dxa" w:w="4334"/>
+            <w:tcBorders>
+              <w:top w:val="single" w:color="D9D4C7" w:sz="4"/>
+              <w:left w:val="single" w:color="D9D4C7" w:sz="4"/>
+              <w:bottom w:val="single" w:color="D9D4C7" w:sz="4"/>
+              <w:right w:val="single" w:color="D9D4C7" w:sz="4"/>
+            </w:tcBorders>
+            <w:tcMar>
+              <w:top w:type="dxa" w:w="60"/>
+              <w:left w:type="dxa" w:w="100"/>
+              <w:bottom w:type="dxa" w:w="60"/>
+              <w:right w:type="dxa" w:w="100"/>
+            </w:tcMar>
+          </w:tcPr>
+          <w:p>
+            <w:pPr>
+              <w:spacing w:after="0"/>
+            </w:pPr>
+            <w:r>
+              <w:rPr>
+                <w:sz w:val="19"/>
+                <w:szCs w:val="19"/>
+              </w:rPr>
+              <w:t xml:space="preserve">Andrej pitao: prozor je bio fiksno 1420×900 i tekst 26 pt (podešen za Surface). Sada </w:t>
+            </w:r>
+            <w:r>
+              <w:rPr>
+                <w:rFonts w:ascii="Consolas" w:cs="Consolas" w:eastAsia="Consolas" w:hAnsi="Consolas"/>
+                <w:color w:val="6B4A12"/>
+                <w:sz w:val="19"/>
+                <w:szCs w:val="19"/>
+              </w:rPr>
+              <w:t xml:space="preserve">pse_r/screen.py</w:t>
+            </w:r>
+            <w:r>
+              <w:rPr>
+                <w:sz w:val="19"/>
+                <w:szCs w:val="19"/>
+              </w:rPr>
+              <w:t xml:space="preserve">: mjeri stvarni DPI (piksela / fizičkih inča) → isti fizički tekst (~12 pt) svuda (Surface ≈ 26 pt, ovaj Dell HDMI 480 mm ≈ 12,7 pt); ekran bez vjerodostojne veličine = nije mjerenje (rezerva, ograničena širinom); uzak ekran drži ~70 znakova; prozor 92 % dostupne površine, centriran; zapamćena geometrija samo ako još staje na ekran (laptop ↔ monitor). Tvoja veličina teksta (Ctrl +/−) uvijek ima prednost. Mjera ide u dnevnik pri pokretanju</w:t>
+            </w:r>
+          </w:p>
+        </w:tc>
+      </w:tr>
     </w:tbl>
     <w:p>
       <w:pPr>
@@ -4482,7 +4869,7 @@
         <w:t xml:space="preserve">Sljedeće:</w:t>
       </w:r>
       <w:r>
-        <w:t xml:space="preserve"> stavka 28 (engine za inspiracije „Ideje“), pa 29–33; izdanje 34–38 (38 = .deb + .exe) posljednje.</w:t>
+        <w:t xml:space="preserve"> provjera da svi prozori staju na izmjereni ekran, pa stavke 29–33; izdanje 34–38 (38 = .deb + .exe) posljednje.</w:t>
       </w:r>
     </w:p>
     <w:p>
@@ -4497,7 +4884,7 @@
         <w:t xml:space="preserve">Preostalo:</w:t>
       </w:r>
       <w:r>
-        <w:t xml:space="preserve"> oko 45–90 h.</w:t>
+        <w:t xml:space="preserve"> oko 41–85 h.</w:t>
       </w:r>
     </w:p>
     <w:p>

</xml_diff>

<commit_message>
Svi prozori staju na izmjereni ekran: traka se lomi, tabovi u klizaču, ekran pod mišem, dijalozi po mjeri
Co-Authored-By: Claude Opus 5.5 <noreply@anthropic.com>
</commit_message>
<xml_diff>
--- a/PSE Riemann — PLAN.docx
+++ b/PSE Riemann — PLAN.docx
@@ -4851,6 +4851,193 @@
           </w:p>
         </w:tc>
       </w:tr>
+      <w:tr>
+        <w:trPr>
+          <w:tblHeader w:val="off"/>
+        </w:trPr>
+        <w:tc>
+          <w:tcPr>
+            <w:tcW w:type="dxa" w:w="1191"/>
+            <w:tcBorders>
+              <w:top w:val="single" w:color="D9D4C7" w:sz="4"/>
+              <w:left w:val="single" w:color="D9D4C7" w:sz="4"/>
+              <w:bottom w:val="single" w:color="D9D4C7" w:sz="4"/>
+              <w:right w:val="single" w:color="D9D4C7" w:sz="4"/>
+            </w:tcBorders>
+            <w:shd w:fill="F4F1EA" w:color="auto" w:val="clear"/>
+            <w:tcMar>
+              <w:top w:type="dxa" w:w="60"/>
+              <w:left w:type="dxa" w:w="100"/>
+              <w:bottom w:type="dxa" w:w="60"/>
+              <w:right w:type="dxa" w:w="100"/>
+            </w:tcMar>
+          </w:tcPr>
+          <w:p>
+            <w:pPr>
+              <w:spacing w:after="0"/>
+            </w:pPr>
+            <w:r>
+              <w:rPr>
+                <w:sz w:val="19"/>
+                <w:szCs w:val="19"/>
+              </w:rPr>
+              <w:t xml:space="preserve">2026-10-26</w:t>
+            </w:r>
+          </w:p>
+        </w:tc>
+        <w:tc>
+          <w:tcPr>
+            <w:tcW w:type="dxa" w:w="1732"/>
+            <w:tcBorders>
+              <w:top w:val="single" w:color="D9D4C7" w:sz="4"/>
+              <w:left w:val="single" w:color="D9D4C7" w:sz="4"/>
+              <w:bottom w:val="single" w:color="D9D4C7" w:sz="4"/>
+              <w:right w:val="single" w:color="D9D4C7" w:sz="4"/>
+            </w:tcBorders>
+            <w:shd w:fill="F4F1EA" w:color="auto" w:val="clear"/>
+            <w:tcMar>
+              <w:top w:type="dxa" w:w="60"/>
+              <w:left w:type="dxa" w:w="100"/>
+              <w:bottom w:type="dxa" w:w="60"/>
+              <w:right w:type="dxa" w:w="100"/>
+            </w:tcMar>
+          </w:tcPr>
+          <w:p>
+            <w:pPr>
+              <w:spacing w:after="0"/>
+            </w:pPr>
+            <w:r>
+              <w:rPr>
+                <w:sz w:val="19"/>
+                <w:szCs w:val="19"/>
+              </w:rPr>
+              <w:t xml:space="preserve">— · svi prozori staju na izmjereni ekran</w:t>
+            </w:r>
+          </w:p>
+        </w:tc>
+        <w:tc>
+          <w:tcPr>
+            <w:tcW w:type="dxa" w:w="974"/>
+            <w:tcBorders>
+              <w:top w:val="single" w:color="D9D4C7" w:sz="4"/>
+              <w:left w:val="single" w:color="D9D4C7" w:sz="4"/>
+              <w:bottom w:val="single" w:color="D9D4C7" w:sz="4"/>
+              <w:right w:val="single" w:color="D9D4C7" w:sz="4"/>
+            </w:tcBorders>
+            <w:shd w:fill="F4F1EA" w:color="auto" w:val="clear"/>
+            <w:tcMar>
+              <w:top w:type="dxa" w:w="60"/>
+              <w:left w:type="dxa" w:w="100"/>
+              <w:bottom w:type="dxa" w:w="60"/>
+              <w:right w:type="dxa" w:w="100"/>
+            </w:tcMar>
+          </w:tcPr>
+          <w:p>
+            <w:pPr>
+              <w:spacing w:after="0"/>
+            </w:pPr>
+            <w:r>
+              <w:rPr>
+                <w:sz w:val="19"/>
+                <w:szCs w:val="19"/>
+              </w:rPr>
+              <w:t xml:space="preserve">✅</w:t>
+            </w:r>
+          </w:p>
+        </w:tc>
+        <w:tc>
+          <w:tcPr>
+            <w:tcW w:type="dxa" w:w="1407"/>
+            <w:tcBorders>
+              <w:top w:val="single" w:color="D9D4C7" w:sz="4"/>
+              <w:left w:val="single" w:color="D9D4C7" w:sz="4"/>
+              <w:bottom w:val="single" w:color="D9D4C7" w:sz="4"/>
+              <w:right w:val="single" w:color="D9D4C7" w:sz="4"/>
+            </w:tcBorders>
+            <w:shd w:fill="F4F1EA" w:color="auto" w:val="clear"/>
+            <w:tcMar>
+              <w:top w:type="dxa" w:w="60"/>
+              <w:left w:type="dxa" w:w="100"/>
+              <w:bottom w:type="dxa" w:w="60"/>
+              <w:right w:type="dxa" w:w="100"/>
+            </w:tcMar>
+          </w:tcPr>
+          <w:p>
+            <w:pPr>
+              <w:spacing w:after="0"/>
+            </w:pPr>
+            <w:r>
+              <w:rPr>
+                <w:sz w:val="19"/>
+                <w:szCs w:val="19"/>
+              </w:rPr>
+              <w:t xml:space="preserve">pytest 229/229 + test „svi prozori × 4 ekrana“; živo na ovom Dellu (</w:t>
+            </w:r>
+            <w:r>
+              <w:rPr>
+                <w:rFonts w:ascii="Consolas" w:cs="Consolas" w:eastAsia="Consolas" w:hAnsi="Consolas"/>
+                <w:color w:val="6B4A12"/>
+                <w:sz w:val="19"/>
+                <w:szCs w:val="19"/>
+              </w:rPr>
+              <w:t xml:space="preserve">r3_screen_fit_dell.png</w:t>
+            </w:r>
+            <w:r>
+              <w:rPr>
+                <w:sz w:val="19"/>
+                <w:szCs w:val="19"/>
+              </w:rPr>
+              <w:t xml:space="preserve">)</w:t>
+            </w:r>
+          </w:p>
+        </w:tc>
+        <w:tc>
+          <w:tcPr>
+            <w:tcW w:type="dxa" w:w="4334"/>
+            <w:tcBorders>
+              <w:top w:val="single" w:color="D9D4C7" w:sz="4"/>
+              <w:left w:val="single" w:color="D9D4C7" w:sz="4"/>
+              <w:bottom w:val="single" w:color="D9D4C7" w:sz="4"/>
+              <w:right w:val="single" w:color="D9D4C7" w:sz="4"/>
+            </w:tcBorders>
+            <w:shd w:fill="F4F1EA" w:color="auto" w:val="clear"/>
+            <w:tcMar>
+              <w:top w:type="dxa" w:w="60"/>
+              <w:left w:type="dxa" w:w="100"/>
+              <w:bottom w:type="dxa" w:w="60"/>
+              <w:right w:type="dxa" w:w="100"/>
+            </w:tcMar>
+          </w:tcPr>
+          <w:p>
+            <w:pPr>
+              <w:spacing w:after="0"/>
+            </w:pPr>
+            <w:r>
+              <w:rPr>
+                <w:sz w:val="19"/>
+                <w:szCs w:val="19"/>
+              </w:rPr>
+              <w:t xml:space="preserve">Provjera je našla </w:t>
+            </w:r>
+            <w:r>
+              <w:rPr>
+                <w:b/>
+                <w:bCs/>
+                <w:sz w:val="19"/>
+                <w:szCs w:val="19"/>
+              </w:rPr>
+              <w:t xml:space="preserve">staru grešku</w:t>
+            </w:r>
+            <w:r>
+              <w:rPr>
+                <w:sz w:val="19"/>
+                <w:szCs w:val="19"/>
+              </w:rPr>
+              <w:t xml:space="preserve">: gornja traka (sve pilule u jednom redu) tražila je najmanje 4309 px širine na Surfaceu / 2378 px na Dellu → glavni prozor širi od ekrana, desni dio (i „Čeka tvoju odluku“) van ekrana; čarobnjak visok 1628 px; Podešavanje najmanje 1000×640 (Acer ima ~738 px visine). Popravljeno: traka se lomi u redove (FlowLayout); svaki tab je u klizaču; trake dugmadi u Misijama i Idejama se lome; padajući meniji sa dugim nazivima misija skraćeni; Pregled 4 → 2 → 1 kolona po širini; čarobnjak sa klizačem; čarobnjak/Podešavanje/paleta/opasno upozorenje veličinu uzimaju iz izmjerenog ekrana (najmanje pola ekrana, najviše 92 %). Živo: dva monitora — Qt je mjerio „primarni“ DP-2 (1280×1024), a prozor se otvarao na HDMI-1 → sada se mjeri ekran pod mišem (HDMI-1, 101,6 DPI → 12,7 pt, prozor 1766×993). Rezultat: 0 prekoračenja na Surface / Dell / Acer / nemjereni 1366 ekran</w:t>
+            </w:r>
+          </w:p>
+        </w:tc>
+      </w:tr>
     </w:tbl>
     <w:p>
       <w:pPr>
@@ -4869,7 +5056,7 @@
         <w:t xml:space="preserve">Sljedeće:</w:t>
       </w:r>
       <w:r>
-        <w:t xml:space="preserve"> provjera da svi prozori staju na izmjereni ekran, pa stavke 29–33; izdanje 34–38 (38 = .deb + .exe) posljednje.</w:t>
+        <w:t xml:space="preserve"> stavka 29 (interaktivni grafovi), pa 30–33; izdanje 34–38 (38 = .deb + .exe) posljednje.</w:t>
       </w:r>
     </w:p>
     <w:p>
@@ -4884,7 +5071,7 @@
         <w:t xml:space="preserve">Preostalo:</w:t>
       </w:r>
       <w:r>
-        <w:t xml:space="preserve"> oko 41–85 h.</w:t>
+        <w:t xml:space="preserve"> oko 40–84 h.</w:t>
       </w:r>
     </w:p>
     <w:p>

</xml_diff>

<commit_message>
Runda 3, stavka 29 (korak 1/6): računsko jezgro grafova — sigurni izrazi, funkcije projekta, sve o tački, računi na zahtjev, red sa prekidom
Co-Authored-By: Claude Opus 5.5 <noreply@anthropic.com>
</commit_message>
<xml_diff>
--- a/PSE Riemann — PLAN.docx
+++ b/PSE Riemann — PLAN.docx
@@ -5034,6 +5034,277 @@
                 <w:szCs w:val="19"/>
               </w:rPr>
               <w:t xml:space="preserve">: gornja traka (sve pilule u jednom redu) tražila je najmanje 4309 px širine na Surfaceu / 2378 px na Dellu → glavni prozor širi od ekrana, desni dio (i „Čeka tvoju odluku“) van ekrana; čarobnjak visok 1628 px; Podešavanje najmanje 1000×640 (Acer ima ~738 px visine). Popravljeno: traka se lomi u redove (FlowLayout); svaki tab je u klizaču; trake dugmadi u Misijama i Idejama se lome; padajući meniji sa dugim nazivima misija skraćeni; Pregled 4 → 2 → 1 kolona po širini; čarobnjak sa klizačem; čarobnjak/Podešavanje/paleta/opasno upozorenje veličinu uzimaju iz izmjerenog ekrana (najmanje pola ekrana, najviše 92 %). Živo: dva monitora — Qt je mjerio „primarni“ DP-2 (1280×1024), a prozor se otvarao na HDMI-1 → sada se mjeri ekran pod mišem (HDMI-1, 101,6 DPI → 12,7 pt, prozor 1766×993). Rezultat: 0 prekoračenja na Surface / Dell / Acer / nemjereni 1366 ekran</w:t>
+            </w:r>
+          </w:p>
+        </w:tc>
+      </w:tr>
+      <w:tr>
+        <w:trPr>
+          <w:tblHeader w:val="off"/>
+        </w:trPr>
+        <w:tc>
+          <w:tcPr>
+            <w:tcW w:type="dxa" w:w="1191"/>
+            <w:tcBorders>
+              <w:top w:val="single" w:color="D9D4C7" w:sz="4"/>
+              <w:left w:val="single" w:color="D9D4C7" w:sz="4"/>
+              <w:bottom w:val="single" w:color="D9D4C7" w:sz="4"/>
+              <w:right w:val="single" w:color="D9D4C7" w:sz="4"/>
+            </w:tcBorders>
+            <w:tcMar>
+              <w:top w:type="dxa" w:w="60"/>
+              <w:left w:type="dxa" w:w="100"/>
+              <w:bottom w:type="dxa" w:w="60"/>
+              <w:right w:type="dxa" w:w="100"/>
+            </w:tcMar>
+          </w:tcPr>
+          <w:p>
+            <w:pPr>
+              <w:spacing w:after="0"/>
+            </w:pPr>
+            <w:r>
+              <w:rPr>
+                <w:sz w:val="19"/>
+                <w:szCs w:val="19"/>
+              </w:rPr>
+              <w:t xml:space="preserve">2026-10-26</w:t>
+            </w:r>
+          </w:p>
+        </w:tc>
+        <w:tc>
+          <w:tcPr>
+            <w:tcW w:type="dxa" w:w="1732"/>
+            <w:tcBorders>
+              <w:top w:val="single" w:color="D9D4C7" w:sz="4"/>
+              <w:left w:val="single" w:color="D9D4C7" w:sz="4"/>
+              <w:bottom w:val="single" w:color="D9D4C7" w:sz="4"/>
+              <w:right w:val="single" w:color="D9D4C7" w:sz="4"/>
+            </w:tcBorders>
+            <w:tcMar>
+              <w:top w:type="dxa" w:w="60"/>
+              <w:left w:type="dxa" w:w="100"/>
+              <w:bottom w:type="dxa" w:w="60"/>
+              <w:right w:type="dxa" w:w="100"/>
+            </w:tcMar>
+          </w:tcPr>
+          <w:p>
+            <w:pPr>
+              <w:spacing w:after="0"/>
+            </w:pPr>
+            <w:r>
+              <w:rPr>
+                <w:sz w:val="19"/>
+                <w:szCs w:val="19"/>
+              </w:rPr>
+              <w:t xml:space="preserve">29 · grafovi, korak 1/6: računsko jezgro</w:t>
+            </w:r>
+          </w:p>
+        </w:tc>
+        <w:tc>
+          <w:tcPr>
+            <w:tcW w:type="dxa" w:w="974"/>
+            <w:tcBorders>
+              <w:top w:val="single" w:color="D9D4C7" w:sz="4"/>
+              <w:left w:val="single" w:color="D9D4C7" w:sz="4"/>
+              <w:bottom w:val="single" w:color="D9D4C7" w:sz="4"/>
+              <w:right w:val="single" w:color="D9D4C7" w:sz="4"/>
+            </w:tcBorders>
+            <w:tcMar>
+              <w:top w:type="dxa" w:w="60"/>
+              <w:left w:type="dxa" w:w="100"/>
+              <w:bottom w:type="dxa" w:w="60"/>
+              <w:right w:type="dxa" w:w="100"/>
+            </w:tcMar>
+          </w:tcPr>
+          <w:p>
+            <w:pPr>
+              <w:spacing w:after="0"/>
+            </w:pPr>
+            <w:r>
+              <w:rPr>
+                <w:sz w:val="19"/>
+                <w:szCs w:val="19"/>
+              </w:rPr>
+              <w:t xml:space="preserve">✅</w:t>
+            </w:r>
+          </w:p>
+        </w:tc>
+        <w:tc>
+          <w:tcPr>
+            <w:tcW w:type="dxa" w:w="1407"/>
+            <w:tcBorders>
+              <w:top w:val="single" w:color="D9D4C7" w:sz="4"/>
+              <w:left w:val="single" w:color="D9D4C7" w:sz="4"/>
+              <w:bottom w:val="single" w:color="D9D4C7" w:sz="4"/>
+              <w:right w:val="single" w:color="D9D4C7" w:sz="4"/>
+            </w:tcBorders>
+            <w:tcMar>
+              <w:top w:type="dxa" w:w="60"/>
+              <w:left w:type="dxa" w:w="100"/>
+              <w:bottom w:type="dxa" w:w="60"/>
+              <w:right w:type="dxa" w:w="100"/>
+            </w:tcMar>
+          </w:tcPr>
+          <w:p>
+            <w:pPr>
+              <w:spacing w:after="0"/>
+            </w:pPr>
+            <w:r>
+              <w:rPr>
+                <w:sz w:val="19"/>
+                <w:szCs w:val="19"/>
+              </w:rPr>
+              <w:t xml:space="preserve">pytest 16 novih</w:t>
+            </w:r>
+          </w:p>
+        </w:tc>
+        <w:tc>
+          <w:tcPr>
+            <w:tcW w:type="dxa" w:w="4334"/>
+            <w:tcBorders>
+              <w:top w:val="single" w:color="D9D4C7" w:sz="4"/>
+              <w:left w:val="single" w:color="D9D4C7" w:sz="4"/>
+              <w:bottom w:val="single" w:color="D9D4C7" w:sz="4"/>
+              <w:right w:val="single" w:color="D9D4C7" w:sz="4"/>
+            </w:tcBorders>
+            <w:tcMar>
+              <w:top w:type="dxa" w:w="60"/>
+              <w:left w:type="dxa" w:w="100"/>
+              <w:bottom w:type="dxa" w:w="60"/>
+              <w:right w:type="dxa" w:w="100"/>
+            </w:tcMar>
+          </w:tcPr>
+          <w:p>
+            <w:pPr>
+              <w:spacing w:after="0"/>
+            </w:pPr>
+            <w:r>
+              <w:rPr>
+                <w:rFonts w:ascii="Consolas" w:cs="Consolas" w:eastAsia="Consolas" w:hAnsi="Consolas"/>
+                <w:color w:val="6B4A12"/>
+                <w:sz w:val="19"/>
+                <w:szCs w:val="19"/>
+              </w:rPr>
+              <w:t xml:space="preserve">pse_r/graphs/</w:t>
+            </w:r>
+            <w:r>
+              <w:rPr>
+                <w:sz w:val="19"/>
+                <w:szCs w:val="19"/>
+              </w:rPr>
+              <w:t xml:space="preserve">: </w:t>
+            </w:r>
+            <w:r>
+              <w:rPr>
+                <w:rFonts w:ascii="Consolas" w:cs="Consolas" w:eastAsia="Consolas" w:hAnsi="Consolas"/>
+                <w:color w:val="6B4A12"/>
+                <w:sz w:val="19"/>
+                <w:szCs w:val="19"/>
+              </w:rPr>
+              <w:t xml:space="preserve">fexpr</w:t>
+            </w:r>
+            <w:r>
+              <w:rPr>
+                <w:sz w:val="19"/>
+                <w:szCs w:val="19"/>
+              </w:rPr>
+              <w:t xml:space="preserve"> (siguran izraz kao u </w:t>
+            </w:r>
+            <w:r>
+              <w:rPr>
+                <w:rFonts w:ascii="Consolas" w:cs="Consolas" w:eastAsia="Consolas" w:hAnsi="Consolas"/>
+                <w:color w:val="6B4A12"/>
+                <w:sz w:val="19"/>
+                <w:szCs w:val="19"/>
+              </w:rPr>
+              <w:t xml:space="preserve">methods/expr.py</w:t>
+            </w:r>
+            <w:r>
+              <w:rPr>
+                <w:sz w:val="19"/>
+                <w:szCs w:val="19"/>
+              </w:rPr>
+              <w:t xml:space="preserve">, ali sa sin/ζ/Z/Γ/Re/Im/arg; svaki literal postaje float → </w:t>
+            </w:r>
+            <w:r>
+              <w:rPr>
+                <w:rFonts w:ascii="Consolas" w:cs="Consolas" w:eastAsia="Consolas" w:hAnsi="Consolas"/>
+                <w:color w:val="6B4A12"/>
+                <w:sz w:val="19"/>
+                <w:szCs w:val="19"/>
+              </w:rPr>
+              <w:t xml:space="preserve">10**10**10</w:t>
+            </w:r>
+            <w:r>
+              <w:rPr>
+                <w:sz w:val="19"/>
+                <w:szCs w:val="19"/>
+              </w:rPr>
+              <w:t xml:space="preserve"> je NaN, nikad veliki cijeli broj; tri pozadine: numpy, mpmath, mpmath.iv); </w:t>
+            </w:r>
+            <w:r>
+              <w:rPr>
+                <w:rFonts w:ascii="Consolas" w:cs="Consolas" w:eastAsia="Consolas" w:hAnsi="Consolas"/>
+                <w:color w:val="6B4A12"/>
+                <w:sz w:val="19"/>
+                <w:szCs w:val="19"/>
+              </w:rPr>
+              <w:t xml:space="preserve">functions</w:t>
+            </w:r>
+            <w:r>
+              <w:rPr>
+                <w:sz w:val="19"/>
+                <w:szCs w:val="19"/>
+              </w:rPr>
+              <w:t xml:space="preserve"> (realne, kompleksne, površi, parametarske, polarne + ugrađene B(ℓ), E_Liu(δ), E_XS(δ), max_δ E(ℓ), B</w:t>
+            </w:r>
+            <w:r>
+              <w:rPr>
+                <w:i/>
+                <w:iCs/>
+                <w:sz w:val="19"/>
+                <w:szCs w:val="19"/>
+              </w:rPr>
+              <w:t xml:space="preserve">(t), B</w:t>
+            </w:r>
+            <w:r>
+              <w:rPr>
+                <w:sz w:val="19"/>
+                <w:szCs w:val="19"/>
+              </w:rPr>
+              <w:t xml:space="preserve">(w) sa nivoom RAD / NAŠE-NERECENZIRANO / KORISNIK i karticom; klizači ℓ, b, κ, t, w, d, niska strana, Δ); </w:t>
+            </w:r>
+            <w:r>
+              <w:rPr>
+                <w:rFonts w:ascii="Consolas" w:cs="Consolas" w:eastAsia="Consolas" w:hAnsi="Consolas"/>
+                <w:color w:val="6B4A12"/>
+                <w:sz w:val="19"/>
+                <w:szCs w:val="19"/>
+              </w:rPr>
+              <w:t xml:space="preserve">compute</w:t>
+            </w:r>
+            <w:r>
+              <w:rPr>
+                <w:sz w:val="19"/>
+                <w:szCs w:val="19"/>
+              </w:rPr>
+              <w:t xml:space="preserve"> („sve o tački“: cilj i udaljenost, presjek, zid, nula, E≤0 prolazi; najviše 4 ponude po vrsti tačke sa procjenom trajanja, skuplje od 0,3 s se samo nudi; izvod/tangenta, 2. izvod, Taylor, tačan korijen (sympy) + strogi interval-certifikat (postojanje + jedinstvenost), pomak do cilja ili dokaz da ga domen/zid sprečava, površina između funkcija, smjer proširenja za misiju; red u pozadini sa „prekini“, poštuje „→ ∞“ pauzu i RAM, keš, zapis u </w:t>
+            </w:r>
+            <w:r>
+              <w:rPr>
+                <w:rFonts w:ascii="Consolas" w:cs="Consolas" w:eastAsia="Consolas" w:hAnsi="Consolas"/>
+                <w:color w:val="6B4A12"/>
+                <w:sz w:val="19"/>
+                <w:szCs w:val="19"/>
+              </w:rPr>
+              <w:t xml:space="preserve">graph_runs</w:t>
+            </w:r>
+            <w:r>
+              <w:rPr>
+                <w:sz w:val="19"/>
+                <w:szCs w:val="19"/>
+              </w:rPr>
+              <w:t xml:space="preserve"> sa NAŠE-NERECENZIRANO). Liuov kubni polinom: korijen = B* = 0.874957019420 tačno, certifikovan. Izmjereno: B*(t) ≈ 4,6 s po tački na Dellu (Acer procjena ×1,8) → samo u pozadini. Nađeno testom: Taylor preko mpmath „step“ na float funkciji davao 2,76 umjesto 3 → upisane funkcije idu kroz mpmath na 40 cifara, ugrađene kroz fit (označeno kao procjena)</w:t>
             </w:r>
           </w:p>
         </w:tc>

</xml_diff>

<commit_message>
Runda 3, stavka 29 (korak 2/6): tab Grafovi — tri panela, kretanje u sva 4 smjera, sve o tački, računi na zahtjev, ⤢ na svakom panelu, vodič SR/EN
Co-Authored-By: Claude Opus 5.5 <noreply@anthropic.com>
</commit_message>
<xml_diff>
--- a/PSE Riemann — PLAN.docx
+++ b/PSE Riemann — PLAN.docx
@@ -5309,6 +5309,268 @@
           </w:p>
         </w:tc>
       </w:tr>
+      <w:tr>
+        <w:trPr>
+          <w:tblHeader w:val="off"/>
+        </w:trPr>
+        <w:tc>
+          <w:tcPr>
+            <w:tcW w:type="dxa" w:w="1191"/>
+            <w:tcBorders>
+              <w:top w:val="single" w:color="D9D4C7" w:sz="4"/>
+              <w:left w:val="single" w:color="D9D4C7" w:sz="4"/>
+              <w:bottom w:val="single" w:color="D9D4C7" w:sz="4"/>
+              <w:right w:val="single" w:color="D9D4C7" w:sz="4"/>
+            </w:tcBorders>
+            <w:shd w:fill="F4F1EA" w:color="auto" w:val="clear"/>
+            <w:tcMar>
+              <w:top w:type="dxa" w:w="60"/>
+              <w:left w:type="dxa" w:w="100"/>
+              <w:bottom w:type="dxa" w:w="60"/>
+              <w:right w:type="dxa" w:w="100"/>
+            </w:tcMar>
+          </w:tcPr>
+          <w:p>
+            <w:pPr>
+              <w:spacing w:after="0"/>
+            </w:pPr>
+            <w:r>
+              <w:rPr>
+                <w:sz w:val="19"/>
+                <w:szCs w:val="19"/>
+              </w:rPr>
+              <w:t xml:space="preserve">2026-10-26</w:t>
+            </w:r>
+          </w:p>
+        </w:tc>
+        <w:tc>
+          <w:tcPr>
+            <w:tcW w:type="dxa" w:w="1732"/>
+            <w:tcBorders>
+              <w:top w:val="single" w:color="D9D4C7" w:sz="4"/>
+              <w:left w:val="single" w:color="D9D4C7" w:sz="4"/>
+              <w:bottom w:val="single" w:color="D9D4C7" w:sz="4"/>
+              <w:right w:val="single" w:color="D9D4C7" w:sz="4"/>
+            </w:tcBorders>
+            <w:shd w:fill="F4F1EA" w:color="auto" w:val="clear"/>
+            <w:tcMar>
+              <w:top w:type="dxa" w:w="60"/>
+              <w:left w:type="dxa" w:w="100"/>
+              <w:bottom w:type="dxa" w:w="60"/>
+              <w:right w:type="dxa" w:w="100"/>
+            </w:tcMar>
+          </w:tcPr>
+          <w:p>
+            <w:pPr>
+              <w:spacing w:after="0"/>
+            </w:pPr>
+            <w:r>
+              <w:rPr>
+                <w:sz w:val="19"/>
+                <w:szCs w:val="19"/>
+              </w:rPr>
+              <w:t xml:space="preserve">29 · grafovi, korak 2/6: tab Grafovi</w:t>
+            </w:r>
+          </w:p>
+        </w:tc>
+        <w:tc>
+          <w:tcPr>
+            <w:tcW w:type="dxa" w:w="974"/>
+            <w:tcBorders>
+              <w:top w:val="single" w:color="D9D4C7" w:sz="4"/>
+              <w:left w:val="single" w:color="D9D4C7" w:sz="4"/>
+              <w:bottom w:val="single" w:color="D9D4C7" w:sz="4"/>
+              <w:right w:val="single" w:color="D9D4C7" w:sz="4"/>
+            </w:tcBorders>
+            <w:shd w:fill="F4F1EA" w:color="auto" w:val="clear"/>
+            <w:tcMar>
+              <w:top w:type="dxa" w:w="60"/>
+              <w:left w:type="dxa" w:w="100"/>
+              <w:bottom w:type="dxa" w:w="60"/>
+              <w:right w:type="dxa" w:w="100"/>
+            </w:tcMar>
+          </w:tcPr>
+          <w:p>
+            <w:pPr>
+              <w:spacing w:after="0"/>
+            </w:pPr>
+            <w:r>
+              <w:rPr>
+                <w:sz w:val="19"/>
+                <w:szCs w:val="19"/>
+              </w:rPr>
+              <w:t xml:space="preserve">✅</w:t>
+            </w:r>
+          </w:p>
+        </w:tc>
+        <w:tc>
+          <w:tcPr>
+            <w:tcW w:type="dxa" w:w="1407"/>
+            <w:tcBorders>
+              <w:top w:val="single" w:color="D9D4C7" w:sz="4"/>
+              <w:left w:val="single" w:color="D9D4C7" w:sz="4"/>
+              <w:bottom w:val="single" w:color="D9D4C7" w:sz="4"/>
+              <w:right w:val="single" w:color="D9D4C7" w:sz="4"/>
+            </w:tcBorders>
+            <w:shd w:fill="F4F1EA" w:color="auto" w:val="clear"/>
+            <w:tcMar>
+              <w:top w:type="dxa" w:w="60"/>
+              <w:left w:type="dxa" w:w="100"/>
+              <w:bottom w:type="dxa" w:w="60"/>
+              <w:right w:type="dxa" w:w="100"/>
+            </w:tcMar>
+          </w:tcPr>
+          <w:p>
+            <w:pPr>
+              <w:spacing w:after="0"/>
+            </w:pPr>
+            <w:r>
+              <w:rPr>
+                <w:sz w:val="19"/>
+                <w:szCs w:val="19"/>
+              </w:rPr>
+              <w:t xml:space="preserve">pytest 251/251; snimci </w:t>
+            </w:r>
+            <w:r>
+              <w:rPr>
+                <w:rFonts w:ascii="Consolas" w:cs="Consolas" w:eastAsia="Consolas" w:hAnsi="Consolas"/>
+                <w:color w:val="6B4A12"/>
+                <w:sz w:val="19"/>
+                <w:szCs w:val="19"/>
+              </w:rPr>
+              <w:t xml:space="preserve">r3_grafovi_{dell,acer,surface}.png</w:t>
+            </w:r>
+          </w:p>
+        </w:tc>
+        <w:tc>
+          <w:tcPr>
+            <w:tcW w:type="dxa" w:w="4334"/>
+            <w:tcBorders>
+              <w:top w:val="single" w:color="D9D4C7" w:sz="4"/>
+              <w:left w:val="single" w:color="D9D4C7" w:sz="4"/>
+              <w:bottom w:val="single" w:color="D9D4C7" w:sz="4"/>
+              <w:right w:val="single" w:color="D9D4C7" w:sz="4"/>
+            </w:tcBorders>
+            <w:shd w:fill="F4F1EA" w:color="auto" w:val="clear"/>
+            <w:tcMar>
+              <w:top w:type="dxa" w:w="60"/>
+              <w:left w:type="dxa" w:w="100"/>
+              <w:bottom w:type="dxa" w:w="60"/>
+              <w:right w:type="dxa" w:w="100"/>
+            </w:tcMar>
+          </w:tcPr>
+          <w:p>
+            <w:pPr>
+              <w:spacing w:after="0"/>
+            </w:pPr>
+            <w:r>
+              <w:rPr>
+                <w:rFonts w:ascii="Consolas" w:cs="Consolas" w:eastAsia="Consolas" w:hAnsi="Consolas"/>
+                <w:color w:val="6B4A12"/>
+                <w:sz w:val="19"/>
+                <w:szCs w:val="19"/>
+              </w:rPr>
+              <w:t xml:space="preserve">gui/grafovi.py</w:t>
+            </w:r>
+            <w:r>
+              <w:rPr>
+                <w:sz w:val="19"/>
+                <w:szCs w:val="19"/>
+              </w:rPr>
+              <w:t xml:space="preserve">: tri panela Funkcije · Graf · Kalkulacije (uzor Calculus Tools), tamno, neograničeno funkcija u boji (upis, uređivanje, boja, kvačica, ugrađene sa nivoom), 8 klizača (ℓ, b, κ, t, w, d, niska strana → σ</w:t>
+            </w:r>
+            <w:r>
+              <w:rPr>
+                <w:i/>
+                <w:iCs/>
+                <w:sz w:val="19"/>
+                <w:szCs w:val="19"/>
+              </w:rPr>
+              <w:t xml:space="preserve">, Δ); kretanje: prevlačenje, strelice (Shift = 40 %), ◀ ▲ ▼ ▶, točkić/+/−, ⌂; pod mišem funkcija, tačka, nivo, najbliži cilj; klik = „sve o tački“ + ≤ 4 ponude (+ „više…“), skupo samo „Želiš li da izračunam … (~N s)?“, red u pozadini + „Prekini“; dvoklik = kartica; ciljevi i zidovi; nivo u naslovu; izvoz PNG/SVG/CSV; </w:t>
+            </w:r>
+            <w:r>
+              <w:rPr>
+                <w:i/>
+                <w:iCs/>
+                <w:sz w:val="19"/>
+                <w:szCs w:val="19"/>
+              </w:rPr>
+              <w:t xml:space="preserve">svaki panel ima svoje ⤢</w:t>
+            </w:r>
+            <w:r>
+              <w:rPr>
+                <w:sz w:val="19"/>
+                <w:szCs w:val="19"/>
+              </w:rPr>
+              <w:t xml:space="preserve">* (Andrej) — raširi ga preko taba, ⤡ vraća. Skupe ugrađene (B</w:t>
+            </w:r>
+            <w:r>
+              <w:rPr>
+                <w:i/>
+                <w:iCs/>
+                <w:sz w:val="19"/>
+                <w:szCs w:val="19"/>
+              </w:rPr>
+              <w:t xml:space="preserve">(t), B</w:t>
+            </w:r>
+            <w:r>
+              <w:rPr>
+                <w:sz w:val="19"/>
+                <w:szCs w:val="19"/>
+              </w:rPr>
+              <w:t xml:space="preserve">(w)) crtaju se u pozadini iz 9 tačaka uz „računam…“. Vodič </w:t>
+            </w:r>
+            <w:r>
+              <w:rPr>
+                <w:rFonts w:ascii="Consolas" w:cs="Consolas" w:eastAsia="Consolas" w:hAnsi="Consolas"/>
+                <w:color w:val="6B4A12"/>
+                <w:sz w:val="19"/>
+                <w:szCs w:val="19"/>
+              </w:rPr>
+              <w:t xml:space="preserve">docs/VODIC-GRAFOVI-SR.md</w:t>
+            </w:r>
+            <w:r>
+              <w:rPr>
+                <w:sz w:val="19"/>
+                <w:szCs w:val="19"/>
+              </w:rPr>
+              <w:t xml:space="preserve"> / </w:t>
+            </w:r>
+            <w:r>
+              <w:rPr>
+                <w:rFonts w:ascii="Consolas" w:cs="Consolas" w:eastAsia="Consolas" w:hAnsi="Consolas"/>
+                <w:color w:val="6B4A12"/>
+                <w:sz w:val="19"/>
+                <w:szCs w:val="19"/>
+              </w:rPr>
+              <w:t xml:space="preserve">-EN.md</w:t>
+            </w:r>
+            <w:r>
+              <w:rPr>
+                <w:sz w:val="19"/>
+                <w:szCs w:val="19"/>
+              </w:rPr>
+              <w:t xml:space="preserve"> (dugme „?“). Nađeno snimcima: dugmad ponuda sa dugim tekstom i red klizača forsirali širinu → graf uzak; klizači nevidljivi (bez stila); oznake osa odsječene → ponude u listi koja prelama, bočni paneli u klizaču, stil klizača, </w:t>
+            </w:r>
+            <w:r>
+              <w:rPr>
+                <w:rFonts w:ascii="Consolas" w:cs="Consolas" w:eastAsia="Consolas" w:hAnsi="Consolas"/>
+                <w:color w:val="6B4A12"/>
+                <w:sz w:val="19"/>
+                <w:szCs w:val="19"/>
+              </w:rPr>
+              <w:t xml:space="preserve">constrained</w:t>
+            </w:r>
+            <w:r>
+              <w:rPr>
+                <w:sz w:val="19"/>
+                <w:szCs w:val="19"/>
+              </w:rPr>
+              <w:t xml:space="preserve"> raspored</w:t>
+            </w:r>
+          </w:p>
+        </w:tc>
+      </w:tr>
     </w:tbl>
     <w:p>
       <w:pPr>
@@ -5327,7 +5589,7 @@
         <w:t xml:space="preserve">Sljedeće:</w:t>
       </w:r>
       <w:r>
-        <w:t xml:space="preserve"> stavka 29 (interaktivni grafovi), pa 30–33; izdanje 34–38 (38 = .deb + .exe) posljednje.</w:t>
+        <w:t xml:space="preserve"> stavka 29, korak 3/6 (parametarski, vektorsko polje, rezerva, polarni), pa 4–6, pa 30–33; izdanje 34–38 (38 = .deb + .exe) posljednje.</w:t>
       </w:r>
     </w:p>
     <w:p>
@@ -5342,7 +5604,7 @@
         <w:t xml:space="preserve">Preostalo:</w:t>
       </w:r>
       <w:r>
-        <w:t xml:space="preserve"> oko 40–84 h.</w:t>
+        <w:t xml:space="preserve"> oko 36–78 h.</w:t>
       </w:r>
     </w:p>
     <w:p>
@@ -10779,6 +11041,52 @@
       </w:r>
       <w:r>
         <w:t xml:space="preserve"> za sve parametre metoda odjednom. Pravilo: najviše 3 dimenzije na ekranu, ostale uvijek vidljive kao klizači; profil mašine smanjuje mrežu na Aceru.</w:t>
+      </w:r>
+    </w:p>
+    <w:p>
+      <w:pPr>
+        <w:spacing w:after="100"/>
+        <w:ind w:left="820"/>
+      </w:pPr>
+      <w:r>
+        <w:rPr>
+          <w:b/>
+          <w:bCs/>
+        </w:rPr>
+        <w:t xml:space="preserve">Kretanje po grafu i vodič (Andrej, 2026-10-26):</w:t>
+      </w:r>
+      <w:r>
+        <w:t xml:space="preserve"> pomjeranje gore/dolje/lijevo/desno prevlačenjem mišem, strelicama na tastaturi (Shift = veći korak) i dugmićima ◀ ▲ ▼ ▶ na ekranu; zum točkićem, „+ / −“ i „⌂“ (vrati pogled). Uz tab ide </w:t>
+      </w:r>
+      <w:r>
+        <w:rPr>
+          <w:b/>
+          <w:bCs/>
+        </w:rPr>
+        <w:t xml:space="preserve">detaljan vodič</w:t>
+      </w:r>
+      <w:r>
+        <w:t xml:space="preserve"> </w:t>
+      </w:r>
+      <w:r>
+        <w:rPr>
+          <w:rFonts w:ascii="Consolas" w:cs="Consolas" w:eastAsia="Consolas" w:hAnsi="Consolas"/>
+          <w:color w:val="6B4A12"/>
+        </w:rPr>
+        <w:t xml:space="preserve">docs/VODIC-GRAFOVI-SR.md</w:t>
+      </w:r>
+      <w:r>
+        <w:t xml:space="preserve"> i </w:t>
+      </w:r>
+      <w:r>
+        <w:rPr>
+          <w:rFonts w:ascii="Consolas" w:cs="Consolas" w:eastAsia="Consolas" w:hAnsi="Consolas"/>
+          <w:color w:val="6B4A12"/>
+        </w:rPr>
+        <w:t xml:space="preserve">-EN.md</w:t>
+      </w:r>
+      <w:r>
+        <w:t xml:space="preserve"> (otvara se iz taba dugmetom „?“ i iz Pomoći): tri panela, upis funkcija sa primjerima, klizači, kretanje, „sve o tački“, računi na zahtjev i šta znači procjena trajanja, nivoi (RAD / NAŠE-NERECENZIRANO / KORISNIK), kompleksni i 3D prikazi, izvoz; ulazi u paket.</w:t>
       </w:r>
     </w:p>
     <w:p>

</xml_diff>

<commit_message>
Runda 3, stavka 29 (korak 3/6): parametarski, polarni, vektorsko polje nad (ℓ, κ), osjenčana rezerva
Co-Authored-By: Claude Opus 5.5 <noreply@anthropic.com>
</commit_message>
<xml_diff>
--- a/PSE Riemann — PLAN.docx
+++ b/PSE Riemann — PLAN.docx
@@ -5571,6 +5571,197 @@
           </w:p>
         </w:tc>
       </w:tr>
+      <w:tr>
+        <w:trPr>
+          <w:tblHeader w:val="off"/>
+        </w:trPr>
+        <w:tc>
+          <w:tcPr>
+            <w:tcW w:type="dxa" w:w="1191"/>
+            <w:tcBorders>
+              <w:top w:val="single" w:color="D9D4C7" w:sz="4"/>
+              <w:left w:val="single" w:color="D9D4C7" w:sz="4"/>
+              <w:bottom w:val="single" w:color="D9D4C7" w:sz="4"/>
+              <w:right w:val="single" w:color="D9D4C7" w:sz="4"/>
+            </w:tcBorders>
+            <w:tcMar>
+              <w:top w:type="dxa" w:w="60"/>
+              <w:left w:type="dxa" w:w="100"/>
+              <w:bottom w:type="dxa" w:w="60"/>
+              <w:right w:type="dxa" w:w="100"/>
+            </w:tcMar>
+          </w:tcPr>
+          <w:p>
+            <w:pPr>
+              <w:spacing w:after="0"/>
+            </w:pPr>
+            <w:r>
+              <w:rPr>
+                <w:sz w:val="19"/>
+                <w:szCs w:val="19"/>
+              </w:rPr>
+              <w:t xml:space="preserve">2026-10-26</w:t>
+            </w:r>
+          </w:p>
+        </w:tc>
+        <w:tc>
+          <w:tcPr>
+            <w:tcW w:type="dxa" w:w="1732"/>
+            <w:tcBorders>
+              <w:top w:val="single" w:color="D9D4C7" w:sz="4"/>
+              <w:left w:val="single" w:color="D9D4C7" w:sz="4"/>
+              <w:bottom w:val="single" w:color="D9D4C7" w:sz="4"/>
+              <w:right w:val="single" w:color="D9D4C7" w:sz="4"/>
+            </w:tcBorders>
+            <w:tcMar>
+              <w:top w:type="dxa" w:w="60"/>
+              <w:left w:type="dxa" w:w="100"/>
+              <w:bottom w:type="dxa" w:w="60"/>
+              <w:right w:type="dxa" w:w="100"/>
+            </w:tcMar>
+          </w:tcPr>
+          <w:p>
+            <w:pPr>
+              <w:spacing w:after="0"/>
+            </w:pPr>
+            <w:r>
+              <w:rPr>
+                <w:sz w:val="19"/>
+                <w:szCs w:val="19"/>
+              </w:rPr>
+              <w:t xml:space="preserve">29 · grafovi, korak 3/6: parametarski, polarni, vektorsko polje, rezerva</w:t>
+            </w:r>
+          </w:p>
+        </w:tc>
+        <w:tc>
+          <w:tcPr>
+            <w:tcW w:type="dxa" w:w="974"/>
+            <w:tcBorders>
+              <w:top w:val="single" w:color="D9D4C7" w:sz="4"/>
+              <w:left w:val="single" w:color="D9D4C7" w:sz="4"/>
+              <w:bottom w:val="single" w:color="D9D4C7" w:sz="4"/>
+              <w:right w:val="single" w:color="D9D4C7" w:sz="4"/>
+            </w:tcBorders>
+            <w:tcMar>
+              <w:top w:type="dxa" w:w="60"/>
+              <w:left w:type="dxa" w:w="100"/>
+              <w:bottom w:type="dxa" w:w="60"/>
+              <w:right w:type="dxa" w:w="100"/>
+            </w:tcMar>
+          </w:tcPr>
+          <w:p>
+            <w:pPr>
+              <w:spacing w:after="0"/>
+            </w:pPr>
+            <w:r>
+              <w:rPr>
+                <w:sz w:val="19"/>
+                <w:szCs w:val="19"/>
+              </w:rPr>
+              <w:t xml:space="preserve">✅</w:t>
+            </w:r>
+          </w:p>
+        </w:tc>
+        <w:tc>
+          <w:tcPr>
+            <w:tcW w:type="dxa" w:w="1407"/>
+            <w:tcBorders>
+              <w:top w:val="single" w:color="D9D4C7" w:sz="4"/>
+              <w:left w:val="single" w:color="D9D4C7" w:sz="4"/>
+              <w:bottom w:val="single" w:color="D9D4C7" w:sz="4"/>
+              <w:right w:val="single" w:color="D9D4C7" w:sz="4"/>
+            </w:tcBorders>
+            <w:tcMar>
+              <w:top w:type="dxa" w:w="60"/>
+              <w:left w:type="dxa" w:w="100"/>
+              <w:bottom w:type="dxa" w:w="60"/>
+              <w:right w:type="dxa" w:w="100"/>
+            </w:tcMar>
+          </w:tcPr>
+          <w:p>
+            <w:pPr>
+              <w:spacing w:after="0"/>
+            </w:pPr>
+            <w:r>
+              <w:rPr>
+                <w:sz w:val="19"/>
+                <w:szCs w:val="19"/>
+              </w:rPr>
+              <w:t xml:space="preserve">pytest 254/254; snimci </w:t>
+            </w:r>
+            <w:r>
+              <w:rPr>
+                <w:rFonts w:ascii="Consolas" w:cs="Consolas" w:eastAsia="Consolas" w:hAnsi="Consolas"/>
+                <w:color w:val="6B4A12"/>
+                <w:sz w:val="19"/>
+                <w:szCs w:val="19"/>
+              </w:rPr>
+              <w:t xml:space="preserve">r3_grafovi_{polje,putanja,polarni,rezerva}.png</w:t>
+            </w:r>
+          </w:p>
+        </w:tc>
+        <w:tc>
+          <w:tcPr>
+            <w:tcW w:type="dxa" w:w="4334"/>
+            <w:tcBorders>
+              <w:top w:val="single" w:color="D9D4C7" w:sz="4"/>
+              <w:left w:val="single" w:color="D9D4C7" w:sz="4"/>
+              <w:bottom w:val="single" w:color="D9D4C7" w:sz="4"/>
+              <w:right w:val="single" w:color="D9D4C7" w:sz="4"/>
+            </w:tcBorders>
+            <w:tcMar>
+              <w:top w:type="dxa" w:w="60"/>
+              <w:left w:type="dxa" w:w="100"/>
+              <w:bottom w:type="dxa" w:w="60"/>
+              <w:right w:type="dxa" w:w="100"/>
+            </w:tcMar>
+          </w:tcPr>
+          <w:p>
+            <w:pPr>
+              <w:spacing w:after="0"/>
+            </w:pPr>
+            <w:r>
+              <w:rPr>
+                <w:sz w:val="19"/>
+                <w:szCs w:val="19"/>
+              </w:rPr>
+              <w:t xml:space="preserve">Meni „prikaz“: Kartezijanski · Parametarski · Polarni · Vektorsko polje. Nove ugrađene: putanje (ℓ</w:t>
+            </w:r>
+            <w:r>
+              <w:rPr>
+                <w:i/>
+                <w:iCs/>
+                <w:sz w:val="19"/>
+                <w:szCs w:val="19"/>
+              </w:rPr>
+              <w:t xml:space="preserve">(t), B</w:t>
+            </w:r>
+            <w:r>
+              <w:rPr>
+                <w:sz w:val="19"/>
+                <w:szCs w:val="19"/>
+              </w:rPr>
+              <w:t xml:space="preserve">(t)) i (ℓ</w:t>
+            </w:r>
+            <w:r>
+              <w:rPr>
+                <w:i/>
+                <w:iCs/>
+                <w:sz w:val="19"/>
+                <w:szCs w:val="19"/>
+              </w:rPr>
+              <w:t xml:space="preserve">(w), B</w:t>
+            </w:r>
+            <w:r>
+              <w:rPr>
+                <w:sz w:val="19"/>
+                <w:szCs w:val="19"/>
+              </w:rPr>
+              <w:t xml:space="preserve">(w)) (u pozadini, ~7 tačaka, strelica = smjer parametra) i površ max_δ E_Liu nad (ℓ, κ) (~0,1 ms po tački → polje 40×40 odmah). Polje: boja = vrijednost, žuta linija E = 0 = granica ℓ*(κ) (leži na ℓ ≈ 0,1668, skoro nezavisno od κ — test), strelice −∇f prema prolazu metode; klik = vrijednost, gradijent, Hesijan (min/max/sedlo), „ako je ovo granica: B“. Putanja proširenja w leži tačno na pravoj B(ℓ) (kako i mora). Rezultat računa „površina između“ ostaje osjenčan na grafu (E_Liu vs E_XS). Vodič dopunjen (§5 Prikazi)</w:t>
+            </w:r>
+          </w:p>
+        </w:tc>
+      </w:tr>
     </w:tbl>
     <w:p>
       <w:pPr>
@@ -5589,7 +5780,7 @@
         <w:t xml:space="preserve">Sljedeće:</w:t>
       </w:r>
       <w:r>
-        <w:t xml:space="preserve"> stavka 29, korak 3/6 (parametarski, vektorsko polje, rezerva, polarni), pa 4–6, pa 30–33; izdanje 34–38 (38 = .deb + .exe) posljednje.</w:t>
+        <w:t xml:space="preserve"> stavka 29, korak 4/6 (kompleksni prikazi, povezani prikazi, klizač „niska strana + Δ“), pa 5–6, pa 30–33; izdanje 34–38 (38 = .deb + .exe) posljednje.</w:t>
       </w:r>
     </w:p>
     <w:p>
@@ -5604,7 +5795,7 @@
         <w:t xml:space="preserve">Preostalo:</w:t>
       </w:r>
       <w:r>
-        <w:t xml:space="preserve"> oko 36–78 h.</w:t>
+        <w:t xml:space="preserve"> oko 33–74 h.</w:t>
       </w:r>
     </w:p>
     <w:p>

</xml_diff>

<commit_message>
Runda 3, stavka 29 (korak 4/6): kompleksni fazni portret, presjek duž 1/2, povezani prikazi, klizač niska strana + Δ; plan: 29b snimak ekrana
Co-Authored-By: Claude Opus 5.5 <noreply@anthropic.com>
</commit_message>
<xml_diff>
--- a/PSE Riemann — PLAN.docx
+++ b/PSE Riemann — PLAN.docx
@@ -5762,6 +5762,186 @@
           </w:p>
         </w:tc>
       </w:tr>
+      <w:tr>
+        <w:trPr>
+          <w:tblHeader w:val="off"/>
+        </w:trPr>
+        <w:tc>
+          <w:tcPr>
+            <w:tcW w:type="dxa" w:w="1191"/>
+            <w:tcBorders>
+              <w:top w:val="single" w:color="D9D4C7" w:sz="4"/>
+              <w:left w:val="single" w:color="D9D4C7" w:sz="4"/>
+              <w:bottom w:val="single" w:color="D9D4C7" w:sz="4"/>
+              <w:right w:val="single" w:color="D9D4C7" w:sz="4"/>
+            </w:tcBorders>
+            <w:shd w:fill="F4F1EA" w:color="auto" w:val="clear"/>
+            <w:tcMar>
+              <w:top w:type="dxa" w:w="60"/>
+              <w:left w:type="dxa" w:w="100"/>
+              <w:bottom w:type="dxa" w:w="60"/>
+              <w:right w:type="dxa" w:w="100"/>
+            </w:tcMar>
+          </w:tcPr>
+          <w:p>
+            <w:pPr>
+              <w:spacing w:after="0"/>
+            </w:pPr>
+            <w:r>
+              <w:rPr>
+                <w:sz w:val="19"/>
+                <w:szCs w:val="19"/>
+              </w:rPr>
+              <w:t xml:space="preserve">2026-10-26</w:t>
+            </w:r>
+          </w:p>
+        </w:tc>
+        <w:tc>
+          <w:tcPr>
+            <w:tcW w:type="dxa" w:w="1732"/>
+            <w:tcBorders>
+              <w:top w:val="single" w:color="D9D4C7" w:sz="4"/>
+              <w:left w:val="single" w:color="D9D4C7" w:sz="4"/>
+              <w:bottom w:val="single" w:color="D9D4C7" w:sz="4"/>
+              <w:right w:val="single" w:color="D9D4C7" w:sz="4"/>
+            </w:tcBorders>
+            <w:shd w:fill="F4F1EA" w:color="auto" w:val="clear"/>
+            <w:tcMar>
+              <w:top w:type="dxa" w:w="60"/>
+              <w:left w:type="dxa" w:w="100"/>
+              <w:bottom w:type="dxa" w:w="60"/>
+              <w:right w:type="dxa" w:w="100"/>
+            </w:tcMar>
+          </w:tcPr>
+          <w:p>
+            <w:pPr>
+              <w:spacing w:after="0"/>
+            </w:pPr>
+            <w:r>
+              <w:rPr>
+                <w:sz w:val="19"/>
+                <w:szCs w:val="19"/>
+              </w:rPr>
+              <w:t xml:space="preserve">29 · grafovi, korak 4/6: kompleksni, presjek, povezani prikazi</w:t>
+            </w:r>
+          </w:p>
+        </w:tc>
+        <w:tc>
+          <w:tcPr>
+            <w:tcW w:type="dxa" w:w="974"/>
+            <w:tcBorders>
+              <w:top w:val="single" w:color="D9D4C7" w:sz="4"/>
+              <w:left w:val="single" w:color="D9D4C7" w:sz="4"/>
+              <w:bottom w:val="single" w:color="D9D4C7" w:sz="4"/>
+              <w:right w:val="single" w:color="D9D4C7" w:sz="4"/>
+            </w:tcBorders>
+            <w:shd w:fill="F4F1EA" w:color="auto" w:val="clear"/>
+            <w:tcMar>
+              <w:top w:type="dxa" w:w="60"/>
+              <w:left w:type="dxa" w:w="100"/>
+              <w:bottom w:type="dxa" w:w="60"/>
+              <w:right w:type="dxa" w:w="100"/>
+            </w:tcMar>
+          </w:tcPr>
+          <w:p>
+            <w:pPr>
+              <w:spacing w:after="0"/>
+            </w:pPr>
+            <w:r>
+              <w:rPr>
+                <w:sz w:val="19"/>
+                <w:szCs w:val="19"/>
+              </w:rPr>
+              <w:t xml:space="preserve">✅</w:t>
+            </w:r>
+          </w:p>
+        </w:tc>
+        <w:tc>
+          <w:tcPr>
+            <w:tcW w:type="dxa" w:w="1407"/>
+            <w:tcBorders>
+              <w:top w:val="single" w:color="D9D4C7" w:sz="4"/>
+              <w:left w:val="single" w:color="D9D4C7" w:sz="4"/>
+              <w:bottom w:val="single" w:color="D9D4C7" w:sz="4"/>
+              <w:right w:val="single" w:color="D9D4C7" w:sz="4"/>
+            </w:tcBorders>
+            <w:shd w:fill="F4F1EA" w:color="auto" w:val="clear"/>
+            <w:tcMar>
+              <w:top w:type="dxa" w:w="60"/>
+              <w:left w:type="dxa" w:w="100"/>
+              <w:bottom w:type="dxa" w:w="60"/>
+              <w:right w:type="dxa" w:w="100"/>
+            </w:tcMar>
+          </w:tcPr>
+          <w:p>
+            <w:pPr>
+              <w:spacing w:after="0"/>
+            </w:pPr>
+            <w:r>
+              <w:rPr>
+                <w:sz w:val="19"/>
+                <w:szCs w:val="19"/>
+              </w:rPr>
+              <w:t xml:space="preserve">pytest 257/257; snimci </w:t>
+            </w:r>
+            <w:r>
+              <w:rPr>
+                <w:rFonts w:ascii="Consolas" w:cs="Consolas" w:eastAsia="Consolas" w:hAnsi="Consolas"/>
+                <w:color w:val="6B4A12"/>
+                <w:sz w:val="19"/>
+                <w:szCs w:val="19"/>
+              </w:rPr>
+              <w:t xml:space="preserve">r3_grafovi_{kompleksni,presjek,povezani}.png</w:t>
+            </w:r>
+          </w:p>
+        </w:tc>
+        <w:tc>
+          <w:tcPr>
+            <w:tcW w:type="dxa" w:w="4334"/>
+            <w:tcBorders>
+              <w:top w:val="single" w:color="D9D4C7" w:sz="4"/>
+              <w:left w:val="single" w:color="D9D4C7" w:sz="4"/>
+              <w:bottom w:val="single" w:color="D9D4C7" w:sz="4"/>
+              <w:right w:val="single" w:color="D9D4C7" w:sz="4"/>
+            </w:tcBorders>
+            <w:shd w:fill="F4F1EA" w:color="auto" w:val="clear"/>
+            <w:tcMar>
+              <w:top w:type="dxa" w:w="60"/>
+              <w:left w:type="dxa" w:w="100"/>
+              <w:bottom w:type="dxa" w:w="60"/>
+              <w:right w:type="dxa" w:w="100"/>
+            </w:tcMar>
+          </w:tcPr>
+          <w:p>
+            <w:pPr>
+              <w:spacing w:after="0"/>
+            </w:pPr>
+            <w:r>
+              <w:rPr>
+                <w:sz w:val="19"/>
+                <w:szCs w:val="19"/>
+              </w:rPr>
+              <w:t xml:space="preserve">Fazni portret (boja = arg, svjetlina = modul f, Re f = 0 bijelo, Im f = 0 crno; kritična traka, prava 1/2, poluravan bez nula Re s &gt; σ</w:t>
+            </w:r>
+            <w:r>
+              <w:rPr>
+                <w:i/>
+                <w:iCs/>
+                <w:sz w:val="19"/>
+                <w:szCs w:val="19"/>
+              </w:rPr>
+              <w:t xml:space="preserve">, poznate nule ζ); presjek duž Re s = 1/2 (modul f, Re, Im, Hardy Z); povezani prikaz ravan (ℓ, σ) ↔ ℂ sa istom σ</w:t>
+            </w:r>
+            <w:r>
+              <w:rPr>
+                <w:sz w:val="19"/>
+                <w:szCs w:val="19"/>
+              </w:rPr>
+              <w:t xml:space="preserve">; klizač niska strana + Δ: σ* = 11/16 + niska strana + Δ (početno 3/16 → 7/8; 7/8 podnosi Δ do 1/8; σ* ≥ 1 = oblast nestala). Računi: kompleksni izvod, broj nula u pravougaoniku (princip argumenta, profinjenje gdje faza skače, „NESIGURNO“ kad ne konvergira) — ζ u [0,1·0,9]×[1·30] = 3 nule; rezidua (ζ u 1 = 1). ζ na mreži preko mpmath.fp (0,09 ms/tačka, 8× brže) → 160×160 ≈ 2 s u pozadini (Acer 100×100). Andrej je dodao 29b (snimak ekrana, F12) — u planu</w:t>
+            </w:r>
+          </w:p>
+        </w:tc>
+      </w:tr>
     </w:tbl>
     <w:p>
       <w:pPr>
@@ -5780,7 +5960,7 @@
         <w:t xml:space="preserve">Sljedeće:</w:t>
       </w:r>
       <w:r>
-        <w:t xml:space="preserve"> stavka 29, korak 4/6 (kompleksni prikazi, povezani prikazi, klizač „niska strana + Δ“), pa 5–6, pa 30–33; izdanje 34–38 (38 = .deb + .exe) posljednje.</w:t>
+        <w:t xml:space="preserve"> 29b (snimak ekrana), pa 29 korak 5/6 (3D, više dimenzija), 6/6 (Lab grafovi), pa 30–33; izdanje 34–38 (38 = .deb + .exe) posljednje.</w:t>
       </w:r>
     </w:p>
     <w:p>
@@ -5795,7 +5975,7 @@
         <w:t xml:space="preserve">Preostalo:</w:t>
       </w:r>
       <w:r>
-        <w:t xml:space="preserve"> oko 33–74 h.</w:t>
+        <w:t xml:space="preserve"> oko 30–70 h.</w:t>
       </w:r>
     </w:p>
     <w:p>
@@ -11278,6 +11458,55 @@
       </w:r>
       <w:r>
         <w:t xml:space="preserve"> (otvara se iz taba dugmetom „?“ i iz Pomoći): tri panela, upis funkcija sa primjerima, klizači, kretanje, „sve o tački“, računi na zahtjev i šta znači procjena trajanja, nivoi (RAD / NAŠE-NERECENZIRANO / KORISNIK), kompleksni i 3D prikazi, izvoz; ulazi u paket.</w:t>
+      </w:r>
+    </w:p>
+    <w:p>
+      <w:pPr>
+        <w:spacing w:after="100"/>
+        <w:ind w:left="0"/>
+      </w:pPr>
+      <w:r>
+        <w:t xml:space="preserve">29b. </w:t>
+      </w:r>
+      <w:r>
+        <w:rPr>
+          <w:b/>
+          <w:bCs/>
+        </w:rPr>
+        <w:t xml:space="preserve">Snimak ekrana u bilo kom trenutku</w:t>
+      </w:r>
+      <w:r>
+        <w:t xml:space="preserve"> (Andrej, 2026-10-26): dugme 📷 u gornjoj traci i prečica </w:t>
+      </w:r>
+      <w:r>
+        <w:rPr>
+          <w:b/>
+          <w:bCs/>
+        </w:rPr>
+        <w:t xml:space="preserve">F12</w:t>
+      </w:r>
+      <w:r>
+        <w:t xml:space="preserve"> (cijeli prozor) / </w:t>
+      </w:r>
+      <w:r>
+        <w:rPr>
+          <w:b/>
+          <w:bCs/>
+        </w:rPr>
+        <w:t xml:space="preserve">Shift+F12</w:t>
+      </w:r>
+      <w:r>
+        <w:t xml:space="preserve"> (samo aktivni tab ili panel); PNG sa datumom i vremenom u imenu ide u </w:t>
+      </w:r>
+      <w:r>
+        <w:rPr>
+          <w:rFonts w:ascii="Consolas" w:cs="Consolas" w:eastAsia="Consolas" w:hAnsi="Consolas"/>
+          <w:color w:val="6B4A12"/>
+        </w:rPr>
+        <w:t xml:space="preserve">~/Pictures/PSE-Riemann/</w:t>
+      </w:r>
+      <w:r>
+        <w:t xml:space="preserve"> (folder mijenja operater u Podešavanju); poruka u statusnoj traci sa putanjom i „Otvori folder“, bez iskačućih prozora; zapis u dnevniku (ime fajla, ne sadržaj). Radi u svakom tabu i dijalogu glavnog prozora. Ide u vodič.</w:t>
       </w:r>
     </w:p>
     <w:p>

</xml_diff>

<commit_message>
Runda 3, stavka 29b: snimak ekrana (F12 / Shift+F12 / 📷); paleta otvara prave tabove; nit provjere mreže ne ruši Qt; plan: vodiči posle izgradnje paketa
Co-Authored-By: Claude Opus 5.5 <noreply@anthropic.com>
</commit_message>
<xml_diff>
--- a/PSE Riemann — PLAN.docx
+++ b/PSE Riemann — PLAN.docx
@@ -5942,6 +5942,213 @@
           </w:p>
         </w:tc>
       </w:tr>
+      <w:tr>
+        <w:trPr>
+          <w:tblHeader w:val="off"/>
+        </w:trPr>
+        <w:tc>
+          <w:tcPr>
+            <w:tcW w:type="dxa" w:w="1191"/>
+            <w:tcBorders>
+              <w:top w:val="single" w:color="D9D4C7" w:sz="4"/>
+              <w:left w:val="single" w:color="D9D4C7" w:sz="4"/>
+              <w:bottom w:val="single" w:color="D9D4C7" w:sz="4"/>
+              <w:right w:val="single" w:color="D9D4C7" w:sz="4"/>
+            </w:tcBorders>
+            <w:tcMar>
+              <w:top w:type="dxa" w:w="60"/>
+              <w:left w:type="dxa" w:w="100"/>
+              <w:bottom w:type="dxa" w:w="60"/>
+              <w:right w:type="dxa" w:w="100"/>
+            </w:tcMar>
+          </w:tcPr>
+          <w:p>
+            <w:pPr>
+              <w:spacing w:after="0"/>
+            </w:pPr>
+            <w:r>
+              <w:rPr>
+                <w:sz w:val="19"/>
+                <w:szCs w:val="19"/>
+              </w:rPr>
+              <w:t xml:space="preserve">2026-10-26</w:t>
+            </w:r>
+          </w:p>
+        </w:tc>
+        <w:tc>
+          <w:tcPr>
+            <w:tcW w:type="dxa" w:w="1732"/>
+            <w:tcBorders>
+              <w:top w:val="single" w:color="D9D4C7" w:sz="4"/>
+              <w:left w:val="single" w:color="D9D4C7" w:sz="4"/>
+              <w:bottom w:val="single" w:color="D9D4C7" w:sz="4"/>
+              <w:right w:val="single" w:color="D9D4C7" w:sz="4"/>
+            </w:tcBorders>
+            <w:tcMar>
+              <w:top w:type="dxa" w:w="60"/>
+              <w:left w:type="dxa" w:w="100"/>
+              <w:bottom w:type="dxa" w:w="60"/>
+              <w:right w:type="dxa" w:w="100"/>
+            </w:tcMar>
+          </w:tcPr>
+          <w:p>
+            <w:pPr>
+              <w:spacing w:after="0"/>
+            </w:pPr>
+            <w:r>
+              <w:rPr>
+                <w:sz w:val="19"/>
+                <w:szCs w:val="19"/>
+              </w:rPr>
+              <w:t xml:space="preserve">29b · snimak ekrana u bilo kom trenutku</w:t>
+            </w:r>
+          </w:p>
+        </w:tc>
+        <w:tc>
+          <w:tcPr>
+            <w:tcW w:type="dxa" w:w="974"/>
+            <w:tcBorders>
+              <w:top w:val="single" w:color="D9D4C7" w:sz="4"/>
+              <w:left w:val="single" w:color="D9D4C7" w:sz="4"/>
+              <w:bottom w:val="single" w:color="D9D4C7" w:sz="4"/>
+              <w:right w:val="single" w:color="D9D4C7" w:sz="4"/>
+            </w:tcBorders>
+            <w:tcMar>
+              <w:top w:type="dxa" w:w="60"/>
+              <w:left w:type="dxa" w:w="100"/>
+              <w:bottom w:type="dxa" w:w="60"/>
+              <w:right w:type="dxa" w:w="100"/>
+            </w:tcMar>
+          </w:tcPr>
+          <w:p>
+            <w:pPr>
+              <w:spacing w:after="0"/>
+            </w:pPr>
+            <w:r>
+              <w:rPr>
+                <w:sz w:val="19"/>
+                <w:szCs w:val="19"/>
+              </w:rPr>
+              <w:t xml:space="preserve">✅</w:t>
+            </w:r>
+          </w:p>
+        </w:tc>
+        <w:tc>
+          <w:tcPr>
+            <w:tcW w:type="dxa" w:w="1407"/>
+            <w:tcBorders>
+              <w:top w:val="single" w:color="D9D4C7" w:sz="4"/>
+              <w:left w:val="single" w:color="D9D4C7" w:sz="4"/>
+              <w:bottom w:val="single" w:color="D9D4C7" w:sz="4"/>
+              <w:right w:val="single" w:color="D9D4C7" w:sz="4"/>
+            </w:tcBorders>
+            <w:tcMar>
+              <w:top w:type="dxa" w:w="60"/>
+              <w:left w:type="dxa" w:w="100"/>
+              <w:bottom w:type="dxa" w:w="60"/>
+              <w:right w:type="dxa" w:w="100"/>
+            </w:tcMar>
+          </w:tcPr>
+          <w:p>
+            <w:pPr>
+              <w:spacing w:after="0"/>
+            </w:pPr>
+            <w:r>
+              <w:rPr>
+                <w:sz w:val="19"/>
+                <w:szCs w:val="19"/>
+              </w:rPr>
+              <w:t xml:space="preserve">pytest 259/259; živo na ovom Dellu (F12, Shift+F12, 📷 → 3 PNG)</w:t>
+            </w:r>
+          </w:p>
+        </w:tc>
+        <w:tc>
+          <w:tcPr>
+            <w:tcW w:type="dxa" w:w="4334"/>
+            <w:tcBorders>
+              <w:top w:val="single" w:color="D9D4C7" w:sz="4"/>
+              <w:left w:val="single" w:color="D9D4C7" w:sz="4"/>
+              <w:bottom w:val="single" w:color="D9D4C7" w:sz="4"/>
+              <w:right w:val="single" w:color="D9D4C7" w:sz="4"/>
+            </w:tcBorders>
+            <w:tcMar>
+              <w:top w:type="dxa" w:w="60"/>
+              <w:left w:type="dxa" w:w="100"/>
+              <w:bottom w:type="dxa" w:w="60"/>
+              <w:right w:type="dxa" w:w="100"/>
+            </w:tcMar>
+          </w:tcPr>
+          <w:p>
+            <w:pPr>
+              <w:spacing w:after="0"/>
+            </w:pPr>
+            <w:r>
+              <w:rPr>
+                <w:rFonts w:ascii="Consolas" w:cs="Consolas" w:eastAsia="Consolas" w:hAnsi="Consolas"/>
+                <w:color w:val="6B4A12"/>
+                <w:sz w:val="19"/>
+                <w:szCs w:val="19"/>
+              </w:rPr>
+              <w:t xml:space="preserve">gui/snapshot.py</w:t>
+            </w:r>
+            <w:r>
+              <w:rPr>
+                <w:sz w:val="19"/>
+                <w:szCs w:val="19"/>
+              </w:rPr>
+              <w:t xml:space="preserve">: F12 = prozor ispred (glavni ili dijalog; prečica važi u cijeloj aplikaciji), Shift+F12 = samo aktivni tab, 📷 u gornjoj traci = glavni prozor; PNG </w:t>
+            </w:r>
+            <w:r>
+              <w:rPr>
+                <w:rFonts w:ascii="Consolas" w:cs="Consolas" w:eastAsia="Consolas" w:hAnsi="Consolas"/>
+                <w:color w:val="6B4A12"/>
+                <w:sz w:val="19"/>
+                <w:szCs w:val="19"/>
+              </w:rPr>
+              <w:t xml:space="preserve">pse-riemann_DATUM_VRIJEME[_tab].png</w:t>
+            </w:r>
+            <w:r>
+              <w:rPr>
+                <w:sz w:val="19"/>
+                <w:szCs w:val="19"/>
+              </w:rPr>
+              <w:t xml:space="preserve"> u </w:t>
+            </w:r>
+            <w:r>
+              <w:rPr>
+                <w:rFonts w:ascii="Consolas" w:cs="Consolas" w:eastAsia="Consolas" w:hAnsi="Consolas"/>
+                <w:color w:val="6B4A12"/>
+                <w:sz w:val="19"/>
+                <w:szCs w:val="19"/>
+              </w:rPr>
+              <w:t xml:space="preserve">~/Pictures/PSE-Riemann/</w:t>
+            </w:r>
+            <w:r>
+              <w:rPr>
+                <w:sz w:val="19"/>
+                <w:szCs w:val="19"/>
+              </w:rPr>
+              <w:t xml:space="preserve"> (folder: paleta → „Snimak ekrana — folder…“); putanja + „Otvori folder“ u statusnoj traci, bez iskačućeg prozora; dnevnik bilježi samo ime fajla. Vodiči VODIC-SR / GUIDE-EN dopunjeni. Usput: (a) paleta komandi je otvarala tabove po starim brojevima (posle dodavanja Pregled/Misije/Ideje/Grafovi „Tabla — crtaj“ je vodila na pogrešan tab) → sada po tabu; vodiči su za Ctrl+1/2/3 navodili Plan/Lab/Corpus, a stvarno su Pregled/Misije/Čeka — ispravljeno; (b) </w:t>
+            </w:r>
+            <w:r>
+              <w:rPr>
+                <w:b/>
+                <w:bCs/>
+                <w:sz w:val="19"/>
+                <w:szCs w:val="19"/>
+              </w:rPr>
+              <w:t xml:space="preserve">pravi bug</w:t>
+            </w:r>
+            <w:r>
+              <w:rPr>
+                <w:sz w:val="19"/>
+                <w:szCs w:val="19"/>
+              </w:rPr>
+              <w:t xml:space="preserve">: nit za provjeru mreže (QThread bez roditelja) uništavala se sa prozorom dok još radi → Qt prekida proces („QThread: Destroyed while thread is still running“, pao cijeli pytest) → nit sada sama završava, a dok radi drži je modul, ne prozor. Plan: kompletni SR/EN vodiči za cijelu aplikaciju pišu se posle izgradnje .deb/.exe (Andrej)</w:t>
+            </w:r>
+          </w:p>
+        </w:tc>
+      </w:tr>
     </w:tbl>
     <w:p>
       <w:pPr>
@@ -5960,7 +6167,7 @@
         <w:t xml:space="preserve">Sljedeće:</w:t>
       </w:r>
       <w:r>
-        <w:t xml:space="preserve"> 29b (snimak ekrana), pa 29 korak 5/6 (3D, više dimenzija), 6/6 (Lab grafovi), pa 30–33; izdanje 34–38 (38 = .deb + .exe) posljednje.</w:t>
+        <w:t xml:space="preserve"> 29 korak 5/6 (3D, više dimenzija), 6/6 (Lab grafovi), pa 30–33; izdanje 34–38 (38 = .deb + .exe) posljednje.</w:t>
       </w:r>
     </w:p>
     <w:p>
@@ -5975,7 +6182,7 @@
         <w:t xml:space="preserve">Preostalo:</w:t>
       </w:r>
       <w:r>
-        <w:t xml:space="preserve"> oko 30–70 h.</w:t>
+        <w:t xml:space="preserve"> oko 29–69 h.</w:t>
       </w:r>
     </w:p>
     <w:p>
@@ -11685,6 +11892,52 @@
       </w:r>
       <w:r>
         <w:t xml:space="preserve">Uputstvo za instalaciju .deb, vodiči SR/EN ažurirani.</w:t>
+      </w:r>
+    </w:p>
+    <w:p>
+      <w:pPr>
+        <w:spacing w:after="100"/>
+        <w:ind w:left="820"/>
+      </w:pPr>
+      <w:r>
+        <w:rPr>
+          <w:b/>
+          <w:bCs/>
+        </w:rPr>
+        <w:t xml:space="preserve">Redoslijed (Andrej, 2026-10-26):</w:t>
+      </w:r>
+      <w:r>
+        <w:t xml:space="preserve"> kompletni SR/EN vodiči za </w:t>
+      </w:r>
+      <w:r>
+        <w:rPr>
+          <w:b/>
+          <w:bCs/>
+        </w:rPr>
+        <w:t xml:space="preserve">cijelu aplikaciju</w:t>
+      </w:r>
+      <w:r>
+        <w:t xml:space="preserve"> pišu se tek </w:t>
+      </w:r>
+      <w:r>
+        <w:rPr>
+          <w:b/>
+          <w:bCs/>
+        </w:rPr>
+        <w:t xml:space="preserve">kad se naprave .deb i .exe</w:t>
+      </w:r>
+      <w:r>
+        <w:t xml:space="preserve">, da opisuju tačno ono što je u paketima (snimci iz instaliranog paketa); posle toga paketi se još jednom grade sa vodičima unutra. Vodiči za pojedine dijelove (npr. </w:t>
+      </w:r>
+      <w:r>
+        <w:rPr>
+          <w:rFonts w:ascii="Consolas" w:cs="Consolas" w:eastAsia="Consolas" w:hAnsi="Consolas"/>
+          <w:color w:val="6B4A12"/>
+        </w:rPr>
+        <w:t xml:space="preserve">docs/VODIC-GRAFOVI-*</w:t>
+      </w:r>
+      <w:r>
+        <w:t xml:space="preserve">) nastaju usput i ulaze u kompletne.</w:t>
       </w:r>
     </w:p>
     <w:p>

</xml_diff>

<commit_message>
Runda 3, stavka 29 (korak 5/6): 3D sa rotacijom, 4. dim. kao boja, 5. dim. kao klizač/animacija, male slike, paralelne koordinate
Co-Authored-By: Claude Opus 5.5 <noreply@anthropic.com>
</commit_message>
<xml_diff>
--- a/PSE Riemann — PLAN.docx
+++ b/PSE Riemann — PLAN.docx
@@ -6149,6 +6149,170 @@
           </w:p>
         </w:tc>
       </w:tr>
+      <w:tr>
+        <w:trPr>
+          <w:tblHeader w:val="off"/>
+        </w:trPr>
+        <w:tc>
+          <w:tcPr>
+            <w:tcW w:type="dxa" w:w="1191"/>
+            <w:tcBorders>
+              <w:top w:val="single" w:color="D9D4C7" w:sz="4"/>
+              <w:left w:val="single" w:color="D9D4C7" w:sz="4"/>
+              <w:bottom w:val="single" w:color="D9D4C7" w:sz="4"/>
+              <w:right w:val="single" w:color="D9D4C7" w:sz="4"/>
+            </w:tcBorders>
+            <w:shd w:fill="F4F1EA" w:color="auto" w:val="clear"/>
+            <w:tcMar>
+              <w:top w:type="dxa" w:w="60"/>
+              <w:left w:type="dxa" w:w="100"/>
+              <w:bottom w:type="dxa" w:w="60"/>
+              <w:right w:type="dxa" w:w="100"/>
+            </w:tcMar>
+          </w:tcPr>
+          <w:p>
+            <w:pPr>
+              <w:spacing w:after="0"/>
+            </w:pPr>
+            <w:r>
+              <w:rPr>
+                <w:sz w:val="19"/>
+                <w:szCs w:val="19"/>
+              </w:rPr>
+              <w:t xml:space="preserve">2026-10-26</w:t>
+            </w:r>
+          </w:p>
+        </w:tc>
+        <w:tc>
+          <w:tcPr>
+            <w:tcW w:type="dxa" w:w="1732"/>
+            <w:tcBorders>
+              <w:top w:val="single" w:color="D9D4C7" w:sz="4"/>
+              <w:left w:val="single" w:color="D9D4C7" w:sz="4"/>
+              <w:bottom w:val="single" w:color="D9D4C7" w:sz="4"/>
+              <w:right w:val="single" w:color="D9D4C7" w:sz="4"/>
+            </w:tcBorders>
+            <w:shd w:fill="F4F1EA" w:color="auto" w:val="clear"/>
+            <w:tcMar>
+              <w:top w:type="dxa" w:w="60"/>
+              <w:left w:type="dxa" w:w="100"/>
+              <w:bottom w:type="dxa" w:w="60"/>
+              <w:right w:type="dxa" w:w="100"/>
+            </w:tcMar>
+          </w:tcPr>
+          <w:p>
+            <w:pPr>
+              <w:spacing w:after="0"/>
+            </w:pPr>
+            <w:r>
+              <w:rPr>
+                <w:sz w:val="19"/>
+                <w:szCs w:val="19"/>
+              </w:rPr>
+              <w:t xml:space="preserve">29 · grafovi, korak 5/6: 3D i više dimenzija</w:t>
+            </w:r>
+          </w:p>
+        </w:tc>
+        <w:tc>
+          <w:tcPr>
+            <w:tcW w:type="dxa" w:w="974"/>
+            <w:tcBorders>
+              <w:top w:val="single" w:color="D9D4C7" w:sz="4"/>
+              <w:left w:val="single" w:color="D9D4C7" w:sz="4"/>
+              <w:bottom w:val="single" w:color="D9D4C7" w:sz="4"/>
+              <w:right w:val="single" w:color="D9D4C7" w:sz="4"/>
+            </w:tcBorders>
+            <w:shd w:fill="F4F1EA" w:color="auto" w:val="clear"/>
+            <w:tcMar>
+              <w:top w:type="dxa" w:w="60"/>
+              <w:left w:type="dxa" w:w="100"/>
+              <w:bottom w:type="dxa" w:w="60"/>
+              <w:right w:type="dxa" w:w="100"/>
+            </w:tcMar>
+          </w:tcPr>
+          <w:p>
+            <w:pPr>
+              <w:spacing w:after="0"/>
+            </w:pPr>
+            <w:r>
+              <w:rPr>
+                <w:sz w:val="19"/>
+                <w:szCs w:val="19"/>
+              </w:rPr>
+              <w:t xml:space="preserve">✅</w:t>
+            </w:r>
+          </w:p>
+        </w:tc>
+        <w:tc>
+          <w:tcPr>
+            <w:tcW w:type="dxa" w:w="1407"/>
+            <w:tcBorders>
+              <w:top w:val="single" w:color="D9D4C7" w:sz="4"/>
+              <w:left w:val="single" w:color="D9D4C7" w:sz="4"/>
+              <w:bottom w:val="single" w:color="D9D4C7" w:sz="4"/>
+              <w:right w:val="single" w:color="D9D4C7" w:sz="4"/>
+            </w:tcBorders>
+            <w:shd w:fill="F4F1EA" w:color="auto" w:val="clear"/>
+            <w:tcMar>
+              <w:top w:type="dxa" w:w="60"/>
+              <w:left w:type="dxa" w:w="100"/>
+              <w:bottom w:type="dxa" w:w="60"/>
+              <w:right w:type="dxa" w:w="100"/>
+            </w:tcMar>
+          </w:tcPr>
+          <w:p>
+            <w:pPr>
+              <w:spacing w:after="0"/>
+            </w:pPr>
+            <w:r>
+              <w:rPr>
+                <w:sz w:val="19"/>
+                <w:szCs w:val="19"/>
+              </w:rPr>
+              <w:t xml:space="preserve">pytest 263/263; snimci </w:t>
+            </w:r>
+            <w:r>
+              <w:rPr>
+                <w:rFonts w:ascii="Consolas" w:cs="Consolas" w:eastAsia="Consolas" w:hAnsi="Consolas"/>
+                <w:color w:val="6B4A12"/>
+                <w:sz w:val="19"/>
+                <w:szCs w:val="19"/>
+              </w:rPr>
+              <w:t xml:space="preserve">r3_grafovi_{3d_zeta,3d_eksponenti,male_slike,paralelne}.png</w:t>
+            </w:r>
+          </w:p>
+        </w:tc>
+        <w:tc>
+          <w:tcPr>
+            <w:tcW w:type="dxa" w:w="4334"/>
+            <w:tcBorders>
+              <w:top w:val="single" w:color="D9D4C7" w:sz="4"/>
+              <w:left w:val="single" w:color="D9D4C7" w:sz="4"/>
+              <w:bottom w:val="single" w:color="D9D4C7" w:sz="4"/>
+              <w:right w:val="single" w:color="D9D4C7" w:sz="4"/>
+            </w:tcBorders>
+            <w:shd w:fill="F4F1EA" w:color="auto" w:val="clear"/>
+            <w:tcMar>
+              <w:top w:type="dxa" w:w="60"/>
+              <w:left w:type="dxa" w:w="100"/>
+              <w:bottom w:type="dxa" w:w="60"/>
+              <w:right w:type="dxa" w:w="100"/>
+            </w:tcMar>
+          </w:tcPr>
+          <w:p>
+            <w:pPr>
+              <w:spacing w:after="0"/>
+            </w:pPr>
+            <w:r>
+              <w:rPr>
+                <w:sz w:val="19"/>
+                <w:szCs w:val="19"/>
+              </w:rPr>
+              <w:t xml:space="preserve">3D (rotacija mišem, strelicama ±10°/30°, ◀▲▼▶ ±9°, ⌂): modul ζ iznad ℂ obojen po arg (4. dim.; nule = jame, pol u 1 = šiljak); dvije površi z = σ i z = B(ℓ) nad (ℓ, σ) sijeku se po σ = B(ℓ) (žuto); boja po drugoj površi; 5. dim. = izabrani klizač + ▶ animacija; Male slike = 6 vrijednosti parametra; Paralelne koordinate = 8 metoda (Liu, XS, t ×3, w ×3) po osama ℓ, b, κ, B (u pozadini ~11 s). Acer: rjeđa mreža (3D 40×40, slike 36×36). Nađeno snimkom: male slike po b bile identične jer je površ max_δ E(ℓ, κ) koristila fiksni Liuov b → sada b sa klizača (početno 0,1234 = Liu), granica se zaista pomjera (najdalje kod b ≈ 0,12). „⌂“ u 3D zvao view_init na 2D osama → popravljen redoslijed</w:t>
+            </w:r>
+          </w:p>
+        </w:tc>
+      </w:tr>
     </w:tbl>
     <w:p>
       <w:pPr>
@@ -6167,7 +6331,7 @@
         <w:t xml:space="preserve">Sljedeće:</w:t>
       </w:r>
       <w:r>
-        <w:t xml:space="preserve"> 29 korak 5/6 (3D, više dimenzija), 6/6 (Lab grafovi), pa 30–33; izdanje 34–38 (38 = .deb + .exe) posljednje.</w:t>
+        <w:t xml:space="preserve"> 29 korak 6/6 (Lab grafovi na interaktivni prikaz), pa 30–33; izdanje 34–38 (38 = .deb + .exe) posljednje.</w:t>
       </w:r>
     </w:p>
     <w:p>
@@ -6182,7 +6346,7 @@
         <w:t xml:space="preserve">Preostalo:</w:t>
       </w:r>
       <w:r>
-        <w:t xml:space="preserve"> oko 29–69 h.</w:t>
+        <w:t xml:space="preserve"> oko 26–64 h.</w:t>
       </w:r>
     </w:p>
     <w:p>

</xml_diff>

<commit_message>
Runda 3, stavka 29 (korak 6/6): Lab grafovi interaktivni, PNG ostaje (Sačuvaj PNG/SVG/CSV) — stavka 29 gotova
Co-Authored-By: Claude Opus 5.5 <noreply@anthropic.com>
</commit_message>
<xml_diff>
--- a/PSE Riemann — PLAN.docx
+++ b/PSE Riemann — PLAN.docx
@@ -6313,6 +6313,279 @@
           </w:p>
         </w:tc>
       </w:tr>
+      <w:tr>
+        <w:trPr>
+          <w:tblHeader w:val="off"/>
+        </w:trPr>
+        <w:tc>
+          <w:tcPr>
+            <w:tcW w:type="dxa" w:w="1191"/>
+            <w:tcBorders>
+              <w:top w:val="single" w:color="D9D4C7" w:sz="4"/>
+              <w:left w:val="single" w:color="D9D4C7" w:sz="4"/>
+              <w:bottom w:val="single" w:color="D9D4C7" w:sz="4"/>
+              <w:right w:val="single" w:color="D9D4C7" w:sz="4"/>
+            </w:tcBorders>
+            <w:tcMar>
+              <w:top w:type="dxa" w:w="60"/>
+              <w:left w:type="dxa" w:w="100"/>
+              <w:bottom w:type="dxa" w:w="60"/>
+              <w:right w:type="dxa" w:w="100"/>
+            </w:tcMar>
+          </w:tcPr>
+          <w:p>
+            <w:pPr>
+              <w:spacing w:after="0"/>
+            </w:pPr>
+            <w:r>
+              <w:rPr>
+                <w:sz w:val="19"/>
+                <w:szCs w:val="19"/>
+              </w:rPr>
+              <w:t xml:space="preserve">2026-10-26</w:t>
+            </w:r>
+          </w:p>
+        </w:tc>
+        <w:tc>
+          <w:tcPr>
+            <w:tcW w:type="dxa" w:w="1732"/>
+            <w:tcBorders>
+              <w:top w:val="single" w:color="D9D4C7" w:sz="4"/>
+              <w:left w:val="single" w:color="D9D4C7" w:sz="4"/>
+              <w:bottom w:val="single" w:color="D9D4C7" w:sz="4"/>
+              <w:right w:val="single" w:color="D9D4C7" w:sz="4"/>
+            </w:tcBorders>
+            <w:tcMar>
+              <w:top w:type="dxa" w:w="60"/>
+              <w:left w:type="dxa" w:w="100"/>
+              <w:bottom w:type="dxa" w:w="60"/>
+              <w:right w:type="dxa" w:w="100"/>
+            </w:tcMar>
+          </w:tcPr>
+          <w:p>
+            <w:pPr>
+              <w:spacing w:after="0"/>
+            </w:pPr>
+            <w:r>
+              <w:rPr>
+                <w:sz w:val="19"/>
+                <w:szCs w:val="19"/>
+              </w:rPr>
+              <w:t xml:space="preserve">29 · grafovi, korak 6/6: Lab grafovi interaktivni — </w:t>
+            </w:r>
+            <w:r>
+              <w:rPr>
+                <w:b/>
+                <w:bCs/>
+                <w:sz w:val="19"/>
+                <w:szCs w:val="19"/>
+              </w:rPr>
+              <w:t xml:space="preserve">stavka 29 gotova</w:t>
+            </w:r>
+          </w:p>
+        </w:tc>
+        <w:tc>
+          <w:tcPr>
+            <w:tcW w:type="dxa" w:w="974"/>
+            <w:tcBorders>
+              <w:top w:val="single" w:color="D9D4C7" w:sz="4"/>
+              <w:left w:val="single" w:color="D9D4C7" w:sz="4"/>
+              <w:bottom w:val="single" w:color="D9D4C7" w:sz="4"/>
+              <w:right w:val="single" w:color="D9D4C7" w:sz="4"/>
+            </w:tcBorders>
+            <w:tcMar>
+              <w:top w:type="dxa" w:w="60"/>
+              <w:left w:type="dxa" w:w="100"/>
+              <w:bottom w:type="dxa" w:w="60"/>
+              <w:right w:type="dxa" w:w="100"/>
+            </w:tcMar>
+          </w:tcPr>
+          <w:p>
+            <w:pPr>
+              <w:spacing w:after="0"/>
+            </w:pPr>
+            <w:r>
+              <w:rPr>
+                <w:sz w:val="19"/>
+                <w:szCs w:val="19"/>
+              </w:rPr>
+              <w:t xml:space="preserve">✅</w:t>
+            </w:r>
+          </w:p>
+        </w:tc>
+        <w:tc>
+          <w:tcPr>
+            <w:tcW w:type="dxa" w:w="1407"/>
+            <w:tcBorders>
+              <w:top w:val="single" w:color="D9D4C7" w:sz="4"/>
+              <w:left w:val="single" w:color="D9D4C7" w:sz="4"/>
+              <w:bottom w:val="single" w:color="D9D4C7" w:sz="4"/>
+              <w:right w:val="single" w:color="D9D4C7" w:sz="4"/>
+            </w:tcBorders>
+            <w:tcMar>
+              <w:top w:type="dxa" w:w="60"/>
+              <w:left w:type="dxa" w:w="100"/>
+              <w:bottom w:type="dxa" w:w="60"/>
+              <w:right w:type="dxa" w:w="100"/>
+            </w:tcMar>
+          </w:tcPr>
+          <w:p>
+            <w:pPr>
+              <w:spacing w:after="0"/>
+            </w:pPr>
+            <w:r>
+              <w:rPr>
+                <w:sz w:val="19"/>
+                <w:szCs w:val="19"/>
+              </w:rPr>
+              <w:t xml:space="preserve">pytest 265/265, selftest ✅; snimak </w:t>
+            </w:r>
+            <w:r>
+              <w:rPr>
+                <w:rFonts w:ascii="Consolas" w:cs="Consolas" w:eastAsia="Consolas" w:hAnsi="Consolas"/>
+                <w:color w:val="6B4A12"/>
+                <w:sz w:val="19"/>
+                <w:szCs w:val="19"/>
+              </w:rPr>
+              <w:t xml:space="preserve">r3_lab_interaktivni.png</w:t>
+            </w:r>
+          </w:p>
+        </w:tc>
+        <w:tc>
+          <w:tcPr>
+            <w:tcW w:type="dxa" w:w="4334"/>
+            <w:tcBorders>
+              <w:top w:val="single" w:color="D9D4C7" w:sz="4"/>
+              <w:left w:val="single" w:color="D9D4C7" w:sz="4"/>
+              <w:bottom w:val="single" w:color="D9D4C7" w:sz="4"/>
+              <w:right w:val="single" w:color="D9D4C7" w:sz="4"/>
+            </w:tcBorders>
+            <w:tcMar>
+              <w:top w:type="dxa" w:w="60"/>
+              <w:left w:type="dxa" w:w="100"/>
+              <w:bottom w:type="dxa" w:w="60"/>
+              <w:right w:type="dxa" w:w="100"/>
+            </w:tcMar>
+          </w:tcPr>
+          <w:p>
+            <w:pPr>
+              <w:spacing w:after="0"/>
+            </w:pPr>
+            <w:r>
+              <w:rPr>
+                <w:rFonts w:ascii="Consolas" w:cs="Consolas" w:eastAsia="Consolas" w:hAnsi="Consolas"/>
+                <w:color w:val="6B4A12"/>
+                <w:sz w:val="19"/>
+                <w:szCs w:val="19"/>
+              </w:rPr>
+              <w:t xml:space="preserve">lab/plots.py</w:t>
+            </w:r>
+            <w:r>
+              <w:rPr>
+                <w:sz w:val="19"/>
+                <w:szCs w:val="19"/>
+              </w:rPr>
+              <w:t xml:space="preserve"> razdvojen na </w:t>
+            </w:r>
+            <w:r>
+              <w:rPr>
+                <w:rFonts w:ascii="Consolas" w:cs="Consolas" w:eastAsia="Consolas" w:hAnsi="Consolas"/>
+                <w:color w:val="6B4A12"/>
+                <w:sz w:val="19"/>
+                <w:szCs w:val="19"/>
+              </w:rPr>
+              <w:t xml:space="preserve">draw()</w:t>
+            </w:r>
+            <w:r>
+              <w:rPr>
+                <w:sz w:val="19"/>
+                <w:szCs w:val="19"/>
+              </w:rPr>
+              <w:t xml:space="preserve"> + </w:t>
+            </w:r>
+            <w:r>
+              <w:rPr>
+                <w:rFonts w:ascii="Consolas" w:cs="Consolas" w:eastAsia="Consolas" w:hAnsi="Consolas"/>
+                <w:color w:val="6B4A12"/>
+                <w:sz w:val="19"/>
+                <w:szCs w:val="19"/>
+              </w:rPr>
+              <w:t xml:space="preserve">style()</w:t>
+            </w:r>
+            <w:r>
+              <w:rPr>
+                <w:sz w:val="19"/>
+                <w:szCs w:val="19"/>
+              </w:rPr>
+              <w:t xml:space="preserve"> (isti kod crta PNG i živi prikaz); </w:t>
+            </w:r>
+            <w:r>
+              <w:rPr>
+                <w:rFonts w:ascii="Consolas" w:cs="Consolas" w:eastAsia="Consolas" w:hAnsi="Consolas"/>
+                <w:color w:val="6B4A12"/>
+                <w:sz w:val="19"/>
+                <w:szCs w:val="19"/>
+              </w:rPr>
+              <w:t xml:space="preserve">gui/lab_plot.py</w:t>
+            </w:r>
+            <w:r>
+              <w:rPr>
+                <w:sz w:val="19"/>
+                <w:szCs w:val="19"/>
+              </w:rPr>
+              <w:t xml:space="preserve">: zum, pomjeranje u 4 smjera (prevlačenje, strelice, ◀▲▼▶), ⌂, vrijednost pod mišem, ⤢, izbor grafa; run sada pamti i opis grafa (</w:t>
+            </w:r>
+            <w:r>
+              <w:rPr>
+                <w:rFonts w:ascii="Consolas" w:cs="Consolas" w:eastAsia="Consolas" w:hAnsi="Consolas"/>
+                <w:color w:val="6B4A12"/>
+                <w:sz w:val="19"/>
+                <w:szCs w:val="19"/>
+              </w:rPr>
+              <w:t xml:space="preserve">plot_specs</w:t>
+            </w:r>
+            <w:r>
+              <w:rPr>
+                <w:sz w:val="19"/>
+                <w:szCs w:val="19"/>
+              </w:rPr>
+              <w:t xml:space="preserve">). </w:t>
+            </w:r>
+            <w:r>
+              <w:rPr>
+                <w:b/>
+                <w:bCs/>
+                <w:sz w:val="19"/>
+                <w:szCs w:val="19"/>
+              </w:rPr>
+              <w:t xml:space="preserve">PNG ostaje</w:t>
+            </w:r>
+            <w:r>
+              <w:rPr>
+                <w:sz w:val="19"/>
+                <w:szCs w:val="19"/>
+              </w:rPr>
+              <w:t xml:space="preserve"> (Andrej): svaki run i dalje piše PNG (kartice ga koriste), „Sačuvaj PNG“ snima trenutni pogled (+ SVG, CSV); stari runovi bez opisa prikazuju svoj PNG. Nađeno testom: posle refaktorisanja Lab više NIJE pravio PNG (</w:t>
+            </w:r>
+            <w:r>
+              <w:rPr>
+                <w:rFonts w:ascii="Consolas" w:cs="Consolas" w:eastAsia="Consolas" w:hAnsi="Consolas"/>
+                <w:color w:val="6B4A12"/>
+                <w:sz w:val="19"/>
+                <w:szCs w:val="19"/>
+              </w:rPr>
+              <w:t xml:space="preserve">color=None</w:t>
+            </w:r>
+            <w:r>
+              <w:rPr>
+                <w:sz w:val="19"/>
+                <w:szCs w:val="19"/>
+              </w:rPr>
+              <w:t xml:space="preserve"> u svijetlom stilu) — popravljeno prije commita, test to sada čuva</w:t>
+            </w:r>
+          </w:p>
+        </w:tc>
+      </w:tr>
     </w:tbl>
     <w:p>
       <w:pPr>
@@ -6331,7 +6604,7 @@
         <w:t xml:space="preserve">Sljedeće:</w:t>
       </w:r>
       <w:r>
-        <w:t xml:space="preserve"> 29 korak 6/6 (Lab grafovi na interaktivni prikaz), pa 30–33; izdanje 34–38 (38 = .deb + .exe) posljednje.</w:t>
+        <w:t xml:space="preserve"> stavka 30 (graf znanja vizuelno), pa 31–33; izdanje 34–38 posljednje (vodiči za cijelu aplikaciju posle izgradnje paketa); izdanje 34–38 (38 = .deb + .exe) posljednje.</w:t>
       </w:r>
     </w:p>
     <w:p>
@@ -6346,7 +6619,7 @@
         <w:t xml:space="preserve">Preostalo:</w:t>
       </w:r>
       <w:r>
-        <w:t xml:space="preserve"> oko 26–64 h.</w:t>
+        <w:t xml:space="preserve"> oko 24–60 h.</w:t>
       </w:r>
     </w:p>
     <w:p>

</xml_diff>

<commit_message>
Runda 3, stavka 30: graf znanja kao mreža (teme, kartice, metode, misije, ideje), klik otvara karticu
Co-Authored-By: Claude Opus 5.5 <noreply@anthropic.com>
</commit_message>
<xml_diff>
--- a/PSE Riemann — PLAN.docx
+++ b/PSE Riemann — PLAN.docx
@@ -6586,6 +6586,211 @@
           </w:p>
         </w:tc>
       </w:tr>
+      <w:tr>
+        <w:trPr>
+          <w:tblHeader w:val="off"/>
+        </w:trPr>
+        <w:tc>
+          <w:tcPr>
+            <w:tcW w:type="dxa" w:w="1191"/>
+            <w:tcBorders>
+              <w:top w:val="single" w:color="D9D4C7" w:sz="4"/>
+              <w:left w:val="single" w:color="D9D4C7" w:sz="4"/>
+              <w:bottom w:val="single" w:color="D9D4C7" w:sz="4"/>
+              <w:right w:val="single" w:color="D9D4C7" w:sz="4"/>
+            </w:tcBorders>
+            <w:shd w:fill="F4F1EA" w:color="auto" w:val="clear"/>
+            <w:tcMar>
+              <w:top w:type="dxa" w:w="60"/>
+              <w:left w:type="dxa" w:w="100"/>
+              <w:bottom w:type="dxa" w:w="60"/>
+              <w:right w:type="dxa" w:w="100"/>
+            </w:tcMar>
+          </w:tcPr>
+          <w:p>
+            <w:pPr>
+              <w:spacing w:after="0"/>
+            </w:pPr>
+            <w:r>
+              <w:rPr>
+                <w:sz w:val="19"/>
+                <w:szCs w:val="19"/>
+              </w:rPr>
+              <w:t xml:space="preserve">2026-10-26</w:t>
+            </w:r>
+          </w:p>
+        </w:tc>
+        <w:tc>
+          <w:tcPr>
+            <w:tcW w:type="dxa" w:w="1732"/>
+            <w:tcBorders>
+              <w:top w:val="single" w:color="D9D4C7" w:sz="4"/>
+              <w:left w:val="single" w:color="D9D4C7" w:sz="4"/>
+              <w:bottom w:val="single" w:color="D9D4C7" w:sz="4"/>
+              <w:right w:val="single" w:color="D9D4C7" w:sz="4"/>
+            </w:tcBorders>
+            <w:shd w:fill="F4F1EA" w:color="auto" w:val="clear"/>
+            <w:tcMar>
+              <w:top w:type="dxa" w:w="60"/>
+              <w:left w:type="dxa" w:w="100"/>
+              <w:bottom w:type="dxa" w:w="60"/>
+              <w:right w:type="dxa" w:w="100"/>
+            </w:tcMar>
+          </w:tcPr>
+          <w:p>
+            <w:pPr>
+              <w:spacing w:after="0"/>
+            </w:pPr>
+            <w:r>
+              <w:rPr>
+                <w:sz w:val="19"/>
+                <w:szCs w:val="19"/>
+              </w:rPr>
+              <w:t xml:space="preserve">30 · graf znanja vizuelno</w:t>
+            </w:r>
+          </w:p>
+        </w:tc>
+        <w:tc>
+          <w:tcPr>
+            <w:tcW w:type="dxa" w:w="974"/>
+            <w:tcBorders>
+              <w:top w:val="single" w:color="D9D4C7" w:sz="4"/>
+              <w:left w:val="single" w:color="D9D4C7" w:sz="4"/>
+              <w:bottom w:val="single" w:color="D9D4C7" w:sz="4"/>
+              <w:right w:val="single" w:color="D9D4C7" w:sz="4"/>
+            </w:tcBorders>
+            <w:shd w:fill="F4F1EA" w:color="auto" w:val="clear"/>
+            <w:tcMar>
+              <w:top w:type="dxa" w:w="60"/>
+              <w:left w:type="dxa" w:w="100"/>
+              <w:bottom w:type="dxa" w:w="60"/>
+              <w:right w:type="dxa" w:w="100"/>
+            </w:tcMar>
+          </w:tcPr>
+          <w:p>
+            <w:pPr>
+              <w:spacing w:after="0"/>
+            </w:pPr>
+            <w:r>
+              <w:rPr>
+                <w:sz w:val="19"/>
+                <w:szCs w:val="19"/>
+              </w:rPr>
+              <w:t xml:space="preserve">✅</w:t>
+            </w:r>
+          </w:p>
+        </w:tc>
+        <w:tc>
+          <w:tcPr>
+            <w:tcW w:type="dxa" w:w="1407"/>
+            <w:tcBorders>
+              <w:top w:val="single" w:color="D9D4C7" w:sz="4"/>
+              <w:left w:val="single" w:color="D9D4C7" w:sz="4"/>
+              <w:bottom w:val="single" w:color="D9D4C7" w:sz="4"/>
+              <w:right w:val="single" w:color="D9D4C7" w:sz="4"/>
+            </w:tcBorders>
+            <w:shd w:fill="F4F1EA" w:color="auto" w:val="clear"/>
+            <w:tcMar>
+              <w:top w:type="dxa" w:w="60"/>
+              <w:left w:type="dxa" w:w="100"/>
+              <w:bottom w:type="dxa" w:w="60"/>
+              <w:right w:type="dxa" w:w="100"/>
+            </w:tcMar>
+          </w:tcPr>
+          <w:p>
+            <w:pPr>
+              <w:spacing w:after="0"/>
+            </w:pPr>
+            <w:r>
+              <w:rPr>
+                <w:sz w:val="19"/>
+                <w:szCs w:val="19"/>
+              </w:rPr>
+              <w:t xml:space="preserve">pytest 268/268; snimak </w:t>
+            </w:r>
+            <w:r>
+              <w:rPr>
+                <w:rFonts w:ascii="Consolas" w:cs="Consolas" w:eastAsia="Consolas" w:hAnsi="Consolas"/>
+                <w:color w:val="6B4A12"/>
+                <w:sz w:val="19"/>
+                <w:szCs w:val="19"/>
+              </w:rPr>
+              <w:t xml:space="preserve">r3_graf_znanja.png</w:t>
+            </w:r>
+          </w:p>
+        </w:tc>
+        <w:tc>
+          <w:tcPr>
+            <w:tcW w:type="dxa" w:w="4334"/>
+            <w:tcBorders>
+              <w:top w:val="single" w:color="D9D4C7" w:sz="4"/>
+              <w:left w:val="single" w:color="D9D4C7" w:sz="4"/>
+              <w:bottom w:val="single" w:color="D9D4C7" w:sz="4"/>
+              <w:right w:val="single" w:color="D9D4C7" w:sz="4"/>
+            </w:tcBorders>
+            <w:shd w:fill="F4F1EA" w:color="auto" w:val="clear"/>
+            <w:tcMar>
+              <w:top w:type="dxa" w:w="60"/>
+              <w:left w:type="dxa" w:w="100"/>
+              <w:bottom w:type="dxa" w:w="60"/>
+              <w:right w:type="dxa" w:w="100"/>
+            </w:tcMar>
+          </w:tcPr>
+          <w:p>
+            <w:pPr>
+              <w:spacing w:after="0"/>
+            </w:pPr>
+            <w:r>
+              <w:rPr>
+                <w:rFonts w:ascii="Consolas" w:cs="Consolas" w:eastAsia="Consolas" w:hAnsi="Consolas"/>
+                <w:color w:val="6B4A12"/>
+                <w:sz w:val="19"/>
+                <w:szCs w:val="19"/>
+              </w:rPr>
+              <w:t xml:space="preserve">graphs/knowledge.py</w:t>
+            </w:r>
+            <w:r>
+              <w:rPr>
+                <w:sz w:val="19"/>
+                <w:szCs w:val="19"/>
+              </w:rPr>
+              <w:t xml:space="preserve"> + </w:t>
+            </w:r>
+            <w:r>
+              <w:rPr>
+                <w:rFonts w:ascii="Consolas" w:cs="Consolas" w:eastAsia="Consolas" w:hAnsi="Consolas"/>
+                <w:color w:val="6B4A12"/>
+                <w:sz w:val="19"/>
+                <w:szCs w:val="19"/>
+              </w:rPr>
+              <w:t xml:space="preserve">gui/knowledge_view.py</w:t>
+            </w:r>
+            <w:r>
+              <w:rPr>
+                <w:sz w:val="19"/>
+                <w:szCs w:val="19"/>
+              </w:rPr>
+              <w:t xml:space="preserve">; tab Graf: prekidač </w:t>
+            </w:r>
+            <w:r>
+              <w:rPr>
+                <w:b/>
+                <w:bCs/>
+                <w:sz w:val="19"/>
+                <w:szCs w:val="19"/>
+              </w:rPr>
+              <w:t xml:space="preserve">Stablo / Mreža</w:t>
+            </w:r>
+            <w:r>
+              <w:rPr>
+                <w:sz w:val="19"/>
+                <w:szCs w:val="19"/>
+              </w:rPr>
+              <w:t xml:space="preserve"> (Mreža prva). Čvorovi: teme, kartice, metode (registar), misije, ideje (prikazane/zadržane); veze: link/depends iz vaulta, metoda → kartica njenog izvora, misija → kartica koraka, misija → metoda, ideja → misija (tačkasto). Raspored: Fruchterman–Reingold u numpy (networkx nije u paketu), svaka povezana cjelina posebno, cjeline poredane po veličini, usamljeni čvorovi u redovima dolje; deterministički i keširan po hešu grafa (slika ne skače). Klik na čvor sa karticom otvara karticu; misija/metoda/ideja → opis + istaknute veze; pretraga „nađi čvor…“ centrira; filteri po vrsti; isto kretanje kao Grafovi; PNG. Nađeno snimkom: nekoliko tema bez veza razvlačilo je sliku i gnječilo povezane dijelove → raspored po cjelinama. Iskreno: 13 opštih RH tema iz početnog seeda nema nijednu vezu (vidi se sada jasno). Vodič za tab Graf ide u kompletne vodiče (posle izgradnje paketa)</w:t>
+            </w:r>
+          </w:p>
+        </w:tc>
+      </w:tr>
     </w:tbl>
     <w:p>
       <w:pPr>
@@ -6604,7 +6809,7 @@
         <w:t xml:space="preserve">Sljedeće:</w:t>
       </w:r>
       <w:r>
-        <w:t xml:space="preserve"> stavka 30 (graf znanja vizuelno), pa 31–33; izdanje 34–38 posljednje (vodiči za cijelu aplikaciju posle izgradnje paketa); izdanje 34–38 (38 = .deb + .exe) posljednje.</w:t>
+        <w:t xml:space="preserve"> stavka 31 (adversarijalni mod), pa 32–33; izdanje 34–38 posljednje (vodiči za cijelu aplikaciju posle izgradnje paketa); izdanje 34–38 (38 = .deb + .exe) posljednje.</w:t>
       </w:r>
     </w:p>
     <w:p>
@@ -6619,7 +6824,7 @@
         <w:t xml:space="preserve">Preostalo:</w:t>
       </w:r>
       <w:r>
-        <w:t xml:space="preserve"> oko 24–60 h.</w:t>
+        <w:t xml:space="preserve"> oko 21–55 h.</w:t>
       </w:r>
     </w:p>
     <w:p>

</xml_diff>

<commit_message>
Runda 3, stavka 31: adversarijalni mod — potraga po parametrima, šta se krši, strogi certifikat praznine iznad B*
Co-Authored-By: Claude Opus 5.5 <noreply@anthropic.com>
</commit_message>
<xml_diff>
--- a/PSE Riemann — PLAN.docx
+++ b/PSE Riemann — PLAN.docx
@@ -6791,6 +6791,238 @@
           </w:p>
         </w:tc>
       </w:tr>
+      <w:tr>
+        <w:trPr>
+          <w:tblHeader w:val="off"/>
+        </w:trPr>
+        <w:tc>
+          <w:tcPr>
+            <w:tcW w:type="dxa" w:w="1191"/>
+            <w:tcBorders>
+              <w:top w:val="single" w:color="D9D4C7" w:sz="4"/>
+              <w:left w:val="single" w:color="D9D4C7" w:sz="4"/>
+              <w:bottom w:val="single" w:color="D9D4C7" w:sz="4"/>
+              <w:right w:val="single" w:color="D9D4C7" w:sz="4"/>
+            </w:tcBorders>
+            <w:tcMar>
+              <w:top w:type="dxa" w:w="60"/>
+              <w:left w:type="dxa" w:w="100"/>
+              <w:bottom w:type="dxa" w:w="60"/>
+              <w:right w:type="dxa" w:w="100"/>
+            </w:tcMar>
+          </w:tcPr>
+          <w:p>
+            <w:pPr>
+              <w:spacing w:after="0"/>
+            </w:pPr>
+            <w:r>
+              <w:rPr>
+                <w:sz w:val="19"/>
+                <w:szCs w:val="19"/>
+              </w:rPr>
+              <w:t xml:space="preserve">2026-10-26</w:t>
+            </w:r>
+          </w:p>
+        </w:tc>
+        <w:tc>
+          <w:tcPr>
+            <w:tcW w:type="dxa" w:w="1732"/>
+            <w:tcBorders>
+              <w:top w:val="single" w:color="D9D4C7" w:sz="4"/>
+              <w:left w:val="single" w:color="D9D4C7" w:sz="4"/>
+              <w:bottom w:val="single" w:color="D9D4C7" w:sz="4"/>
+              <w:right w:val="single" w:color="D9D4C7" w:sz="4"/>
+            </w:tcBorders>
+            <w:tcMar>
+              <w:top w:type="dxa" w:w="60"/>
+              <w:left w:type="dxa" w:w="100"/>
+              <w:bottom w:type="dxa" w:w="60"/>
+              <w:right w:type="dxa" w:w="100"/>
+            </w:tcMar>
+          </w:tcPr>
+          <w:p>
+            <w:pPr>
+              <w:spacing w:after="0"/>
+            </w:pPr>
+            <w:r>
+              <w:rPr>
+                <w:sz w:val="19"/>
+                <w:szCs w:val="19"/>
+              </w:rPr>
+              <w:t xml:space="preserve">31 · adversarijalni mod</w:t>
+            </w:r>
+          </w:p>
+        </w:tc>
+        <w:tc>
+          <w:tcPr>
+            <w:tcW w:type="dxa" w:w="974"/>
+            <w:tcBorders>
+              <w:top w:val="single" w:color="D9D4C7" w:sz="4"/>
+              <w:left w:val="single" w:color="D9D4C7" w:sz="4"/>
+              <w:bottom w:val="single" w:color="D9D4C7" w:sz="4"/>
+              <w:right w:val="single" w:color="D9D4C7" w:sz="4"/>
+            </w:tcBorders>
+            <w:tcMar>
+              <w:top w:type="dxa" w:w="60"/>
+              <w:left w:type="dxa" w:w="100"/>
+              <w:bottom w:type="dxa" w:w="60"/>
+              <w:right w:type="dxa" w:w="100"/>
+            </w:tcMar>
+          </w:tcPr>
+          <w:p>
+            <w:pPr>
+              <w:spacing w:after="0"/>
+            </w:pPr>
+            <w:r>
+              <w:rPr>
+                <w:sz w:val="19"/>
+                <w:szCs w:val="19"/>
+              </w:rPr>
+              <w:t xml:space="preserve">✅</w:t>
+            </w:r>
+          </w:p>
+        </w:tc>
+        <w:tc>
+          <w:tcPr>
+            <w:tcW w:type="dxa" w:w="1407"/>
+            <w:tcBorders>
+              <w:top w:val="single" w:color="D9D4C7" w:sz="4"/>
+              <w:left w:val="single" w:color="D9D4C7" w:sz="4"/>
+              <w:bottom w:val="single" w:color="D9D4C7" w:sz="4"/>
+              <w:right w:val="single" w:color="D9D4C7" w:sz="4"/>
+            </w:tcBorders>
+            <w:tcMar>
+              <w:top w:type="dxa" w:w="60"/>
+              <w:left w:type="dxa" w:w="100"/>
+              <w:bottom w:type="dxa" w:w="60"/>
+              <w:right w:type="dxa" w:w="100"/>
+            </w:tcMar>
+          </w:tcPr>
+          <w:p>
+            <w:pPr>
+              <w:spacing w:after="0"/>
+            </w:pPr>
+            <w:r>
+              <w:rPr>
+                <w:sz w:val="19"/>
+                <w:szCs w:val="19"/>
+              </w:rPr>
+              <w:t xml:space="preserve">pytest 273/273, selftest ✅; snimci </w:t>
+            </w:r>
+            <w:r>
+              <w:rPr>
+                <w:rFonts w:ascii="Consolas" w:cs="Consolas" w:eastAsia="Consolas" w:hAnsi="Consolas"/>
+                <w:color w:val="6B4A12"/>
+                <w:sz w:val="19"/>
+                <w:szCs w:val="19"/>
+              </w:rPr>
+              <w:t xml:space="preserve">r3_adversarijalni_{grafovi,red}.png</w:t>
+            </w:r>
+          </w:p>
+        </w:tc>
+        <w:tc>
+          <w:tcPr>
+            <w:tcW w:type="dxa" w:w="4334"/>
+            <w:tcBorders>
+              <w:top w:val="single" w:color="D9D4C7" w:sz="4"/>
+              <w:left w:val="single" w:color="D9D4C7" w:sz="4"/>
+              <w:bottom w:val="single" w:color="D9D4C7" w:sz="4"/>
+              <w:right w:val="single" w:color="D9D4C7" w:sz="4"/>
+            </w:tcBorders>
+            <w:tcMar>
+              <w:top w:type="dxa" w:w="60"/>
+              <w:left w:type="dxa" w:w="100"/>
+              <w:bottom w:type="dxa" w:w="60"/>
+              <w:right w:type="dxa" w:w="100"/>
+            </w:tcMar>
+          </w:tcPr>
+          <w:p>
+            <w:pPr>
+              <w:spacing w:after="0"/>
+            </w:pPr>
+            <w:r>
+              <w:rPr>
+                <w:rFonts w:ascii="Consolas" w:cs="Consolas" w:eastAsia="Consolas" w:hAnsi="Consolas"/>
+                <w:color w:val="6B4A12"/>
+                <w:sz w:val="19"/>
+                <w:szCs w:val="19"/>
+              </w:rPr>
+              <w:t xml:space="preserve">methods/adversary.py</w:t>
+            </w:r>
+            <w:r>
+              <w:rPr>
+                <w:sz w:val="19"/>
+                <w:szCs w:val="19"/>
+              </w:rPr>
+              <w:t xml:space="preserve"> (lab eksperiment </w:t>
+            </w:r>
+            <w:r>
+              <w:rPr>
+                <w:rFonts w:ascii="Consolas" w:cs="Consolas" w:eastAsia="Consolas" w:hAnsi="Consolas"/>
+                <w:color w:val="6B4A12"/>
+                <w:sz w:val="19"/>
+                <w:szCs w:val="19"/>
+              </w:rPr>
+              <w:t xml:space="preserve">qrh_adversary</w:t>
+            </w:r>
+            <w:r>
+              <w:rPr>
+                <w:sz w:val="19"/>
+                <w:szCs w:val="19"/>
+              </w:rPr>
+              <w:t xml:space="preserve">, dugme u tabu Misije, automatski posle odobrenja svake nove metode na vratima): (a) uz uslove metode (licenca κ = 2B − 1, x = 1/2, δ ∈ [dlo, 5/6]) potraga po b + zlatni rez → </w:t>
+            </w:r>
+            <w:r>
+              <w:rPr>
+                <w:b/>
+                <w:bCs/>
+                <w:sz w:val="19"/>
+                <w:szCs w:val="19"/>
+              </w:rPr>
+              <w:t xml:space="preserve">Liu i Xu–Sang odolijevaju</w:t>
+            </w:r>
+            <w:r>
+              <w:rPr>
+                <w:sz w:val="19"/>
+                <w:szCs w:val="19"/>
+              </w:rPr>
+              <w:t xml:space="preserve"> (najbolje B = tvrđeno na 12 cifara); lažna tvrdnja 0.8755 uhvaćena (test); (b) sa slobodnim κ: Liu 38, XS 62 tačke bolje od tvrdnje — </w:t>
+            </w:r>
+            <w:r>
+              <w:rPr>
+                <w:b/>
+                <w:bCs/>
+                <w:sz w:val="19"/>
+                <w:szCs w:val="19"/>
+              </w:rPr>
+              <w:t xml:space="preserve">svaka krši licencu i zid 6κℓ &gt; 3/4</w:t>
+            </w:r>
+            <w:r>
+              <w:rPr>
+                <w:sz w:val="19"/>
+                <w:szCs w:val="19"/>
+              </w:rPr>
+              <w:t xml:space="preserve"> (često i (1+κ)/2 &gt; B); (c) </w:t>
+            </w:r>
+            <w:r>
+              <w:rPr>
+                <w:b/>
+                <w:bCs/>
+                <w:sz w:val="19"/>
+                <w:szCs w:val="19"/>
+              </w:rPr>
+              <w:t xml:space="preserve">certifikat praznine</w:t>
+            </w:r>
+            <w:r>
+              <w:rPr>
+                <w:sz w:val="19"/>
+                <w:szCs w:val="19"/>
+              </w:rPr>
+              <w:t xml:space="preserve"> (mpmath.iv, adaptivne ćelije): nema dopustivih parametara za B ∈ [0.866667, B* − 2.5·10⁻⁷] — Liu 4 171 ćelija / 3,6 s, XS 6 252 / 6,3 s, kompletno; sa ε = 10⁻⁷ budžet ne stiže → piše DJELIMIČNO. Pretpostavke napisane uz rezultat; certifikat važi za E kako je implementiran (konstante u double). Rezultat: stavka u „Čeka tvoju odluku“ (odobri = korak misije), tačke na Grafovima (zeleno = najbolje uz uslove, crveno = krši), lab run sa PNG i karticom, NAŠE-NERECENZIRANO. Metode-kao-podatak (više grana E) zasad pošteno odbijene sa razlogom. Usput: dugački naslov u meniju reda odluka širio je cijeli tab (dugmad Odobri/Ne odobri van ekrana) → svi padajući meniji ograničeni na 16 znakova</w:t>
+            </w:r>
+          </w:p>
+        </w:tc>
+      </w:tr>
     </w:tbl>
     <w:p>
       <w:pPr>
@@ -6809,7 +7041,7 @@
         <w:t xml:space="preserve">Sljedeće:</w:t>
       </w:r>
       <w:r>
-        <w:t xml:space="preserve"> stavka 31 (adversarijalni mod), pa 32–33; izdanje 34–38 posljednje (vodiči za cijelu aplikaciju posle izgradnje paketa); izdanje 34–38 (38 = .deb + .exe) posljednje.</w:t>
+        <w:t xml:space="preserve"> stavka 32 (misija 3: kompleksna verzija), pa 33; izdanje 34–38 posljednje; izdanje 34–38 posljednje (vodiči za cijelu aplikaciju posle izgradnje paketa); izdanje 34–38 (38 = .deb + .exe) posljednje.</w:t>
       </w:r>
     </w:p>
     <w:p>
@@ -6824,7 +7056,7 @@
         <w:t xml:space="preserve">Preostalo:</w:t>
       </w:r>
       <w:r>
-        <w:t xml:space="preserve"> oko 21–55 h.</w:t>
+        <w:t xml:space="preserve"> oko 17–48 h.</w:t>
       </w:r>
     </w:p>
     <w:p>

</xml_diff>

<commit_message>
⤢/⤡ na svim panelima gdje ima smisla (Editor, Tabla, Corpus, Lab, Ideje, Pregled)
Co-Authored-By: Claude Opus 5.5 <noreply@anthropic.com>
</commit_message>
<xml_diff>
--- a/PSE Riemann — PLAN.docx
+++ b/PSE Riemann — PLAN.docx
@@ -7019,6 +7019,218 @@
                 <w:szCs w:val="19"/>
               </w:rPr>
               <w:t xml:space="preserve"> (mpmath.iv, adaptivne ćelije): nema dopustivih parametara za B ∈ [0.866667, B* − 2.5·10⁻⁷] — Liu 4 171 ćelija / 3,6 s, XS 6 252 / 6,3 s, kompletno; sa ε = 10⁻⁷ budžet ne stiže → piše DJELIMIČNO. Pretpostavke napisane uz rezultat; certifikat važi za E kako je implementiran (konstante u double). Rezultat: stavka u „Čeka tvoju odluku“ (odobri = korak misije), tačke na Grafovima (zeleno = najbolje uz uslove, crveno = krši), lab run sa PNG i karticom, NAŠE-NERECENZIRANO. Metode-kao-podatak (više grana E) zasad pošteno odbijene sa razlogom. Usput: dugački naslov u meniju reda odluka širio je cijeli tab (dugmad Odobri/Ne odobri van ekrana) → svi padajući meniji ograničeni na 16 znakova</w:t>
+            </w:r>
+          </w:p>
+        </w:tc>
+      </w:tr>
+      <w:tr>
+        <w:trPr>
+          <w:tblHeader w:val="off"/>
+        </w:trPr>
+        <w:tc>
+          <w:tcPr>
+            <w:tcW w:type="dxa" w:w="1191"/>
+            <w:tcBorders>
+              <w:top w:val="single" w:color="D9D4C7" w:sz="4"/>
+              <w:left w:val="single" w:color="D9D4C7" w:sz="4"/>
+              <w:bottom w:val="single" w:color="D9D4C7" w:sz="4"/>
+              <w:right w:val="single" w:color="D9D4C7" w:sz="4"/>
+            </w:tcBorders>
+            <w:shd w:fill="F4F1EA" w:color="auto" w:val="clear"/>
+            <w:tcMar>
+              <w:top w:type="dxa" w:w="60"/>
+              <w:left w:type="dxa" w:w="100"/>
+              <w:bottom w:type="dxa" w:w="60"/>
+              <w:right w:type="dxa" w:w="100"/>
+            </w:tcMar>
+          </w:tcPr>
+          <w:p>
+            <w:pPr>
+              <w:spacing w:after="0"/>
+            </w:pPr>
+            <w:r>
+              <w:rPr>
+                <w:sz w:val="19"/>
+                <w:szCs w:val="19"/>
+              </w:rPr>
+              <w:t xml:space="preserve">2026-10-26</w:t>
+            </w:r>
+          </w:p>
+        </w:tc>
+        <w:tc>
+          <w:tcPr>
+            <w:tcW w:type="dxa" w:w="1732"/>
+            <w:tcBorders>
+              <w:top w:val="single" w:color="D9D4C7" w:sz="4"/>
+              <w:left w:val="single" w:color="D9D4C7" w:sz="4"/>
+              <w:bottom w:val="single" w:color="D9D4C7" w:sz="4"/>
+              <w:right w:val="single" w:color="D9D4C7" w:sz="4"/>
+            </w:tcBorders>
+            <w:shd w:fill="F4F1EA" w:color="auto" w:val="clear"/>
+            <w:tcMar>
+              <w:top w:type="dxa" w:w="60"/>
+              <w:left w:type="dxa" w:w="100"/>
+              <w:bottom w:type="dxa" w:w="60"/>
+              <w:right w:type="dxa" w:w="100"/>
+            </w:tcMar>
+          </w:tcPr>
+          <w:p>
+            <w:pPr>
+              <w:spacing w:after="0"/>
+            </w:pPr>
+            <w:r>
+              <w:rPr>
+                <w:sz w:val="19"/>
+                <w:szCs w:val="19"/>
+              </w:rPr>
+              <w:t xml:space="preserve">— · ⤢ / ⤡ svuda gdje ima smisla</w:t>
+            </w:r>
+          </w:p>
+        </w:tc>
+        <w:tc>
+          <w:tcPr>
+            <w:tcW w:type="dxa" w:w="974"/>
+            <w:tcBorders>
+              <w:top w:val="single" w:color="D9D4C7" w:sz="4"/>
+              <w:left w:val="single" w:color="D9D4C7" w:sz="4"/>
+              <w:bottom w:val="single" w:color="D9D4C7" w:sz="4"/>
+              <w:right w:val="single" w:color="D9D4C7" w:sz="4"/>
+            </w:tcBorders>
+            <w:shd w:fill="F4F1EA" w:color="auto" w:val="clear"/>
+            <w:tcMar>
+              <w:top w:type="dxa" w:w="60"/>
+              <w:left w:type="dxa" w:w="100"/>
+              <w:bottom w:type="dxa" w:w="60"/>
+              <w:right w:type="dxa" w:w="100"/>
+            </w:tcMar>
+          </w:tcPr>
+          <w:p>
+            <w:pPr>
+              <w:spacing w:after="0"/>
+            </w:pPr>
+            <w:r>
+              <w:rPr>
+                <w:sz w:val="19"/>
+                <w:szCs w:val="19"/>
+              </w:rPr>
+              <w:t xml:space="preserve">✅</w:t>
+            </w:r>
+          </w:p>
+        </w:tc>
+        <w:tc>
+          <w:tcPr>
+            <w:tcW w:type="dxa" w:w="1407"/>
+            <w:tcBorders>
+              <w:top w:val="single" w:color="D9D4C7" w:sz="4"/>
+              <w:left w:val="single" w:color="D9D4C7" w:sz="4"/>
+              <w:bottom w:val="single" w:color="D9D4C7" w:sz="4"/>
+              <w:right w:val="single" w:color="D9D4C7" w:sz="4"/>
+            </w:tcBorders>
+            <w:shd w:fill="F4F1EA" w:color="auto" w:val="clear"/>
+            <w:tcMar>
+              <w:top w:type="dxa" w:w="60"/>
+              <w:left w:type="dxa" w:w="100"/>
+              <w:bottom w:type="dxa" w:w="60"/>
+              <w:right w:type="dxa" w:w="100"/>
+            </w:tcMar>
+          </w:tcPr>
+          <w:p>
+            <w:pPr>
+              <w:spacing w:after="0"/>
+            </w:pPr>
+            <w:r>
+              <w:rPr>
+                <w:sz w:val="19"/>
+                <w:szCs w:val="19"/>
+              </w:rPr>
+              <w:t xml:space="preserve">pytest 274/274; snimci </w:t>
+            </w:r>
+            <w:r>
+              <w:rPr>
+                <w:rFonts w:ascii="Consolas" w:cs="Consolas" w:eastAsia="Consolas" w:hAnsi="Consolas"/>
+                <w:color w:val="6B4A12"/>
+                <w:sz w:val="19"/>
+                <w:szCs w:val="19"/>
+              </w:rPr>
+              <w:t xml:space="preserve">r3_rasiri_{lab,pregled}.png</w:t>
+            </w:r>
+          </w:p>
+        </w:tc>
+        <w:tc>
+          <w:tcPr>
+            <w:tcW w:type="dxa" w:w="4334"/>
+            <w:tcBorders>
+              <w:top w:val="single" w:color="D9D4C7" w:sz="4"/>
+              <w:left w:val="single" w:color="D9D4C7" w:sz="4"/>
+              <w:bottom w:val="single" w:color="D9D4C7" w:sz="4"/>
+              <w:right w:val="single" w:color="D9D4C7" w:sz="4"/>
+            </w:tcBorders>
+            <w:shd w:fill="F4F1EA" w:color="auto" w:val="clear"/>
+            <w:tcMar>
+              <w:top w:type="dxa" w:w="60"/>
+              <w:left w:type="dxa" w:w="100"/>
+              <w:bottom w:type="dxa" w:w="60"/>
+              <w:right w:type="dxa" w:w="100"/>
+            </w:tcMar>
+          </w:tcPr>
+          <w:p>
+            <w:pPr>
+              <w:spacing w:after="0"/>
+            </w:pPr>
+            <w:r>
+              <w:rPr>
+                <w:sz w:val="19"/>
+                <w:szCs w:val="19"/>
+              </w:rPr>
+              <w:t xml:space="preserve">Andrej: dugme „raširi / vrati“ na sve panele. </w:t>
+            </w:r>
+            <w:r>
+              <w:rPr>
+                <w:rFonts w:ascii="Consolas" w:cs="Consolas" w:eastAsia="Consolas" w:hAnsi="Consolas"/>
+                <w:color w:val="6B4A12"/>
+                <w:sz w:val="19"/>
+                <w:szCs w:val="19"/>
+              </w:rPr>
+              <w:t xml:space="preserve">widgets.add_expand</w:t>
+            </w:r>
+            <w:r>
+              <w:rPr>
+                <w:sz w:val="19"/>
+                <w:szCs w:val="19"/>
+              </w:rPr>
+              <w:t xml:space="preserve"> + </w:t>
+            </w:r>
+            <w:r>
+              <w:rPr>
+                <w:rFonts w:ascii="Consolas" w:cs="Consolas" w:eastAsia="Consolas" w:hAnsi="Consolas"/>
+                <w:color w:val="6B4A12"/>
+                <w:sz w:val="19"/>
+                <w:szCs w:val="19"/>
+              </w:rPr>
+              <w:t xml:space="preserve">expand_splitter</w:t>
+            </w:r>
+            <w:r>
+              <w:rPr>
+                <w:sz w:val="19"/>
+                <w:szCs w:val="19"/>
+              </w:rPr>
+              <w:t xml:space="preserve">: mali ⤢ u gornjem desnom uglu svakog panela u razdjeljenim dijelovima — Editor (tekst / pregled), Tabla, Corpus, Lab (lista, istorija, desni dio, tekst rezultata), Ideje (lista / detalj) — i obje kartice u Pregledu; panel zauzme mjesto susjeda, ⤡ vraća. Grafovi, Lab graf i chat već imaju svoje (bez duplikata, ugniježđeni razdjelnici takođe). Nađeno testom: u tabu koji nije na ekranu susjedi nisu „vidljivi“, pa je drugo dugme pogrešno raširivalo ponovo → eksplicitno stanje + </w:t>
+            </w:r>
+            <w:r>
+              <w:rPr>
+                <w:rFonts w:ascii="Consolas" w:cs="Consolas" w:eastAsia="Consolas" w:hAnsi="Consolas"/>
+                <w:color w:val="6B4A12"/>
+                <w:sz w:val="19"/>
+                <w:szCs w:val="19"/>
+              </w:rPr>
+              <w:t xml:space="preserve">isHidden()</w:t>
+            </w:r>
+            <w:r>
+              <w:rPr>
+                <w:sz w:val="19"/>
+                <w:szCs w:val="19"/>
+              </w:rPr>
+              <w:t xml:space="preserve">. Usput: prazan Lab graf je bio bijel → taman sa porukom</w:t>
             </w:r>
           </w:p>
         </w:tc>

</xml_diff>

<commit_message>
Runda 3, stavka 32: misija 3 (kompleksna verzija) — granica kao nula diskriminante, margina Im δ, σ*(γ) ≡ B u okviru metode
Co-Authored-By: Claude Opus 5.5 <noreply@anthropic.com>
</commit_message>
<xml_diff>
--- a/PSE Riemann — PLAN.docx
+++ b/PSE Riemann — PLAN.docx
@@ -7235,6 +7235,238 @@
           </w:p>
         </w:tc>
       </w:tr>
+      <w:tr>
+        <w:trPr>
+          <w:tblHeader w:val="off"/>
+        </w:trPr>
+        <w:tc>
+          <w:tcPr>
+            <w:tcW w:type="dxa" w:w="1191"/>
+            <w:tcBorders>
+              <w:top w:val="single" w:color="D9D4C7" w:sz="4"/>
+              <w:left w:val="single" w:color="D9D4C7" w:sz="4"/>
+              <w:bottom w:val="single" w:color="D9D4C7" w:sz="4"/>
+              <w:right w:val="single" w:color="D9D4C7" w:sz="4"/>
+            </w:tcBorders>
+            <w:tcMar>
+              <w:top w:type="dxa" w:w="60"/>
+              <w:left w:type="dxa" w:w="100"/>
+              <w:bottom w:type="dxa" w:w="60"/>
+              <w:right w:type="dxa" w:w="100"/>
+            </w:tcMar>
+          </w:tcPr>
+          <w:p>
+            <w:pPr>
+              <w:spacing w:after="0"/>
+            </w:pPr>
+            <w:r>
+              <w:rPr>
+                <w:sz w:val="19"/>
+                <w:szCs w:val="19"/>
+              </w:rPr>
+              <w:t xml:space="preserve">2026-10-26</w:t>
+            </w:r>
+          </w:p>
+        </w:tc>
+        <w:tc>
+          <w:tcPr>
+            <w:tcW w:type="dxa" w:w="1732"/>
+            <w:tcBorders>
+              <w:top w:val="single" w:color="D9D4C7" w:sz="4"/>
+              <w:left w:val="single" w:color="D9D4C7" w:sz="4"/>
+              <w:bottom w:val="single" w:color="D9D4C7" w:sz="4"/>
+              <w:right w:val="single" w:color="D9D4C7" w:sz="4"/>
+            </w:tcBorders>
+            <w:tcMar>
+              <w:top w:type="dxa" w:w="60"/>
+              <w:left w:type="dxa" w:w="100"/>
+              <w:bottom w:type="dxa" w:w="60"/>
+              <w:right w:type="dxa" w:w="100"/>
+            </w:tcMar>
+          </w:tcPr>
+          <w:p>
+            <w:pPr>
+              <w:spacing w:after="0"/>
+            </w:pPr>
+            <w:r>
+              <w:rPr>
+                <w:sz w:val="19"/>
+                <w:szCs w:val="19"/>
+              </w:rPr>
+              <w:t xml:space="preserve">32 · misija 3: kompleksna verzija</w:t>
+            </w:r>
+          </w:p>
+        </w:tc>
+        <w:tc>
+          <w:tcPr>
+            <w:tcW w:type="dxa" w:w="974"/>
+            <w:tcBorders>
+              <w:top w:val="single" w:color="D9D4C7" w:sz="4"/>
+              <w:left w:val="single" w:color="D9D4C7" w:sz="4"/>
+              <w:bottom w:val="single" w:color="D9D4C7" w:sz="4"/>
+              <w:right w:val="single" w:color="D9D4C7" w:sz="4"/>
+            </w:tcBorders>
+            <w:tcMar>
+              <w:top w:type="dxa" w:w="60"/>
+              <w:left w:type="dxa" w:w="100"/>
+              <w:bottom w:type="dxa" w:w="60"/>
+              <w:right w:type="dxa" w:w="100"/>
+            </w:tcMar>
+          </w:tcPr>
+          <w:p>
+            <w:pPr>
+              <w:spacing w:after="0"/>
+            </w:pPr>
+            <w:r>
+              <w:rPr>
+                <w:sz w:val="19"/>
+                <w:szCs w:val="19"/>
+              </w:rPr>
+              <w:t xml:space="preserve">✅</w:t>
+            </w:r>
+          </w:p>
+        </w:tc>
+        <w:tc>
+          <w:tcPr>
+            <w:tcW w:type="dxa" w:w="1407"/>
+            <w:tcBorders>
+              <w:top w:val="single" w:color="D9D4C7" w:sz="4"/>
+              <w:left w:val="single" w:color="D9D4C7" w:sz="4"/>
+              <w:bottom w:val="single" w:color="D9D4C7" w:sz="4"/>
+              <w:right w:val="single" w:color="D9D4C7" w:sz="4"/>
+            </w:tcBorders>
+            <w:tcMar>
+              <w:top w:type="dxa" w:w="60"/>
+              <w:left w:type="dxa" w:w="100"/>
+              <w:bottom w:type="dxa" w:w="60"/>
+              <w:right w:type="dxa" w:w="100"/>
+            </w:tcMar>
+          </w:tcPr>
+          <w:p>
+            <w:pPr>
+              <w:spacing w:after="0"/>
+            </w:pPr>
+            <w:r>
+              <w:rPr>
+                <w:sz w:val="19"/>
+                <w:szCs w:val="19"/>
+              </w:rPr>
+              <w:t xml:space="preserve">pytest 278/278, selftest ✅; snimci </w:t>
+            </w:r>
+            <w:r>
+              <w:rPr>
+                <w:rFonts w:ascii="Consolas" w:cs="Consolas" w:eastAsia="Consolas" w:hAnsi="Consolas"/>
+                <w:color w:val="6B4A12"/>
+                <w:sz w:val="19"/>
+                <w:szCs w:val="19"/>
+              </w:rPr>
+              <w:t xml:space="preserve">r3_misija3_delta_{ispod,iznad}.png</w:t>
+            </w:r>
+            <w:r>
+              <w:rPr>
+                <w:sz w:val="19"/>
+                <w:szCs w:val="19"/>
+              </w:rPr>
+              <w:t xml:space="preserve">; </w:t>
+            </w:r>
+            <w:r>
+              <w:rPr>
+                <w:rFonts w:ascii="Consolas" w:cs="Consolas" w:eastAsia="Consolas" w:hAnsi="Consolas"/>
+                <w:color w:val="6B4A12"/>
+                <w:sz w:val="19"/>
+                <w:szCs w:val="19"/>
+              </w:rPr>
+              <w:t xml:space="preserve">research/misija3-2026-10/REPORT.md</w:t>
+            </w:r>
+          </w:p>
+        </w:tc>
+        <w:tc>
+          <w:tcPr>
+            <w:tcW w:type="dxa" w:w="4334"/>
+            <w:tcBorders>
+              <w:top w:val="single" w:color="D9D4C7" w:sz="4"/>
+              <w:left w:val="single" w:color="D9D4C7" w:sz="4"/>
+              <w:bottom w:val="single" w:color="D9D4C7" w:sz="4"/>
+              <w:right w:val="single" w:color="D9D4C7" w:sz="4"/>
+            </w:tcBorders>
+            <w:tcMar>
+              <w:top w:type="dxa" w:w="60"/>
+              <w:left w:type="dxa" w:w="100"/>
+              <w:bottom w:type="dxa" w:w="60"/>
+              <w:right w:type="dxa" w:w="100"/>
+            </w:tcMar>
+          </w:tcPr>
+          <w:p>
+            <w:pPr>
+              <w:spacing w:after="0"/>
+            </w:pPr>
+            <w:r>
+              <w:rPr>
+                <w:sz w:val="19"/>
+                <w:szCs w:val="19"/>
+              </w:rPr>
+              <w:t xml:space="preserve">Misija „Kompleksna verzija: savija li se granica?“ (u krugu misija, isti meni ciljeva). (a) E ne sadrži γ → u okviru Liu/XS σ</w:t>
+            </w:r>
+            <w:r>
+              <w:rPr>
+                <w:i/>
+                <w:iCs/>
+                <w:sz w:val="19"/>
+                <w:szCs w:val="19"/>
+              </w:rPr>
+              <w:t xml:space="preserve">(γ) ≡ B (čitanje formalizma, NAŠE-NERECENZIRANO; van metode otvoreno). (b) </w:t>
+            </w:r>
+            <w:r>
+              <w:rPr>
+                <w:i/>
+                <w:iCs/>
+                <w:sz w:val="19"/>
+                <w:szCs w:val="19"/>
+              </w:rPr>
+              <w:t xml:space="preserve">Brojilac E(δ) pri x = 1/2 je kvadratni u δ</w:t>
+            </w:r>
+            <w:r>
+              <w:rPr>
+                <w:sz w:val="19"/>
+                <w:szCs w:val="19"/>
+              </w:rPr>
+              <w:t xml:space="preserve">* (sympy, tačno): ℓ &lt; ℓ* konjugovani par (prolazi), ℓ* dvostruki korijen (granica = nula diskriminante), ℓ &gt; ℓ* dva realna (pada). Nula diskriminante = ℓ* na 3,4·10⁻¹⁴ (Liu i XS); margina Im δ ≈ c·√(ℓ* − ℓ), c = 2,62 (Liu), 2,38 (XS). </w:t>
+            </w:r>
+            <w:r>
+              <w:rPr>
+                <w:b/>
+                <w:bCs/>
+                <w:sz w:val="19"/>
+                <w:szCs w:val="19"/>
+              </w:rPr>
+              <w:t xml:space="preserve">Novo B: ne</w:t>
+            </w:r>
+            <w:r>
+              <w:rPr>
+                <w:sz w:val="19"/>
+                <w:szCs w:val="19"/>
+              </w:rPr>
+              <w:t xml:space="preserve"> — i to je zapisano kao rezultat; dobitak je algebarska karakterizacija granice i mjera margine. Lab </w:t>
+            </w:r>
+            <w:r>
+              <w:rPr>
+                <w:rFonts w:ascii="Consolas" w:cs="Consolas" w:eastAsia="Consolas" w:hAnsi="Consolas"/>
+                <w:color w:val="6B4A12"/>
+                <w:sz w:val="19"/>
+                <w:szCs w:val="19"/>
+              </w:rPr>
+              <w:t xml:space="preserve">qrh_complex</w:t>
+            </w:r>
+            <w:r>
+              <w:rPr>
+                <w:sz w:val="19"/>
+                <w:szCs w:val="19"/>
+              </w:rPr>
+              <w:t xml:space="preserve"> (upisuje korak misije), Grafovi: ugrađena „E_Liu(δ) za kompleksno δ“ u δ-ravni (klizač ℓ pomjera nule preko realne ose). Probni numerički solver nije nalazio konjugovani par iz date početne tačke → tačan put preko polinoma</w:t>
+            </w:r>
+          </w:p>
+        </w:tc>
+      </w:tr>
     </w:tbl>
     <w:p>
       <w:pPr>
@@ -7253,7 +7485,7 @@
         <w:t xml:space="preserve">Sljedeće:</w:t>
       </w:r>
       <w:r>
-        <w:t xml:space="preserve"> stavka 32 (misija 3: kompleksna verzija), pa 33; izdanje 34–38 posljednje; izdanje 34–38 posljednje (vodiči za cijelu aplikaciju posle izgradnje paketa); izdanje 34–38 (38 = .deb + .exe) posljednje.</w:t>
+        <w:t xml:space="preserve"> stavka 33 (radni tekst rada iz misija 2 i 3), pa izdanje 34–38; izdanje 34–38 posljednje (vodiči za cijelu aplikaciju posle izgradnje paketa); izdanje 34–38 (38 = .deb + .exe) posljednje.</w:t>
       </w:r>
     </w:p>
     <w:p>
@@ -7268,7 +7500,7 @@
         <w:t xml:space="preserve">Preostalo:</w:t>
       </w:r>
       <w:r>
-        <w:t xml:space="preserve"> oko 17–48 h.</w:t>
+        <w:t xml:space="preserve"> oko 13–40 h.</w:t>
       </w:r>
     </w:p>
     <w:p>

</xml_diff>

<commit_message>
Runda 3, stavka 33: radni tekst iz misija 2 i 3 (kapija, izvori za svaki broj, skeptik prije operatera); primopredaja ažurirana
Co-Authored-By: Claude Opus 5.5 <noreply@anthropic.com>
</commit_message>
<xml_diff>
--- a/PSE Riemann — PLAN.docx
+++ b/PSE Riemann — PLAN.docx
@@ -7467,6 +7467,211 @@
           </w:p>
         </w:tc>
       </w:tr>
+      <w:tr>
+        <w:trPr>
+          <w:tblHeader w:val="off"/>
+        </w:trPr>
+        <w:tc>
+          <w:tcPr>
+            <w:tcW w:type="dxa" w:w="1191"/>
+            <w:tcBorders>
+              <w:top w:val="single" w:color="D9D4C7" w:sz="4"/>
+              <w:left w:val="single" w:color="D9D4C7" w:sz="4"/>
+              <w:bottom w:val="single" w:color="D9D4C7" w:sz="4"/>
+              <w:right w:val="single" w:color="D9D4C7" w:sz="4"/>
+            </w:tcBorders>
+            <w:shd w:fill="F4F1EA" w:color="auto" w:val="clear"/>
+            <w:tcMar>
+              <w:top w:type="dxa" w:w="60"/>
+              <w:left w:type="dxa" w:w="100"/>
+              <w:bottom w:type="dxa" w:w="60"/>
+              <w:right w:type="dxa" w:w="100"/>
+            </w:tcMar>
+          </w:tcPr>
+          <w:p>
+            <w:pPr>
+              <w:spacing w:after="0"/>
+            </w:pPr>
+            <w:r>
+              <w:rPr>
+                <w:sz w:val="19"/>
+                <w:szCs w:val="19"/>
+              </w:rPr>
+              <w:t xml:space="preserve">2026-10-26</w:t>
+            </w:r>
+          </w:p>
+        </w:tc>
+        <w:tc>
+          <w:tcPr>
+            <w:tcW w:type="dxa" w:w="1732"/>
+            <w:tcBorders>
+              <w:top w:val="single" w:color="D9D4C7" w:sz="4"/>
+              <w:left w:val="single" w:color="D9D4C7" w:sz="4"/>
+              <w:bottom w:val="single" w:color="D9D4C7" w:sz="4"/>
+              <w:right w:val="single" w:color="D9D4C7" w:sz="4"/>
+            </w:tcBorders>
+            <w:shd w:fill="F4F1EA" w:color="auto" w:val="clear"/>
+            <w:tcMar>
+              <w:top w:type="dxa" w:w="60"/>
+              <w:left w:type="dxa" w:w="100"/>
+              <w:bottom w:type="dxa" w:w="60"/>
+              <w:right w:type="dxa" w:w="100"/>
+            </w:tcMar>
+          </w:tcPr>
+          <w:p>
+            <w:pPr>
+              <w:spacing w:after="0"/>
+            </w:pPr>
+            <w:r>
+              <w:rPr>
+                <w:sz w:val="19"/>
+                <w:szCs w:val="19"/>
+              </w:rPr>
+              <w:t xml:space="preserve">33 · radni tekst iz misija 2 i 3</w:t>
+            </w:r>
+          </w:p>
+        </w:tc>
+        <w:tc>
+          <w:tcPr>
+            <w:tcW w:type="dxa" w:w="974"/>
+            <w:tcBorders>
+              <w:top w:val="single" w:color="D9D4C7" w:sz="4"/>
+              <w:left w:val="single" w:color="D9D4C7" w:sz="4"/>
+              <w:bottom w:val="single" w:color="D9D4C7" w:sz="4"/>
+              <w:right w:val="single" w:color="D9D4C7" w:sz="4"/>
+            </w:tcBorders>
+            <w:shd w:fill="F4F1EA" w:color="auto" w:val="clear"/>
+            <w:tcMar>
+              <w:top w:type="dxa" w:w="60"/>
+              <w:left w:type="dxa" w:w="100"/>
+              <w:bottom w:type="dxa" w:w="60"/>
+              <w:right w:type="dxa" w:w="100"/>
+            </w:tcMar>
+          </w:tcPr>
+          <w:p>
+            <w:pPr>
+              <w:spacing w:after="0"/>
+            </w:pPr>
+            <w:r>
+              <w:rPr>
+                <w:sz w:val="19"/>
+                <w:szCs w:val="19"/>
+              </w:rPr>
+              <w:t xml:space="preserve">✅</w:t>
+            </w:r>
+          </w:p>
+        </w:tc>
+        <w:tc>
+          <w:tcPr>
+            <w:tcW w:type="dxa" w:w="1407"/>
+            <w:tcBorders>
+              <w:top w:val="single" w:color="D9D4C7" w:sz="4"/>
+              <w:left w:val="single" w:color="D9D4C7" w:sz="4"/>
+              <w:bottom w:val="single" w:color="D9D4C7" w:sz="4"/>
+              <w:right w:val="single" w:color="D9D4C7" w:sz="4"/>
+            </w:tcBorders>
+            <w:shd w:fill="F4F1EA" w:color="auto" w:val="clear"/>
+            <w:tcMar>
+              <w:top w:type="dxa" w:w="60"/>
+              <w:left w:type="dxa" w:w="100"/>
+              <w:bottom w:type="dxa" w:w="60"/>
+              <w:right w:type="dxa" w:w="100"/>
+            </w:tcMar>
+          </w:tcPr>
+          <w:p>
+            <w:pPr>
+              <w:spacing w:after="0"/>
+            </w:pPr>
+            <w:r>
+              <w:rPr>
+                <w:sz w:val="19"/>
+                <w:szCs w:val="19"/>
+              </w:rPr>
+              <w:t xml:space="preserve">pytest 281/281, selftest ✅; snimak </w:t>
+            </w:r>
+            <w:r>
+              <w:rPr>
+                <w:rFonts w:ascii="Consolas" w:cs="Consolas" w:eastAsia="Consolas" w:hAnsi="Consolas"/>
+                <w:color w:val="6B4A12"/>
+                <w:sz w:val="19"/>
+                <w:szCs w:val="19"/>
+              </w:rPr>
+              <w:t xml:space="preserve">r3_radni_tekst.png</w:t>
+            </w:r>
+          </w:p>
+        </w:tc>
+        <w:tc>
+          <w:tcPr>
+            <w:tcW w:type="dxa" w:w="4334"/>
+            <w:tcBorders>
+              <w:top w:val="single" w:color="D9D4C7" w:sz="4"/>
+              <w:left w:val="single" w:color="D9D4C7" w:sz="4"/>
+              <w:bottom w:val="single" w:color="D9D4C7" w:sz="4"/>
+              <w:right w:val="single" w:color="D9D4C7" w:sz="4"/>
+            </w:tcBorders>
+            <w:shd w:fill="F4F1EA" w:color="auto" w:val="clear"/>
+            <w:tcMar>
+              <w:top w:type="dxa" w:w="60"/>
+              <w:left w:type="dxa" w:w="100"/>
+              <w:bottom w:type="dxa" w:w="60"/>
+              <w:right w:type="dxa" w:w="100"/>
+            </w:tcMar>
+          </w:tcPr>
+          <w:p>
+            <w:pPr>
+              <w:spacing w:after="0"/>
+            </w:pPr>
+            <w:r>
+              <w:rPr>
+                <w:rFonts w:ascii="Consolas" w:cs="Consolas" w:eastAsia="Consolas" w:hAnsi="Consolas"/>
+                <w:color w:val="6B4A12"/>
+                <w:sz w:val="19"/>
+                <w:szCs w:val="19"/>
+              </w:rPr>
+              <w:t xml:space="preserve">shared_lib/paper.py</w:t>
+            </w:r>
+            <w:r>
+              <w:rPr>
+                <w:sz w:val="19"/>
+                <w:szCs w:val="19"/>
+              </w:rPr>
+              <w:t xml:space="preserve"> + dugme u tabu Misije: uvod, metode, mapa prenosivosti, misija 3 (tabela sa lab run-ovima), adversarijalna provjera, izvori sa nivoima, slike, otvorena pitanja; NAŠE-NERECENZIRANO. Kapija (</w:t>
+            </w:r>
+            <w:r>
+              <w:rPr>
+                <w:rFonts w:ascii="Consolas" w:cs="Consolas" w:eastAsia="Consolas" w:hAnsi="Consolas"/>
+                <w:color w:val="6B4A12"/>
+                <w:sz w:val="19"/>
+                <w:szCs w:val="19"/>
+              </w:rPr>
+              <w:t xml:space="preserve">_claims_proof</w:t>
+            </w:r>
+            <w:r>
+              <w:rPr>
+                <w:sz w:val="19"/>
+                <w:szCs w:val="19"/>
+              </w:rPr>
+              <w:t xml:space="preserve">) odbija tekst sa tvrdnjom o dokazu (test); svaki broj mora imati lab run/izvor u istom redu (</w:t>
+            </w:r>
+            <w:r>
+              <w:rPr>
+                <w:rFonts w:ascii="Consolas" w:cs="Consolas" w:eastAsia="Consolas" w:hAnsi="Consolas"/>
+                <w:color w:val="6B4A12"/>
+                <w:sz w:val="19"/>
+                <w:szCs w:val="19"/>
+              </w:rPr>
+              <w:t xml:space="preserve">unsourced</w:t>
+            </w:r>
+            <w:r>
+              <w:rPr>
+                <w:sz w:val="19"/>
+                <w:szCs w:val="19"/>
+              </w:rPr>
+              <w:t xml:space="preserve">), inače se ne zapisuje; skeptik napada prije operatera (nedostupan = rečeno); zapečaćen izvještaj + stavka u redu. „Kompleksna verzija ne daje novo B“ upisano kao rezultat. Nađeno snimkom: σ* u podebljanom tekstu kvario Markdown → σ∗</w:t>
+            </w:r>
+          </w:p>
+        </w:tc>
+      </w:tr>
     </w:tbl>
     <w:p>
       <w:pPr>
@@ -7485,7 +7690,7 @@
         <w:t xml:space="preserve">Sljedeće:</w:t>
       </w:r>
       <w:r>
-        <w:t xml:space="preserve"> stavka 33 (radni tekst rada iz misija 2 i 3), pa izdanje 34–38; izdanje 34–38 posljednje (vodiči za cijelu aplikaciju posle izgradnje paketa); izdanje 34–38 (38 = .deb + .exe) posljednje.</w:t>
+        <w:t xml:space="preserve"> izdanje 34–38 (35 živi test, 36 CI, 37 v0.2.0, 38 .deb + .exe; kompletni SR/EN vodiči posle izgradnje paketa; spajanje u main samo na „spoji u main“); izdanje 34–38 posljednje (vodiči za cijelu aplikaciju posle izgradnje paketa); izdanje 34–38 (38 = .deb + .exe) posljednje.</w:t>
       </w:r>
     </w:p>
     <w:p>
@@ -7500,7 +7705,7 @@
         <w:t xml:space="preserve">Preostalo:</w:t>
       </w:r>
       <w:r>
-        <w:t xml:space="preserve"> oko 13–40 h.</w:t>
+        <w:t xml:space="preserve"> oko 10–25 h (samo izdanje).</w:t>
       </w:r>
     </w:p>
     <w:p>

</xml_diff>

<commit_message>
Kandidat 0.2.0~rc1 za živi test: paket nosi korpus, pomoćni program čuvara, vodiče i izvještaje; OSTALO.md/.docx
Co-Authored-By: Claude Opus 5.5 <noreply@anthropic.com>
</commit_message>
<xml_diff>
--- a/PSE Riemann — PLAN.docx
+++ b/PSE Riemann — PLAN.docx
@@ -7668,6 +7668,277 @@
                 <w:szCs w:val="19"/>
               </w:rPr>
               <w:t xml:space="preserve">), inače se ne zapisuje; skeptik napada prije operatera (nedostupan = rečeno); zapečaćen izvještaj + stavka u redu. „Kompleksna verzija ne daje novo B“ upisano kao rezultat. Nađeno snimkom: σ* u podebljanom tekstu kvario Markdown → σ∗</w:t>
+            </w:r>
+          </w:p>
+        </w:tc>
+      </w:tr>
+      <w:tr>
+        <w:trPr>
+          <w:tblHeader w:val="off"/>
+        </w:trPr>
+        <w:tc>
+          <w:tcPr>
+            <w:tcW w:type="dxa" w:w="1191"/>
+            <w:tcBorders>
+              <w:top w:val="single" w:color="D9D4C7" w:sz="4"/>
+              <w:left w:val="single" w:color="D9D4C7" w:sz="4"/>
+              <w:bottom w:val="single" w:color="D9D4C7" w:sz="4"/>
+              <w:right w:val="single" w:color="D9D4C7" w:sz="4"/>
+            </w:tcBorders>
+            <w:tcMar>
+              <w:top w:type="dxa" w:w="60"/>
+              <w:left w:type="dxa" w:w="100"/>
+              <w:bottom w:type="dxa" w:w="60"/>
+              <w:right w:type="dxa" w:w="100"/>
+            </w:tcMar>
+          </w:tcPr>
+          <w:p>
+            <w:pPr>
+              <w:spacing w:after="0"/>
+            </w:pPr>
+            <w:r>
+              <w:rPr>
+                <w:sz w:val="19"/>
+                <w:szCs w:val="19"/>
+              </w:rPr>
+              <w:t xml:space="preserve">2026-10-26</w:t>
+            </w:r>
+          </w:p>
+        </w:tc>
+        <w:tc>
+          <w:tcPr>
+            <w:tcW w:type="dxa" w:w="1732"/>
+            <w:tcBorders>
+              <w:top w:val="single" w:color="D9D4C7" w:sz="4"/>
+              <w:left w:val="single" w:color="D9D4C7" w:sz="4"/>
+              <w:bottom w:val="single" w:color="D9D4C7" w:sz="4"/>
+              <w:right w:val="single" w:color="D9D4C7" w:sz="4"/>
+            </w:tcBorders>
+            <w:tcMar>
+              <w:top w:type="dxa" w:w="60"/>
+              <w:left w:type="dxa" w:w="100"/>
+              <w:bottom w:type="dxa" w:w="60"/>
+              <w:right w:type="dxa" w:w="100"/>
+            </w:tcMar>
+          </w:tcPr>
+          <w:p>
+            <w:pPr>
+              <w:spacing w:after="0"/>
+            </w:pPr>
+            <w:r>
+              <w:rPr>
+                <w:sz w:val="19"/>
+                <w:szCs w:val="19"/>
+              </w:rPr>
+              <w:t xml:space="preserve">— · kandidat za živi test: B </w:t>
+            </w:r>
+            <w:r>
+              <w:rPr>
+                <w:rFonts w:ascii="Consolas" w:cs="Consolas" w:eastAsia="Consolas" w:hAnsi="Consolas"/>
+                <w:color w:val="6B4A12"/>
+                <w:sz w:val="19"/>
+                <w:szCs w:val="19"/>
+              </w:rPr>
+              <w:t xml:space="preserve">pse-riemann_0.2.0~rc1</w:t>
+            </w:r>
+          </w:p>
+        </w:tc>
+        <w:tc>
+          <w:tcPr>
+            <w:tcW w:type="dxa" w:w="974"/>
+            <w:tcBorders>
+              <w:top w:val="single" w:color="D9D4C7" w:sz="4"/>
+              <w:left w:val="single" w:color="D9D4C7" w:sz="4"/>
+              <w:bottom w:val="single" w:color="D9D4C7" w:sz="4"/>
+              <w:right w:val="single" w:color="D9D4C7" w:sz="4"/>
+            </w:tcBorders>
+            <w:tcMar>
+              <w:top w:type="dxa" w:w="60"/>
+              <w:left w:type="dxa" w:w="100"/>
+              <w:bottom w:type="dxa" w:w="60"/>
+              <w:right w:type="dxa" w:w="100"/>
+            </w:tcMar>
+          </w:tcPr>
+          <w:p>
+            <w:pPr>
+              <w:spacing w:after="0"/>
+            </w:pPr>
+            <w:r>
+              <w:rPr>
+                <w:sz w:val="19"/>
+                <w:szCs w:val="19"/>
+              </w:rPr>
+              <w:t xml:space="preserve">✅</w:t>
+            </w:r>
+          </w:p>
+        </w:tc>
+        <w:tc>
+          <w:tcPr>
+            <w:tcW w:type="dxa" w:w="1407"/>
+            <w:tcBorders>
+              <w:top w:val="single" w:color="D9D4C7" w:sz="4"/>
+              <w:left w:val="single" w:color="D9D4C7" w:sz="4"/>
+              <w:bottom w:val="single" w:color="D9D4C7" w:sz="4"/>
+              <w:right w:val="single" w:color="D9D4C7" w:sz="4"/>
+            </w:tcBorders>
+            <w:tcMar>
+              <w:top w:type="dxa" w:w="60"/>
+              <w:left w:type="dxa" w:w="100"/>
+              <w:bottom w:type="dxa" w:w="60"/>
+              <w:right w:type="dxa" w:w="100"/>
+            </w:tcMar>
+          </w:tcPr>
+          <w:p>
+            <w:pPr>
+              <w:spacing w:after="0"/>
+            </w:pPr>
+            <w:r>
+              <w:rPr>
+                <w:sz w:val="19"/>
+                <w:szCs w:val="19"/>
+              </w:rPr>
+              <w:t xml:space="preserve">pytest 281/281; selftest IZ PAKETA ✅ (44, uklj. test prihvatanja; sistemski python3 + samo biblioteke paketa); GUI iz paketa pokrenut</w:t>
+            </w:r>
+          </w:p>
+        </w:tc>
+        <w:tc>
+          <w:tcPr>
+            <w:tcW w:type="dxa" w:w="4334"/>
+            <w:tcBorders>
+              <w:top w:val="single" w:color="D9D4C7" w:sz="4"/>
+              <w:left w:val="single" w:color="D9D4C7" w:sz="4"/>
+              <w:bottom w:val="single" w:color="D9D4C7" w:sz="4"/>
+              <w:right w:val="single" w:color="D9D4C7" w:sz="4"/>
+            </w:tcBorders>
+            <w:tcMar>
+              <w:top w:type="dxa" w:w="60"/>
+              <w:left w:type="dxa" w:w="100"/>
+              <w:bottom w:type="dxa" w:w="60"/>
+              <w:right w:type="dxa" w:w="100"/>
+            </w:tcMar>
+          </w:tcPr>
+          <w:p>
+            <w:pPr>
+              <w:spacing w:after="0"/>
+            </w:pPr>
+            <w:r>
+              <w:rPr>
+                <w:sz w:val="19"/>
+                <w:szCs w:val="19"/>
+              </w:rPr>
+              <w:t xml:space="preserve">Andrej: večeras samo B (puni) deb, na Desktop i na GitHub; jutros živi test (stavka 35). Verzija 0.2.0~rc1 (tilda = prije 0.2.0, pa se konačni instalira preko). Paket sada nosi i: </w:t>
+            </w:r>
+            <w:r>
+              <w:rPr>
+                <w:rFonts w:ascii="Consolas" w:cs="Consolas" w:eastAsia="Consolas" w:hAnsi="Consolas"/>
+                <w:color w:val="6B4A12"/>
+                <w:sz w:val="19"/>
+                <w:szCs w:val="19"/>
+              </w:rPr>
+              <w:t xml:space="preserve">bench/corpus.json</w:t>
+            </w:r>
+            <w:r>
+              <w:rPr>
+                <w:sz w:val="19"/>
+                <w:szCs w:val="19"/>
+              </w:rPr>
+              <w:t xml:space="preserve">, </w:t>
+            </w:r>
+            <w:r>
+              <w:rPr>
+                <w:rFonts w:ascii="Consolas" w:cs="Consolas" w:eastAsia="Consolas" w:hAnsi="Consolas"/>
+                <w:color w:val="6B4A12"/>
+                <w:sz w:val="19"/>
+                <w:szCs w:val="19"/>
+              </w:rPr>
+              <w:t xml:space="preserve">/usr/lib/pse-riemann/pse-guard-helper</w:t>
+            </w:r>
+            <w:r>
+              <w:rPr>
+                <w:sz w:val="19"/>
+                <w:szCs w:val="19"/>
+              </w:rPr>
+              <w:t xml:space="preserve"> (root:root 0755), vodiče za Grafove, SUDOERS vodiče, BENCHMARK, izvještaje istraživanja (qrh, langlands, misija3). 110 MB &gt; 100 MB (granica gita na GitHubu) → GitHub pre-release sa tagom </w:t>
+            </w:r>
+            <w:r>
+              <w:rPr>
+                <w:rFonts w:ascii="Consolas" w:cs="Consolas" w:eastAsia="Consolas" w:hAnsi="Consolas"/>
+                <w:color w:val="6B4A12"/>
+                <w:sz w:val="19"/>
+                <w:szCs w:val="19"/>
+              </w:rPr>
+              <w:t xml:space="preserve">test-0.2.0-rc1</w:t>
+            </w:r>
+            <w:r>
+              <w:rPr>
+                <w:sz w:val="19"/>
+                <w:szCs w:val="19"/>
+              </w:rPr>
+              <w:t xml:space="preserve"> (namjerno ne </w:t>
+            </w:r>
+            <w:r>
+              <w:rPr>
+                <w:rFonts w:ascii="Consolas" w:cs="Consolas" w:eastAsia="Consolas" w:hAnsi="Consolas"/>
+                <w:color w:val="6B4A12"/>
+                <w:sz w:val="19"/>
+                <w:szCs w:val="19"/>
+              </w:rPr>
+              <w:t xml:space="preserve">v*</w:t>
+            </w:r>
+            <w:r>
+              <w:rPr>
+                <w:sz w:val="19"/>
+                <w:szCs w:val="19"/>
+              </w:rPr>
+              <w:t xml:space="preserve">, da ne pokrene CI bez Andreja). </w:t>
+            </w:r>
+            <w:r>
+              <w:rPr>
+                <w:rFonts w:ascii="Consolas" w:cs="Consolas" w:eastAsia="Consolas" w:hAnsi="Consolas"/>
+                <w:color w:val="6B4A12"/>
+                <w:sz w:val="19"/>
+                <w:szCs w:val="19"/>
+              </w:rPr>
+              <w:t xml:space="preserve">docs/OSTALO.md</w:t>
+            </w:r>
+            <w:r>
+              <w:rPr>
+                <w:sz w:val="19"/>
+                <w:szCs w:val="19"/>
+              </w:rPr>
+              <w:t xml:space="preserve"> + </w:t>
+            </w:r>
+            <w:r>
+              <w:rPr>
+                <w:rFonts w:ascii="Consolas" w:cs="Consolas" w:eastAsia="Consolas" w:hAnsi="Consolas"/>
+                <w:color w:val="6B4A12"/>
+                <w:sz w:val="19"/>
+                <w:szCs w:val="19"/>
+              </w:rPr>
+              <w:t xml:space="preserve">PSE Riemann — OSTALO.docx</w:t>
+            </w:r>
+            <w:r>
+              <w:rPr>
+                <w:sz w:val="19"/>
+                <w:szCs w:val="19"/>
+              </w:rPr>
+              <w:t xml:space="preserve"> (šta je ostalo, koraci živog testa) na Desktopu i u repou; </w:t>
+            </w:r>
+            <w:r>
+              <w:rPr>
+                <w:rFonts w:ascii="Consolas" w:cs="Consolas" w:eastAsia="Consolas" w:hAnsi="Consolas"/>
+                <w:color w:val="6B4A12"/>
+                <w:sz w:val="19"/>
+                <w:szCs w:val="19"/>
+              </w:rPr>
+              <w:t xml:space="preserve">make_plan_docx.js --md … --out …</w:t>
+            </w:r>
+            <w:r>
+              <w:rPr>
+                <w:sz w:val="19"/>
+                <w:szCs w:val="19"/>
+              </w:rPr>
+              <w:t xml:space="preserve"> pravi docx iz bilo kog .md</w:t>
             </w:r>
           </w:p>
         </w:tc>

</xml_diff>

<commit_message>
Živi test, nalaz 1: Gemini više ne ide u karantin (provjera dostupnosti bez HTTP-a, HTML greška nije napad, karantin pita operatera); plan 33a/33b
Co-Authored-By: Claude Opus 5.5 <noreply@anthropic.com>
</commit_message>
<xml_diff>
--- a/PSE Riemann — PLAN.docx
+++ b/PSE Riemann — PLAN.docx
@@ -8123,6 +8123,220 @@
           </w:p>
         </w:tc>
       </w:tr>
+      <w:tr>
+        <w:trPr>
+          <w:tblHeader w:val="off"/>
+        </w:trPr>
+        <w:tc>
+          <w:tcPr>
+            <w:tcW w:type="dxa" w:w="1191"/>
+            <w:tcBorders>
+              <w:top w:val="single" w:color="D9D4C7" w:sz="4"/>
+              <w:left w:val="single" w:color="D9D4C7" w:sz="4"/>
+              <w:bottom w:val="single" w:color="D9D4C7" w:sz="4"/>
+              <w:right w:val="single" w:color="D9D4C7" w:sz="4"/>
+            </w:tcBorders>
+            <w:tcMar>
+              <w:top w:type="dxa" w:w="60"/>
+              <w:left w:type="dxa" w:w="100"/>
+              <w:bottom w:type="dxa" w:w="60"/>
+              <w:right w:type="dxa" w:w="100"/>
+            </w:tcMar>
+          </w:tcPr>
+          <w:p>
+            <w:pPr>
+              <w:spacing w:after="0"/>
+            </w:pPr>
+            <w:r>
+              <w:rPr>
+                <w:sz w:val="19"/>
+                <w:szCs w:val="19"/>
+              </w:rPr>
+              <w:t xml:space="preserve">2026-10-27</w:t>
+            </w:r>
+          </w:p>
+        </w:tc>
+        <w:tc>
+          <w:tcPr>
+            <w:tcW w:type="dxa" w:w="1732"/>
+            <w:tcBorders>
+              <w:top w:val="single" w:color="D9D4C7" w:sz="4"/>
+              <w:left w:val="single" w:color="D9D4C7" w:sz="4"/>
+              <w:bottom w:val="single" w:color="D9D4C7" w:sz="4"/>
+              <w:right w:val="single" w:color="D9D4C7" w:sz="4"/>
+            </w:tcBorders>
+            <w:tcMar>
+              <w:top w:type="dxa" w:w="60"/>
+              <w:left w:type="dxa" w:w="100"/>
+              <w:bottom w:type="dxa" w:w="60"/>
+              <w:right w:type="dxa" w:w="100"/>
+            </w:tcMar>
+          </w:tcPr>
+          <w:p>
+            <w:pPr>
+              <w:spacing w:after="0"/>
+            </w:pPr>
+            <w:r>
+              <w:rPr>
+                <w:sz w:val="19"/>
+                <w:szCs w:val="19"/>
+              </w:rPr>
+              <w:t xml:space="preserve">33a · živi test, nalaz 1: Gemini u karantinu</w:t>
+            </w:r>
+          </w:p>
+        </w:tc>
+        <w:tc>
+          <w:tcPr>
+            <w:tcW w:type="dxa" w:w="974"/>
+            <w:tcBorders>
+              <w:top w:val="single" w:color="D9D4C7" w:sz="4"/>
+              <w:left w:val="single" w:color="D9D4C7" w:sz="4"/>
+              <w:bottom w:val="single" w:color="D9D4C7" w:sz="4"/>
+              <w:right w:val="single" w:color="D9D4C7" w:sz="4"/>
+            </w:tcBorders>
+            <w:tcMar>
+              <w:top w:type="dxa" w:w="60"/>
+              <w:left w:type="dxa" w:w="100"/>
+              <w:bottom w:type="dxa" w:w="60"/>
+              <w:right w:type="dxa" w:w="100"/>
+            </w:tcMar>
+          </w:tcPr>
+          <w:p>
+            <w:pPr>
+              <w:spacing w:after="0"/>
+            </w:pPr>
+            <w:r>
+              <w:rPr>
+                <w:sz w:val="19"/>
+                <w:szCs w:val="19"/>
+              </w:rPr>
+              <w:t xml:space="preserve">✅</w:t>
+            </w:r>
+          </w:p>
+        </w:tc>
+        <w:tc>
+          <w:tcPr>
+            <w:tcW w:type="dxa" w:w="1407"/>
+            <w:tcBorders>
+              <w:top w:val="single" w:color="D9D4C7" w:sz="4"/>
+              <w:left w:val="single" w:color="D9D4C7" w:sz="4"/>
+              <w:bottom w:val="single" w:color="D9D4C7" w:sz="4"/>
+              <w:right w:val="single" w:color="D9D4C7" w:sz="4"/>
+            </w:tcBorders>
+            <w:tcMar>
+              <w:top w:type="dxa" w:w="60"/>
+              <w:left w:type="dxa" w:w="100"/>
+              <w:bottom w:type="dxa" w:w="60"/>
+              <w:right w:type="dxa" w:w="100"/>
+            </w:tcMar>
+          </w:tcPr>
+          <w:p>
+            <w:pPr>
+              <w:spacing w:after="0"/>
+            </w:pPr>
+            <w:r>
+              <w:rPr>
+                <w:sz w:val="19"/>
+                <w:szCs w:val="19"/>
+              </w:rPr>
+              <w:t xml:space="preserve">pytest 284/284; uživo: Google na </w:t>
+            </w:r>
+            <w:r>
+              <w:rPr>
+                <w:rFonts w:ascii="Consolas" w:cs="Consolas" w:eastAsia="Consolas" w:hAnsi="Consolas"/>
+                <w:color w:val="6B4A12"/>
+                <w:sz w:val="19"/>
+                <w:szCs w:val="19"/>
+              </w:rPr>
+              <w:t xml:space="preserve">/</w:t>
+            </w:r>
+            <w:r>
+              <w:rPr>
+                <w:sz w:val="19"/>
+                <w:szCs w:val="19"/>
+              </w:rPr>
+              <w:t xml:space="preserve"> vraća HTTP 404 HTML → više nema karantina</w:t>
+            </w:r>
+          </w:p>
+        </w:tc>
+        <w:tc>
+          <w:tcPr>
+            <w:tcW w:type="dxa" w:w="4334"/>
+            <w:tcBorders>
+              <w:top w:val="single" w:color="D9D4C7" w:sz="4"/>
+              <w:left w:val="single" w:color="D9D4C7" w:sz="4"/>
+              <w:bottom w:val="single" w:color="D9D4C7" w:sz="4"/>
+              <w:right w:val="single" w:color="D9D4C7" w:sz="4"/>
+            </w:tcBorders>
+            <w:tcMar>
+              <w:top w:type="dxa" w:w="60"/>
+              <w:left w:type="dxa" w:w="100"/>
+              <w:bottom w:type="dxa" w:w="60"/>
+              <w:right w:type="dxa" w:w="100"/>
+            </w:tcMar>
+          </w:tcPr>
+          <w:p>
+            <w:pPr>
+              <w:spacing w:after="0"/>
+            </w:pPr>
+            <w:r>
+              <w:rPr>
+                <w:sz w:val="19"/>
+                <w:szCs w:val="19"/>
+              </w:rPr>
+              <w:t xml:space="preserve">Dnevnik instalirane verzije: „Testiraj“ u podešavanju — Gemini odgovara (#96–97); pri svakom startu </w:t>
+            </w:r>
+            <w:r>
+              <w:rPr>
+                <w:rFonts w:ascii="Consolas" w:cs="Consolas" w:eastAsia="Consolas" w:hAnsi="Consolas"/>
+                <w:color w:val="6B4A12"/>
+                <w:sz w:val="19"/>
+                <w:szCs w:val="19"/>
+              </w:rPr>
+              <w:t xml:space="preserve">main_reachable</w:t>
+            </w:r>
+            <w:r>
+              <w:rPr>
+                <w:sz w:val="19"/>
+                <w:szCs w:val="19"/>
+              </w:rPr>
+              <w:t xml:space="preserve"> radi </w:t>
+            </w:r>
+            <w:r>
+              <w:rPr>
+                <w:rFonts w:ascii="Consolas" w:cs="Consolas" w:eastAsia="Consolas" w:hAnsi="Consolas"/>
+                <w:color w:val="6B4A12"/>
+                <w:sz w:val="19"/>
+                <w:szCs w:val="19"/>
+              </w:rPr>
+              <w:t xml:space="preserve">GET https://generativelanguage.googleapis.com/</w:t>
+            </w:r>
+            <w:r>
+              <w:rPr>
+                <w:sz w:val="19"/>
+                <w:szCs w:val="19"/>
+              </w:rPr>
+              <w:t xml:space="preserve"> → Google HTML 404 → pravilo „API host vratio HTML ⇒ captive portal“ → tier-2 karantin (#110, #120) → chat blokiran (#122); ručno oslobađanje bi trajalo do sljedeće provjere (10 min). Popravke: </w:t>
+            </w:r>
+            <w:r>
+              <w:rPr>
+                <w:rFonts w:ascii="Consolas" w:cs="Consolas" w:eastAsia="Consolas" w:hAnsi="Consolas"/>
+                <w:color w:val="6B4A12"/>
+                <w:sz w:val="19"/>
+                <w:szCs w:val="19"/>
+              </w:rPr>
+              <w:t xml:space="preserve">egress.probe()</w:t>
+            </w:r>
+            <w:r>
+              <w:rPr>
+                <w:sz w:val="19"/>
+                <w:szCs w:val="19"/>
+              </w:rPr>
+              <w:t xml:space="preserve"> (kapije + TCP + TLS + pin, bez HTTP-a) za provjeru dostupnosti; karantin zbog HTML-a samo kad poziv nosi ključ i dobije HTML sa statusom &lt; 400; HTML greška = obična greška; svaki karantin pravi stavku u redu (Odobri = oslobodi), poruka kaže gdje. Testovi ponavljaju tačno ovaj slučaj</w:t>
+            </w:r>
+          </w:p>
+        </w:tc>
+      </w:tr>
     </w:tbl>
     <w:p>
       <w:pPr>
@@ -8141,7 +8355,7 @@
         <w:t xml:space="preserve">Sljedeće:</w:t>
       </w:r>
       <w:r>
-        <w:t xml:space="preserve"> Andrejev živi test po vodiču, pa popravke; izdanje 34–38 (35 živi test, 36 CI, 37 v0.2.0, 38 .deb + .exe; kompletni SR/EN vodiči posle izgradnje paketa; spajanje u main samo na „spoji u main“); izdanje 34–38 posljednje (vodiči za cijelu aplikaciju posle izgradnje paketa); izdanje 34–38 (38 = .deb + .exe) posljednje.</w:t>
+        <w:t xml:space="preserve"> ostali nalazi živog testa (33a: folder rezultata, Groq 404), 33b potpuno dvojezično, novi rc; izdanje 34–38 (35 živi test, 36 CI, 37 v0.2.0, 38 .deb + .exe; kompletni SR/EN vodiči posle izgradnje paketa; spajanje u main samo na „spoji u main“); izdanje 34–38 posljednje (vodiči za cijelu aplikaciju posle izgradnje paketa); izdanje 34–38 (38 = .deb + .exe) posljednje.</w:t>
       </w:r>
     </w:p>
     <w:p>
@@ -13836,6 +14050,74 @@
       </w:r>
       <w:r>
         <w:t xml:space="preserve"> aplikacija sastavlja radni tekst (uvod, metode, računi sa lab run-ovima, grafovi, izvori sa nivoima, otvorena pitanja), označen NAŠE-NERECENZIRANO; kapija i dalje odbija svaku tvrdnju o dokazu; svaki broj nosi izvor ili lab run; skeptik i adversarijalni mod napadaju tekst prije nego što ga operater vidi. Rezultat „kompleksna verzija ne daje ništa novo“ je takođe rezultat i piše se.</w:t>
+      </w:r>
+    </w:p>
+    <w:p>
+      <w:pPr>
+        <w:spacing w:after="100"/>
+        <w:ind w:left="0"/>
+      </w:pPr>
+      <w:r>
+        <w:t xml:space="preserve">33a. </w:t>
+      </w:r>
+      <w:r>
+        <w:rPr>
+          <w:b/>
+          <w:bCs/>
+        </w:rPr>
+        <w:t xml:space="preserve">Nalazi živog testa 0.2.0~rc1</w:t>
+      </w:r>
+      <w:r>
+        <w:t xml:space="preserve"> (Andrej, 2026-10-27), popravlja se redom: (1) Gemini u karantinu pri svakom startu — provjera dostupnosti radila </w:t>
+      </w:r>
+      <w:r>
+        <w:rPr>
+          <w:rFonts w:ascii="Consolas" w:cs="Consolas" w:eastAsia="Consolas" w:hAnsi="Consolas"/>
+          <w:color w:val="6B4A12"/>
+        </w:rPr>
+        <w:t xml:space="preserve">GET /</w:t>
+      </w:r>
+      <w:r>
+        <w:t xml:space="preserve"> na API hostu, Google vraća HTML 404, čuvar to čitao kao captive portal → </w:t>
+      </w:r>
+      <w:r>
+        <w:rPr>
+          <w:b/>
+          <w:bCs/>
+        </w:rPr>
+        <w:t xml:space="preserve">popravljeno</w:t>
+      </w:r>
+      <w:r>
+        <w:t xml:space="preserve">; (2) karantin nije bilo moguće naći/osloboditi kroz meni → sada stavka u „Čeka tvoju odluku“ (Odobri = oslobodi) i poruka kaže gdje; (3) rezultati instalirane verzije u skrivenom </w:t>
+      </w:r>
+      <w:r>
+        <w:rPr>
+          <w:rFonts w:ascii="Consolas" w:cs="Consolas" w:eastAsia="Consolas" w:hAnsi="Consolas"/>
+          <w:color w:val="6B4A12"/>
+        </w:rPr>
+        <w:t xml:space="preserve">~/.local/share/pse-riemann/</w:t>
+      </w:r>
+      <w:r>
+        <w:t xml:space="preserve"> — Andrej bira vidljivo mjesto; (4) Groq proba vratila 404 (put/model) — provjeriti.</w:t>
+      </w:r>
+    </w:p>
+    <w:p>
+      <w:pPr>
+        <w:spacing w:after="100"/>
+        <w:ind w:left="0"/>
+      </w:pPr>
+      <w:r>
+        <w:t xml:space="preserve">33b. </w:t>
+      </w:r>
+      <w:r>
+        <w:rPr>
+          <w:b/>
+          <w:bCs/>
+        </w:rPr>
+        <w:t xml:space="preserve">Potpuno dvojezično</w:t>
+      </w:r>
+      <w:r>
+        <w:t xml:space="preserve"> (Andrej): sve, uključujući planove i sadržaj, mora postojati na SR i EN. (a) sav tekst koji kod sastavlja kroz prevod sa fiksnim EN verzijama; (b) zasijani sadržaj (teme, izvori, misije, koraci, ideje, PLAN, otvorena pitanja) dobija napisanu EN verziju; (c) sve ostalo (planovi, kartice, misije, ideje, odgovori, izvještaji) glavni AI prevodi automatski pri prebacivanju jezika — u pozadini, keširano, označeno „mašinski prevod“, original se nikad ne mijenja. Prije izdanja.</w:t>
       </w:r>
     </w:p>
     <w:p>

</xml_diff>

<commit_message>
Živi test, nalazi 3–5: rezultati u vidljivom folderu na Desktopu, oporavak od povučenog modela, puni spisak modela i Testiraj izabranog; 0.2.0~rc2
Co-Authored-By: Claude Opus 5.5 <noreply@anthropic.com>
</commit_message>
<xml_diff>
--- a/PSE Riemann — PLAN.docx
+++ b/PSE Riemann — PLAN.docx
@@ -8333,6 +8333,257 @@
                 <w:szCs w:val="19"/>
               </w:rPr>
               <w:t xml:space="preserve"> (kapije + TCP + TLS + pin, bez HTTP-a) za provjeru dostupnosti; karantin zbog HTML-a samo kad poziv nosi ključ i dobije HTML sa statusom &lt; 400; HTML greška = obična greška; svaki karantin pravi stavku u redu (Odobri = oslobodi), poruka kaže gdje. Testovi ponavljaju tačno ovaj slučaj</w:t>
+            </w:r>
+          </w:p>
+        </w:tc>
+      </w:tr>
+      <w:tr>
+        <w:trPr>
+          <w:tblHeader w:val="off"/>
+        </w:trPr>
+        <w:tc>
+          <w:tcPr>
+            <w:tcW w:type="dxa" w:w="1191"/>
+            <w:tcBorders>
+              <w:top w:val="single" w:color="D9D4C7" w:sz="4"/>
+              <w:left w:val="single" w:color="D9D4C7" w:sz="4"/>
+              <w:bottom w:val="single" w:color="D9D4C7" w:sz="4"/>
+              <w:right w:val="single" w:color="D9D4C7" w:sz="4"/>
+            </w:tcBorders>
+            <w:shd w:fill="F4F1EA" w:color="auto" w:val="clear"/>
+            <w:tcMar>
+              <w:top w:type="dxa" w:w="60"/>
+              <w:left w:type="dxa" w:w="100"/>
+              <w:bottom w:type="dxa" w:w="60"/>
+              <w:right w:type="dxa" w:w="100"/>
+            </w:tcMar>
+          </w:tcPr>
+          <w:p>
+            <w:pPr>
+              <w:spacing w:after="0"/>
+            </w:pPr>
+            <w:r>
+              <w:rPr>
+                <w:sz w:val="19"/>
+                <w:szCs w:val="19"/>
+              </w:rPr>
+              <w:t xml:space="preserve">2026-10-27</w:t>
+            </w:r>
+          </w:p>
+        </w:tc>
+        <w:tc>
+          <w:tcPr>
+            <w:tcW w:type="dxa" w:w="1732"/>
+            <w:tcBorders>
+              <w:top w:val="single" w:color="D9D4C7" w:sz="4"/>
+              <w:left w:val="single" w:color="D9D4C7" w:sz="4"/>
+              <w:bottom w:val="single" w:color="D9D4C7" w:sz="4"/>
+              <w:right w:val="single" w:color="D9D4C7" w:sz="4"/>
+            </w:tcBorders>
+            <w:shd w:fill="F4F1EA" w:color="auto" w:val="clear"/>
+            <w:tcMar>
+              <w:top w:type="dxa" w:w="60"/>
+              <w:left w:type="dxa" w:w="100"/>
+              <w:bottom w:type="dxa" w:w="60"/>
+              <w:right w:type="dxa" w:w="100"/>
+            </w:tcMar>
+          </w:tcPr>
+          <w:p>
+            <w:pPr>
+              <w:spacing w:after="0"/>
+            </w:pPr>
+            <w:r>
+              <w:rPr>
+                <w:sz w:val="19"/>
+                <w:szCs w:val="19"/>
+              </w:rPr>
+              <w:t xml:space="preserve">33a · nalazi 3–5: folder rezultata, Groq 404, izbor modela</w:t>
+            </w:r>
+          </w:p>
+        </w:tc>
+        <w:tc>
+          <w:tcPr>
+            <w:tcW w:type="dxa" w:w="974"/>
+            <w:tcBorders>
+              <w:top w:val="single" w:color="D9D4C7" w:sz="4"/>
+              <w:left w:val="single" w:color="D9D4C7" w:sz="4"/>
+              <w:bottom w:val="single" w:color="D9D4C7" w:sz="4"/>
+              <w:right w:val="single" w:color="D9D4C7" w:sz="4"/>
+            </w:tcBorders>
+            <w:shd w:fill="F4F1EA" w:color="auto" w:val="clear"/>
+            <w:tcMar>
+              <w:top w:type="dxa" w:w="60"/>
+              <w:left w:type="dxa" w:w="100"/>
+              <w:bottom w:type="dxa" w:w="60"/>
+              <w:right w:type="dxa" w:w="100"/>
+            </w:tcMar>
+          </w:tcPr>
+          <w:p>
+            <w:pPr>
+              <w:spacing w:after="0"/>
+            </w:pPr>
+            <w:r>
+              <w:rPr>
+                <w:sz w:val="19"/>
+                <w:szCs w:val="19"/>
+              </w:rPr>
+              <w:t xml:space="preserve">✅</w:t>
+            </w:r>
+          </w:p>
+        </w:tc>
+        <w:tc>
+          <w:tcPr>
+            <w:tcW w:type="dxa" w:w="1407"/>
+            <w:tcBorders>
+              <w:top w:val="single" w:color="D9D4C7" w:sz="4"/>
+              <w:left w:val="single" w:color="D9D4C7" w:sz="4"/>
+              <w:bottom w:val="single" w:color="D9D4C7" w:sz="4"/>
+              <w:right w:val="single" w:color="D9D4C7" w:sz="4"/>
+            </w:tcBorders>
+            <w:shd w:fill="F4F1EA" w:color="auto" w:val="clear"/>
+            <w:tcMar>
+              <w:top w:type="dxa" w:w="60"/>
+              <w:left w:type="dxa" w:w="100"/>
+              <w:bottom w:type="dxa" w:w="60"/>
+              <w:right w:type="dxa" w:w="100"/>
+            </w:tcMar>
+          </w:tcPr>
+          <w:p>
+            <w:pPr>
+              <w:spacing w:after="0"/>
+            </w:pPr>
+            <w:r>
+              <w:rPr>
+                <w:sz w:val="19"/>
+                <w:szCs w:val="19"/>
+              </w:rPr>
+              <w:t xml:space="preserve">pytest 291/291</w:t>
+            </w:r>
+          </w:p>
+        </w:tc>
+        <w:tc>
+          <w:tcPr>
+            <w:tcW w:type="dxa" w:w="4334"/>
+            <w:tcBorders>
+              <w:top w:val="single" w:color="D9D4C7" w:sz="4"/>
+              <w:left w:val="single" w:color="D9D4C7" w:sz="4"/>
+              <w:bottom w:val="single" w:color="D9D4C7" w:sz="4"/>
+              <w:right w:val="single" w:color="D9D4C7" w:sz="4"/>
+            </w:tcBorders>
+            <w:shd w:fill="F4F1EA" w:color="auto" w:val="clear"/>
+            <w:tcMar>
+              <w:top w:type="dxa" w:w="60"/>
+              <w:left w:type="dxa" w:w="100"/>
+              <w:bottom w:type="dxa" w:w="60"/>
+              <w:right w:type="dxa" w:w="100"/>
+            </w:tcMar>
+          </w:tcPr>
+          <w:p>
+            <w:pPr>
+              <w:spacing w:after="0"/>
+            </w:pPr>
+            <w:r>
+              <w:rPr>
+                <w:sz w:val="19"/>
+                <w:szCs w:val="19"/>
+              </w:rPr>
+              <w:t xml:space="preserve">(3) Andrej izabrao 1: instalirana aplikacija čuva sve u vidljivom </w:t>
+            </w:r>
+            <w:r>
+              <w:rPr>
+                <w:rFonts w:ascii="Consolas" w:cs="Consolas" w:eastAsia="Consolas" w:hAnsi="Consolas"/>
+                <w:color w:val="6B4A12"/>
+                <w:sz w:val="19"/>
+                <w:szCs w:val="19"/>
+              </w:rPr>
+              <w:t xml:space="preserve">~/Desktop/PSE Riemann rezultati/</w:t>
+            </w:r>
+            <w:r>
+              <w:rPr>
+                <w:sz w:val="19"/>
+                <w:szCs w:val="19"/>
+              </w:rPr>
+              <w:t xml:space="preserve"> (vault, </w:t>
+            </w:r>
+            <w:r>
+              <w:rPr>
+                <w:rFonts w:ascii="Consolas" w:cs="Consolas" w:eastAsia="Consolas" w:hAnsi="Consolas"/>
+                <w:color w:val="6B4A12"/>
+                <w:sz w:val="19"/>
+                <w:szCs w:val="19"/>
+              </w:rPr>
+              <w:t xml:space="preserve">snimci ekrana/</w:t>
+            </w:r>
+            <w:r>
+              <w:rPr>
+                <w:sz w:val="19"/>
+                <w:szCs w:val="19"/>
+              </w:rPr>
+              <w:t xml:space="preserve">, </w:t>
+            </w:r>
+            <w:r>
+              <w:rPr>
+                <w:rFonts w:ascii="Consolas" w:cs="Consolas" w:eastAsia="Consolas" w:hAnsi="Consolas"/>
+                <w:color w:val="6B4A12"/>
+                <w:sz w:val="19"/>
+                <w:szCs w:val="19"/>
+              </w:rPr>
+              <w:t xml:space="preserve">models/</w:t>
+            </w:r>
+            <w:r>
+              <w:rPr>
+                <w:sz w:val="19"/>
+                <w:szCs w:val="19"/>
+              </w:rPr>
+              <w:t xml:space="preserve">, </w:t>
+            </w:r>
+            <w:r>
+              <w:rPr>
+                <w:rFonts w:ascii="Consolas" w:cs="Consolas" w:eastAsia="Consolas" w:hAnsi="Consolas"/>
+                <w:color w:val="6B4A12"/>
+                <w:sz w:val="19"/>
+                <w:szCs w:val="19"/>
+              </w:rPr>
+              <w:t xml:space="preserve">PROČITAJ.txt</w:t>
+            </w:r>
+            <w:r>
+              <w:rPr>
+                <w:sz w:val="19"/>
+                <w:szCs w:val="19"/>
+              </w:rPr>
+              <w:t xml:space="preserve">); stari skriveni vault se premješta tamo jednom (ništa se ne gubi, </w:t>
+            </w:r>
+            <w:r>
+              <w:rPr>
+                <w:rFonts w:ascii="Consolas" w:cs="Consolas" w:eastAsia="Consolas" w:hAnsi="Consolas"/>
+                <w:color w:val="6B4A12"/>
+                <w:sz w:val="19"/>
+                <w:szCs w:val="19"/>
+              </w:rPr>
+              <w:t xml:space="preserve">PREMJESTENO.txt</w:t>
+            </w:r>
+            <w:r>
+              <w:rPr>
+                <w:sz w:val="19"/>
+                <w:szCs w:val="19"/>
+              </w:rPr>
+              <w:t xml:space="preserve"> u starom folderu, zapis u dnevniku); dugme 📂 + paleta „Rezultati — otvori folder“. (4) Groq 404 = podrazumijevani model povučen: „Testiraj“ na 404 sam učita prave modele, izabere najbliži chat model, proba ponovo i zapamti. (5) Andrej: provajderi imaju više modela, a nuđen je jedan → spisak se sam učitava sa servera čim postoji ključ (bez govornih/guard/embedding modela), sačuvan izbor prvi; </w:t>
+            </w:r>
+            <w:r>
+              <w:rPr>
+                <w:b/>
+                <w:bCs/>
+                <w:sz w:val="19"/>
+                <w:szCs w:val="19"/>
+              </w:rPr>
+              <w:t xml:space="preserve">bug</w:t>
+            </w:r>
+            <w:r>
+              <w:rPr>
+                <w:sz w:val="19"/>
+                <w:szCs w:val="19"/>
+              </w:rPr>
+              <w:t xml:space="preserve">: „Testiraj“ je provjeravao podrazumijevani model umjesto izabranog — sada izabrani, i pamti ga. Verzija 0.2.0~rc2</w:t>
             </w:r>
           </w:p>
         </w:tc>

</xml_diff>

<commit_message>
Dogovor: svi agenti su PSE jedinice (SR + EN, docx); plan Faza 6d, v0.3.0; 33c ⚙ Podešavanje u meniju tabova
Agreement: every agent is a PSE unit (SR + EN, docx); plan phase 6d, v0.3.0; 33c Settings tab.

Co-Authored-By: Claude Opus 5.5 <noreply@anthropic.com>
</commit_message>
<xml_diff>
--- a/PSE Riemann — PLAN.docx
+++ b/PSE Riemann — PLAN.docx
@@ -8588,6 +8588,197 @@
           </w:p>
         </w:tc>
       </w:tr>
+      <w:tr>
+        <w:trPr>
+          <w:tblHeader w:val="off"/>
+        </w:trPr>
+        <w:tc>
+          <w:tcPr>
+            <w:tcW w:type="dxa" w:w="1191"/>
+            <w:tcBorders>
+              <w:top w:val="single" w:color="D9D4C7" w:sz="4"/>
+              <w:left w:val="single" w:color="D9D4C7" w:sz="4"/>
+              <w:bottom w:val="single" w:color="D9D4C7" w:sz="4"/>
+              <w:right w:val="single" w:color="D9D4C7" w:sz="4"/>
+            </w:tcBorders>
+            <w:tcMar>
+              <w:top w:type="dxa" w:w="60"/>
+              <w:left w:type="dxa" w:w="100"/>
+              <w:bottom w:type="dxa" w:w="60"/>
+              <w:right w:type="dxa" w:w="100"/>
+            </w:tcMar>
+          </w:tcPr>
+          <w:p>
+            <w:pPr>
+              <w:spacing w:after="0"/>
+            </w:pPr>
+            <w:r>
+              <w:rPr>
+                <w:sz w:val="19"/>
+                <w:szCs w:val="19"/>
+              </w:rPr>
+              <w:t xml:space="preserve">2026-10-27</w:t>
+            </w:r>
+          </w:p>
+        </w:tc>
+        <w:tc>
+          <w:tcPr>
+            <w:tcW w:type="dxa" w:w="1732"/>
+            <w:tcBorders>
+              <w:top w:val="single" w:color="D9D4C7" w:sz="4"/>
+              <w:left w:val="single" w:color="D9D4C7" w:sz="4"/>
+              <w:bottom w:val="single" w:color="D9D4C7" w:sz="4"/>
+              <w:right w:val="single" w:color="D9D4C7" w:sz="4"/>
+            </w:tcBorders>
+            <w:tcMar>
+              <w:top w:type="dxa" w:w="60"/>
+              <w:left w:type="dxa" w:w="100"/>
+              <w:bottom w:type="dxa" w:w="60"/>
+              <w:right w:type="dxa" w:w="100"/>
+            </w:tcMar>
+          </w:tcPr>
+          <w:p>
+            <w:pPr>
+              <w:spacing w:after="0"/>
+            </w:pPr>
+            <w:r>
+              <w:rPr>
+                <w:sz w:val="19"/>
+                <w:szCs w:val="19"/>
+              </w:rPr>
+              <w:t xml:space="preserve">33c + dogovor „svi agenti su PSE“</w:t>
+            </w:r>
+          </w:p>
+        </w:tc>
+        <w:tc>
+          <w:tcPr>
+            <w:tcW w:type="dxa" w:w="974"/>
+            <w:tcBorders>
+              <w:top w:val="single" w:color="D9D4C7" w:sz="4"/>
+              <w:left w:val="single" w:color="D9D4C7" w:sz="4"/>
+              <w:bottom w:val="single" w:color="D9D4C7" w:sz="4"/>
+              <w:right w:val="single" w:color="D9D4C7" w:sz="4"/>
+            </w:tcBorders>
+            <w:tcMar>
+              <w:top w:type="dxa" w:w="60"/>
+              <w:left w:type="dxa" w:w="100"/>
+              <w:bottom w:type="dxa" w:w="60"/>
+              <w:right w:type="dxa" w:w="100"/>
+            </w:tcMar>
+          </w:tcPr>
+          <w:p>
+            <w:pPr>
+              <w:spacing w:after="0"/>
+            </w:pPr>
+            <w:r>
+              <w:rPr>
+                <w:sz w:val="19"/>
+                <w:szCs w:val="19"/>
+              </w:rPr>
+              <w:t xml:space="preserve">✅ 33c; dogovor zapisan</w:t>
+            </w:r>
+          </w:p>
+        </w:tc>
+        <w:tc>
+          <w:tcPr>
+            <w:tcW w:type="dxa" w:w="1407"/>
+            <w:tcBorders>
+              <w:top w:val="single" w:color="D9D4C7" w:sz="4"/>
+              <w:left w:val="single" w:color="D9D4C7" w:sz="4"/>
+              <w:bottom w:val="single" w:color="D9D4C7" w:sz="4"/>
+              <w:right w:val="single" w:color="D9D4C7" w:sz="4"/>
+            </w:tcBorders>
+            <w:tcMar>
+              <w:top w:type="dxa" w:w="60"/>
+              <w:left w:type="dxa" w:w="100"/>
+              <w:bottom w:type="dxa" w:w="60"/>
+              <w:right w:type="dxa" w:w="100"/>
+            </w:tcMar>
+          </w:tcPr>
+          <w:p>
+            <w:pPr>
+              <w:spacing w:after="0"/>
+            </w:pPr>
+            <w:r>
+              <w:rPr>
+                <w:sz w:val="19"/>
+                <w:szCs w:val="19"/>
+              </w:rPr>
+              <w:t xml:space="preserve">test 33c</w:t>
+            </w:r>
+          </w:p>
+        </w:tc>
+        <w:tc>
+          <w:tcPr>
+            <w:tcW w:type="dxa" w:w="4334"/>
+            <w:tcBorders>
+              <w:top w:val="single" w:color="D9D4C7" w:sz="4"/>
+              <w:left w:val="single" w:color="D9D4C7" w:sz="4"/>
+              <w:bottom w:val="single" w:color="D9D4C7" w:sz="4"/>
+              <w:right w:val="single" w:color="D9D4C7" w:sz="4"/>
+            </w:tcBorders>
+            <w:tcMar>
+              <w:top w:type="dxa" w:w="60"/>
+              <w:left w:type="dxa" w:w="100"/>
+              <w:bottom w:type="dxa" w:w="60"/>
+              <w:right w:type="dxa" w:w="100"/>
+            </w:tcMar>
+          </w:tcPr>
+          <w:p>
+            <w:pPr>
+              <w:spacing w:after="0"/>
+            </w:pPr>
+            <w:r>
+              <w:rPr>
+                <w:sz w:val="19"/>
+                <w:szCs w:val="19"/>
+              </w:rPr>
+              <w:t xml:space="preserve">33c: tab „⚙ Podešavanje“ otvara podešavanje i vraća na prethodni tab. Andrej je primijetio da agenti nisu PSE: inventar je potvrdio </w:t>
+            </w:r>
+            <w:r>
+              <w:rPr>
+                <w:b/>
+                <w:bCs/>
+                <w:sz w:val="19"/>
+                <w:szCs w:val="19"/>
+              </w:rPr>
+              <w:t xml:space="preserve">15 agenata, 0 PSE sazdano, 3 djelimično</w:t>
+            </w:r>
+            <w:r>
+              <w:rPr>
+                <w:sz w:val="19"/>
+                <w:szCs w:val="19"/>
+              </w:rPr>
+              <w:t xml:space="preserve"> (moj propust u izvedbi i izvještavanju). Dogovor (</w:t>
+            </w:r>
+            <w:r>
+              <w:rPr>
+                <w:rFonts w:ascii="Consolas" w:cs="Consolas" w:eastAsia="Consolas" w:hAnsi="Consolas"/>
+                <w:color w:val="6B4A12"/>
+                <w:sz w:val="19"/>
+                <w:szCs w:val="19"/>
+              </w:rPr>
+              <w:t xml:space="preserve">docs/DOGOVOR-PSE-AGENTI.md</w:t>
+            </w:r>
+            <w:r>
+              <w:rPr>
+                <w:sz w:val="19"/>
+                <w:szCs w:val="19"/>
+              </w:rPr>
+              <w:t xml:space="preserve"> + EN + docx): četvorka jedinice za svakog agenta, θ po potezu (rad i riječi), K_C = K_N = 30 početno, čitač nezavisan od modela (čita skeptikov model), smrt ⇒ sve u SHARED_LIB, njihanje (RMSSD, PAC, prozori 30/10 000, amplituda 10), A5 sa „tatama“ dokumenata, fisija/fuzija odlučuje SHARED_LIB sam, sumnja ⇒ Doktor ⇒ ako nađe loše, operateru; kočnice se vežu za svoje članove arhitekture. Verzija izdanja: </w:t>
+            </w:r>
+            <w:r>
+              <w:rPr>
+                <w:b/>
+                <w:bCs/>
+                <w:sz w:val="19"/>
+                <w:szCs w:val="19"/>
+              </w:rPr>
+              <w:t xml:space="preserve">v0.3.0</w:t>
+            </w:r>
+          </w:p>
+        </w:tc>
+      </w:tr>
     </w:tbl>
     <w:p>
       <w:pPr>
@@ -8606,7 +8797,7 @@
         <w:t xml:space="preserve">Sljedeće:</w:t>
       </w:r>
       <w:r>
-        <w:t xml:space="preserve"> ostali nalazi živog testa (33a: folder rezultata, Groq 404), 33b potpuno dvojezično, novi rc; izdanje 34–38 (35 živi test, 36 CI, 37 v0.2.0, 38 .deb + .exe; kompletni SR/EN vodiči posle izgradnje paketa; spajanje u main samo na „spoji u main“); izdanje 34–38 posljednje (vodiči za cijelu aplikaciju posle izgradnje paketa); izdanje 34–38 (38 = .deb + .exe) posljednje.</w:t>
+        <w:t xml:space="preserve"> Faza 6d — svi agenti su PSE (P0 jezgro → P1 → P2 → P3), pa 33b, 33d, 33e, 0.3.0~rc1; izdanje 34–38 posljednje (CI, v0.3.0, .deb + .exe, kompletni SR/EN vodiči posle izgradnje, spajanje u main samo na „spoji u main“).</w:t>
       </w:r>
     </w:p>
     <w:p>
@@ -9204,7 +9395,7 @@
           </w:pPr>
           <w:hyperlink w:history="1" w:anchor="_Toc26">
             <w:r>
-              <w:t xml:space="preserve">Faza 5 · Pametniji Fizičar i mjerenje</w:t>
+              <w:t xml:space="preserve">Faza 5 · Pametniji Doktor (ranije „Fizičar“) i mjerenje</w:t>
             </w:r>
             <w:r>
               <w:tab/>
@@ -9292,7 +9483,7 @@
           </w:pPr>
           <w:hyperlink w:history="1" w:anchor="_Toc30">
             <w:r>
-              <w:t xml:space="preserve">Faza 7 · Dokumentacija i izdanje</w:t>
+              <w:t xml:space="preserve">Faza 6d · SVI AGENTI SU PSE JEDINICE (Andrej, 2026-10-27 — prije svega ostalog)</w:t>
             </w:r>
             <w:r>
               <w:tab/>
@@ -9300,6 +9491,28 @@
             <w:r>
               <w:fldChar w:fldCharType="begin" w:dirty="true"/>
               <w:instrText xml:space="preserve">PAGEREF _Toc30 \h</w:instrText>
+              <w:fldChar w:fldCharType="separate"/>
+              <w:fldChar w:fldCharType="end"/>
+            </w:r>
+          </w:hyperlink>
+        </w:p>
+        <w:p>
+          <w:pPr>
+            <w:pStyle w:val="TOC2"/>
+            <w:tabs>
+              <w:tab w:val="right" w:pos="9638" w:leader="dot"/>
+            </w:tabs>
+          </w:pPr>
+          <w:hyperlink w:history="1" w:anchor="_Toc31">
+            <w:r>
+              <w:t xml:space="preserve">Faza 7 · Dokumentacija i izdanje</w:t>
+            </w:r>
+            <w:r>
+              <w:tab/>
+            </w:r>
+            <w:r>
+              <w:fldChar w:fldCharType="begin" w:dirty="true"/>
+              <w:instrText xml:space="preserve">PAGEREF _Toc31 \h</w:instrText>
               <w:fldChar w:fldCharType="separate"/>
               <w:fldChar w:fldCharType="end"/>
             </w:r>
@@ -12498,14 +12711,24 @@
         <w:t xml:space="preserve">.deb i .exe</w:t>
       </w:r>
       <w:r>
-        <w:t xml:space="preserve"> (verzija 0.2.0, tag </w:t>
+        <w:t xml:space="preserve"> (verzija </w:t>
+      </w:r>
+      <w:r>
+        <w:rPr>
+          <w:b/>
+          <w:bCs/>
+        </w:rPr>
+        <w:t xml:space="preserve">0.3.0</w:t>
+      </w:r>
+      <w:r>
+        <w:t xml:space="preserve">, tag </w:t>
       </w:r>
       <w:r>
         <w:rPr>
           <w:rFonts w:ascii="Consolas" w:cs="Consolas" w:eastAsia="Consolas" w:hAnsi="Consolas"/>
           <w:color w:val="6B4A12"/>
         </w:rPr>
-        <w:t xml:space="preserve">v0.2.0</w:t>
+        <w:t xml:space="preserve">v0.3.0</w:t>
       </w:r>
       <w:r>
         <w:t xml:space="preserve">, </w:t>
@@ -12518,7 +12741,7 @@
         <w:t xml:space="preserve">.exe</w:t>
       </w:r>
       <w:r>
-        <w:t xml:space="preserve"> kao GitHub Release). Oznake: S = od Svaroga, P = od Peruna, A = greška nađena poređenjem. Brojevi S/P odgovaraju redovima B/C u </w:t>
+        <w:t xml:space="preserve"> kao GitHub Release; Andrej 2026-10-27: izdanje se zove v0.3.0, kandidati 0.3.0~rcN). Oznake: S = od Svaroga, P = od Peruna, A = greška nađena poređenjem. Brojevi S/P odgovaraju redovima B/C u </w:t>
       </w:r>
       <w:r>
         <w:rPr>
@@ -13172,7 +13395,7 @@
       </w:pPr>
       <w:bookmarkStart w:name="_Toc26" w:id="26"/>
       <w:r>
-        <w:t xml:space="preserve">Faza 5 · Pametniji Fizičar i mjerenje</w:t>
+        <w:t xml:space="preserve">Faza 5 · Pametniji Doktor (ranije „Fizičar“) i mjerenje</w:t>
       </w:r>
       <w:bookmarkEnd w:id="26"/>
     </w:p>
@@ -14373,13 +14596,164 @@
     </w:p>
     <w:p>
       <w:pPr>
+        <w:spacing w:after="100"/>
+        <w:ind w:left="0"/>
+      </w:pPr>
+      <w:r>
+        <w:t xml:space="preserve">33c. </w:t>
+      </w:r>
+      <w:r>
+        <w:rPr>
+          <w:b/>
+          <w:bCs/>
+        </w:rPr>
+        <w:t xml:space="preserve">„⚙ Podešavanje“ u meniju tabova</w:t>
+      </w:r>
+      <w:r>
+        <w:t xml:space="preserve"> (Andrej, 2026-10-27): posljednji tab otvara podešavanje (provajder AI-ja, ključevi, modeli, skeptik) — isto kao prvo pokretanje.</w:t>
+      </w:r>
+    </w:p>
+    <w:p>
+      <w:pPr>
+        <w:spacing w:after="100"/>
+        <w:ind w:left="0"/>
+      </w:pPr>
+      <w:r>
+        <w:t xml:space="preserve">33d. </w:t>
+      </w:r>
+      <w:r>
+        <w:rPr>
+          <w:b/>
+          <w:bCs/>
+        </w:rPr>
+        <w:t xml:space="preserve">„Čeka tvoju odluku“ po grupama, sa izborom</w:t>
+      </w:r>
+      <w:r>
+        <w:t xml:space="preserve"> (Andrej): stablo po vrsti, a radovi po temama koje mašina sama izvuče iz naslova i sažetaka (deterministički); kvačica na stavci i grupi; „Odobri označene“ / „Ne odobri označene“ — jedna, više ili sve; klik prikaže cijeli sažetak.</w:t>
+      </w:r>
+    </w:p>
+    <w:p>
+      <w:pPr>
+        <w:spacing w:after="100"/>
+        <w:ind w:left="0"/>
+      </w:pPr>
+      <w:r>
+        <w:t xml:space="preserve">33e. </w:t>
+      </w:r>
+      <w:r>
+        <w:rPr>
+          <w:b/>
+          <w:bCs/>
+        </w:rPr>
+        <w:t xml:space="preserve">SHARED_LIB razgovara ljudski</w:t>
+      </w:r>
+      <w:r>
+        <w:t xml:space="preserve"> (Andrej): činjenice i dalje samo iz baze (SELECT, nijedan izmišljen broj), ali glasom asistenta na poslu; SQL i redovi sklopljeni ispod („prikaži odakle“); bez AI-ja šablonske ljudske rečenice.</w:t>
+      </w:r>
+    </w:p>
+    <w:p>
+      <w:pPr>
+        <w:spacing w:after="100"/>
+        <w:ind w:left="0"/>
+      </w:pPr>
+      <w:r>
+        <w:t xml:space="preserve">33f. </w:t>
+      </w:r>
+      <w:r>
+        <w:rPr>
+          <w:b/>
+          <w:bCs/>
+        </w:rPr>
+        <w:t xml:space="preserve">Razgovor o misiji — srce misije</w:t>
+      </w:r>
+      <w:r>
+        <w:t xml:space="preserve"> (Andrej): izbor jednog, više ili svih radova + misija → agent misije čita (sažetak, na traženje puni tekst) uz stanje misije → razgovor u oba smjera (agent ispituje operatera, operater agenta; skeptik napada tvrdnje u toku) → „Sastavi zaključak“: prijedlozi (koraci misije, otvorena pitanja, ideje, cilj, metoda za vrata) idu u „Čeka tvoju odluku“, ništa se ne upisuje samo; razgovor sačuvan u rezultatima (NAŠE-NERECENZIRANO) i u „gdje si stao“.</w:t>
+      </w:r>
+    </w:p>
+    <w:p>
+      <w:pPr>
+        <w:spacing w:after="100"/>
+        <w:ind w:left="820"/>
+      </w:pPr>
+      <w:r>
+        <w:rPr>
+          <w:b/>
+          <w:bCs/>
+        </w:rPr>
+        <w:t xml:space="preserve">Redoslijed:</w:t>
+      </w:r>
+      <w:r>
+        <w:t xml:space="preserve"> 33c → 33b (prvo sloj za prevođenje, da 33d–33f nastanu dvojezično) → 33d → 33e → 33f → rc3.</w:t>
+      </w:r>
+    </w:p>
+    <w:p>
+      <w:pPr>
         <w:pStyle w:val="Heading2"/>
       </w:pPr>
       <w:bookmarkStart w:name="_Toc30" w:id="30"/>
       <w:r>
+        <w:t xml:space="preserve">Faza 6d · SVI AGENTI SU PSE JEDINICE (Andrej, 2026-10-27 — prije svega ostalog)</w:t>
+      </w:r>
+      <w:bookmarkEnd w:id="30"/>
+    </w:p>
+    <w:p>
+      <w:pPr>
+        <w:spacing w:after="100"/>
+        <w:ind w:left="0"/>
+      </w:pPr>
+      <w:r>
+        <w:t xml:space="preserve">Ugovor za izvedbu: </w:t>
+      </w:r>
+      <w:r>
+        <w:rPr>
+          <w:rFonts w:ascii="Consolas" w:cs="Consolas" w:eastAsia="Consolas" w:hAnsi="Consolas"/>
+          <w:color w:val="6B4A12"/>
+        </w:rPr>
+        <w:t xml:space="preserve">DOGOVOR-PSE-AGENTI.md</w:t>
+      </w:r>
+      <w:r>
+        <w:t xml:space="preserve"> / </w:t>
+      </w:r>
+      <w:r>
+        <w:rPr>
+          <w:rFonts w:ascii="Consolas" w:cs="Consolas" w:eastAsia="Consolas" w:hAnsi="Consolas"/>
+          <w:color w:val="6B4A12"/>
+        </w:rPr>
+        <w:t xml:space="preserve">AGREEMENT-PSE-AGENTS.md</w:t>
+      </w:r>
+      <w:r>
+        <w:t xml:space="preserve"> (+ docx). Stanje 2026-10-27: 15 agenata, </w:t>
+      </w:r>
+      <w:r>
+        <w:rPr>
+          <w:b/>
+          <w:bCs/>
+        </w:rPr>
+        <w:t xml:space="preserve">0 PSE sazdano</w:t>
+      </w:r>
+      <w:r>
+        <w:t xml:space="preserve">, 3 djelimično. P0 jezgro u SHARED_LIB-u (PSEUnit, profili, registracija/PVP, θ po potezu iz rada i riječi, atraktori, vijek/smrt/predaja SHARED_LIB-u, Doktor, fisija i fuzija, deklaracije, DL1 + oznaka porijekla, prerada kočnica) → P1 AI agenti → P2 agenti bez modela → P3 agent misije (33f) → 33b → 33d → 33e → 0.3.0~rc1. „Fizičar“ se svuda zove </w:t>
+      </w:r>
+      <w:r>
+        <w:rPr>
+          <w:b/>
+          <w:bCs/>
+        </w:rPr>
+        <w:t xml:space="preserve">Doktor</w:t>
+      </w:r>
+      <w:r>
+        <w:t xml:space="preserve">. Otvoreno (odlučuje Andrej): povratnost fisije/fuzije; spajanje brojeva čitača i poda pravila; klasifikacija izvora; učenje težina glasova.</w:t>
+      </w:r>
+    </w:p>
+    <w:p>
+      <w:pPr>
+        <w:pStyle w:val="Heading2"/>
+      </w:pPr>
+      <w:bookmarkStart w:name="_Toc31" w:id="31"/>
+      <w:r>
         <w:t xml:space="preserve">Faza 7 · Dokumentacija i izdanje</w:t>
       </w:r>
-      <w:bookmarkEnd w:id="30"/>
+      <w:bookmarkEnd w:id="31"/>
     </w:p>
     <w:p>
       <w:pPr>
@@ -14504,17 +14878,27 @@
         <w:t xml:space="preserve">37.	</w:t>
       </w:r>
       <w:r>
-        <w:t xml:space="preserve">Verzija 0.2.0, tag </w:t>
+        <w:t xml:space="preserve">Verzija </w:t>
+      </w:r>
+      <w:r>
+        <w:rPr>
+          <w:b/>
+          <w:bCs/>
+        </w:rPr>
+        <w:t xml:space="preserve">0.3.0</w:t>
+      </w:r>
+      <w:r>
+        <w:t xml:space="preserve"> (Andrej, 2026-10-27; bilo 0.2.0), tag </w:t>
       </w:r>
       <w:r>
         <w:rPr>
           <w:rFonts w:ascii="Consolas" w:cs="Consolas" w:eastAsia="Consolas" w:hAnsi="Consolas"/>
           <w:color w:val="6B4A12"/>
         </w:rPr>
-        <w:t xml:space="preserve">v0.2.0</w:t>
-      </w:r>
-      <w:r>
-        <w:t xml:space="preserve">, .exe samo kao GitHub Release.</w:t>
+        <w:t xml:space="preserve">v0.3.0</w:t>
+      </w:r>
+      <w:r>
+        <w:t xml:space="preserve">, .exe samo kao GitHub Release. Kandidati: 0.3.0~rc1, rc2 … (instaliraju se preko 0.2.0~rc2).</w:t>
       </w:r>
     </w:p>
     <w:p>

</xml_diff>

<commit_message>
6d: WORKLOG, ZA-ANDREJA (tumačenja + kalibracija), snimci Laboratorije
Co-Authored-By: Claude Opus 5.5 <noreply@anthropic.com>
</commit_message>
<xml_diff>
--- a/PSE Riemann — PLAN.docx
+++ b/PSE Riemann — PLAN.docx
@@ -40,7 +40,7 @@
           <w:sz w:val="20"/>
           <w:szCs w:val="20"/>
         </w:rPr>
-        <w:t xml:space="preserve">Stanje na dan 2026-10-26 · izvor: docs/PLAN.md i docs/WORKLOG.md (GitHub andrejristic/pse-riemann)</w:t>
+        <w:t xml:space="preserve">Stanje na dan 2026-10-27 · izvor: docs/PLAN.md i docs/WORKLOG.md (GitHub andrejristic/pse-riemann)</w:t>
       </w:r>
     </w:p>
     <w:p>
@@ -2793,7 +2793,7 @@
                 <w:sz w:val="19"/>
                 <w:szCs w:val="19"/>
               </w:rPr>
-              <w:t xml:space="preserve">: posterior nad oblicima H/N/B/C/S (+ zaboravljanje), CUSUM, potvrda tvrdim znakom; zaraza = 3-od-3 → Fizičar; posterior+CUSUM bez potvrde = povratno zadržavanje (</w:t>
+              <w:t xml:space="preserve">: posterior nad oblicima H/N/B/C/S (+ zaboravljanje), CUSUM, potvrda tvrdim znakom; zaraza = 3-od-3 → Doktor; posterior+CUSUM bez potvrde = povratno zadržavanje (</w:t>
             </w:r>
             <w:r>
               <w:rPr>
@@ -11919,7 +11919,7 @@
         <w:t xml:space="preserve">Agent sa ijednim zlom je zaražen i mora se liječiti</w:t>
       </w:r>
       <w:r>
-        <w:t xml:space="preserve"> (master §4 S3, §8 Fizičar, §10.6 dva stepena):</w:t>
+        <w:t xml:space="preserve"> (master §4 S3, §8 Doktor, §10.6 dva stepena):</w:t>
       </w:r>
     </w:p>
     <w:p>
@@ -11973,7 +11973,7 @@
         <w:t xml:space="preserve">Dijagnoza</w:t>
       </w:r>
       <w:r>
-        <w:t xml:space="preserve"> (Fizičar): koje zlo, od kada ("nulti pacijent" iz dnevnika), praćenje kontakata po provenance tragu, atraktor N/B/C/S</w:t>
+        <w:t xml:space="preserve"> (Doktor): koje zlo, od kada ("nulti pacijent" iz dnevnika), praćenje kontakata po provenance tragu, atraktor N/B/C/S</w:t>
       </w:r>
     </w:p>
     <w:p>
@@ -12127,7 +12127,7 @@
         <w:ind w:left="0"/>
       </w:pPr>
       <w:r>
-        <w:t xml:space="preserve">Ko liječi liječnika: SHARED_LIB zamjenjuje bolesnog Fizičara svježim (nasljeđuje registar obrazaca, ne bolesnu thetu). Sve iz stepena 2 (fisija, smrt, vraćanje operaterovih fajlova) odlučuje čovjek.</w:t>
+        <w:t xml:space="preserve">Ko liječi liječnika: SHARED_LIB zamjenjuje bolesnog Doktora svježim (nasljeđuje registar obrazaca, ne bolesnu thetu). Sve iz stepena 2 (fisija, smrt, vraćanje operaterovih fajlova) odlučuje čovjek.</w:t>
       </w:r>
     </w:p>
     <w:p>

</xml_diff>

<commit_message>
6d R7 (2/2) + R8: slike vodiča iz paketa, docx vodiča, vodič za instalaciju i živi test (SR + EN), konačni paketi 0.3.0~rc1
- vodič u aplikaciji prikazuje slike (osnovni folder preglednika); Laboratorija i red potpuno na EN
- javno izdanje bez dugmeta „Radni tekst (misije 2 i 3)“
- paketi nose VODIC-SR/GUIDE-EN (md + docx) i vodic-slike; lični i dodatak „Tvoje misije“
- pytest 338/338; PSE revizija 0; revizija jezika 0/0; selftest iz oba konačna paketa: SVE PROLAZI
- WORKLOG, PLAN (+ docx), ZA-ANDREJA (commitovi za odobrenje, kalibracija, tumačenja)

Co-Authored-By: Claude Opus 5.5 <noreply@anthropic.com>
</commit_message>
<xml_diff>
--- a/PSE Riemann — PLAN.docx
+++ b/PSE Riemann — PLAN.docx
@@ -8797,7 +8797,7 @@
         <w:t xml:space="preserve">Sljedeće:</w:t>
       </w:r>
       <w:r>
-        <w:t xml:space="preserve"> Faza 6d — svi agenti su PSE (P0 jezgro → P1 → P2 → P3), pa 33b, 33d, 33e, 0.3.0~rc1; izdanje 34–38 posljednje (CI, v0.3.0, .deb + .exe, kompletni SR/EN vodiči posle izgradnje, spajanje u main samo na „spoji u main“).</w:t>
+        <w:t xml:space="preserve"> Faza 6d GOTOVA (P0–P3, 33b, 33d, 33e, 0.3.0~rc1 lični + javni paket). Čeka Andreja: push, živi test, .exe; zatim izdanje 34–38 posljednje (CI, v0.3.0, .deb + .exe, kompletni SR/EN vodiči posle izgradnje, spajanje u main samo na „spoji u main“).</w:t>
       </w:r>
     </w:p>
     <w:p>
@@ -14809,10 +14809,10 @@
           <w:b/>
           <w:bCs/>
         </w:rPr>
-        <w:t xml:space="preserve">Stanje 2026-10-27:</w:t>
-      </w:r>
-      <w:r>
-        <w:t xml:space="preserve"> P0–P2 gotovi; druga runda dogovora (pravila 27–41) i plan R1–R8 u </w:t>
+        <w:t xml:space="preserve">Stanje 2026-10-27 (jutro): R1–R8 GOTOVI</w:t>
+      </w:r>
+      <w:r>
+        <w:t xml:space="preserve"> — paketi 0.3.0~rc1 (lični i javni) izgrađeni, čeka živi test. Ranije: P0–P2 gotovi; druga runda dogovora (pravila 27–41) i plan R1–R8 u </w:t>
       </w:r>
       <w:r>
         <w:rPr>

</xml_diff>